<commit_message>
report: keep figures with captions; template face on body runs
</commit_message>
<xml_diff>
--- a/report/build/Sentinel_Apart_AIIR_Sprint_2026.docx
+++ b/report/build/Sentinel_Apart_AIIR_Sprint_2026.docx
@@ -13,6 +13,7 @@
       </w:pPr>
       <w:r>
         <w:rPr>
+          <w:rFonts w:ascii="Old Standard TT" w:hAnsi="Old Standard TT"/>
           <w:sz w:val="21"/>
           <w:rtl w:val="0"/>
         </w:rPr>
@@ -666,6 +667,7 @@
       </w:pPr>
       <w:r>
         <w:rPr>
+          <w:rFonts w:ascii="Old Standard TT" w:hAnsi="Old Standard TT"/>
           <w:sz w:val="21"/>
           <w:rtl w:val="0"/>
         </w:rPr>
@@ -687,6 +689,7 @@
       </w:pPr>
       <w:r>
         <w:rPr>
+          <w:rFonts w:ascii="Old Standard TT" w:hAnsi="Old Standard TT"/>
           <w:sz w:val="21"/>
         </w:rPr>
         <w:t>In July 2026 two pre-release OpenAI models, running a cyber-capability evaluation with production refusal classifiers disabled, escaped their sandbox through a zero-day in the package-registry cache proxy that was their one permitted network egress, reached the open internet, and spent 11 to 13 July inside Hugging Face's production infrastructure [1, 2]. Hugging Face cut the attacker off on 13 July and disclosed on 16 July without knowing the origin; OpenAI attributed it on 21 July [1]. It was not the only case. Anthropic reported three incidents in its cyber evaluations, including one where the task prompt declared no internet access, a partner misconfiguration left it on, and the agent reached a real company that shared the fictional target's name; it was found months later by transcript review [3]. The UK AI Security Institute reported models on an intentionally internet-connected cyber range reaching GitHub over Tor, caught by a Tor egress alarm [4]. The sprint page also reports (we have not retrieved the primary source) that from 24 May OpenAI agents made about 15,000 edits to a dormant German wiki, discovered by outside researchers reading its public edit logs [5].</w:t>
@@ -699,6 +702,7 @@
       </w:pPr>
       <w:r>
         <w:rPr>
+          <w:rFonts w:ascii="Old Standard TT" w:hAnsi="Old Standard TT"/>
           <w:sz w:val="21"/>
         </w:rPr>
         <w:t>These cases share a shape that is not "no monitor existed." In each one the operators knew the intended scope in prose: no internet; only the LLM API and the package proxy; only the range. Nowhere was that scope an artifact the transcript was checked against, and in every case the first signal came from somewhere else: an identity-API anomaly, a Tor alarm, a retrospective sweep, a stranger reading a wiki. Hugging Face's own post-mortem says its correlation stack existed but "failed to correctly raise the alert's criticality" [2]. The failure is one of scope attachment and attestation, and it is the failure Track 1 asks about: could a third party verify compliance without access to the lab's network?</w:t>
@@ -711,6 +715,7 @@
       </w:pPr>
       <w:r>
         <w:rPr>
+          <w:rFonts w:ascii="Old Standard TT" w:hAnsi="Old Standard TT"/>
           <w:sz w:val="21"/>
         </w:rPr>
         <w:t>We take the smallest step that answers it. Our main contributions are:</w:t>
@@ -724,6 +729,7 @@
       </w:pPr>
       <w:r>
         <w:rPr>
+          <w:rFonts w:ascii="Old Standard TT" w:hAnsi="Old Standard TT"/>
           <w:sz w:val="21"/>
         </w:rPr>
         <w:t>•  A declared-scope representation (a JSON allowlist) and Sentinel, a mechanical, Inspect-native scanner that turns the first tool-call destination outside that scope into a finding a third party can recompute from files alone.</w:t>
@@ -737,6 +743,7 @@
       </w:pPr>
       <w:r>
         <w:rPr>
+          <w:rFonts w:ascii="Old Standard TT" w:hAnsi="Old Standard TT"/>
           <w:sz w:val="21"/>
         </w:rPr>
         <w:t>•  An allowlist-misspecification ablation on a reconstruction of the Hugging Face trace: a too-tight scope pages on permitted traffic; a wildcard scope is silent on the escape. The control is the pair (trace, allowlist), not the detector.</w:t>
@@ -750,6 +757,7 @@
       </w:pPr>
       <w:r>
         <w:rPr>
+          <w:rFonts w:ascii="Old Standard TT" w:hAnsi="Old Standard TT"/>
           <w:sz w:val="21"/>
         </w:rPr>
         <w:t>•  Seven incident-derived fixtures with stated provenance, used as executable specifications rather than a benchmark, plus a tested statement of what the method cannot see: an escape through a permitted egress, and spoofed arguments.</w:t>
@@ -771,6 +779,7 @@
       </w:pPr>
       <w:r>
         <w:rPr>
+          <w:rFonts w:ascii="Old Standard TT" w:hAnsi="Old Standard TT"/>
           <w:sz w:val="21"/>
         </w:rPr>
         <w:t>Trace monitors for agents exist and are good. Inspect Scout ships scanners over evaluation transcripts, including reward-hacking and evaluation-awareness scanners [6]; ControlArena [7] and SHADE-Arena [8] monitor for side tasks and sabotage; Apollo's Watcher reads transcripts for scheming [9]; OpenAI monitors chain-of-thought and states that such a monitor "would have caught the initial relevant activity" more than a day before the breach [1]. Preventive controls also exist: default-deny egress via Cilium or Squid FQDN allowlists, and ExploitGym itself ships a Squid firewall that permits only LLM API endpoints [10].</w:t>
@@ -783,6 +792,7 @@
       </w:pPr>
       <w:r>
         <w:rPr>
+          <w:rFonts w:ascii="Old Standard TT" w:hAnsi="Old Standard TT"/>
           <w:sz w:val="21"/>
         </w:rPr>
         <w:t>None of these takes the evaluation's declared scope as an input artifact and emits a verdict that someone outside the lab can recompute. Behavioural monitors answer "does this look bad?", which needs a model and a threshold; a proxy answers "was this blocked?", but its logs stay inside the lab, and in the OpenAI case the proxy was the hole. Sentinel's wedge is narrow: a mechanical predicate over (trace, allowlist). One would use it alongside the monitors above, never instead of a default-deny proxy. What it provides that we did not have is the index of the first out-of-scope stated destination as a reproducible number attached to a declared scope.</w:t>
@@ -813,6 +823,7 @@
       </w:pPr>
       <w:r>
         <w:rPr>
+          <w:rFonts w:ascii="Old Standard TT" w:hAnsi="Old Standard TT"/>
           <w:sz w:val="21"/>
         </w:rPr>
         <w:t>An allowlist is a JSON file: name, internet_expected, allowed_hosts (exact hosts or .suffix entries), allowed_cidrs, and free-text notes recording why each entry is permitted. classify(host) returns ALLOWED, LOOPBACK, METADATA (the cloud instance-metadata addresses) or OUT. A wildcard entry "*" allows everything; it exists only so the ablation can express "no real scope." Three scopes are in the repo, one per incident: ExploitGym (LLM API endpoints plus the Artifactory package proxy, both documented as permitted [1, 10]), the Irregular CTF (an internal CIDR and one target host; internet declared off [3]), and the AISI range (range hosts, internet_expected true [4]).</w:t>
@@ -834,6 +845,7 @@
       </w:pPr>
       <w:r>
         <w:rPr>
+          <w:rFonts w:ascii="Old Standard TT" w:hAnsi="Old Standard TT"/>
           <w:sz w:val="21"/>
         </w:rPr>
         <w:t>A trace is the ordered list of tool calls with their arguments; the scanner reads nothing else. extract_destinations pulls stated hosts from URLs, nc/ncat, socat, Python HTTP literals and bare host:port tokens, by regular expression. There is no model in the loop and no API key. The extractor is deliberately conservative: it reads what the agent said it would reach.</w:t>
@@ -855,6 +867,7 @@
       </w:pPr>
       <w:r>
         <w:rPr>
+          <w:rFonts w:ascii="Old Standard TT" w:hAnsi="Old Standard TT"/>
           <w:sz w:val="21"/>
         </w:rPr>
         <w:t>T3, a stated destination classified OUT, is the only PAGE. T1 (reading grader or solution internals) and T2 (mount tables, cgroups, proxy enumeration, metadata addresses) are WARN and never page. The reason is base rates: in a capture-the-flag task, flag-seeking is the task, and reconnaissance of one's own box is routine. AISI's cheating study lists "probing evaluation software for solution leaks" as a cheating mode [11]; we surface it, we do not alarm on it. Gating on a predicate the environment can settle itself, rather than on a second model, follows scorer-integrity [12], which measured an LLM scheming-judge against an operative-action oracle over 599 Inspect gradings and noted that most environments offer no such predicate. Containment evaluations do: the allowlist.</w:t>
@@ -876,6 +889,7 @@
       </w:pPr>
       <w:r>
         <w:rPr>
+          <w:rFonts w:ascii="Old Standard TT" w:hAnsi="Old Standard TT"/>
           <w:sz w:val="21"/>
         </w:rPr>
         <w:t>scanner.py wraps the same rule as an inspect_scout scanner over ChatMessageAssistant.tool_calls and returns a Result whose answer is the host and whose metadata carries the first out-of-scope message index. It runs offline over existing logs (scout scan sentinel/scanner.py -T ./logs) or attached to an evaluation. core.py runs the identical rule over the JSON trace schema, so a party with only files reproduces the verdict. Fifteen tests pin every number in this paper.</w:t>
@@ -897,6 +911,7 @@
       </w:pPr>
       <w:r>
         <w:rPr>
+          <w:rFonts w:ascii="Old Standard TT" w:hAnsi="Old Standard TT"/>
           <w:sz w:val="21"/>
         </w:rPr>
         <w:t>Three positives are reconstructions from the public write-ups, each carrying a source URL and lab_detected_at_event taken from the published timeline: the Hugging Face escape (7 events), the AISI Tor egress (4) and the Anthropic name-collision case (4). Three synthetic hard negatives cover the cases a naive monitor gets wrong: an agent whose only egress is the permitted LLM API; in-sandbox reconnaissance that reads task files; and an internet-expected range where the agent hits allowlisted hosts. One synthetic fixture reads grader internals and should warn only. The baseline pages on any of curl, wget, nc, requests, socket or http with no allowlist. These fixtures were written by us, from descriptions, to a rule we wrote; Section 4 says what that does and does not license.</w:t>
@@ -918,6 +933,7 @@
       </w:pPr>
       <w:r>
         <w:rPr>
+          <w:rFonts w:ascii="Old Standard TT" w:hAnsi="Old Standard TT"/>
           <w:sz w:val="21"/>
         </w:rPr>
         <w:t>Two first-run failures became the paper. The Hugging Face trace first paged at event 2 on artifactory.internal: our allowlist had omitted the package proxy, which OpenAI documents as a genuinely permitted egress. Adding it moved the page to event 3 and exposed the blind spot in Section 4.3, and the difference between the two allowlists became the ablation. Second, T1 fired on cat solution_template.py; grep -r flag. That was the rule working and the test being wrong: in a CTF that command is the task. We changed the test to assert T2-only on that fixture and added a separate grader-internals fixture for the genuine T1 signal.</w:t>
@@ -971,9 +987,14 @@
             <w:tcW w:type="dxa" w:w="2232"/>
           </w:tcPr>
           <w:p>
-            <w:r/>
-            <w:r>
-              <w:rPr>
+            <w:r>
+              <w:rPr>
+                <w:rFonts w:ascii="Old Standard TT" w:hAnsi="Old Standard TT"/>
+              </w:rPr>
+            </w:r>
+            <w:r>
+              <w:rPr>
+                <w:rFonts w:ascii="Old Standard TT" w:hAnsi="Old Standard TT"/>
                 <w:b/>
                 <w:sz w:val="17"/>
               </w:rPr>
@@ -986,9 +1007,14 @@
             <w:tcW w:type="dxa" w:w="1080"/>
           </w:tcPr>
           <w:p>
-            <w:r/>
-            <w:r>
-              <w:rPr>
+            <w:r>
+              <w:rPr>
+                <w:rFonts w:ascii="Old Standard TT" w:hAnsi="Old Standard TT"/>
+              </w:rPr>
+            </w:r>
+            <w:r>
+              <w:rPr>
+                <w:rFonts w:ascii="Old Standard TT" w:hAnsi="Old Standard TT"/>
                 <w:b/>
                 <w:sz w:val="17"/>
               </w:rPr>
@@ -1001,9 +1027,14 @@
             <w:tcW w:type="dxa" w:w="1368"/>
           </w:tcPr>
           <w:p>
-            <w:r/>
-            <w:r>
-              <w:rPr>
+            <w:r>
+              <w:rPr>
+                <w:rFonts w:ascii="Old Standard TT" w:hAnsi="Old Standard TT"/>
+              </w:rPr>
+            </w:r>
+            <w:r>
+              <w:rPr>
+                <w:rFonts w:ascii="Old Standard TT" w:hAnsi="Old Standard TT"/>
                 <w:b/>
                 <w:sz w:val="17"/>
               </w:rPr>
@@ -1016,9 +1047,14 @@
             <w:tcW w:type="dxa" w:w="2232"/>
           </w:tcPr>
           <w:p>
-            <w:r/>
-            <w:r>
-              <w:rPr>
+            <w:r>
+              <w:rPr>
+                <w:rFonts w:ascii="Old Standard TT" w:hAnsi="Old Standard TT"/>
+              </w:rPr>
+            </w:r>
+            <w:r>
+              <w:rPr>
+                <w:rFonts w:ascii="Old Standard TT" w:hAnsi="Old Standard TT"/>
                 <w:b/>
                 <w:sz w:val="17"/>
               </w:rPr>
@@ -1031,9 +1067,14 @@
             <w:tcW w:type="dxa" w:w="1224"/>
           </w:tcPr>
           <w:p>
-            <w:r/>
-            <w:r>
-              <w:rPr>
+            <w:r>
+              <w:rPr>
+                <w:rFonts w:ascii="Old Standard TT" w:hAnsi="Old Standard TT"/>
+              </w:rPr>
+            </w:r>
+            <w:r>
+              <w:rPr>
+                <w:rFonts w:ascii="Old Standard TT" w:hAnsi="Old Standard TT"/>
                 <w:b/>
                 <w:sz w:val="17"/>
               </w:rPr>
@@ -1046,9 +1087,14 @@
             <w:tcW w:type="dxa" w:w="1224"/>
           </w:tcPr>
           <w:p>
-            <w:r/>
-            <w:r>
-              <w:rPr>
+            <w:r>
+              <w:rPr>
+                <w:rFonts w:ascii="Old Standard TT" w:hAnsi="Old Standard TT"/>
+              </w:rPr>
+            </w:r>
+            <w:r>
+              <w:rPr>
+                <w:rFonts w:ascii="Old Standard TT" w:hAnsi="Old Standard TT"/>
                 <w:b/>
                 <w:sz w:val="17"/>
               </w:rPr>
@@ -1066,9 +1112,14 @@
             <w:tcW w:type="dxa" w:w="2232"/>
           </w:tcPr>
           <w:p>
-            <w:r/>
-            <w:r>
-              <w:rPr>
+            <w:r>
+              <w:rPr>
+                <w:rFonts w:ascii="Old Standard TT" w:hAnsi="Old Standard TT"/>
+              </w:rPr>
+            </w:r>
+            <w:r>
+              <w:rPr>
+                <w:rFonts w:ascii="Old Standard TT" w:hAnsi="Old Standard TT"/>
                 <w:b w:val="0"/>
                 <w:sz w:val="17"/>
               </w:rPr>
@@ -1081,9 +1132,14 @@
             <w:tcW w:type="dxa" w:w="1080"/>
           </w:tcPr>
           <w:p>
-            <w:r/>
-            <w:r>
-              <w:rPr>
+            <w:r>
+              <w:rPr>
+                <w:rFonts w:ascii="Old Standard TT" w:hAnsi="Old Standard TT"/>
+              </w:rPr>
+            </w:r>
+            <w:r>
+              <w:rPr>
+                <w:rFonts w:ascii="Old Standard TT" w:hAnsi="Old Standard TT"/>
                 <w:b w:val="0"/>
                 <w:sz w:val="17"/>
               </w:rPr>
@@ -1096,9 +1152,14 @@
             <w:tcW w:type="dxa" w:w="1368"/>
           </w:tcPr>
           <w:p>
-            <w:r/>
-            <w:r>
-              <w:rPr>
+            <w:r>
+              <w:rPr>
+                <w:rFonts w:ascii="Old Standard TT" w:hAnsi="Old Standard TT"/>
+              </w:rPr>
+            </w:r>
+            <w:r>
+              <w:rPr>
+                <w:rFonts w:ascii="Old Standard TT" w:hAnsi="Old Standard TT"/>
                 <w:b w:val="0"/>
                 <w:sz w:val="17"/>
               </w:rPr>
@@ -1111,9 +1172,14 @@
             <w:tcW w:type="dxa" w:w="2232"/>
           </w:tcPr>
           <w:p>
-            <w:r/>
-            <w:r>
-              <w:rPr>
+            <w:r>
+              <w:rPr>
+                <w:rFonts w:ascii="Old Standard TT" w:hAnsi="Old Standard TT"/>
+              </w:rPr>
+            </w:r>
+            <w:r>
+              <w:rPr>
+                <w:rFonts w:ascii="Old Standard TT" w:hAnsi="Old Standard TT"/>
                 <w:b w:val="0"/>
                 <w:sz w:val="17"/>
               </w:rPr>
@@ -1126,9 +1192,14 @@
             <w:tcW w:type="dxa" w:w="1224"/>
           </w:tcPr>
           <w:p>
-            <w:r/>
-            <w:r>
-              <w:rPr>
+            <w:r>
+              <w:rPr>
+                <w:rFonts w:ascii="Old Standard TT" w:hAnsi="Old Standard TT"/>
+              </w:rPr>
+            </w:r>
+            <w:r>
+              <w:rPr>
+                <w:rFonts w:ascii="Old Standard TT" w:hAnsi="Old Standard TT"/>
                 <w:b w:val="0"/>
                 <w:sz w:val="17"/>
               </w:rPr>
@@ -1141,9 +1212,14 @@
             <w:tcW w:type="dxa" w:w="1224"/>
           </w:tcPr>
           <w:p>
-            <w:r/>
-            <w:r>
-              <w:rPr>
+            <w:r>
+              <w:rPr>
+                <w:rFonts w:ascii="Old Standard TT" w:hAnsi="Old Standard TT"/>
+              </w:rPr>
+            </w:r>
+            <w:r>
+              <w:rPr>
+                <w:rFonts w:ascii="Old Standard TT" w:hAnsi="Old Standard TT"/>
                 <w:b w:val="0"/>
                 <w:sz w:val="17"/>
               </w:rPr>
@@ -1161,9 +1237,14 @@
             <w:tcW w:type="dxa" w:w="2232"/>
           </w:tcPr>
           <w:p>
-            <w:r/>
-            <w:r>
-              <w:rPr>
+            <w:r>
+              <w:rPr>
+                <w:rFonts w:ascii="Old Standard TT" w:hAnsi="Old Standard TT"/>
+              </w:rPr>
+            </w:r>
+            <w:r>
+              <w:rPr>
+                <w:rFonts w:ascii="Old Standard TT" w:hAnsi="Old Standard TT"/>
                 <w:b w:val="0"/>
                 <w:sz w:val="17"/>
               </w:rPr>
@@ -1176,9 +1257,14 @@
             <w:tcW w:type="dxa" w:w="1080"/>
           </w:tcPr>
           <w:p>
-            <w:r/>
-            <w:r>
-              <w:rPr>
+            <w:r>
+              <w:rPr>
+                <w:rFonts w:ascii="Old Standard TT" w:hAnsi="Old Standard TT"/>
+              </w:rPr>
+            </w:r>
+            <w:r>
+              <w:rPr>
+                <w:rFonts w:ascii="Old Standard TT" w:hAnsi="Old Standard TT"/>
                 <w:b w:val="0"/>
                 <w:sz w:val="17"/>
               </w:rPr>
@@ -1191,9 +1277,14 @@
             <w:tcW w:type="dxa" w:w="1368"/>
           </w:tcPr>
           <w:p>
-            <w:r/>
-            <w:r>
-              <w:rPr>
+            <w:r>
+              <w:rPr>
+                <w:rFonts w:ascii="Old Standard TT" w:hAnsi="Old Standard TT"/>
+              </w:rPr>
+            </w:r>
+            <w:r>
+              <w:rPr>
+                <w:rFonts w:ascii="Old Standard TT" w:hAnsi="Old Standard TT"/>
                 <w:b w:val="0"/>
                 <w:sz w:val="17"/>
               </w:rPr>
@@ -1206,9 +1297,14 @@
             <w:tcW w:type="dxa" w:w="2232"/>
           </w:tcPr>
           <w:p>
-            <w:r/>
-            <w:r>
-              <w:rPr>
+            <w:r>
+              <w:rPr>
+                <w:rFonts w:ascii="Old Standard TT" w:hAnsi="Old Standard TT"/>
+              </w:rPr>
+            </w:r>
+            <w:r>
+              <w:rPr>
+                <w:rFonts w:ascii="Old Standard TT" w:hAnsi="Old Standard TT"/>
                 <w:b w:val="0"/>
                 <w:sz w:val="17"/>
               </w:rPr>
@@ -1221,9 +1317,14 @@
             <w:tcW w:type="dxa" w:w="1224"/>
           </w:tcPr>
           <w:p>
-            <w:r/>
-            <w:r>
-              <w:rPr>
+            <w:r>
+              <w:rPr>
+                <w:rFonts w:ascii="Old Standard TT" w:hAnsi="Old Standard TT"/>
+              </w:rPr>
+            </w:r>
+            <w:r>
+              <w:rPr>
+                <w:rFonts w:ascii="Old Standard TT" w:hAnsi="Old Standard TT"/>
                 <w:b w:val="0"/>
                 <w:sz w:val="17"/>
               </w:rPr>
@@ -1236,9 +1337,14 @@
             <w:tcW w:type="dxa" w:w="1224"/>
           </w:tcPr>
           <w:p>
-            <w:r/>
-            <w:r>
-              <w:rPr>
+            <w:r>
+              <w:rPr>
+                <w:rFonts w:ascii="Old Standard TT" w:hAnsi="Old Standard TT"/>
+              </w:rPr>
+            </w:r>
+            <w:r>
+              <w:rPr>
+                <w:rFonts w:ascii="Old Standard TT" w:hAnsi="Old Standard TT"/>
                 <w:b w:val="0"/>
                 <w:sz w:val="17"/>
               </w:rPr>
@@ -1256,9 +1362,14 @@
             <w:tcW w:type="dxa" w:w="2232"/>
           </w:tcPr>
           <w:p>
-            <w:r/>
-            <w:r>
-              <w:rPr>
+            <w:r>
+              <w:rPr>
+                <w:rFonts w:ascii="Old Standard TT" w:hAnsi="Old Standard TT"/>
+              </w:rPr>
+            </w:r>
+            <w:r>
+              <w:rPr>
+                <w:rFonts w:ascii="Old Standard TT" w:hAnsi="Old Standard TT"/>
                 <w:b w:val="0"/>
                 <w:sz w:val="17"/>
               </w:rPr>
@@ -1271,9 +1382,14 @@
             <w:tcW w:type="dxa" w:w="1080"/>
           </w:tcPr>
           <w:p>
-            <w:r/>
-            <w:r>
-              <w:rPr>
+            <w:r>
+              <w:rPr>
+                <w:rFonts w:ascii="Old Standard TT" w:hAnsi="Old Standard TT"/>
+              </w:rPr>
+            </w:r>
+            <w:r>
+              <w:rPr>
+                <w:rFonts w:ascii="Old Standard TT" w:hAnsi="Old Standard TT"/>
                 <w:b w:val="0"/>
                 <w:sz w:val="17"/>
               </w:rPr>
@@ -1286,9 +1402,14 @@
             <w:tcW w:type="dxa" w:w="1368"/>
           </w:tcPr>
           <w:p>
-            <w:r/>
-            <w:r>
-              <w:rPr>
+            <w:r>
+              <w:rPr>
+                <w:rFonts w:ascii="Old Standard TT" w:hAnsi="Old Standard TT"/>
+              </w:rPr>
+            </w:r>
+            <w:r>
+              <w:rPr>
+                <w:rFonts w:ascii="Old Standard TT" w:hAnsi="Old Standard TT"/>
                 <w:b w:val="0"/>
                 <w:sz w:val="17"/>
               </w:rPr>
@@ -1301,9 +1422,14 @@
             <w:tcW w:type="dxa" w:w="2232"/>
           </w:tcPr>
           <w:p>
-            <w:r/>
-            <w:r>
-              <w:rPr>
+            <w:r>
+              <w:rPr>
+                <w:rFonts w:ascii="Old Standard TT" w:hAnsi="Old Standard TT"/>
+              </w:rPr>
+            </w:r>
+            <w:r>
+              <w:rPr>
+                <w:rFonts w:ascii="Old Standard TT" w:hAnsi="Old Standard TT"/>
                 <w:b w:val="0"/>
                 <w:sz w:val="17"/>
               </w:rPr>
@@ -1316,9 +1442,14 @@
             <w:tcW w:type="dxa" w:w="1224"/>
           </w:tcPr>
           <w:p>
-            <w:r/>
-            <w:r>
-              <w:rPr>
+            <w:r>
+              <w:rPr>
+                <w:rFonts w:ascii="Old Standard TT" w:hAnsi="Old Standard TT"/>
+              </w:rPr>
+            </w:r>
+            <w:r>
+              <w:rPr>
+                <w:rFonts w:ascii="Old Standard TT" w:hAnsi="Old Standard TT"/>
                 <w:b w:val="0"/>
                 <w:sz w:val="17"/>
               </w:rPr>
@@ -1331,9 +1462,14 @@
             <w:tcW w:type="dxa" w:w="1224"/>
           </w:tcPr>
           <w:p>
-            <w:r/>
-            <w:r>
-              <w:rPr>
+            <w:r>
+              <w:rPr>
+                <w:rFonts w:ascii="Old Standard TT" w:hAnsi="Old Standard TT"/>
+              </w:rPr>
+            </w:r>
+            <w:r>
+              <w:rPr>
+                <w:rFonts w:ascii="Old Standard TT" w:hAnsi="Old Standard TT"/>
                 <w:b w:val="0"/>
                 <w:sz w:val="17"/>
               </w:rPr>
@@ -1351,9 +1487,14 @@
             <w:tcW w:type="dxa" w:w="2232"/>
           </w:tcPr>
           <w:p>
-            <w:r/>
-            <w:r>
-              <w:rPr>
+            <w:r>
+              <w:rPr>
+                <w:rFonts w:ascii="Old Standard TT" w:hAnsi="Old Standard TT"/>
+              </w:rPr>
+            </w:r>
+            <w:r>
+              <w:rPr>
+                <w:rFonts w:ascii="Old Standard TT" w:hAnsi="Old Standard TT"/>
                 <w:b w:val="0"/>
                 <w:sz w:val="17"/>
               </w:rPr>
@@ -1366,9 +1507,14 @@
             <w:tcW w:type="dxa" w:w="1080"/>
           </w:tcPr>
           <w:p>
-            <w:r/>
-            <w:r>
-              <w:rPr>
+            <w:r>
+              <w:rPr>
+                <w:rFonts w:ascii="Old Standard TT" w:hAnsi="Old Standard TT"/>
+              </w:rPr>
+            </w:r>
+            <w:r>
+              <w:rPr>
+                <w:rFonts w:ascii="Old Standard TT" w:hAnsi="Old Standard TT"/>
                 <w:b w:val="0"/>
                 <w:sz w:val="17"/>
               </w:rPr>
@@ -1381,9 +1527,14 @@
             <w:tcW w:type="dxa" w:w="1368"/>
           </w:tcPr>
           <w:p>
-            <w:r/>
-            <w:r>
-              <w:rPr>
+            <w:r>
+              <w:rPr>
+                <w:rFonts w:ascii="Old Standard TT" w:hAnsi="Old Standard TT"/>
+              </w:rPr>
+            </w:r>
+            <w:r>
+              <w:rPr>
+                <w:rFonts w:ascii="Old Standard TT" w:hAnsi="Old Standard TT"/>
                 <w:b w:val="0"/>
                 <w:sz w:val="17"/>
               </w:rPr>
@@ -1396,9 +1547,14 @@
             <w:tcW w:type="dxa" w:w="2232"/>
           </w:tcPr>
           <w:p>
-            <w:r/>
-            <w:r>
-              <w:rPr>
+            <w:r>
+              <w:rPr>
+                <w:rFonts w:ascii="Old Standard TT" w:hAnsi="Old Standard TT"/>
+              </w:rPr>
+            </w:r>
+            <w:r>
+              <w:rPr>
+                <w:rFonts w:ascii="Old Standard TT" w:hAnsi="Old Standard TT"/>
                 <w:b w:val="0"/>
                 <w:sz w:val="17"/>
               </w:rPr>
@@ -1411,9 +1567,14 @@
             <w:tcW w:type="dxa" w:w="1224"/>
           </w:tcPr>
           <w:p>
-            <w:r/>
-            <w:r>
-              <w:rPr>
+            <w:r>
+              <w:rPr>
+                <w:rFonts w:ascii="Old Standard TT" w:hAnsi="Old Standard TT"/>
+              </w:rPr>
+            </w:r>
+            <w:r>
+              <w:rPr>
+                <w:rFonts w:ascii="Old Standard TT" w:hAnsi="Old Standard TT"/>
                 <w:b w:val="0"/>
                 <w:sz w:val="17"/>
               </w:rPr>
@@ -1426,9 +1587,14 @@
             <w:tcW w:type="dxa" w:w="1224"/>
           </w:tcPr>
           <w:p>
-            <w:r/>
-            <w:r>
-              <w:rPr>
+            <w:r>
+              <w:rPr>
+                <w:rFonts w:ascii="Old Standard TT" w:hAnsi="Old Standard TT"/>
+              </w:rPr>
+            </w:r>
+            <w:r>
+              <w:rPr>
+                <w:rFonts w:ascii="Old Standard TT" w:hAnsi="Old Standard TT"/>
                 <w:b w:val="0"/>
                 <w:sz w:val="17"/>
               </w:rPr>
@@ -1446,9 +1612,14 @@
             <w:tcW w:type="dxa" w:w="2232"/>
           </w:tcPr>
           <w:p>
-            <w:r/>
-            <w:r>
-              <w:rPr>
+            <w:r>
+              <w:rPr>
+                <w:rFonts w:ascii="Old Standard TT" w:hAnsi="Old Standard TT"/>
+              </w:rPr>
+            </w:r>
+            <w:r>
+              <w:rPr>
+                <w:rFonts w:ascii="Old Standard TT" w:hAnsi="Old Standard TT"/>
                 <w:b w:val="0"/>
                 <w:sz w:val="17"/>
               </w:rPr>
@@ -1461,9 +1632,14 @@
             <w:tcW w:type="dxa" w:w="1080"/>
           </w:tcPr>
           <w:p>
-            <w:r/>
-            <w:r>
-              <w:rPr>
+            <w:r>
+              <w:rPr>
+                <w:rFonts w:ascii="Old Standard TT" w:hAnsi="Old Standard TT"/>
+              </w:rPr>
+            </w:r>
+            <w:r>
+              <w:rPr>
+                <w:rFonts w:ascii="Old Standard TT" w:hAnsi="Old Standard TT"/>
                 <w:b w:val="0"/>
                 <w:sz w:val="17"/>
               </w:rPr>
@@ -1476,9 +1652,14 @@
             <w:tcW w:type="dxa" w:w="1368"/>
           </w:tcPr>
           <w:p>
-            <w:r/>
-            <w:r>
-              <w:rPr>
+            <w:r>
+              <w:rPr>
+                <w:rFonts w:ascii="Old Standard TT" w:hAnsi="Old Standard TT"/>
+              </w:rPr>
+            </w:r>
+            <w:r>
+              <w:rPr>
+                <w:rFonts w:ascii="Old Standard TT" w:hAnsi="Old Standard TT"/>
                 <w:b w:val="0"/>
                 <w:sz w:val="17"/>
               </w:rPr>
@@ -1491,9 +1672,14 @@
             <w:tcW w:type="dxa" w:w="2232"/>
           </w:tcPr>
           <w:p>
-            <w:r/>
-            <w:r>
-              <w:rPr>
+            <w:r>
+              <w:rPr>
+                <w:rFonts w:ascii="Old Standard TT" w:hAnsi="Old Standard TT"/>
+              </w:rPr>
+            </w:r>
+            <w:r>
+              <w:rPr>
+                <w:rFonts w:ascii="Old Standard TT" w:hAnsi="Old Standard TT"/>
                 <w:b w:val="0"/>
                 <w:sz w:val="17"/>
               </w:rPr>
@@ -1506,9 +1692,14 @@
             <w:tcW w:type="dxa" w:w="1224"/>
           </w:tcPr>
           <w:p>
-            <w:r/>
-            <w:r>
-              <w:rPr>
+            <w:r>
+              <w:rPr>
+                <w:rFonts w:ascii="Old Standard TT" w:hAnsi="Old Standard TT"/>
+              </w:rPr>
+            </w:r>
+            <w:r>
+              <w:rPr>
+                <w:rFonts w:ascii="Old Standard TT" w:hAnsi="Old Standard TT"/>
                 <w:b w:val="0"/>
                 <w:sz w:val="17"/>
               </w:rPr>
@@ -1521,9 +1712,14 @@
             <w:tcW w:type="dxa" w:w="1224"/>
           </w:tcPr>
           <w:p>
-            <w:r/>
-            <w:r>
-              <w:rPr>
+            <w:r>
+              <w:rPr>
+                <w:rFonts w:ascii="Old Standard TT" w:hAnsi="Old Standard TT"/>
+              </w:rPr>
+            </w:r>
+            <w:r>
+              <w:rPr>
+                <w:rFonts w:ascii="Old Standard TT" w:hAnsi="Old Standard TT"/>
                 <w:b w:val="0"/>
                 <w:sz w:val="17"/>
               </w:rPr>
@@ -1541,9 +1737,14 @@
             <w:tcW w:type="dxa" w:w="2232"/>
           </w:tcPr>
           <w:p>
-            <w:r/>
-            <w:r>
-              <w:rPr>
+            <w:r>
+              <w:rPr>
+                <w:rFonts w:ascii="Old Standard TT" w:hAnsi="Old Standard TT"/>
+              </w:rPr>
+            </w:r>
+            <w:r>
+              <w:rPr>
+                <w:rFonts w:ascii="Old Standard TT" w:hAnsi="Old Standard TT"/>
                 <w:b w:val="0"/>
                 <w:sz w:val="17"/>
               </w:rPr>
@@ -1556,9 +1757,14 @@
             <w:tcW w:type="dxa" w:w="1080"/>
           </w:tcPr>
           <w:p>
-            <w:r/>
-            <w:r>
-              <w:rPr>
+            <w:r>
+              <w:rPr>
+                <w:rFonts w:ascii="Old Standard TT" w:hAnsi="Old Standard TT"/>
+              </w:rPr>
+            </w:r>
+            <w:r>
+              <w:rPr>
+                <w:rFonts w:ascii="Old Standard TT" w:hAnsi="Old Standard TT"/>
                 <w:b w:val="0"/>
                 <w:sz w:val="17"/>
               </w:rPr>
@@ -1571,9 +1777,14 @@
             <w:tcW w:type="dxa" w:w="1368"/>
           </w:tcPr>
           <w:p>
-            <w:r/>
-            <w:r>
-              <w:rPr>
+            <w:r>
+              <w:rPr>
+                <w:rFonts w:ascii="Old Standard TT" w:hAnsi="Old Standard TT"/>
+              </w:rPr>
+            </w:r>
+            <w:r>
+              <w:rPr>
+                <w:rFonts w:ascii="Old Standard TT" w:hAnsi="Old Standard TT"/>
                 <w:b w:val="0"/>
                 <w:sz w:val="17"/>
               </w:rPr>
@@ -1586,9 +1797,14 @@
             <w:tcW w:type="dxa" w:w="2232"/>
           </w:tcPr>
           <w:p>
-            <w:r/>
-            <w:r>
-              <w:rPr>
+            <w:r>
+              <w:rPr>
+                <w:rFonts w:ascii="Old Standard TT" w:hAnsi="Old Standard TT"/>
+              </w:rPr>
+            </w:r>
+            <w:r>
+              <w:rPr>
+                <w:rFonts w:ascii="Old Standard TT" w:hAnsi="Old Standard TT"/>
                 <w:b w:val="0"/>
                 <w:sz w:val="17"/>
               </w:rPr>
@@ -1601,9 +1817,14 @@
             <w:tcW w:type="dxa" w:w="1224"/>
           </w:tcPr>
           <w:p>
-            <w:r/>
-            <w:r>
-              <w:rPr>
+            <w:r>
+              <w:rPr>
+                <w:rFonts w:ascii="Old Standard TT" w:hAnsi="Old Standard TT"/>
+              </w:rPr>
+            </w:r>
+            <w:r>
+              <w:rPr>
+                <w:rFonts w:ascii="Old Standard TT" w:hAnsi="Old Standard TT"/>
                 <w:b w:val="0"/>
                 <w:sz w:val="17"/>
               </w:rPr>
@@ -1616,9 +1837,14 @@
             <w:tcW w:type="dxa" w:w="1224"/>
           </w:tcPr>
           <w:p>
-            <w:r/>
-            <w:r>
-              <w:rPr>
+            <w:r>
+              <w:rPr>
+                <w:rFonts w:ascii="Old Standard TT" w:hAnsi="Old Standard TT"/>
+              </w:rPr>
+            </w:r>
+            <w:r>
+              <w:rPr>
+                <w:rFonts w:ascii="Old Standard TT" w:hAnsi="Old Standard TT"/>
                 <w:b w:val="0"/>
                 <w:sz w:val="17"/>
               </w:rPr>
@@ -1636,9 +1862,14 @@
             <w:tcW w:type="dxa" w:w="2232"/>
           </w:tcPr>
           <w:p>
-            <w:r/>
-            <w:r>
-              <w:rPr>
+            <w:r>
+              <w:rPr>
+                <w:rFonts w:ascii="Old Standard TT" w:hAnsi="Old Standard TT"/>
+              </w:rPr>
+            </w:r>
+            <w:r>
+              <w:rPr>
+                <w:rFonts w:ascii="Old Standard TT" w:hAnsi="Old Standard TT"/>
                 <w:b w:val="0"/>
                 <w:sz w:val="17"/>
               </w:rPr>
@@ -1651,9 +1882,14 @@
             <w:tcW w:type="dxa" w:w="1080"/>
           </w:tcPr>
           <w:p>
-            <w:r/>
-            <w:r>
-              <w:rPr>
+            <w:r>
+              <w:rPr>
+                <w:rFonts w:ascii="Old Standard TT" w:hAnsi="Old Standard TT"/>
+              </w:rPr>
+            </w:r>
+            <w:r>
+              <w:rPr>
+                <w:rFonts w:ascii="Old Standard TT" w:hAnsi="Old Standard TT"/>
                 <w:b w:val="0"/>
                 <w:sz w:val="17"/>
               </w:rPr>
@@ -1666,9 +1902,14 @@
             <w:tcW w:type="dxa" w:w="1368"/>
           </w:tcPr>
           <w:p>
-            <w:r/>
-            <w:r>
-              <w:rPr>
+            <w:r>
+              <w:rPr>
+                <w:rFonts w:ascii="Old Standard TT" w:hAnsi="Old Standard TT"/>
+              </w:rPr>
+            </w:r>
+            <w:r>
+              <w:rPr>
+                <w:rFonts w:ascii="Old Standard TT" w:hAnsi="Old Standard TT"/>
                 <w:b w:val="0"/>
                 <w:sz w:val="17"/>
               </w:rPr>
@@ -1681,9 +1922,14 @@
             <w:tcW w:type="dxa" w:w="2232"/>
           </w:tcPr>
           <w:p>
-            <w:r/>
-            <w:r>
-              <w:rPr>
+            <w:r>
+              <w:rPr>
+                <w:rFonts w:ascii="Old Standard TT" w:hAnsi="Old Standard TT"/>
+              </w:rPr>
+            </w:r>
+            <w:r>
+              <w:rPr>
+                <w:rFonts w:ascii="Old Standard TT" w:hAnsi="Old Standard TT"/>
                 <w:b w:val="0"/>
                 <w:sz w:val="17"/>
               </w:rPr>
@@ -1696,9 +1942,14 @@
             <w:tcW w:type="dxa" w:w="1224"/>
           </w:tcPr>
           <w:p>
-            <w:r/>
-            <w:r>
-              <w:rPr>
+            <w:r>
+              <w:rPr>
+                <w:rFonts w:ascii="Old Standard TT" w:hAnsi="Old Standard TT"/>
+              </w:rPr>
+            </w:r>
+            <w:r>
+              <w:rPr>
+                <w:rFonts w:ascii="Old Standard TT" w:hAnsi="Old Standard TT"/>
                 <w:b w:val="0"/>
                 <w:sz w:val="17"/>
               </w:rPr>
@@ -1711,9 +1962,14 @@
             <w:tcW w:type="dxa" w:w="1224"/>
           </w:tcPr>
           <w:p>
-            <w:r/>
-            <w:r>
-              <w:rPr>
+            <w:r>
+              <w:rPr>
+                <w:rFonts w:ascii="Old Standard TT" w:hAnsi="Old Standard TT"/>
+              </w:rPr>
+            </w:r>
+            <w:r>
+              <w:rPr>
+                <w:rFonts w:ascii="Old Standard TT" w:hAnsi="Old Standard TT"/>
                 <w:b w:val="0"/>
                 <w:sz w:val="17"/>
               </w:rPr>
@@ -1729,6 +1985,7 @@
       </w:pPr>
       <w:r>
         <w:rPr>
+          <w:rFonts w:ascii="Old Standard TT" w:hAnsi="Old Standard TT"/>
           <w:i/>
           <w:sz w:val="19"/>
         </w:rPr>
@@ -1742,6 +1999,7 @@
       </w:pPr>
       <w:r>
         <w:rPr>
+          <w:rFonts w:ascii="Old Standard TT" w:hAnsi="Old Standard TT"/>
           <w:sz w:val="21"/>
         </w:rPr>
         <w:t>Observation: Sentinel pages at the first non-allowlisted stated destination on all three positives and is silent on all three negatives. The keyword baseline false-pages on two negatives and, on every positive, its first hit is an in-scope or local command rather than the out-of-scope event. Interpretation: these are tests that the rule does what it says on traces we wrote to describe the public record. They are not detection rates and we report no accuracy. What they establish is that the verdict and its event index are reproducible from files, and that the allowlist, not the regular expressions, is the component doing the work.</w:t>
@@ -1758,11 +2016,13 @@
     </w:p>
     <w:p>
       <w:pPr>
+        <w:keepNext/>
         <w:spacing w:line="240" w:lineRule="auto"/>
         <w:jc w:val="center"/>
       </w:pPr>
       <w:r>
         <w:rPr>
+          <w:rFonts w:ascii="Old Standard TT" w:hAnsi="Old Standard TT"/>
           <w:sz w:val="21"/>
         </w:rPr>
         <w:drawing>
@@ -1805,6 +2065,7 @@
       </w:pPr>
       <w:r>
         <w:rPr>
+          <w:rFonts w:ascii="Old Standard TT" w:hAnsi="Old Standard TT"/>
           <w:i/>
           <w:sz w:val="19"/>
         </w:rPr>
@@ -1818,6 +2079,7 @@
       </w:pPr>
       <w:r>
         <w:rPr>
+          <w:rFonts w:ascii="Old Standard TT" w:hAnsi="Old Standard TT"/>
           <w:sz w:val="21"/>
         </w:rPr>
         <w:t>Observation: the same trace yields three different verdicts under three scopes (Figure 1). Interpretation: both directions of misspecification fail, and they fail differently. The too-tight scope produces a page on permitted egress, the kind of alert that gets a monitor switched off within a day. The wildcard scope, which is what "we allow internet" means when nobody writes the list, is silent on a real containment failure. A scanner with no declared scope is not a control. This is the result we would defend in front of a detection engineer: the artifact worth publishing per evaluation class is the pair (trace, allowlist), and verifiability is a property of the pair.</w:t>
@@ -1839,6 +2101,7 @@
       </w:pPr>
       <w:r>
         <w:rPr>
+          <w:rFonts w:ascii="Old Standard TT" w:hAnsi="Old Standard TT"/>
           <w:sz w:val="21"/>
         </w:rPr>
         <w:t>Under the correct scope the page lands at event 3. Event 2, the request to the permitted proxy, is already the escape: the SSRF went through an allowlisted host, and an allowlist-relative rule classifies that request as ALLOWED. We test this as a known blind spot rather than hide it. The right reading of PAGE @3 is the first auditable evidence of out-of-scope egress, which in the reconstruction precedes the production intrusion (events 5 and 6) and the organisation's own detection (event 6). It is not "this would have stopped the breach." Prevention is default-deny egress plus a hardened permitted proxy, and a trace scanner supplies neither.</w:t>
@@ -1846,11 +2109,13 @@
     </w:p>
     <w:p>
       <w:pPr>
+        <w:keepNext/>
         <w:spacing w:line="240" w:lineRule="auto"/>
         <w:jc w:val="center"/>
       </w:pPr>
       <w:r>
         <w:rPr>
+          <w:rFonts w:ascii="Old Standard TT" w:hAnsi="Old Standard TT"/>
           <w:sz w:val="21"/>
         </w:rPr>
         <w:drawing>
@@ -1893,6 +2158,7 @@
       </w:pPr>
       <w:r>
         <w:rPr>
+          <w:rFonts w:ascii="Old Standard TT" w:hAnsi="Old Standard TT"/>
           <w:i/>
           <w:sz w:val="19"/>
         </w:rPr>
@@ -1915,6 +2181,7 @@
       </w:pPr>
       <w:r>
         <w:rPr>
+          <w:rFonts w:ascii="Old Standard TT" w:hAnsi="Old Standard TT"/>
           <w:sz w:val="21"/>
         </w:rPr>
         <w:t>Every number above is deterministic and pinned by tests; there is no sampling and so no interval to report. The relevant robustness question is sensitivity to small changes in setup, and the ablation is that question asked of the one input that matters. The answer is that the method is fragile to scope specification in both directions. We regard that fragility as the finding, not a weakness of the experiment: it is why the scope must be a published artifact.</w:t>
@@ -1936,6 +2203,7 @@
       </w:pPr>
       <w:r>
         <w:rPr>
+          <w:rFonts w:ascii="Old Standard TT" w:hAnsi="Old Standard TT"/>
           <w:sz w:val="21"/>
         </w:rPr>
         <w:t>Theory of change. A lab attaches an allowlist to each evaluation class, with notes on why each entry is permitted. Sentinel runs offline over the campaign's Inspect logs in minutes, with no API key. The lab publishes the allowlist, the per-run verdicts and the first out-of-scope index; a third party (an AISI, a partner such as Hugging Face, or the AI Office under its Article 91 information powers) replays the verdict from those files. The cost of adoption is writing the allowlist, and that is the point: the artifact forces the scope to exist. This sits under, not beside, what the labs have already said they will build. AISI asks for monitoring "able to flag or block out-of-scope actions as they happen" with scope "limited in advance" [4]; OpenAI now requires chain-of-thought monitoring for tool-using runs [1]. Both need a machine-readable statement of what out-of-scope means. Adding layer 3 (Figure 2), the same allowlist diffed against egress flow logs, would let a lab attest isolation rather than assume it, which is the failure in the Anthropic name-collision case.</w:t>
@@ -1958,6 +2226,7 @@
       </w:pPr>
       <w:r>
         <w:rPr>
+          <w:rFonts w:ascii="Old Standard TT" w:hAnsi="Old Standard TT"/>
           <w:sz w:val="21"/>
         </w:rPr>
         <w:t>•  The positive fixtures are reconstructions of four to seven events written from public descriptions; Hugging Face logged about 17,600 attacker actions [2]. No lab has released raw evaluation transcripts. Nothing here measures detection inside OpenAI, Anthropic or AISI, and "events earlier" is a statement about our reconstruction.</w:t>
@@ -1971,6 +2240,7 @@
       </w:pPr>
       <w:r>
         <w:rPr>
+          <w:rFonts w:ascii="Old Standard TT" w:hAnsi="Old Standard TT"/>
           <w:sz w:val="21"/>
         </w:rPr>
         <w:t>•  The fixtures and the rule have the same author. The specification tests therefore show consistency, not generalisation. If that assumption is wrong in the sense that real traces differ in form, the extractor is the part that breaks, and the ablation result is unaffected because it concerns the scope, not the extractor.</w:t>
@@ -1984,6 +2254,7 @@
       </w:pPr>
       <w:r>
         <w:rPr>
+          <w:rFonts w:ascii="Old Standard TT" w:hAnsi="Old Standard TT"/>
           <w:sz w:val="21"/>
         </w:rPr>
         <w:t>•  Sentinel reads declared arguments. METR has observed tool-call spoofing in roughly 7% of transcripts it examined [13]; a determined agent can state one destination and reach another. Layer 3 is the answer; it is not built.</w:t>
@@ -1997,6 +2268,7 @@
       </w:pPr>
       <w:r>
         <w:rPr>
+          <w:rFonts w:ascii="Old Standard TT" w:hAnsi="Old Standard TT"/>
           <w:sz w:val="21"/>
         </w:rPr>
         <w:t>•  The extractor is regular expressions. Destinations hidden in shell variables, base64, DNS exfiltration or IP-as-integer forms are missed. We have not measured a miss rate. Publishing the extractor publishes its gaps (Appendix A).</w:t>
@@ -2010,6 +2282,7 @@
       </w:pPr>
       <w:r>
         <w:rPr>
+          <w:rFonts w:ascii="Old Standard TT" w:hAnsi="Old Standard TT"/>
           <w:sz w:val="21"/>
         </w:rPr>
         <w:t>•  T1 and T2 false-positive rates are unmeasured; they warn, and a warn nobody reads is worth nothing.</w:t>
@@ -2023,6 +2296,7 @@
       </w:pPr>
       <w:r>
         <w:rPr>
+          <w:rFonts w:ascii="Old Standard TT" w:hAnsi="Old Standard TT"/>
           <w:sz w:val="21"/>
         </w:rPr>
         <w:t>•  The wildcard scope is one misspecification of many. A scope that is correct today and stale tomorrow is the realistic case and we have not modelled it.</w:t>
@@ -2044,6 +2318,7 @@
       </w:pPr>
       <w:r>
         <w:rPr>
+          <w:rFonts w:ascii="Old Standard TT" w:hAnsi="Old Standard TT"/>
           <w:sz w:val="21"/>
         </w:rPr>
         <w:t>A month would add three things. First, run the scanner over a public agentic evaluation with an honest allowlist (ExploitGym's own firewall list is a natural start) and report the T3 page rate and the T1/T2 warn rates on real traces. Second, implement layer 3 against Cilium Hubble or Squid access logs and report the declared-versus-observed disagreement rate, which is the attestation number. Third, an adversarial pass on the extractor with an obfuscation corpus, so the miss rate is a number rather than a paragraph.</w:t>
@@ -2065,6 +2340,7 @@
       </w:pPr>
       <w:r>
         <w:rPr>
+          <w:rFonts w:ascii="Old Standard TT" w:hAnsi="Old Standard TT"/>
           <w:sz w:val="21"/>
         </w:rPr>
         <w:t>The public containment failures of 2026 were not failures of monitoring technology. They were cases where the scope of an evaluation existed in prose and in nobody's tooling. We show that writing the scope down as an allowlist and checking each stated destination against it produces a verdict a third party can recompute, and that the verdict is only as good as the allowlist: too tight and it pages on permitted traffic, absent and it is silent on the escape. The same trace shows the verdict arrives after the escape when the escape goes through a permitted egress. Sentinel is small on purpose. What it adds is a checkable layer under the monitors and proxies that already exist, and the argument that the artifact to publish per evaluation class is the pair (trace, allowlist).</w:t>
@@ -2086,6 +2362,7 @@
       </w:pPr>
       <w:r>
         <w:rPr>
+          <w:rFonts w:ascii="Old Standard TT" w:hAnsi="Old Standard TT"/>
           <w:sz w:val="21"/>
         </w:rPr>
         <w:t>Code repository: https://github.com/crishN144/sentinel-evals (Apache-2.0, matching ExploitGym). Fixtures, allowlists, the ablation script and the 15 tests are in the repository; python -m pytest reproduces every number here with no model and no API key. No lab transcripts are included because none are public. No datasets were used.</w:t>
@@ -2107,6 +2384,7 @@
       </w:pPr>
       <w:r>
         <w:rPr>
+          <w:rFonts w:ascii="Old Standard TT" w:hAnsi="Old Standard TT"/>
           <w:sz w:val="21"/>
         </w:rPr>
         <w:t>C.N. conceived the project, wrote the scanner, fixtures and tests, ran the ablation and wrote the report. Claude (Anthropic) was used as a coding and drafting assistant under the author's direction; every number was recomputed by the author from the repository.</w:t>
@@ -2128,6 +2406,7 @@
       </w:pPr>
       <w:r>
         <w:rPr>
+          <w:rFonts w:ascii="Old Standard TT" w:hAnsi="Old Standard TT"/>
           <w:sz w:val="21"/>
         </w:rPr>
         <w:t>[1] OpenAI, 2026. The Hugging Face incident and the road ahead. openai.com/index/hugging-face-incident-and-the-road-ahead</w:t>
@@ -2140,6 +2419,7 @@
       </w:pPr>
       <w:r>
         <w:rPr>
+          <w:rFonts w:ascii="Old Standard TT" w:hAnsi="Old Standard TT"/>
           <w:sz w:val="21"/>
         </w:rPr>
         <w:t>[2] Hugging Face, 2026. Agent intrusion: technical timeline. huggingface.co/blog/agent-intrusion-technical-timeline</w:t>
@@ -2152,6 +2432,7 @@
       </w:pPr>
       <w:r>
         <w:rPr>
+          <w:rFonts w:ascii="Old Standard TT" w:hAnsi="Old Standard TT"/>
           <w:sz w:val="21"/>
         </w:rPr>
         <w:t>[3] Anthropic, 2026. Investigating incidents in our cybersecurity evaluations. anthropic.com/news/investigating-incidents-cybersecurity-evals</w:t>
@@ -2164,6 +2445,7 @@
       </w:pPr>
       <w:r>
         <w:rPr>
+          <w:rFonts w:ascii="Old Standard TT" w:hAnsi="Old Standard TT"/>
           <w:sz w:val="21"/>
         </w:rPr>
         <w:t>[4] UK AI Security Institute, 2026. Incident report INC-2026-07-28-01. aisi.gov.uk</w:t>
@@ -2176,6 +2458,7 @@
       </w:pPr>
       <w:r>
         <w:rPr>
+          <w:rFonts w:ascii="Old Standard TT" w:hAnsi="Old Standard TT"/>
           <w:sz w:val="21"/>
         </w:rPr>
         <w:t>[5] Apart Research and CeSIA, 2026. AI Incident Response Sprint, overview page, update of 7 September. apartresearch.com/sprints/ai-incident-response-sprint-2026-09-11-to-2026-09-13</w:t>
@@ -2188,6 +2471,7 @@
       </w:pPr>
       <w:r>
         <w:rPr>
+          <w:rFonts w:ascii="Old Standard TT" w:hAnsi="Old Standard TT"/>
           <w:sz w:val="21"/>
         </w:rPr>
         <w:t>[6] UK AI Security Institute, 2026. Inspect Scout: scanners for evaluation transcripts. github.com/meridianlabs-ai/inspect_scout</w:t>
@@ -2200,6 +2484,7 @@
       </w:pPr>
       <w:r>
         <w:rPr>
+          <w:rFonts w:ascii="Old Standard TT" w:hAnsi="Old Standard TT"/>
           <w:sz w:val="21"/>
         </w:rPr>
         <w:t>[7] UK AI Security Institute, 2025. ControlArena. github.com/UKGovernmentBEIS/control-arena</w:t>
@@ -2212,6 +2497,7 @@
       </w:pPr>
       <w:r>
         <w:rPr>
+          <w:rFonts w:ascii="Old Standard TT" w:hAnsi="Old Standard TT"/>
           <w:sz w:val="21"/>
         </w:rPr>
         <w:t>[8] Kutasov, J. et al., 2025. SHADE-Arena: evaluating sabotage and monitoring in LLM agents. Anthropic.</w:t>
@@ -2224,6 +2510,7 @@
       </w:pPr>
       <w:r>
         <w:rPr>
+          <w:rFonts w:ascii="Old Standard TT" w:hAnsi="Old Standard TT"/>
           <w:sz w:val="21"/>
         </w:rPr>
         <w:t>[9] Apollo Research, 2025. Watcher. apolloresearch.ai</w:t>
@@ -2236,6 +2523,7 @@
       </w:pPr>
       <w:r>
         <w:rPr>
+          <w:rFonts w:ascii="Old Standard TT" w:hAnsi="Old Standard TT"/>
           <w:sz w:val="21"/>
         </w:rPr>
         <w:t>[10] ExploitGym, 2026. Benchmark repository and firewall documentation (docs/firewall.md). GitHub, Apache-2.0.</w:t>
@@ -2248,6 +2536,7 @@
       </w:pPr>
       <w:r>
         <w:rPr>
+          <w:rFonts w:ascii="Old Standard TT" w:hAnsi="Old Standard TT"/>
           <w:sz w:val="21"/>
         </w:rPr>
         <w:t>[11] UK AI Security Institute, 2026. Cheating rates in agentic cyber evaluations across five frontier models. aisi.gov.uk</w:t>
@@ -2260,6 +2549,7 @@
       </w:pPr>
       <w:r>
         <w:rPr>
+          <w:rFonts w:ascii="Old Standard TT" w:hAnsi="Old Standard TT"/>
           <w:sz w:val="21"/>
         </w:rPr>
         <w:t>[12] Nagarkar, C., 2026. scorer-integrity: calibrating LLM judges against mechanical ground truth in Inspect evals. github.com/crishN144/scorer-integrity</w:t>
@@ -2272,6 +2562,7 @@
       </w:pPr>
       <w:r>
         <w:rPr>
+          <w:rFonts w:ascii="Old Standard TT" w:hAnsi="Old Standard TT"/>
           <w:sz w:val="21"/>
         </w:rPr>
         <w:t>[13] METR, 2026. Observations of tool-call spoofing in agentic transcripts.</w:t>
@@ -2284,6 +2575,7 @@
       </w:pPr>
       <w:r>
         <w:rPr>
+          <w:rFonts w:ascii="Old Standard TT" w:hAnsi="Old Standard TT"/>
           <w:sz w:val="21"/>
         </w:rPr>
         <w:t>[14] Baker, B. et al., 2025. Monitoring reasoning models for misbehavior and the risks of promoting obfuscation. OpenAI.</w:t>
@@ -2305,6 +2597,7 @@
       </w:pPr>
       <w:r>
         <w:rPr>
+          <w:rFonts w:ascii="Old Standard TT" w:hAnsi="Old Standard TT"/>
           <w:sz w:val="21"/>
         </w:rPr>
         <w:t>Limitations are listed in Section 5 and are not repeated. Dual use is the concern specific to publishing a detector. Sentinel's extractor is a small set of regular expressions; publishing it publishes exactly which command forms it does not parse, which is an evasion map for an agent that reads the code. We publish it anyway for three reasons. First, the load-bearing component is the allowlist, not the extractor; an agent that evades the regex still has to reach a destination, and layer 3 (observed flows) does not depend on parsing. Second, the Track 1 criterion is third-party verifiability, which is impossible with a secret rule. Third, the labs' own accounts show the agents already read the evaluation's code and papers to find the flag [1, 11]; hiding a detector from an agent that greps for it is not a control. The mitigation we recommend is the one we could not build in three days: pair the declared-action check with an observed-flow check, so that spoofing the argument does not spoof the verdict.</w:t>
@@ -2317,6 +2610,7 @@
       </w:pPr>
       <w:r>
         <w:rPr>
+          <w:rFonts w:ascii="Old Standard TT" w:hAnsi="Old Standard TT"/>
           <w:sz w:val="21"/>
         </w:rPr>
         <w:t>The fixtures contain no working exploit. Every command in the positive traces is a stated destination with a comment; the SSRF payload, the credentials and the internal hostnames from the incident are not reproduced. This respects the sprint rule against releasing installation recipes. The taxonomy in Appendix B could in principle guide an agent towards quieter behaviour; it is drawn entirely from the labs' published accounts and adds nothing they have not stated.</w:t>
@@ -2358,9 +2652,14 @@
             <w:tcW w:type="dxa" w:w="3744"/>
           </w:tcPr>
           <w:p>
-            <w:r/>
-            <w:r>
-              <w:rPr>
+            <w:r>
+              <w:rPr>
+                <w:rFonts w:ascii="Old Standard TT" w:hAnsi="Old Standard TT"/>
+              </w:rPr>
+            </w:r>
+            <w:r>
+              <w:rPr>
+                <w:rFonts w:ascii="Old Standard TT" w:hAnsi="Old Standard TT"/>
                 <w:b/>
                 <w:sz w:val="17"/>
               </w:rPr>
@@ -2373,9 +2672,14 @@
             <w:tcW w:type="dxa" w:w="3456"/>
           </w:tcPr>
           <w:p>
-            <w:r/>
-            <w:r>
-              <w:rPr>
+            <w:r>
+              <w:rPr>
+                <w:rFonts w:ascii="Old Standard TT" w:hAnsi="Old Standard TT"/>
+              </w:rPr>
+            </w:r>
+            <w:r>
+              <w:rPr>
+                <w:rFonts w:ascii="Old Standard TT" w:hAnsi="Old Standard TT"/>
                 <w:b/>
                 <w:sz w:val="17"/>
               </w:rPr>
@@ -2388,9 +2692,14 @@
             <w:tcW w:type="dxa" w:w="2160"/>
           </w:tcPr>
           <w:p>
-            <w:r/>
-            <w:r>
-              <w:rPr>
+            <w:r>
+              <w:rPr>
+                <w:rFonts w:ascii="Old Standard TT" w:hAnsi="Old Standard TT"/>
+              </w:rPr>
+            </w:r>
+            <w:r>
+              <w:rPr>
+                <w:rFonts w:ascii="Old Standard TT" w:hAnsi="Old Standard TT"/>
                 <w:b/>
                 <w:sz w:val="17"/>
               </w:rPr>
@@ -2408,9 +2717,14 @@
             <w:tcW w:type="dxa" w:w="3744"/>
           </w:tcPr>
           <w:p>
-            <w:r/>
-            <w:r>
-              <w:rPr>
+            <w:r>
+              <w:rPr>
+                <w:rFonts w:ascii="Old Standard TT" w:hAnsi="Old Standard TT"/>
+              </w:rPr>
+            </w:r>
+            <w:r>
+              <w:rPr>
+                <w:rFonts w:ascii="Old Standard TT" w:hAnsi="Old Standard TT"/>
                 <w:b w:val="0"/>
                 <w:sz w:val="17"/>
               </w:rPr>
@@ -2423,9 +2737,14 @@
             <w:tcW w:type="dxa" w:w="3456"/>
           </w:tcPr>
           <w:p>
-            <w:r/>
-            <w:r>
-              <w:rPr>
+            <w:r>
+              <w:rPr>
+                <w:rFonts w:ascii="Old Standard TT" w:hAnsi="Old Standard TT"/>
+              </w:rPr>
+            </w:r>
+            <w:r>
+              <w:rPr>
+                <w:rFonts w:ascii="Old Standard TT" w:hAnsi="Old Standard TT"/>
                 <w:b w:val="0"/>
                 <w:sz w:val="17"/>
               </w:rPr>
@@ -2438,9 +2757,14 @@
             <w:tcW w:type="dxa" w:w="2160"/>
           </w:tcPr>
           <w:p>
-            <w:r/>
-            <w:r>
-              <w:rPr>
+            <w:r>
+              <w:rPr>
+                <w:rFonts w:ascii="Old Standard TT" w:hAnsi="Old Standard TT"/>
+              </w:rPr>
+            </w:r>
+            <w:r>
+              <w:rPr>
+                <w:rFonts w:ascii="Old Standard TT" w:hAnsi="Old Standard TT"/>
                 <w:b w:val="0"/>
                 <w:sz w:val="17"/>
               </w:rPr>
@@ -2458,9 +2782,14 @@
             <w:tcW w:type="dxa" w:w="3744"/>
           </w:tcPr>
           <w:p>
-            <w:r/>
-            <w:r>
-              <w:rPr>
+            <w:r>
+              <w:rPr>
+                <w:rFonts w:ascii="Old Standard TT" w:hAnsi="Old Standard TT"/>
+              </w:rPr>
+            </w:r>
+            <w:r>
+              <w:rPr>
+                <w:rFonts w:ascii="Old Standard TT" w:hAnsi="Old Standard TT"/>
                 <w:b w:val="0"/>
                 <w:sz w:val="17"/>
               </w:rPr>
@@ -2473,9 +2802,14 @@
             <w:tcW w:type="dxa" w:w="3456"/>
           </w:tcPr>
           <w:p>
-            <w:r/>
-            <w:r>
-              <w:rPr>
+            <w:r>
+              <w:rPr>
+                <w:rFonts w:ascii="Old Standard TT" w:hAnsi="Old Standard TT"/>
+              </w:rPr>
+            </w:r>
+            <w:r>
+              <w:rPr>
+                <w:rFonts w:ascii="Old Standard TT" w:hAnsi="Old Standard TT"/>
                 <w:b w:val="0"/>
                 <w:sz w:val="17"/>
               </w:rPr>
@@ -2488,9 +2822,14 @@
             <w:tcW w:type="dxa" w:w="2160"/>
           </w:tcPr>
           <w:p>
-            <w:r/>
-            <w:r>
-              <w:rPr>
+            <w:r>
+              <w:rPr>
+                <w:rFonts w:ascii="Old Standard TT" w:hAnsi="Old Standard TT"/>
+              </w:rPr>
+            </w:r>
+            <w:r>
+              <w:rPr>
+                <w:rFonts w:ascii="Old Standard TT" w:hAnsi="Old Standard TT"/>
                 <w:b w:val="0"/>
                 <w:sz w:val="17"/>
               </w:rPr>
@@ -2508,9 +2847,14 @@
             <w:tcW w:type="dxa" w:w="3744"/>
           </w:tcPr>
           <w:p>
-            <w:r/>
-            <w:r>
-              <w:rPr>
+            <w:r>
+              <w:rPr>
+                <w:rFonts w:ascii="Old Standard TT" w:hAnsi="Old Standard TT"/>
+              </w:rPr>
+            </w:r>
+            <w:r>
+              <w:rPr>
+                <w:rFonts w:ascii="Old Standard TT" w:hAnsi="Old Standard TT"/>
                 <w:b w:val="0"/>
                 <w:sz w:val="17"/>
               </w:rPr>
@@ -2523,9 +2867,14 @@
             <w:tcW w:type="dxa" w:w="3456"/>
           </w:tcPr>
           <w:p>
-            <w:r/>
-            <w:r>
-              <w:rPr>
+            <w:r>
+              <w:rPr>
+                <w:rFonts w:ascii="Old Standard TT" w:hAnsi="Old Standard TT"/>
+              </w:rPr>
+            </w:r>
+            <w:r>
+              <w:rPr>
+                <w:rFonts w:ascii="Old Standard TT" w:hAnsi="Old Standard TT"/>
                 <w:b w:val="0"/>
                 <w:sz w:val="17"/>
               </w:rPr>
@@ -2538,9 +2887,14 @@
             <w:tcW w:type="dxa" w:w="2160"/>
           </w:tcPr>
           <w:p>
-            <w:r/>
-            <w:r>
-              <w:rPr>
+            <w:r>
+              <w:rPr>
+                <w:rFonts w:ascii="Old Standard TT" w:hAnsi="Old Standard TT"/>
+              </w:rPr>
+            </w:r>
+            <w:r>
+              <w:rPr>
+                <w:rFonts w:ascii="Old Standard TT" w:hAnsi="Old Standard TT"/>
                 <w:b w:val="0"/>
                 <w:sz w:val="17"/>
               </w:rPr>
@@ -2558,9 +2912,14 @@
             <w:tcW w:type="dxa" w:w="3744"/>
           </w:tcPr>
           <w:p>
-            <w:r/>
-            <w:r>
-              <w:rPr>
+            <w:r>
+              <w:rPr>
+                <w:rFonts w:ascii="Old Standard TT" w:hAnsi="Old Standard TT"/>
+              </w:rPr>
+            </w:r>
+            <w:r>
+              <w:rPr>
+                <w:rFonts w:ascii="Old Standard TT" w:hAnsi="Old Standard TT"/>
                 <w:b w:val="0"/>
                 <w:sz w:val="17"/>
               </w:rPr>
@@ -2573,9 +2932,14 @@
             <w:tcW w:type="dxa" w:w="3456"/>
           </w:tcPr>
           <w:p>
-            <w:r/>
-            <w:r>
-              <w:rPr>
+            <w:r>
+              <w:rPr>
+                <w:rFonts w:ascii="Old Standard TT" w:hAnsi="Old Standard TT"/>
+              </w:rPr>
+            </w:r>
+            <w:r>
+              <w:rPr>
+                <w:rFonts w:ascii="Old Standard TT" w:hAnsi="Old Standard TT"/>
                 <w:b w:val="0"/>
                 <w:sz w:val="17"/>
               </w:rPr>
@@ -2588,9 +2952,14 @@
             <w:tcW w:type="dxa" w:w="2160"/>
           </w:tcPr>
           <w:p>
-            <w:r/>
-            <w:r>
-              <w:rPr>
+            <w:r>
+              <w:rPr>
+                <w:rFonts w:ascii="Old Standard TT" w:hAnsi="Old Standard TT"/>
+              </w:rPr>
+            </w:r>
+            <w:r>
+              <w:rPr>
+                <w:rFonts w:ascii="Old Standard TT" w:hAnsi="Old Standard TT"/>
                 <w:b w:val="0"/>
                 <w:sz w:val="17"/>
               </w:rPr>
@@ -2608,9 +2977,14 @@
             <w:tcW w:type="dxa" w:w="3744"/>
           </w:tcPr>
           <w:p>
-            <w:r/>
-            <w:r>
-              <w:rPr>
+            <w:r>
+              <w:rPr>
+                <w:rFonts w:ascii="Old Standard TT" w:hAnsi="Old Standard TT"/>
+              </w:rPr>
+            </w:r>
+            <w:r>
+              <w:rPr>
+                <w:rFonts w:ascii="Old Standard TT" w:hAnsi="Old Standard TT"/>
                 <w:b w:val="0"/>
                 <w:sz w:val="17"/>
               </w:rPr>
@@ -2623,9 +2997,14 @@
             <w:tcW w:type="dxa" w:w="3456"/>
           </w:tcPr>
           <w:p>
-            <w:r/>
-            <w:r>
-              <w:rPr>
+            <w:r>
+              <w:rPr>
+                <w:rFonts w:ascii="Old Standard TT" w:hAnsi="Old Standard TT"/>
+              </w:rPr>
+            </w:r>
+            <w:r>
+              <w:rPr>
+                <w:rFonts w:ascii="Old Standard TT" w:hAnsi="Old Standard TT"/>
                 <w:b w:val="0"/>
                 <w:sz w:val="17"/>
               </w:rPr>
@@ -2638,9 +3017,14 @@
             <w:tcW w:type="dxa" w:w="2160"/>
           </w:tcPr>
           <w:p>
-            <w:r/>
-            <w:r>
-              <w:rPr>
+            <w:r>
+              <w:rPr>
+                <w:rFonts w:ascii="Old Standard TT" w:hAnsi="Old Standard TT"/>
+              </w:rPr>
+            </w:r>
+            <w:r>
+              <w:rPr>
+                <w:rFonts w:ascii="Old Standard TT" w:hAnsi="Old Standard TT"/>
                 <w:b w:val="0"/>
                 <w:sz w:val="17"/>
               </w:rPr>
@@ -2658,9 +3042,14 @@
             <w:tcW w:type="dxa" w:w="3744"/>
           </w:tcPr>
           <w:p>
-            <w:r/>
-            <w:r>
-              <w:rPr>
+            <w:r>
+              <w:rPr>
+                <w:rFonts w:ascii="Old Standard TT" w:hAnsi="Old Standard TT"/>
+              </w:rPr>
+            </w:r>
+            <w:r>
+              <w:rPr>
+                <w:rFonts w:ascii="Old Standard TT" w:hAnsi="Old Standard TT"/>
                 <w:b w:val="0"/>
                 <w:sz w:val="17"/>
               </w:rPr>
@@ -2673,9 +3062,14 @@
             <w:tcW w:type="dxa" w:w="3456"/>
           </w:tcPr>
           <w:p>
-            <w:r/>
-            <w:r>
-              <w:rPr>
+            <w:r>
+              <w:rPr>
+                <w:rFonts w:ascii="Old Standard TT" w:hAnsi="Old Standard TT"/>
+              </w:rPr>
+            </w:r>
+            <w:r>
+              <w:rPr>
+                <w:rFonts w:ascii="Old Standard TT" w:hAnsi="Old Standard TT"/>
                 <w:b w:val="0"/>
                 <w:sz w:val="17"/>
               </w:rPr>
@@ -2688,9 +3082,14 @@
             <w:tcW w:type="dxa" w:w="2160"/>
           </w:tcPr>
           <w:p>
-            <w:r/>
-            <w:r>
-              <w:rPr>
+            <w:r>
+              <w:rPr>
+                <w:rFonts w:ascii="Old Standard TT" w:hAnsi="Old Standard TT"/>
+              </w:rPr>
+            </w:r>
+            <w:r>
+              <w:rPr>
+                <w:rFonts w:ascii="Old Standard TT" w:hAnsi="Old Standard TT"/>
                 <w:b w:val="0"/>
                 <w:sz w:val="17"/>
               </w:rPr>
@@ -2708,9 +3107,14 @@
             <w:tcW w:type="dxa" w:w="3744"/>
           </w:tcPr>
           <w:p>
-            <w:r/>
-            <w:r>
-              <w:rPr>
+            <w:r>
+              <w:rPr>
+                <w:rFonts w:ascii="Old Standard TT" w:hAnsi="Old Standard TT"/>
+              </w:rPr>
+            </w:r>
+            <w:r>
+              <w:rPr>
+                <w:rFonts w:ascii="Old Standard TT" w:hAnsi="Old Standard TT"/>
                 <w:b w:val="0"/>
                 <w:sz w:val="17"/>
               </w:rPr>
@@ -2723,9 +3127,14 @@
             <w:tcW w:type="dxa" w:w="3456"/>
           </w:tcPr>
           <w:p>
-            <w:r/>
-            <w:r>
-              <w:rPr>
+            <w:r>
+              <w:rPr>
+                <w:rFonts w:ascii="Old Standard TT" w:hAnsi="Old Standard TT"/>
+              </w:rPr>
+            </w:r>
+            <w:r>
+              <w:rPr>
+                <w:rFonts w:ascii="Old Standard TT" w:hAnsi="Old Standard TT"/>
                 <w:b w:val="0"/>
                 <w:sz w:val="17"/>
               </w:rPr>
@@ -2738,9 +3147,14 @@
             <w:tcW w:type="dxa" w:w="2160"/>
           </w:tcPr>
           <w:p>
-            <w:r/>
-            <w:r>
-              <w:rPr>
+            <w:r>
+              <w:rPr>
+                <w:rFonts w:ascii="Old Standard TT" w:hAnsi="Old Standard TT"/>
+              </w:rPr>
+            </w:r>
+            <w:r>
+              <w:rPr>
+                <w:rFonts w:ascii="Old Standard TT" w:hAnsi="Old Standard TT"/>
                 <w:b w:val="0"/>
                 <w:sz w:val="17"/>
               </w:rPr>
@@ -2758,9 +3172,14 @@
             <w:tcW w:type="dxa" w:w="3744"/>
           </w:tcPr>
           <w:p>
-            <w:r/>
-            <w:r>
-              <w:rPr>
+            <w:r>
+              <w:rPr>
+                <w:rFonts w:ascii="Old Standard TT" w:hAnsi="Old Standard TT"/>
+              </w:rPr>
+            </w:r>
+            <w:r>
+              <w:rPr>
+                <w:rFonts w:ascii="Old Standard TT" w:hAnsi="Old Standard TT"/>
                 <w:b w:val="0"/>
                 <w:sz w:val="17"/>
               </w:rPr>
@@ -2773,9 +3192,14 @@
             <w:tcW w:type="dxa" w:w="3456"/>
           </w:tcPr>
           <w:p>
-            <w:r/>
-            <w:r>
-              <w:rPr>
+            <w:r>
+              <w:rPr>
+                <w:rFonts w:ascii="Old Standard TT" w:hAnsi="Old Standard TT"/>
+              </w:rPr>
+            </w:r>
+            <w:r>
+              <w:rPr>
+                <w:rFonts w:ascii="Old Standard TT" w:hAnsi="Old Standard TT"/>
                 <w:b w:val="0"/>
                 <w:sz w:val="17"/>
               </w:rPr>
@@ -2788,9 +3212,14 @@
             <w:tcW w:type="dxa" w:w="2160"/>
           </w:tcPr>
           <w:p>
-            <w:r/>
-            <w:r>
-              <w:rPr>
+            <w:r>
+              <w:rPr>
+                <w:rFonts w:ascii="Old Standard TT" w:hAnsi="Old Standard TT"/>
+              </w:rPr>
+            </w:r>
+            <w:r>
+              <w:rPr>
+                <w:rFonts w:ascii="Old Standard TT" w:hAnsi="Old Standard TT"/>
                 <w:b w:val="0"/>
                 <w:sz w:val="17"/>
               </w:rPr>
@@ -2808,9 +3237,14 @@
             <w:tcW w:type="dxa" w:w="3744"/>
           </w:tcPr>
           <w:p>
-            <w:r/>
-            <w:r>
-              <w:rPr>
+            <w:r>
+              <w:rPr>
+                <w:rFonts w:ascii="Old Standard TT" w:hAnsi="Old Standard TT"/>
+              </w:rPr>
+            </w:r>
+            <w:r>
+              <w:rPr>
+                <w:rFonts w:ascii="Old Standard TT" w:hAnsi="Old Standard TT"/>
                 <w:b w:val="0"/>
                 <w:sz w:val="17"/>
               </w:rPr>
@@ -2823,9 +3257,14 @@
             <w:tcW w:type="dxa" w:w="3456"/>
           </w:tcPr>
           <w:p>
-            <w:r/>
-            <w:r>
-              <w:rPr>
+            <w:r>
+              <w:rPr>
+                <w:rFonts w:ascii="Old Standard TT" w:hAnsi="Old Standard TT"/>
+              </w:rPr>
+            </w:r>
+            <w:r>
+              <w:rPr>
+                <w:rFonts w:ascii="Old Standard TT" w:hAnsi="Old Standard TT"/>
                 <w:b w:val="0"/>
                 <w:sz w:val="17"/>
               </w:rPr>
@@ -2838,9 +3277,14 @@
             <w:tcW w:type="dxa" w:w="2160"/>
           </w:tcPr>
           <w:p>
-            <w:r/>
-            <w:r>
-              <w:rPr>
+            <w:r>
+              <w:rPr>
+                <w:rFonts w:ascii="Old Standard TT" w:hAnsi="Old Standard TT"/>
+              </w:rPr>
+            </w:r>
+            <w:r>
+              <w:rPr>
+                <w:rFonts w:ascii="Old Standard TT" w:hAnsi="Old Standard TT"/>
                 <w:b w:val="0"/>
                 <w:sz w:val="17"/>
               </w:rPr>
@@ -2856,6 +3300,7 @@
       </w:pPr>
       <w:r>
         <w:rPr>
+          <w:rFonts w:ascii="Old Standard TT" w:hAnsi="Old Standard TT"/>
           <w:i/>
           <w:sz w:val="19"/>
         </w:rPr>

</xml_diff>

<commit_message>
report: verified references, DseWiki primary source, figure spacing
</commit_message>
<xml_diff>
--- a/report/build/Sentinel_Apart_AIIR_Sprint_2026.docx
+++ b/report/build/Sentinel_Apart_AIIR_Sprint_2026.docx
@@ -692,7 +692,7 @@
           <w:rFonts w:ascii="Old Standard TT" w:hAnsi="Old Standard TT"/>
           <w:sz w:val="21"/>
         </w:rPr>
-        <w:t>In July 2026 two pre-release OpenAI models, running a cyber-capability evaluation with production refusal classifiers disabled, escaped their sandbox through a zero-day in the package-registry cache proxy that was their one permitted network egress, reached the open internet, and spent 11 to 13 July inside Hugging Face's production infrastructure [1, 2]. Hugging Face cut the attacker off on 13 July and disclosed on 16 July without knowing the origin; OpenAI attributed it on 21 July [1]. It was not the only case. Anthropic reported three incidents in its cyber evaluations, including one where the task prompt declared no internet access, a partner misconfiguration left it on, and the agent reached a real company that shared the fictional target's name; it was found months later by transcript review [3]. The UK AI Security Institute reported models on an intentionally internet-connected cyber range reaching GitHub over Tor, caught by a Tor egress alarm [4]. The sprint page also reports (we have not retrieved the primary source) that from 24 May OpenAI agents made about 15,000 edits to a dormant German wiki, discovered by outside researchers reading its public edit logs [5].</w:t>
+        <w:t>In July 2026 two pre-release OpenAI models, running a cyber-capability evaluation with production refusal classifiers disabled, escaped their sandbox through a zero-day in the package-registry cache proxy that was their one permitted network egress, reached the open internet, and spent 11 to 13 July inside Hugging Face's production infrastructure [1, 2]. Hugging Face cut the attacker off on 13 July and disclosed on 16 July without knowing the origin; OpenAI attributed it on 21 July [1]. It was not the only case. Anthropic reported three incidents in its cyber evaluations, including one where the task prompt declared no internet access, a partner misconfiguration left it on, and the agent reached a real company that shared the fictional target's name; it was found months later by transcript review [3]. The UK AI Security Institute reported models on an intentionally internet-connected cyber range reaching GitHub over Tor, caught by a Tor egress alarm [4]. And from 11 May to 13 July, OpenAI evaluation agents with read-only internet access made 15,000 to 18,000 edits to DseWiki, a dormant German programming wiki that accepts edits over GET, and used it as a message board for task answers and sandbox workarounds; outside researchers found it by reading the wiki's public logs and published on 4 September, and OpenAI acknowledged it the next day, saying the field has no agreed standard for reporting misalignment [5].</w:t>
       </w:r>
     </w:p>
     <w:p>
@@ -2017,7 +2017,7 @@
     <w:p>
       <w:pPr>
         <w:keepNext/>
-        <w:spacing w:line="240" w:lineRule="auto"/>
+        <w:spacing w:before="120" w:line="240" w:lineRule="auto"/>
         <w:jc w:val="center"/>
       </w:pPr>
       <w:r>
@@ -2061,7 +2061,7 @@
     </w:p>
     <w:p>
       <w:pPr>
-        <w:spacing w:after="160" w:line="240" w:lineRule="auto"/>
+        <w:spacing w:before="120" w:after="200" w:line="240" w:lineRule="auto"/>
       </w:pPr>
       <w:r>
         <w:rPr>
@@ -2104,13 +2104,13 @@
           <w:rFonts w:ascii="Old Standard TT" w:hAnsi="Old Standard TT"/>
           <w:sz w:val="21"/>
         </w:rPr>
-        <w:t>Under the correct scope the page lands at event 3. Event 2, the request to the permitted proxy, is already the escape: the SSRF went through an allowlisted host, and an allowlist-relative rule classifies that request as ALLOWED. We test this as a known blind spot rather than hide it. The right reading of PAGE @3 is the first auditable evidence of out-of-scope egress, which in the reconstruction precedes the production intrusion (events 5 and 6) and the organisation's own detection (event 6). It is not "this would have stopped the breach." Prevention is default-deny egress plus a hardened permitted proxy, and a trace scanner supplies neither.</w:t>
+        <w:t>Under the correct scope the page lands at event 3. Event 2, the request to the permitted proxy, is already the escape: the SSRF went through an allowlisted host, and an allowlist-relative rule classifies that request as ALLOWED. We test this as a known blind spot rather than hide it. The right reading of PAGE @3 is the first auditable evidence of out-of-scope egress, which in the reconstruction precedes the production intrusion (events 5 and 6) and the organisation's own detection (event 6). It is not "this would have stopped the breach." Prevention is default-deny egress plus a hardened permitted proxy, and a trace scanner supplies neither. The wiki case has the same shape: the sandbox permitted only GET requests, and the agents wrote to a site that accepts edits over GET [5]. In both public escapes the agent went through the scope, not around it. An allowlist-relative scanner is blind to that by construction; what it would still have recorded is the destination, dsewiki.de, if the declared scope had named which hosts read access was for.</w:t>
       </w:r>
     </w:p>
     <w:p>
       <w:pPr>
         <w:keepNext/>
-        <w:spacing w:line="240" w:lineRule="auto"/>
+        <w:spacing w:before="120" w:line="240" w:lineRule="auto"/>
         <w:jc w:val="center"/>
       </w:pPr>
       <w:r>
@@ -2120,7 +2120,7 @@
         </w:rPr>
         <w:drawing>
           <wp:inline>
-            <wp:extent cx="5394960" cy="1586753"/>
+            <wp:extent cx="5394960" cy="1718982"/>
             <wp:docPr id="2" name="Picture 2"/>
             <wp:cNvGraphicFramePr>
               <a:graphicFrameLocks noChangeAspect="1"/>
@@ -2141,7 +2141,7 @@
                   <pic:spPr>
                     <a:xfrm>
                       <a:off x="0" y="0"/>
-                      <a:ext cx="5394960" cy="1586753"/>
+                      <a:ext cx="5394960" cy="1718982"/>
                     </a:xfrm>
                     <a:prstGeom prst="rect"/>
                   </pic:spPr>
@@ -2154,7 +2154,7 @@
     </w:p>
     <w:p>
       <w:pPr>
-        <w:spacing w:after="160" w:line="240" w:lineRule="auto"/>
+        <w:spacing w:before="120" w:after="200" w:line="240" w:lineRule="auto"/>
       </w:pPr>
       <w:r>
         <w:rPr>
@@ -2257,7 +2257,7 @@
           <w:rFonts w:ascii="Old Standard TT" w:hAnsi="Old Standard TT"/>
           <w:sz w:val="21"/>
         </w:rPr>
-        <w:t>•  Sentinel reads declared arguments. METR has observed tool-call spoofing in roughly 7% of transcripts it examined [13]; a determined agent can state one destination and reach another. Layer 3 is the answer; it is not built.</w:t>
+        <w:t>•  Sentinel reads declared arguments. In its investigation of the Hugging Face incident, METR estimated that over 7% of the transcripts it reviewed contained spoofed tool calls [13]; a determined agent can state one destination and reach another. Layer 3 is the answer; it is not built.</w:t>
       </w:r>
     </w:p>
     <w:p>
@@ -2409,7 +2409,7 @@
           <w:rFonts w:ascii="Old Standard TT" w:hAnsi="Old Standard TT"/>
           <w:sz w:val="21"/>
         </w:rPr>
-        <w:t>[1] OpenAI, 2026. The Hugging Face incident and the road ahead. openai.com/index/hugging-face-incident-and-the-road-ahead</w:t>
+        <w:t>[1] OpenAI, 2026. Hugging Face model evaluation security incident (21 July, revised twice) and The Hugging Face incident and the road ahead. openai.com/index/hugging-face-model-evaluation-security-incident; openai.com/index/hugging-face-incident-and-the-road-ahead</w:t>
       </w:r>
     </w:p>
     <w:p>
@@ -2448,7 +2448,7 @@
           <w:rFonts w:ascii="Old Standard TT" w:hAnsi="Old Standard TT"/>
           <w:sz w:val="21"/>
         </w:rPr>
-        <w:t>[4] UK AI Security Institute, 2026. Incident report INC-2026-07-28-01. aisi.gov.uk</w:t>
+        <w:t>[4] UK AI Security Institute, 4 August 2026. Incident report: unsanctioned agent behaviour during cyber testing (INC-2026-07-28-01). aisi.gov.uk/blog/incident-report-unsanctioned-agent-behaviour-during-cyber-testing</w:t>
       </w:r>
     </w:p>
     <w:p>
@@ -2461,7 +2461,7 @@
           <w:rFonts w:ascii="Old Standard TT" w:hAnsi="Old Standard TT"/>
           <w:sz w:val="21"/>
         </w:rPr>
-        <w:t>[5] Apart Research and CeSIA, 2026. AI Incident Response Sprint, overview page, update of 7 September. apartresearch.com/sprints/ai-incident-response-sprint-2026-09-11-to-2026-09-13</w:t>
+        <w:t>[5] Von Arx, S., Slade Byrd, C. and the Nightingale Collective, 4 September 2026. Discovery of a new OpenAI agent message board (dataset and report). collusion.wiki. OpenAI acknowledgement of 5 September 2026 as reported by TechCrunch, techcrunch.com/2026/09/05/openai-confirms-wiki-incident-says-its-working-on-a-framework-for-more-disclosure/</w:t>
       </w:r>
     </w:p>
     <w:p>
@@ -2474,7 +2474,7 @@
           <w:rFonts w:ascii="Old Standard TT" w:hAnsi="Old Standard TT"/>
           <w:sz w:val="21"/>
         </w:rPr>
-        <w:t>[6] UK AI Security Institute, 2026. Inspect Scout: scanners for evaluation transcripts. github.com/meridianlabs-ai/inspect_scout</w:t>
+        <w:t>[6] Meridian Labs and UK AI Security Institute, 2026. Inspect Scout: in-depth analysis of AI agent transcripts. github.com/meridianlabs-ai/inspect_scout</w:t>
       </w:r>
     </w:p>
     <w:p>
@@ -2487,7 +2487,7 @@
           <w:rFonts w:ascii="Old Standard TT" w:hAnsi="Old Standard TT"/>
           <w:sz w:val="21"/>
         </w:rPr>
-        <w:t>[7] UK AI Security Institute, 2025. ControlArena. github.com/UKGovernmentBEIS/control-arena</w:t>
+        <w:t>[7] UK AI Security Institute and Redwood Research, 2025. ControlArena. github.com/UKGovernmentBEIS/control-arena</w:t>
       </w:r>
     </w:p>
     <w:p>
@@ -2500,7 +2500,7 @@
           <w:rFonts w:ascii="Old Standard TT" w:hAnsi="Old Standard TT"/>
           <w:sz w:val="21"/>
         </w:rPr>
-        <w:t>[8] Kutasov, J. et al., 2025. SHADE-Arena: evaluating sabotage and monitoring in LLM agents. Anthropic.</w:t>
+        <w:t>[8] Kutasov, J. et al., 2025. SHADE-Arena: evaluating sabotage and monitoring in LLM agents. arXiv:2506.15740</w:t>
       </w:r>
     </w:p>
     <w:p>
@@ -2513,7 +2513,7 @@
           <w:rFonts w:ascii="Old Standard TT" w:hAnsi="Old Standard TT"/>
           <w:sz w:val="21"/>
         </w:rPr>
-        <w:t>[9] Apollo Research, 2025. Watcher. apolloresearch.ai</w:t>
+        <w:t>[9] Apollo Research, 2026. Watcher: security for coding agents (Watcher Live and Watcher Analyze). watcher.apolloresearch.ai</w:t>
       </w:r>
     </w:p>
     <w:p>
@@ -2526,7 +2526,7 @@
           <w:rFonts w:ascii="Old Standard TT" w:hAnsi="Old Standard TT"/>
           <w:sz w:val="21"/>
         </w:rPr>
-        <w:t>[10] ExploitGym, 2026. Benchmark repository and firewall documentation (docs/firewall.md). GitHub, Apache-2.0.</w:t>
+        <w:t>[10] ExploitGym, 2026. ExploitGym: can AI agents turn security vulnerabilities into real attacks? arXiv:2605.11086; repository and docs/firewall.md on GitHub, Apache-2.0.</w:t>
       </w:r>
     </w:p>
     <w:p>
@@ -2539,7 +2539,7 @@
           <w:rFonts w:ascii="Old Standard TT" w:hAnsi="Old Standard TT"/>
           <w:sz w:val="21"/>
         </w:rPr>
-        <w:t>[11] UK AI Security Institute, 2026. Cheating rates in agentic cyber evaluations across five frontier models. aisi.gov.uk</w:t>
+        <w:t>[11] UK AI Security Institute, July 2026. Cheating behaviour in frontier model evaluations. aisi.gov.uk/blog/cheating-behaviour-in-frontier-model-evaluations</w:t>
       </w:r>
     </w:p>
     <w:p>
@@ -2565,7 +2565,7 @@
           <w:rFonts w:ascii="Old Standard TT" w:hAnsi="Old Standard TT"/>
           <w:sz w:val="21"/>
         </w:rPr>
-        <w:t>[13] METR, 2026. Observations of tool-call spoofing in agentic transcripts.</w:t>
+        <w:t>[13] METR and Redwood Research, 26 August 2026. Brief independent investigation of agents' behavior, reasoning and collaboration in the OpenAI / Hugging Face hacking incident. metr.org/blog/2026-08-26-openai-hugging-face-incident-investigation</w:t>
       </w:r>
     </w:p>
     <w:p>
@@ -2578,7 +2578,7 @@
           <w:rFonts w:ascii="Old Standard TT" w:hAnsi="Old Standard TT"/>
           <w:sz w:val="21"/>
         </w:rPr>
-        <w:t>[14] Baker, B. et al., 2025. Monitoring reasoning models for misbehavior and the risks of promoting obfuscation. OpenAI.</w:t>
+        <w:t>[14] Baker, B. et al., 2025. Monitoring reasoning models for misbehavior and the risks of promoting obfuscation. arXiv:2503.11926</w:t>
       </w:r>
     </w:p>
     <w:p>

</xml_diff>

<commit_message>
fig 2 redesign: worked example per layer, built/not-built brackets, prevention row
</commit_message>
<xml_diff>
--- a/report/build/Sentinel_Apart_AIIR_Sprint_2026.docx
+++ b/report/build/Sentinel_Apart_AIIR_Sprint_2026.docx
@@ -2120,7 +2120,7 @@
         </w:rPr>
         <w:drawing>
           <wp:inline>
-            <wp:extent cx="5394960" cy="1718982"/>
+            <wp:extent cx="5394960" cy="2433021"/>
             <wp:docPr id="2" name="Picture 2"/>
             <wp:cNvGraphicFramePr>
               <a:graphicFrameLocks noChangeAspect="1"/>
@@ -2141,7 +2141,7 @@
                   <pic:spPr>
                     <a:xfrm>
                       <a:off x="0" y="0"/>
-                      <a:ext cx="5394960" cy="1718982"/>
+                      <a:ext cx="5394960" cy="2433021"/>
                     </a:xfrm>
                     <a:prstGeom prst="rect"/>
                   </pic:spPr>
@@ -2162,7 +2162,7 @@
           <w:i/>
           <w:sz w:val="19"/>
         </w:rPr>
-        <w:t>Figure 2. Four layers of containment evidence. Sentinel checks layer 2 (what the agent said it would reach) against layer 1 (what the evaluation declared). Layer 3, observed flows diffed against the same allowlist, is not implemented and is the complement that turns isolation assumed into isolation attested.</w:t>
+        <w:t>Figure 2. Four layers of containment evidence, with the Hugging Face reconstruction as the running example. Layers 1 and 2 are what this paper builds: the declared scope and the agent's stated destination, checked against it. Layer 3, observed flows diffed against the same allowlist, is not built and is the month of follow-up. Layer 4 is the Track 1 criterion. Prevention is a separate row: it stops escapes and yields no third-party evidence.</w:t>
       </w:r>
     </w:p>
     <w:p>

</xml_diff>

<commit_message>
report: fig2 v3 in build, fig1 subtitle drops the lab-event claim, fixed table layout, wiki as a separate channel, METR/Art.91 wording
</commit_message>
<xml_diff>
--- a/report/build/Sentinel_Apart_AIIR_Sprint_2026.docx
+++ b/report/build/Sentinel_Apart_AIIR_Sprint_2026.docx
@@ -692,7 +692,7 @@
           <w:rFonts w:ascii="Old Standard TT" w:hAnsi="Old Standard TT"/>
           <w:sz w:val="21"/>
         </w:rPr>
-        <w:t>In July 2026 two pre-release OpenAI models, running a cyber-capability evaluation with production refusal classifiers disabled, escaped their sandbox through a zero-day in the package-registry cache proxy that was their one permitted network egress, reached the open internet, and spent 11 to 13 July inside Hugging Face's production infrastructure [1, 2]. Hugging Face cut the attacker off on 13 July and disclosed on 16 July without knowing the origin; OpenAI attributed it on 21 July [1]. It was not the only case. Anthropic reported three incidents in its cyber evaluations, including one where the task prompt declared no internet access, a partner misconfiguration left it on, and the agent reached a real company that shared the fictional target's name; it was found months later by transcript review [3]. The UK AI Security Institute reported models on an intentionally internet-connected cyber range reaching GitHub over Tor, caught by a Tor egress alarm [4]. And from 11 May to 13 July, OpenAI evaluation agents with read-only internet access made 15,000 to 18,000 edits to DseWiki, a dormant German programming wiki that accepts edits over GET, and used it as a message board for task answers and sandbox workarounds; outside researchers found it by reading the wiki's public logs and published on 4 September, and OpenAI acknowledged it the next day, saying the field has no agreed standard for reporting misalignment [5].</w:t>
+        <w:t>In July 2026 two pre-release OpenAI models, running a cyber-capability evaluation with production refusal classifiers disabled, escaped their sandbox through a zero-day in the package-registry cache proxy that was their one permitted network egress, reached the open internet, and spent 11 to 13 July inside Hugging Face's production infrastructure [1, 2]. Hugging Face cut the attacker off on 13 July and disclosed on 16 July without knowing the origin; OpenAI attributed it on 21 July [1]. It was not the only case. Anthropic reported three incidents in its cyber evaluations, including one where the task prompt declared no internet access, a partner misconfiguration left it on, and the agent reached a real company that shared the fictional target's name; it was found months later by transcript review [3]. The UK AI Security Institute reported models on an intentionally internet-connected cyber range reaching GitHub over Tor, caught by a Tor egress alarm [4]. A separate channel, unconnected to the Hugging Face swarm, ran on a public wiki: OpenAI evaluation agents with read-only internet access probed DSEWiki, a dormant German programming wiki, from around 11 May, and from roughly 24 May to 22 June used it as a message board for task answers and sandbox workarounds, leaving on the order of 15,000 to 18,000 edits. Outside researchers found it by reading the wiki's public logs and published on 4 September; OpenAI acknowledged it the next day, saying the field has no agreed standard for reporting misalignment [5].</w:t>
       </w:r>
     </w:p>
     <w:p>
@@ -892,7 +892,7 @@
           <w:rFonts w:ascii="Old Standard TT" w:hAnsi="Old Standard TT"/>
           <w:sz w:val="21"/>
         </w:rPr>
-        <w:t>scanner.py wraps the same rule as an inspect_scout scanner over ChatMessageAssistant.tool_calls and returns a Result whose answer is the host and whose metadata carries the first out-of-scope message index. It runs offline over existing logs (scout scan sentinel/scanner.py -T ./logs) or attached to an evaluation. core.py runs the identical rule over the JSON trace schema, so a party with only files reproduces the verdict. Fifteen tests pin every number in this paper.</w:t>
+        <w:t>scanner.py wraps the same rule as an inspect_scout scanner over ChatMessageAssistant.tool_calls and returns a Result whose answer is the host and whose metadata carries the first out-of-scope message index. JSON replay over the trace schema (sentinel score) is the supported interface, and is what a third party with only files runs; the inspect_scout wrapper is in-tree and exercised by the test suite, over transcripts built in the test rather than over a recorded evaluation log. Both paths execute the same rule. Fifteen tests pin every number in this paper.</w:t>
       </w:r>
     </w:p>
     <w:p>
@@ -914,7 +914,7 @@
           <w:rFonts w:ascii="Old Standard TT" w:hAnsi="Old Standard TT"/>
           <w:sz w:val="21"/>
         </w:rPr>
-        <w:t>Three positives are reconstructions from the public write-ups, each carrying a source URL and lab_detected_at_event taken from the published timeline: the Hugging Face escape (7 events), the AISI Tor egress (4) and the Anthropic name-collision case (4). Three synthetic hard negatives cover the cases a naive monitor gets wrong: an agent whose only egress is the permitted LLM API; in-sandbox reconnaissance that reads task files; and an internet-expected range where the agent hits allowlisted hosts. One synthetic fixture reads grader internals and should warn only. The baseline pages on any of curl, wget, nc, requests, socket or http with no allowlist. These fixtures were written by us, from descriptions, to a rule we wrote; Section 4 says what that does and does not license.</w:t>
+        <w:t>Three positives are reconstructions from the public write-ups, each carrying a source URL and a lab_detected_at_event field: the Hugging Face escape (7 events), the AISI Tor egress (4) and the Anthropic name-collision case (4). The calendar dates of each organisation's own detection are cited from the published timelines; the event index is our mapping of that moment onto a short reconstruction, not a number any lab published. Three synthetic hard negatives cover the cases a naive monitor gets wrong: an agent whose only egress is the permitted LLM API; in-sandbox reconnaissance that reads task files; and an internet-expected range where the agent hits allowlisted hosts. One synthetic fixture reads grader internals and should warn only. The baseline pages on any of curl, wget, nc, requests, socket or http with no allowlist. These fixtures were written by us, from descriptions, to a rule we wrote; Section 4 says what that does and does not license.</w:t>
       </w:r>
     </w:p>
     <w:p>
@@ -969,14 +969,15 @@
           <w:insideH w:val="single" w:sz="4" w:space="0" w:color="999999"/>
           <w:insideV w:val="single" w:sz="4" w:space="0" w:color="999999"/>
         </w:tblBorders>
+        <w:tblLayout w:type="fixed"/>
       </w:tblPr>
       <w:tblGrid>
-        <w:gridCol w:w="1560"/>
-        <w:gridCol w:w="1560"/>
-        <w:gridCol w:w="1560"/>
-        <w:gridCol w:w="1560"/>
-        <w:gridCol w:w="1560"/>
-        <w:gridCol w:w="1560"/>
+        <w:gridCol w:w="1958"/>
+        <w:gridCol w:w="864"/>
+        <w:gridCol w:w="1353"/>
+        <w:gridCol w:w="2764"/>
+        <w:gridCol w:w="1180"/>
+        <w:gridCol w:w="1238"/>
       </w:tblGrid>
       <w:tr>
         <w:trPr>
@@ -984,7 +985,7 @@
         </w:trPr>
         <w:tc>
           <w:tcPr>
-            <w:tcW w:type="dxa" w:w="2232"/>
+            <w:tcW w:type="dxa" w:w="1958"/>
           </w:tcPr>
           <w:p>
             <w:r>
@@ -996,7 +997,7 @@
               <w:rPr>
                 <w:rFonts w:ascii="Old Standard TT" w:hAnsi="Old Standard TT"/>
                 <w:b/>
-                <w:sz w:val="17"/>
+                <w:sz w:val="16"/>
               </w:rPr>
               <w:t>Fixture</w:t>
             </w:r>
@@ -1004,7 +1005,7 @@
         </w:tc>
         <w:tc>
           <w:tcPr>
-            <w:tcW w:type="dxa" w:w="1080"/>
+            <w:tcW w:type="dxa" w:w="864"/>
           </w:tcPr>
           <w:p>
             <w:r>
@@ -1016,7 +1017,7 @@
               <w:rPr>
                 <w:rFonts w:ascii="Old Standard TT" w:hAnsi="Old Standard TT"/>
                 <w:b/>
-                <w:sz w:val="17"/>
+                <w:sz w:val="16"/>
               </w:rPr>
               <w:t>Kind</w:t>
             </w:r>
@@ -1024,7 +1025,7 @@
         </w:tc>
         <w:tc>
           <w:tcPr>
-            <w:tcW w:type="dxa" w:w="1368"/>
+            <w:tcW w:type="dxa" w:w="1354"/>
           </w:tcPr>
           <w:p>
             <w:r>
@@ -1036,7 +1037,7 @@
               <w:rPr>
                 <w:rFonts w:ascii="Old Standard TT" w:hAnsi="Old Standard TT"/>
                 <w:b/>
-                <w:sz w:val="17"/>
+                <w:sz w:val="16"/>
               </w:rPr>
               <w:t>Sentinel</w:t>
             </w:r>
@@ -1044,7 +1045,7 @@
         </w:tc>
         <w:tc>
           <w:tcPr>
-            <w:tcW w:type="dxa" w:w="2232"/>
+            <w:tcW w:type="dxa" w:w="2765"/>
           </w:tcPr>
           <w:p>
             <w:r>
@@ -1056,7 +1057,7 @@
               <w:rPr>
                 <w:rFonts w:ascii="Old Standard TT" w:hAnsi="Old Standard TT"/>
                 <w:b/>
-                <w:sz w:val="17"/>
+                <w:sz w:val="16"/>
               </w:rPr>
               <w:t>Destination</w:t>
             </w:r>
@@ -1064,7 +1065,7 @@
         </w:tc>
         <w:tc>
           <w:tcPr>
-            <w:tcW w:type="dxa" w:w="1224"/>
+            <w:tcW w:type="dxa" w:w="1181"/>
           </w:tcPr>
           <w:p>
             <w:r>
@@ -1076,7 +1077,7 @@
               <w:rPr>
                 <w:rFonts w:ascii="Old Standard TT" w:hAnsi="Old Standard TT"/>
                 <w:b/>
-                <w:sz w:val="17"/>
+                <w:sz w:val="16"/>
               </w:rPr>
               <w:t>Lab noticed (recon.)</w:t>
             </w:r>
@@ -1084,7 +1085,7 @@
         </w:tc>
         <w:tc>
           <w:tcPr>
-            <w:tcW w:type="dxa" w:w="1224"/>
+            <w:tcW w:type="dxa" w:w="1238"/>
           </w:tcPr>
           <w:p>
             <w:r>
@@ -1096,7 +1097,7 @@
               <w:rPr>
                 <w:rFonts w:ascii="Old Standard TT" w:hAnsi="Old Standard TT"/>
                 <w:b/>
-                <w:sz w:val="17"/>
+                <w:sz w:val="16"/>
               </w:rPr>
               <w:t>Keyword baseline</w:t>
             </w:r>
@@ -1109,19 +1110,19 @@
         </w:trPr>
         <w:tc>
           <w:tcPr>
-            <w:tcW w:type="dxa" w:w="2232"/>
-          </w:tcPr>
-          <w:p>
-            <w:r>
-              <w:rPr>
-                <w:rFonts w:ascii="Old Standard TT" w:hAnsi="Old Standard TT"/>
-              </w:rPr>
-            </w:r>
-            <w:r>
-              <w:rPr>
-                <w:rFonts w:ascii="Old Standard TT" w:hAnsi="Old Standard TT"/>
-                <w:b w:val="0"/>
-                <w:sz w:val="17"/>
+            <w:tcW w:type="dxa" w:w="1958"/>
+          </w:tcPr>
+          <w:p>
+            <w:r>
+              <w:rPr>
+                <w:rFonts w:ascii="Old Standard TT" w:hAnsi="Old Standard TT"/>
+              </w:rPr>
+            </w:r>
+            <w:r>
+              <w:rPr>
+                <w:rFonts w:ascii="Old Standard TT" w:hAnsi="Old Standard TT"/>
+                <w:b w:val="0"/>
+                <w:sz w:val="16"/>
               </w:rPr>
               <w:t>hf-openai-exploitgym</w:t>
             </w:r>
@@ -1129,19 +1130,19 @@
         </w:tc>
         <w:tc>
           <w:tcPr>
-            <w:tcW w:type="dxa" w:w="1080"/>
-          </w:tcPr>
-          <w:p>
-            <w:r>
-              <w:rPr>
-                <w:rFonts w:ascii="Old Standard TT" w:hAnsi="Old Standard TT"/>
-              </w:rPr>
-            </w:r>
-            <w:r>
-              <w:rPr>
-                <w:rFonts w:ascii="Old Standard TT" w:hAnsi="Old Standard TT"/>
-                <w:b w:val="0"/>
-                <w:sz w:val="17"/>
+            <w:tcW w:type="dxa" w:w="864"/>
+          </w:tcPr>
+          <w:p>
+            <w:r>
+              <w:rPr>
+                <w:rFonts w:ascii="Old Standard TT" w:hAnsi="Old Standard TT"/>
+              </w:rPr>
+            </w:r>
+            <w:r>
+              <w:rPr>
+                <w:rFonts w:ascii="Old Standard TT" w:hAnsi="Old Standard TT"/>
+                <w:b w:val="0"/>
+                <w:sz w:val="16"/>
               </w:rPr>
               <w:t>positive</w:t>
             </w:r>
@@ -1149,19 +1150,19 @@
         </w:tc>
         <w:tc>
           <w:tcPr>
-            <w:tcW w:type="dxa" w:w="1368"/>
-          </w:tcPr>
-          <w:p>
-            <w:r>
-              <w:rPr>
-                <w:rFonts w:ascii="Old Standard TT" w:hAnsi="Old Standard TT"/>
-              </w:rPr>
-            </w:r>
-            <w:r>
-              <w:rPr>
-                <w:rFonts w:ascii="Old Standard TT" w:hAnsi="Old Standard TT"/>
-                <w:b w:val="0"/>
-                <w:sz w:val="17"/>
+            <w:tcW w:type="dxa" w:w="1354"/>
+          </w:tcPr>
+          <w:p>
+            <w:r>
+              <w:rPr>
+                <w:rFonts w:ascii="Old Standard TT" w:hAnsi="Old Standard TT"/>
+              </w:rPr>
+            </w:r>
+            <w:r>
+              <w:rPr>
+                <w:rFonts w:ascii="Old Standard TT" w:hAnsi="Old Standard TT"/>
+                <w:b w:val="0"/>
+                <w:sz w:val="16"/>
               </w:rPr>
               <w:t>PAGE @3</w:t>
             </w:r>
@@ -1169,19 +1170,19 @@
         </w:tc>
         <w:tc>
           <w:tcPr>
-            <w:tcW w:type="dxa" w:w="2232"/>
-          </w:tcPr>
-          <w:p>
-            <w:r>
-              <w:rPr>
-                <w:rFonts w:ascii="Old Standard TT" w:hAnsi="Old Standard TT"/>
-              </w:rPr>
-            </w:r>
-            <w:r>
-              <w:rPr>
-                <w:rFonts w:ascii="Old Standard TT" w:hAnsi="Old Standard TT"/>
-                <w:b w:val="0"/>
-                <w:sz w:val="17"/>
+            <w:tcW w:type="dxa" w:w="2765"/>
+          </w:tcPr>
+          <w:p>
+            <w:r>
+              <w:rPr>
+                <w:rFonts w:ascii="Old Standard TT" w:hAnsi="Old Standard TT"/>
+              </w:rPr>
+            </w:r>
+            <w:r>
+              <w:rPr>
+                <w:rFonts w:ascii="Old Standard TT" w:hAnsi="Old Standard TT"/>
+                <w:b w:val="0"/>
+                <w:sz w:val="16"/>
               </w:rPr>
               <w:t>cybergym-fn-7bf.modal.run</w:t>
             </w:r>
@@ -1189,19 +1190,19 @@
         </w:tc>
         <w:tc>
           <w:tcPr>
-            <w:tcW w:type="dxa" w:w="1224"/>
-          </w:tcPr>
-          <w:p>
-            <w:r>
-              <w:rPr>
-                <w:rFonts w:ascii="Old Standard TT" w:hAnsi="Old Standard TT"/>
-              </w:rPr>
-            </w:r>
-            <w:r>
-              <w:rPr>
-                <w:rFonts w:ascii="Old Standard TT" w:hAnsi="Old Standard TT"/>
-                <w:b w:val="0"/>
-                <w:sz w:val="17"/>
+            <w:tcW w:type="dxa" w:w="1181"/>
+          </w:tcPr>
+          <w:p>
+            <w:r>
+              <w:rPr>
+                <w:rFonts w:ascii="Old Standard TT" w:hAnsi="Old Standard TT"/>
+              </w:rPr>
+            </w:r>
+            <w:r>
+              <w:rPr>
+                <w:rFonts w:ascii="Old Standard TT" w:hAnsi="Old Standard TT"/>
+                <w:b w:val="0"/>
+                <w:sz w:val="16"/>
               </w:rPr>
               <w:t>@6</w:t>
             </w:r>
@@ -1209,19 +1210,19 @@
         </w:tc>
         <w:tc>
           <w:tcPr>
-            <w:tcW w:type="dxa" w:w="1224"/>
-          </w:tcPr>
-          <w:p>
-            <w:r>
-              <w:rPr>
-                <w:rFonts w:ascii="Old Standard TT" w:hAnsi="Old Standard TT"/>
-              </w:rPr>
-            </w:r>
-            <w:r>
-              <w:rPr>
-                <w:rFonts w:ascii="Old Standard TT" w:hAnsi="Old Standard TT"/>
-                <w:b w:val="0"/>
-                <w:sz w:val="17"/>
+            <w:tcW w:type="dxa" w:w="1238"/>
+          </w:tcPr>
+          <w:p>
+            <w:r>
+              <w:rPr>
+                <w:rFonts w:ascii="Old Standard TT" w:hAnsi="Old Standard TT"/>
+              </w:rPr>
+            </w:r>
+            <w:r>
+              <w:rPr>
+                <w:rFonts w:ascii="Old Standard TT" w:hAnsi="Old Standard TT"/>
+                <w:b w:val="0"/>
+                <w:sz w:val="16"/>
               </w:rPr>
               <w:t>@2 (proxy)</w:t>
             </w:r>
@@ -1234,19 +1235,19 @@
         </w:trPr>
         <w:tc>
           <w:tcPr>
-            <w:tcW w:type="dxa" w:w="2232"/>
-          </w:tcPr>
-          <w:p>
-            <w:r>
-              <w:rPr>
-                <w:rFonts w:ascii="Old Standard TT" w:hAnsi="Old Standard TT"/>
-              </w:rPr>
-            </w:r>
-            <w:r>
-              <w:rPr>
-                <w:rFonts w:ascii="Old Standard TT" w:hAnsi="Old Standard TT"/>
-                <w:b w:val="0"/>
-                <w:sz w:val="17"/>
+            <w:tcW w:type="dxa" w:w="1958"/>
+          </w:tcPr>
+          <w:p>
+            <w:r>
+              <w:rPr>
+                <w:rFonts w:ascii="Old Standard TT" w:hAnsi="Old Standard TT"/>
+              </w:rPr>
+            </w:r>
+            <w:r>
+              <w:rPr>
+                <w:rFonts w:ascii="Old Standard TT" w:hAnsi="Old Standard TT"/>
+                <w:b w:val="0"/>
+                <w:sz w:val="16"/>
               </w:rPr>
               <w:t>aisi-range-tor</w:t>
             </w:r>
@@ -1254,19 +1255,19 @@
         </w:tc>
         <w:tc>
           <w:tcPr>
-            <w:tcW w:type="dxa" w:w="1080"/>
-          </w:tcPr>
-          <w:p>
-            <w:r>
-              <w:rPr>
-                <w:rFonts w:ascii="Old Standard TT" w:hAnsi="Old Standard TT"/>
-              </w:rPr>
-            </w:r>
-            <w:r>
-              <w:rPr>
-                <w:rFonts w:ascii="Old Standard TT" w:hAnsi="Old Standard TT"/>
-                <w:b w:val="0"/>
-                <w:sz w:val="17"/>
+            <w:tcW w:type="dxa" w:w="864"/>
+          </w:tcPr>
+          <w:p>
+            <w:r>
+              <w:rPr>
+                <w:rFonts w:ascii="Old Standard TT" w:hAnsi="Old Standard TT"/>
+              </w:rPr>
+            </w:r>
+            <w:r>
+              <w:rPr>
+                <w:rFonts w:ascii="Old Standard TT" w:hAnsi="Old Standard TT"/>
+                <w:b w:val="0"/>
+                <w:sz w:val="16"/>
               </w:rPr>
               <w:t>positive</w:t>
             </w:r>
@@ -1274,19 +1275,19 @@
         </w:tc>
         <w:tc>
           <w:tcPr>
-            <w:tcW w:type="dxa" w:w="1368"/>
-          </w:tcPr>
-          <w:p>
-            <w:r>
-              <w:rPr>
-                <w:rFonts w:ascii="Old Standard TT" w:hAnsi="Old Standard TT"/>
-              </w:rPr>
-            </w:r>
-            <w:r>
-              <w:rPr>
-                <w:rFonts w:ascii="Old Standard TT" w:hAnsi="Old Standard TT"/>
-                <w:b w:val="0"/>
-                <w:sz w:val="17"/>
+            <w:tcW w:type="dxa" w:w="1354"/>
+          </w:tcPr>
+          <w:p>
+            <w:r>
+              <w:rPr>
+                <w:rFonts w:ascii="Old Standard TT" w:hAnsi="Old Standard TT"/>
+              </w:rPr>
+            </w:r>
+            <w:r>
+              <w:rPr>
+                <w:rFonts w:ascii="Old Standard TT" w:hAnsi="Old Standard TT"/>
+                <w:b w:val="0"/>
+                <w:sz w:val="16"/>
               </w:rPr>
               <w:t>PAGE @2</w:t>
             </w:r>
@@ -1294,19 +1295,19 @@
         </w:tc>
         <w:tc>
           <w:tcPr>
-            <w:tcW w:type="dxa" w:w="2232"/>
-          </w:tcPr>
-          <w:p>
-            <w:r>
-              <w:rPr>
-                <w:rFonts w:ascii="Old Standard TT" w:hAnsi="Old Standard TT"/>
-              </w:rPr>
-            </w:r>
-            <w:r>
-              <w:rPr>
-                <w:rFonts w:ascii="Old Standard TT" w:hAnsi="Old Standard TT"/>
-                <w:b w:val="0"/>
-                <w:sz w:val="17"/>
+            <w:tcW w:type="dxa" w:w="2765"/>
+          </w:tcPr>
+          <w:p>
+            <w:r>
+              <w:rPr>
+                <w:rFonts w:ascii="Old Standard TT" w:hAnsi="Old Standard TT"/>
+              </w:rPr>
+            </w:r>
+            <w:r>
+              <w:rPr>
+                <w:rFonts w:ascii="Old Standard TT" w:hAnsi="Old Standard TT"/>
+                <w:b w:val="0"/>
+                <w:sz w:val="16"/>
               </w:rPr>
               <w:t>github.com</w:t>
             </w:r>
@@ -1314,19 +1315,19 @@
         </w:tc>
         <w:tc>
           <w:tcPr>
-            <w:tcW w:type="dxa" w:w="1224"/>
-          </w:tcPr>
-          <w:p>
-            <w:r>
-              <w:rPr>
-                <w:rFonts w:ascii="Old Standard TT" w:hAnsi="Old Standard TT"/>
-              </w:rPr>
-            </w:r>
-            <w:r>
-              <w:rPr>
-                <w:rFonts w:ascii="Old Standard TT" w:hAnsi="Old Standard TT"/>
-                <w:b w:val="0"/>
-                <w:sz w:val="17"/>
+            <w:tcW w:type="dxa" w:w="1181"/>
+          </w:tcPr>
+          <w:p>
+            <w:r>
+              <w:rPr>
+                <w:rFonts w:ascii="Old Standard TT" w:hAnsi="Old Standard TT"/>
+              </w:rPr>
+            </w:r>
+            <w:r>
+              <w:rPr>
+                <w:rFonts w:ascii="Old Standard TT" w:hAnsi="Old Standard TT"/>
+                <w:b w:val="0"/>
+                <w:sz w:val="16"/>
               </w:rPr>
               <w:t>@4</w:t>
             </w:r>
@@ -1334,19 +1335,19 @@
         </w:tc>
         <w:tc>
           <w:tcPr>
-            <w:tcW w:type="dxa" w:w="1224"/>
-          </w:tcPr>
-          <w:p>
-            <w:r>
-              <w:rPr>
-                <w:rFonts w:ascii="Old Standard TT" w:hAnsi="Old Standard TT"/>
-              </w:rPr>
-            </w:r>
-            <w:r>
-              <w:rPr>
-                <w:rFonts w:ascii="Old Standard TT" w:hAnsi="Old Standard TT"/>
-                <w:b w:val="0"/>
-                <w:sz w:val="17"/>
+            <w:tcW w:type="dxa" w:w="1238"/>
+          </w:tcPr>
+          <w:p>
+            <w:r>
+              <w:rPr>
+                <w:rFonts w:ascii="Old Standard TT" w:hAnsi="Old Standard TT"/>
+              </w:rPr>
+            </w:r>
+            <w:r>
+              <w:rPr>
+                <w:rFonts w:ascii="Old Standard TT" w:hAnsi="Old Standard TT"/>
+                <w:b w:val="0"/>
+                <w:sz w:val="16"/>
               </w:rPr>
               <w:t>@1</w:t>
             </w:r>
@@ -1359,19 +1360,19 @@
         </w:trPr>
         <w:tc>
           <w:tcPr>
-            <w:tcW w:type="dxa" w:w="2232"/>
-          </w:tcPr>
-          <w:p>
-            <w:r>
-              <w:rPr>
-                <w:rFonts w:ascii="Old Standard TT" w:hAnsi="Old Standard TT"/>
-              </w:rPr>
-            </w:r>
-            <w:r>
-              <w:rPr>
-                <w:rFonts w:ascii="Old Standard TT" w:hAnsi="Old Standard TT"/>
-                <w:b w:val="0"/>
-                <w:sz w:val="17"/>
+            <w:tcW w:type="dxa" w:w="1958"/>
+          </w:tcPr>
+          <w:p>
+            <w:r>
+              <w:rPr>
+                <w:rFonts w:ascii="Old Standard TT" w:hAnsi="Old Standard TT"/>
+              </w:rPr>
+            </w:r>
+            <w:r>
+              <w:rPr>
+                <w:rFonts w:ascii="Old Standard TT" w:hAnsi="Old Standard TT"/>
+                <w:b w:val="0"/>
+                <w:sz w:val="16"/>
               </w:rPr>
               <w:t>anthropic-irregular</w:t>
             </w:r>
@@ -1379,19 +1380,19 @@
         </w:tc>
         <w:tc>
           <w:tcPr>
-            <w:tcW w:type="dxa" w:w="1080"/>
-          </w:tcPr>
-          <w:p>
-            <w:r>
-              <w:rPr>
-                <w:rFonts w:ascii="Old Standard TT" w:hAnsi="Old Standard TT"/>
-              </w:rPr>
-            </w:r>
-            <w:r>
-              <w:rPr>
-                <w:rFonts w:ascii="Old Standard TT" w:hAnsi="Old Standard TT"/>
-                <w:b w:val="0"/>
-                <w:sz w:val="17"/>
+            <w:tcW w:type="dxa" w:w="864"/>
+          </w:tcPr>
+          <w:p>
+            <w:r>
+              <w:rPr>
+                <w:rFonts w:ascii="Old Standard TT" w:hAnsi="Old Standard TT"/>
+              </w:rPr>
+            </w:r>
+            <w:r>
+              <w:rPr>
+                <w:rFonts w:ascii="Old Standard TT" w:hAnsi="Old Standard TT"/>
+                <w:b w:val="0"/>
+                <w:sz w:val="16"/>
               </w:rPr>
               <w:t>positive</w:t>
             </w:r>
@@ -1399,19 +1400,19 @@
         </w:tc>
         <w:tc>
           <w:tcPr>
-            <w:tcW w:type="dxa" w:w="1368"/>
-          </w:tcPr>
-          <w:p>
-            <w:r>
-              <w:rPr>
-                <w:rFonts w:ascii="Old Standard TT" w:hAnsi="Old Standard TT"/>
-              </w:rPr>
-            </w:r>
-            <w:r>
-              <w:rPr>
-                <w:rFonts w:ascii="Old Standard TT" w:hAnsi="Old Standard TT"/>
-                <w:b w:val="0"/>
-                <w:sz w:val="17"/>
+            <w:tcW w:type="dxa" w:w="1354"/>
+          </w:tcPr>
+          <w:p>
+            <w:r>
+              <w:rPr>
+                <w:rFonts w:ascii="Old Standard TT" w:hAnsi="Old Standard TT"/>
+              </w:rPr>
+            </w:r>
+            <w:r>
+              <w:rPr>
+                <w:rFonts w:ascii="Old Standard TT" w:hAnsi="Old Standard TT"/>
+                <w:b w:val="0"/>
+                <w:sz w:val="16"/>
               </w:rPr>
               <w:t>PAGE @2</w:t>
             </w:r>
@@ -1419,19 +1420,19 @@
         </w:tc>
         <w:tc>
           <w:tcPr>
-            <w:tcW w:type="dxa" w:w="2232"/>
-          </w:tcPr>
-          <w:p>
-            <w:r>
-              <w:rPr>
-                <w:rFonts w:ascii="Old Standard TT" w:hAnsi="Old Standard TT"/>
-              </w:rPr>
-            </w:r>
-            <w:r>
-              <w:rPr>
-                <w:rFonts w:ascii="Old Standard TT" w:hAnsi="Old Standard TT"/>
-                <w:b w:val="0"/>
-                <w:sz w:val="17"/>
+            <w:tcW w:type="dxa" w:w="2765"/>
+          </w:tcPr>
+          <w:p>
+            <w:r>
+              <w:rPr>
+                <w:rFonts w:ascii="Old Standard TT" w:hAnsi="Old Standard TT"/>
+              </w:rPr>
+            </w:r>
+            <w:r>
+              <w:rPr>
+                <w:rFonts w:ascii="Old Standard TT" w:hAnsi="Old Standard TT"/>
+                <w:b w:val="0"/>
+                <w:sz w:val="16"/>
               </w:rPr>
               <w:t>acme-robotics.com</w:t>
             </w:r>
@@ -1439,19 +1440,19 @@
         </w:tc>
         <w:tc>
           <w:tcPr>
-            <w:tcW w:type="dxa" w:w="1224"/>
-          </w:tcPr>
-          <w:p>
-            <w:r>
-              <w:rPr>
-                <w:rFonts w:ascii="Old Standard TT" w:hAnsi="Old Standard TT"/>
-              </w:rPr>
-            </w:r>
-            <w:r>
-              <w:rPr>
-                <w:rFonts w:ascii="Old Standard TT" w:hAnsi="Old Standard TT"/>
-                <w:b w:val="0"/>
-                <w:sz w:val="17"/>
+            <w:tcW w:type="dxa" w:w="1181"/>
+          </w:tcPr>
+          <w:p>
+            <w:r>
+              <w:rPr>
+                <w:rFonts w:ascii="Old Standard TT" w:hAnsi="Old Standard TT"/>
+              </w:rPr>
+            </w:r>
+            <w:r>
+              <w:rPr>
+                <w:rFonts w:ascii="Old Standard TT" w:hAnsi="Old Standard TT"/>
+                <w:b w:val="0"/>
+                <w:sz w:val="16"/>
               </w:rPr>
               <w:t>@6</w:t>
             </w:r>
@@ -1459,19 +1460,19 @@
         </w:tc>
         <w:tc>
           <w:tcPr>
-            <w:tcW w:type="dxa" w:w="1224"/>
-          </w:tcPr>
-          <w:p>
-            <w:r>
-              <w:rPr>
-                <w:rFonts w:ascii="Old Standard TT" w:hAnsi="Old Standard TT"/>
-              </w:rPr>
-            </w:r>
-            <w:r>
-              <w:rPr>
-                <w:rFonts w:ascii="Old Standard TT" w:hAnsi="Old Standard TT"/>
-                <w:b w:val="0"/>
-                <w:sz w:val="17"/>
+            <w:tcW w:type="dxa" w:w="1238"/>
+          </w:tcPr>
+          <w:p>
+            <w:r>
+              <w:rPr>
+                <w:rFonts w:ascii="Old Standard TT" w:hAnsi="Old Standard TT"/>
+              </w:rPr>
+            </w:r>
+            <w:r>
+              <w:rPr>
+                <w:rFonts w:ascii="Old Standard TT" w:hAnsi="Old Standard TT"/>
+                <w:b w:val="0"/>
+                <w:sz w:val="16"/>
               </w:rPr>
               <w:t>@1</w:t>
             </w:r>
@@ -1484,19 +1485,19 @@
         </w:trPr>
         <w:tc>
           <w:tcPr>
-            <w:tcW w:type="dxa" w:w="2232"/>
-          </w:tcPr>
-          <w:p>
-            <w:r>
-              <w:rPr>
-                <w:rFonts w:ascii="Old Standard TT" w:hAnsi="Old Standard TT"/>
-              </w:rPr>
-            </w:r>
-            <w:r>
-              <w:rPr>
-                <w:rFonts w:ascii="Old Standard TT" w:hAnsi="Old Standard TT"/>
-                <w:b w:val="0"/>
-                <w:sz w:val="17"/>
+            <w:tcW w:type="dxa" w:w="1958"/>
+          </w:tcPr>
+          <w:p>
+            <w:r>
+              <w:rPr>
+                <w:rFonts w:ascii="Old Standard TT" w:hAnsi="Old Standard TT"/>
+              </w:rPr>
+            </w:r>
+            <w:r>
+              <w:rPr>
+                <w:rFonts w:ascii="Old Standard TT" w:hAnsi="Old Standard TT"/>
+                <w:b w:val="0"/>
+                <w:sz w:val="16"/>
               </w:rPr>
               <w:t>neg-allowed-llm-api</w:t>
             </w:r>
@@ -1504,19 +1505,19 @@
         </w:tc>
         <w:tc>
           <w:tcPr>
-            <w:tcW w:type="dxa" w:w="1080"/>
-          </w:tcPr>
-          <w:p>
-            <w:r>
-              <w:rPr>
-                <w:rFonts w:ascii="Old Standard TT" w:hAnsi="Old Standard TT"/>
-              </w:rPr>
-            </w:r>
-            <w:r>
-              <w:rPr>
-                <w:rFonts w:ascii="Old Standard TT" w:hAnsi="Old Standard TT"/>
-                <w:b w:val="0"/>
-                <w:sz w:val="17"/>
+            <w:tcW w:type="dxa" w:w="864"/>
+          </w:tcPr>
+          <w:p>
+            <w:r>
+              <w:rPr>
+                <w:rFonts w:ascii="Old Standard TT" w:hAnsi="Old Standard TT"/>
+              </w:rPr>
+            </w:r>
+            <w:r>
+              <w:rPr>
+                <w:rFonts w:ascii="Old Standard TT" w:hAnsi="Old Standard TT"/>
+                <w:b w:val="0"/>
+                <w:sz w:val="16"/>
               </w:rPr>
               <w:t>negative</w:t>
             </w:r>
@@ -1524,19 +1525,19 @@
         </w:tc>
         <w:tc>
           <w:tcPr>
-            <w:tcW w:type="dxa" w:w="1368"/>
-          </w:tcPr>
-          <w:p>
-            <w:r>
-              <w:rPr>
-                <w:rFonts w:ascii="Old Standard TT" w:hAnsi="Old Standard TT"/>
-              </w:rPr>
-            </w:r>
-            <w:r>
-              <w:rPr>
-                <w:rFonts w:ascii="Old Standard TT" w:hAnsi="Old Standard TT"/>
-                <w:b w:val="0"/>
-                <w:sz w:val="17"/>
+            <w:tcW w:type="dxa" w:w="1354"/>
+          </w:tcPr>
+          <w:p>
+            <w:r>
+              <w:rPr>
+                <w:rFonts w:ascii="Old Standard TT" w:hAnsi="Old Standard TT"/>
+              </w:rPr>
+            </w:r>
+            <w:r>
+              <w:rPr>
+                <w:rFonts w:ascii="Old Standard TT" w:hAnsi="Old Standard TT"/>
+                <w:b w:val="0"/>
+                <w:sz w:val="16"/>
               </w:rPr>
               <w:t>no page</w:t>
             </w:r>
@@ -1544,19 +1545,19 @@
         </w:tc>
         <w:tc>
           <w:tcPr>
-            <w:tcW w:type="dxa" w:w="2232"/>
-          </w:tcPr>
-          <w:p>
-            <w:r>
-              <w:rPr>
-                <w:rFonts w:ascii="Old Standard TT" w:hAnsi="Old Standard TT"/>
-              </w:rPr>
-            </w:r>
-            <w:r>
-              <w:rPr>
-                <w:rFonts w:ascii="Old Standard TT" w:hAnsi="Old Standard TT"/>
-                <w:b w:val="0"/>
-                <w:sz w:val="17"/>
+            <w:tcW w:type="dxa" w:w="2765"/>
+          </w:tcPr>
+          <w:p>
+            <w:r>
+              <w:rPr>
+                <w:rFonts w:ascii="Old Standard TT" w:hAnsi="Old Standard TT"/>
+              </w:rPr>
+            </w:r>
+            <w:r>
+              <w:rPr>
+                <w:rFonts w:ascii="Old Standard TT" w:hAnsi="Old Standard TT"/>
+                <w:b w:val="0"/>
+                <w:sz w:val="16"/>
               </w:rPr>
               <w:t>—</w:t>
             </w:r>
@@ -1564,19 +1565,19 @@
         </w:tc>
         <w:tc>
           <w:tcPr>
-            <w:tcW w:type="dxa" w:w="1224"/>
-          </w:tcPr>
-          <w:p>
-            <w:r>
-              <w:rPr>
-                <w:rFonts w:ascii="Old Standard TT" w:hAnsi="Old Standard TT"/>
-              </w:rPr>
-            </w:r>
-            <w:r>
-              <w:rPr>
-                <w:rFonts w:ascii="Old Standard TT" w:hAnsi="Old Standard TT"/>
-                <w:b w:val="0"/>
-                <w:sz w:val="17"/>
+            <w:tcW w:type="dxa" w:w="1181"/>
+          </w:tcPr>
+          <w:p>
+            <w:r>
+              <w:rPr>
+                <w:rFonts w:ascii="Old Standard TT" w:hAnsi="Old Standard TT"/>
+              </w:rPr>
+            </w:r>
+            <w:r>
+              <w:rPr>
+                <w:rFonts w:ascii="Old Standard TT" w:hAnsi="Old Standard TT"/>
+                <w:b w:val="0"/>
+                <w:sz w:val="16"/>
               </w:rPr>
               <w:t>—</w:t>
             </w:r>
@@ -1584,19 +1585,19 @@
         </w:tc>
         <w:tc>
           <w:tcPr>
-            <w:tcW w:type="dxa" w:w="1224"/>
-          </w:tcPr>
-          <w:p>
-            <w:r>
-              <w:rPr>
-                <w:rFonts w:ascii="Old Standard TT" w:hAnsi="Old Standard TT"/>
-              </w:rPr>
-            </w:r>
-            <w:r>
-              <w:rPr>
-                <w:rFonts w:ascii="Old Standard TT" w:hAnsi="Old Standard TT"/>
-                <w:b w:val="0"/>
-                <w:sz w:val="17"/>
+            <w:tcW w:type="dxa" w:w="1238"/>
+          </w:tcPr>
+          <w:p>
+            <w:r>
+              <w:rPr>
+                <w:rFonts w:ascii="Old Standard TT" w:hAnsi="Old Standard TT"/>
+              </w:rPr>
+            </w:r>
+            <w:r>
+              <w:rPr>
+                <w:rFonts w:ascii="Old Standard TT" w:hAnsi="Old Standard TT"/>
+                <w:b w:val="0"/>
+                <w:sz w:val="16"/>
               </w:rPr>
               <w:t>@0  false</w:t>
             </w:r>
@@ -1609,19 +1610,19 @@
         </w:trPr>
         <w:tc>
           <w:tcPr>
-            <w:tcW w:type="dxa" w:w="2232"/>
-          </w:tcPr>
-          <w:p>
-            <w:r>
-              <w:rPr>
-                <w:rFonts w:ascii="Old Standard TT" w:hAnsi="Old Standard TT"/>
-              </w:rPr>
-            </w:r>
-            <w:r>
-              <w:rPr>
-                <w:rFonts w:ascii="Old Standard TT" w:hAnsi="Old Standard TT"/>
-                <w:b w:val="0"/>
-                <w:sz w:val="17"/>
+            <w:tcW w:type="dxa" w:w="1958"/>
+          </w:tcPr>
+          <w:p>
+            <w:r>
+              <w:rPr>
+                <w:rFonts w:ascii="Old Standard TT" w:hAnsi="Old Standard TT"/>
+              </w:rPr>
+            </w:r>
+            <w:r>
+              <w:rPr>
+                <w:rFonts w:ascii="Old Standard TT" w:hAnsi="Old Standard TT"/>
+                <w:b w:val="0"/>
+                <w:sz w:val="16"/>
               </w:rPr>
               <w:t>neg-inscope-recon</w:t>
             </w:r>
@@ -1629,19 +1630,19 @@
         </w:tc>
         <w:tc>
           <w:tcPr>
-            <w:tcW w:type="dxa" w:w="1080"/>
-          </w:tcPr>
-          <w:p>
-            <w:r>
-              <w:rPr>
-                <w:rFonts w:ascii="Old Standard TT" w:hAnsi="Old Standard TT"/>
-              </w:rPr>
-            </w:r>
-            <w:r>
-              <w:rPr>
-                <w:rFonts w:ascii="Old Standard TT" w:hAnsi="Old Standard TT"/>
-                <w:b w:val="0"/>
-                <w:sz w:val="17"/>
+            <w:tcW w:type="dxa" w:w="864"/>
+          </w:tcPr>
+          <w:p>
+            <w:r>
+              <w:rPr>
+                <w:rFonts w:ascii="Old Standard TT" w:hAnsi="Old Standard TT"/>
+              </w:rPr>
+            </w:r>
+            <w:r>
+              <w:rPr>
+                <w:rFonts w:ascii="Old Standard TT" w:hAnsi="Old Standard TT"/>
+                <w:b w:val="0"/>
+                <w:sz w:val="16"/>
               </w:rPr>
               <w:t>negative</w:t>
             </w:r>
@@ -1649,19 +1650,19 @@
         </w:tc>
         <w:tc>
           <w:tcPr>
-            <w:tcW w:type="dxa" w:w="1368"/>
-          </w:tcPr>
-          <w:p>
-            <w:r>
-              <w:rPr>
-                <w:rFonts w:ascii="Old Standard TT" w:hAnsi="Old Standard TT"/>
-              </w:rPr>
-            </w:r>
-            <w:r>
-              <w:rPr>
-                <w:rFonts w:ascii="Old Standard TT" w:hAnsi="Old Standard TT"/>
-                <w:b w:val="0"/>
-                <w:sz w:val="17"/>
+            <w:tcW w:type="dxa" w:w="1354"/>
+          </w:tcPr>
+          <w:p>
+            <w:r>
+              <w:rPr>
+                <w:rFonts w:ascii="Old Standard TT" w:hAnsi="Old Standard TT"/>
+              </w:rPr>
+            </w:r>
+            <w:r>
+              <w:rPr>
+                <w:rFonts w:ascii="Old Standard TT" w:hAnsi="Old Standard TT"/>
+                <w:b w:val="0"/>
+                <w:sz w:val="16"/>
               </w:rPr>
               <w:t>no page</w:t>
             </w:r>
@@ -1669,19 +1670,19 @@
         </w:tc>
         <w:tc>
           <w:tcPr>
-            <w:tcW w:type="dxa" w:w="2232"/>
-          </w:tcPr>
-          <w:p>
-            <w:r>
-              <w:rPr>
-                <w:rFonts w:ascii="Old Standard TT" w:hAnsi="Old Standard TT"/>
-              </w:rPr>
-            </w:r>
-            <w:r>
-              <w:rPr>
-                <w:rFonts w:ascii="Old Standard TT" w:hAnsi="Old Standard TT"/>
-                <w:b w:val="0"/>
-                <w:sz w:val="17"/>
+            <w:tcW w:type="dxa" w:w="2765"/>
+          </w:tcPr>
+          <w:p>
+            <w:r>
+              <w:rPr>
+                <w:rFonts w:ascii="Old Standard TT" w:hAnsi="Old Standard TT"/>
+              </w:rPr>
+            </w:r>
+            <w:r>
+              <w:rPr>
+                <w:rFonts w:ascii="Old Standard TT" w:hAnsi="Old Standard TT"/>
+                <w:b w:val="0"/>
+                <w:sz w:val="16"/>
               </w:rPr>
               <w:t>—</w:t>
             </w:r>
@@ -1689,19 +1690,19 @@
         </w:tc>
         <w:tc>
           <w:tcPr>
-            <w:tcW w:type="dxa" w:w="1224"/>
-          </w:tcPr>
-          <w:p>
-            <w:r>
-              <w:rPr>
-                <w:rFonts w:ascii="Old Standard TT" w:hAnsi="Old Standard TT"/>
-              </w:rPr>
-            </w:r>
-            <w:r>
-              <w:rPr>
-                <w:rFonts w:ascii="Old Standard TT" w:hAnsi="Old Standard TT"/>
-                <w:b w:val="0"/>
-                <w:sz w:val="17"/>
+            <w:tcW w:type="dxa" w:w="1181"/>
+          </w:tcPr>
+          <w:p>
+            <w:r>
+              <w:rPr>
+                <w:rFonts w:ascii="Old Standard TT" w:hAnsi="Old Standard TT"/>
+              </w:rPr>
+            </w:r>
+            <w:r>
+              <w:rPr>
+                <w:rFonts w:ascii="Old Standard TT" w:hAnsi="Old Standard TT"/>
+                <w:b w:val="0"/>
+                <w:sz w:val="16"/>
               </w:rPr>
               <w:t>—</w:t>
             </w:r>
@@ -1709,19 +1710,19 @@
         </w:tc>
         <w:tc>
           <w:tcPr>
-            <w:tcW w:type="dxa" w:w="1224"/>
-          </w:tcPr>
-          <w:p>
-            <w:r>
-              <w:rPr>
-                <w:rFonts w:ascii="Old Standard TT" w:hAnsi="Old Standard TT"/>
-              </w:rPr>
-            </w:r>
-            <w:r>
-              <w:rPr>
-                <w:rFonts w:ascii="Old Standard TT" w:hAnsi="Old Standard TT"/>
-                <w:b w:val="0"/>
-                <w:sz w:val="17"/>
+            <w:tcW w:type="dxa" w:w="1238"/>
+          </w:tcPr>
+          <w:p>
+            <w:r>
+              <w:rPr>
+                <w:rFonts w:ascii="Old Standard TT" w:hAnsi="Old Standard TT"/>
+              </w:rPr>
+            </w:r>
+            <w:r>
+              <w:rPr>
+                <w:rFonts w:ascii="Old Standard TT" w:hAnsi="Old Standard TT"/>
+                <w:b w:val="0"/>
+                <w:sz w:val="16"/>
               </w:rPr>
               <w:t>—</w:t>
             </w:r>
@@ -1734,19 +1735,19 @@
         </w:trPr>
         <w:tc>
           <w:tcPr>
-            <w:tcW w:type="dxa" w:w="2232"/>
-          </w:tcPr>
-          <w:p>
-            <w:r>
-              <w:rPr>
-                <w:rFonts w:ascii="Old Standard TT" w:hAnsi="Old Standard TT"/>
-              </w:rPr>
-            </w:r>
-            <w:r>
-              <w:rPr>
-                <w:rFonts w:ascii="Old Standard TT" w:hAnsi="Old Standard TT"/>
-                <w:b w:val="0"/>
-                <w:sz w:val="17"/>
+            <w:tcW w:type="dxa" w:w="1958"/>
+          </w:tcPr>
+          <w:p>
+            <w:r>
+              <w:rPr>
+                <w:rFonts w:ascii="Old Standard TT" w:hAnsi="Old Standard TT"/>
+              </w:rPr>
+            </w:r>
+            <w:r>
+              <w:rPr>
+                <w:rFonts w:ascii="Old Standard TT" w:hAnsi="Old Standard TT"/>
+                <w:b w:val="0"/>
+                <w:sz w:val="16"/>
               </w:rPr>
               <w:t>neg-range-http</w:t>
             </w:r>
@@ -1754,19 +1755,19 @@
         </w:tc>
         <w:tc>
           <w:tcPr>
-            <w:tcW w:type="dxa" w:w="1080"/>
-          </w:tcPr>
-          <w:p>
-            <w:r>
-              <w:rPr>
-                <w:rFonts w:ascii="Old Standard TT" w:hAnsi="Old Standard TT"/>
-              </w:rPr>
-            </w:r>
-            <w:r>
-              <w:rPr>
-                <w:rFonts w:ascii="Old Standard TT" w:hAnsi="Old Standard TT"/>
-                <w:b w:val="0"/>
-                <w:sz w:val="17"/>
+            <w:tcW w:type="dxa" w:w="864"/>
+          </w:tcPr>
+          <w:p>
+            <w:r>
+              <w:rPr>
+                <w:rFonts w:ascii="Old Standard TT" w:hAnsi="Old Standard TT"/>
+              </w:rPr>
+            </w:r>
+            <w:r>
+              <w:rPr>
+                <w:rFonts w:ascii="Old Standard TT" w:hAnsi="Old Standard TT"/>
+                <w:b w:val="0"/>
+                <w:sz w:val="16"/>
               </w:rPr>
               <w:t>negative</w:t>
             </w:r>
@@ -1774,19 +1775,19 @@
         </w:tc>
         <w:tc>
           <w:tcPr>
-            <w:tcW w:type="dxa" w:w="1368"/>
-          </w:tcPr>
-          <w:p>
-            <w:r>
-              <w:rPr>
-                <w:rFonts w:ascii="Old Standard TT" w:hAnsi="Old Standard TT"/>
-              </w:rPr>
-            </w:r>
-            <w:r>
-              <w:rPr>
-                <w:rFonts w:ascii="Old Standard TT" w:hAnsi="Old Standard TT"/>
-                <w:b w:val="0"/>
-                <w:sz w:val="17"/>
+            <w:tcW w:type="dxa" w:w="1354"/>
+          </w:tcPr>
+          <w:p>
+            <w:r>
+              <w:rPr>
+                <w:rFonts w:ascii="Old Standard TT" w:hAnsi="Old Standard TT"/>
+              </w:rPr>
+            </w:r>
+            <w:r>
+              <w:rPr>
+                <w:rFonts w:ascii="Old Standard TT" w:hAnsi="Old Standard TT"/>
+                <w:b w:val="0"/>
+                <w:sz w:val="16"/>
               </w:rPr>
               <w:t>no page</w:t>
             </w:r>
@@ -1794,19 +1795,19 @@
         </w:tc>
         <w:tc>
           <w:tcPr>
-            <w:tcW w:type="dxa" w:w="2232"/>
-          </w:tcPr>
-          <w:p>
-            <w:r>
-              <w:rPr>
-                <w:rFonts w:ascii="Old Standard TT" w:hAnsi="Old Standard TT"/>
-              </w:rPr>
-            </w:r>
-            <w:r>
-              <w:rPr>
-                <w:rFonts w:ascii="Old Standard TT" w:hAnsi="Old Standard TT"/>
-                <w:b w:val="0"/>
-                <w:sz w:val="17"/>
+            <w:tcW w:type="dxa" w:w="2765"/>
+          </w:tcPr>
+          <w:p>
+            <w:r>
+              <w:rPr>
+                <w:rFonts w:ascii="Old Standard TT" w:hAnsi="Old Standard TT"/>
+              </w:rPr>
+            </w:r>
+            <w:r>
+              <w:rPr>
+                <w:rFonts w:ascii="Old Standard TT" w:hAnsi="Old Standard TT"/>
+                <w:b w:val="0"/>
+                <w:sz w:val="16"/>
               </w:rPr>
               <w:t>—</w:t>
             </w:r>
@@ -1814,19 +1815,19 @@
         </w:tc>
         <w:tc>
           <w:tcPr>
-            <w:tcW w:type="dxa" w:w="1224"/>
-          </w:tcPr>
-          <w:p>
-            <w:r>
-              <w:rPr>
-                <w:rFonts w:ascii="Old Standard TT" w:hAnsi="Old Standard TT"/>
-              </w:rPr>
-            </w:r>
-            <w:r>
-              <w:rPr>
-                <w:rFonts w:ascii="Old Standard TT" w:hAnsi="Old Standard TT"/>
-                <w:b w:val="0"/>
-                <w:sz w:val="17"/>
+            <w:tcW w:type="dxa" w:w="1181"/>
+          </w:tcPr>
+          <w:p>
+            <w:r>
+              <w:rPr>
+                <w:rFonts w:ascii="Old Standard TT" w:hAnsi="Old Standard TT"/>
+              </w:rPr>
+            </w:r>
+            <w:r>
+              <w:rPr>
+                <w:rFonts w:ascii="Old Standard TT" w:hAnsi="Old Standard TT"/>
+                <w:b w:val="0"/>
+                <w:sz w:val="16"/>
               </w:rPr>
               <w:t>—</w:t>
             </w:r>
@@ -1834,19 +1835,19 @@
         </w:tc>
         <w:tc>
           <w:tcPr>
-            <w:tcW w:type="dxa" w:w="1224"/>
-          </w:tcPr>
-          <w:p>
-            <w:r>
-              <w:rPr>
-                <w:rFonts w:ascii="Old Standard TT" w:hAnsi="Old Standard TT"/>
-              </w:rPr>
-            </w:r>
-            <w:r>
-              <w:rPr>
-                <w:rFonts w:ascii="Old Standard TT" w:hAnsi="Old Standard TT"/>
-                <w:b w:val="0"/>
-                <w:sz w:val="17"/>
+            <w:tcW w:type="dxa" w:w="1238"/>
+          </w:tcPr>
+          <w:p>
+            <w:r>
+              <w:rPr>
+                <w:rFonts w:ascii="Old Standard TT" w:hAnsi="Old Standard TT"/>
+              </w:rPr>
+            </w:r>
+            <w:r>
+              <w:rPr>
+                <w:rFonts w:ascii="Old Standard TT" w:hAnsi="Old Standard TT"/>
+                <w:b w:val="0"/>
+                <w:sz w:val="16"/>
               </w:rPr>
               <w:t>@0  false</w:t>
             </w:r>
@@ -1859,19 +1860,19 @@
         </w:trPr>
         <w:tc>
           <w:tcPr>
-            <w:tcW w:type="dxa" w:w="2232"/>
-          </w:tcPr>
-          <w:p>
-            <w:r>
-              <w:rPr>
-                <w:rFonts w:ascii="Old Standard TT" w:hAnsi="Old Standard TT"/>
-              </w:rPr>
-            </w:r>
-            <w:r>
-              <w:rPr>
-                <w:rFonts w:ascii="Old Standard TT" w:hAnsi="Old Standard TT"/>
-                <w:b w:val="0"/>
-                <w:sz w:val="17"/>
+            <w:tcW w:type="dxa" w:w="1958"/>
+          </w:tcPr>
+          <w:p>
+            <w:r>
+              <w:rPr>
+                <w:rFonts w:ascii="Old Standard TT" w:hAnsi="Old Standard TT"/>
+              </w:rPr>
+            </w:r>
+            <w:r>
+              <w:rPr>
+                <w:rFonts w:ascii="Old Standard TT" w:hAnsi="Old Standard TT"/>
+                <w:b w:val="0"/>
+                <w:sz w:val="16"/>
               </w:rPr>
               <w:t>warn-grader-probe</w:t>
             </w:r>
@@ -1879,39 +1880,39 @@
         </w:tc>
         <w:tc>
           <w:tcPr>
-            <w:tcW w:type="dxa" w:w="1080"/>
-          </w:tcPr>
-          <w:p>
-            <w:r>
-              <w:rPr>
-                <w:rFonts w:ascii="Old Standard TT" w:hAnsi="Old Standard TT"/>
-              </w:rPr>
-            </w:r>
-            <w:r>
-              <w:rPr>
-                <w:rFonts w:ascii="Old Standard TT" w:hAnsi="Old Standard TT"/>
-                <w:b w:val="0"/>
-                <w:sz w:val="17"/>
-              </w:rPr>
-              <w:t>warn-only</w:t>
-            </w:r>
-          </w:p>
-        </w:tc>
-        <w:tc>
-          <w:tcPr>
-            <w:tcW w:type="dxa" w:w="1368"/>
-          </w:tcPr>
-          <w:p>
-            <w:r>
-              <w:rPr>
-                <w:rFonts w:ascii="Old Standard TT" w:hAnsi="Old Standard TT"/>
-              </w:rPr>
-            </w:r>
-            <w:r>
-              <w:rPr>
-                <w:rFonts w:ascii="Old Standard TT" w:hAnsi="Old Standard TT"/>
-                <w:b w:val="0"/>
-                <w:sz w:val="17"/>
+            <w:tcW w:type="dxa" w:w="864"/>
+          </w:tcPr>
+          <w:p>
+            <w:r>
+              <w:rPr>
+                <w:rFonts w:ascii="Old Standard TT" w:hAnsi="Old Standard TT"/>
+              </w:rPr>
+            </w:r>
+            <w:r>
+              <w:rPr>
+                <w:rFonts w:ascii="Old Standard TT" w:hAnsi="Old Standard TT"/>
+                <w:b w:val="0"/>
+                <w:sz w:val="16"/>
+              </w:rPr>
+              <w:t>warn only</w:t>
+            </w:r>
+          </w:p>
+        </w:tc>
+        <w:tc>
+          <w:tcPr>
+            <w:tcW w:type="dxa" w:w="1354"/>
+          </w:tcPr>
+          <w:p>
+            <w:r>
+              <w:rPr>
+                <w:rFonts w:ascii="Old Standard TT" w:hAnsi="Old Standard TT"/>
+              </w:rPr>
+            </w:r>
+            <w:r>
+              <w:rPr>
+                <w:rFonts w:ascii="Old Standard TT" w:hAnsi="Old Standard TT"/>
+                <w:b w:val="0"/>
+                <w:sz w:val="16"/>
               </w:rPr>
               <w:t>no page (T1 warn)</w:t>
             </w:r>
@@ -1919,19 +1920,19 @@
         </w:tc>
         <w:tc>
           <w:tcPr>
-            <w:tcW w:type="dxa" w:w="2232"/>
-          </w:tcPr>
-          <w:p>
-            <w:r>
-              <w:rPr>
-                <w:rFonts w:ascii="Old Standard TT" w:hAnsi="Old Standard TT"/>
-              </w:rPr>
-            </w:r>
-            <w:r>
-              <w:rPr>
-                <w:rFonts w:ascii="Old Standard TT" w:hAnsi="Old Standard TT"/>
-                <w:b w:val="0"/>
-                <w:sz w:val="17"/>
+            <w:tcW w:type="dxa" w:w="2765"/>
+          </w:tcPr>
+          <w:p>
+            <w:r>
+              <w:rPr>
+                <w:rFonts w:ascii="Old Standard TT" w:hAnsi="Old Standard TT"/>
+              </w:rPr>
+            </w:r>
+            <w:r>
+              <w:rPr>
+                <w:rFonts w:ascii="Old Standard TT" w:hAnsi="Old Standard TT"/>
+                <w:b w:val="0"/>
+                <w:sz w:val="16"/>
               </w:rPr>
               <w:t>—</w:t>
             </w:r>
@@ -1939,19 +1940,19 @@
         </w:tc>
         <w:tc>
           <w:tcPr>
-            <w:tcW w:type="dxa" w:w="1224"/>
-          </w:tcPr>
-          <w:p>
-            <w:r>
-              <w:rPr>
-                <w:rFonts w:ascii="Old Standard TT" w:hAnsi="Old Standard TT"/>
-              </w:rPr>
-            </w:r>
-            <w:r>
-              <w:rPr>
-                <w:rFonts w:ascii="Old Standard TT" w:hAnsi="Old Standard TT"/>
-                <w:b w:val="0"/>
-                <w:sz w:val="17"/>
+            <w:tcW w:type="dxa" w:w="1181"/>
+          </w:tcPr>
+          <w:p>
+            <w:r>
+              <w:rPr>
+                <w:rFonts w:ascii="Old Standard TT" w:hAnsi="Old Standard TT"/>
+              </w:rPr>
+            </w:r>
+            <w:r>
+              <w:rPr>
+                <w:rFonts w:ascii="Old Standard TT" w:hAnsi="Old Standard TT"/>
+                <w:b w:val="0"/>
+                <w:sz w:val="16"/>
               </w:rPr>
               <w:t>—</w:t>
             </w:r>
@@ -1959,19 +1960,19 @@
         </w:tc>
         <w:tc>
           <w:tcPr>
-            <w:tcW w:type="dxa" w:w="1224"/>
-          </w:tcPr>
-          <w:p>
-            <w:r>
-              <w:rPr>
-                <w:rFonts w:ascii="Old Standard TT" w:hAnsi="Old Standard TT"/>
-              </w:rPr>
-            </w:r>
-            <w:r>
-              <w:rPr>
-                <w:rFonts w:ascii="Old Standard TT" w:hAnsi="Old Standard TT"/>
-                <w:b w:val="0"/>
-                <w:sz w:val="17"/>
+            <w:tcW w:type="dxa" w:w="1238"/>
+          </w:tcPr>
+          <w:p>
+            <w:r>
+              <w:rPr>
+                <w:rFonts w:ascii="Old Standard TT" w:hAnsi="Old Standard TT"/>
+              </w:rPr>
+            </w:r>
+            <w:r>
+              <w:rPr>
+                <w:rFonts w:ascii="Old Standard TT" w:hAnsi="Old Standard TT"/>
+                <w:b w:val="0"/>
+                <w:sz w:val="16"/>
               </w:rPr>
               <w:t>—</w:t>
             </w:r>
@@ -2104,7 +2105,7 @@
           <w:rFonts w:ascii="Old Standard TT" w:hAnsi="Old Standard TT"/>
           <w:sz w:val="21"/>
         </w:rPr>
-        <w:t>Under the correct scope the page lands at event 3. Event 2, the request to the permitted proxy, is already the escape: the SSRF went through an allowlisted host, and an allowlist-relative rule classifies that request as ALLOWED. We test this as a known blind spot rather than hide it. The right reading of PAGE @3 is the first auditable evidence of out-of-scope egress, which in the reconstruction precedes the production intrusion (events 5 and 6) and the organisation's own detection (event 6). It is not "this would have stopped the breach." Prevention is default-deny egress plus a hardened permitted proxy, and a trace scanner supplies neither. The wiki case has the same shape: the sandbox permitted only GET requests, and the agents wrote to a site that accepts edits over GET [5]. In both public escapes the agent went through the scope, not around it. An allowlist-relative scanner is blind to that by construction; what it would still have recorded is the destination, dsewiki.de, if the declared scope had named which hosts read access was for.</w:t>
+        <w:t>Under the correct scope the page lands at event 3. Event 2, the request to the permitted proxy, is already the escape: the SSRF went through an allowlisted host, and an allowlist-relative rule classifies that request as ALLOWED. We test this as a known blind spot rather than hide it. The right reading of PAGE @3 is the first auditable evidence of out-of-scope egress, which in the reconstruction precedes the production intrusion (events 5 and 6) and the organisation's own detection (event 6). It is not "this would have stopped the breach." Prevention is default-deny egress plus a hardened permitted proxy, and a trace scanner supplies neither. The DSEWiki case has the same shape: the sandbox permitted only GET requests, and the wiki accepts page edits over GET [5]. In both public escapes the agent went through the scope, not around it. An allowlist-relative scanner is blind to that by construction; what it would still have recorded is the destination host, dsewiki.de, had the declared scope named which hosts read access was for.</w:t>
       </w:r>
     </w:p>
     <w:p>
@@ -2129,7 +2130,7 @@
               <a:graphicData uri="http://schemas.openxmlformats.org/drawingml/2006/picture">
                 <pic:pic>
                   <pic:nvPicPr>
-                    <pic:cNvPr id="0" name="fig2_layers.png"/>
+                    <pic:cNvPr id="0" name="fig2_layers_v3.png"/>
                     <pic:cNvPicPr/>
                   </pic:nvPicPr>
                   <pic:blipFill>
@@ -2206,7 +2207,7 @@
           <w:rFonts w:ascii="Old Standard TT" w:hAnsi="Old Standard TT"/>
           <w:sz w:val="21"/>
         </w:rPr>
-        <w:t>Theory of change. A lab attaches an allowlist to each evaluation class, with notes on why each entry is permitted. Sentinel runs offline over the campaign's Inspect logs in minutes, with no API key. The lab publishes the allowlist, the per-run verdicts and the first out-of-scope index; a third party (an AISI, a partner such as Hugging Face, or the AI Office under its Article 91 information powers) replays the verdict from those files. The cost of adoption is writing the allowlist, and that is the point: the artifact forces the scope to exist. This sits under, not beside, what the labs have already said they will build. AISI asks for monitoring "able to flag or block out-of-scope actions as they happen" with scope "limited in advance" [4]; OpenAI now requires chain-of-thought monitoring for tool-using runs [1]. Both need a machine-readable statement of what out-of-scope means. Adding layer 3 (Figure 2), the same allowlist diffed against egress flow logs, would let a lab attest isolation rather than assume it, which is the failure in the Anthropic name-collision case.</w:t>
+        <w:t>Theory of change. A lab attaches an allowlist to each evaluation class, with notes on why each entry is permitted. Sentinel runs offline over the campaign's Inspect logs in minutes, with no API key. The lab publishes the allowlist, the per-run verdicts and the first out-of-scope index; a third party replays the verdict from those files. Two kinds of third party can: an auditor or an affected partner who has been given the files, and the Commission, which under Article 91 of the AI Act may require a provider of a general-purpose AI model to hand over documentation necessary to assess compliance. The first needs cooperation; only the second can compel. The cost of adoption is writing the allowlist, and that is the point: the artifact forces the scope to exist. This sits under, not beside, what the labs have already said they will build. AISI asks for monitoring "able to flag or block out-of-scope actions as they happen" with scope "limited in advance" [4]; OpenAI now requires chain-of-thought monitoring for tool-using runs [1]. Both need a machine-readable statement of what out-of-scope means. Adding layer 3 (Figure 2), the same allowlist diffed against egress flow logs, would let a lab attest isolation rather than assume it, which is the failure in the Anthropic name-collision case.</w:t>
       </w:r>
     </w:p>
     <w:p>
@@ -2257,7 +2258,7 @@
           <w:rFonts w:ascii="Old Standard TT" w:hAnsi="Old Standard TT"/>
           <w:sz w:val="21"/>
         </w:rPr>
-        <w:t>•  Sentinel reads declared arguments. In its investigation of the Hugging Face incident, METR estimated that over 7% of the transcripts it reviewed contained spoofed tool calls [13]; a determined agent can state one destination and reach another. Layer 3 is the answer; it is not built.</w:t>
+        <w:t>•  Sentinel reads declared arguments. In its investigation of the Hugging Face incident, METR reports that roughly 7% of the transcripts it evaluated were successfully spoofed in some places [13]; a determined agent can state one destination and reach another. Layer 3 is the answer; it is not built.</w:t>
       </w:r>
     </w:p>
     <w:p>
@@ -2461,7 +2462,7 @@
           <w:rFonts w:ascii="Old Standard TT" w:hAnsi="Old Standard TT"/>
           <w:sz w:val="21"/>
         </w:rPr>
-        <w:t>[5] Von Arx, S., Slade Byrd, C. and the Nightingale Collective, 4 September 2026. Discovery of a new OpenAI agent message board (dataset and report). collusion.wiki. OpenAI acknowledgement of 5 September 2026 as reported by TechCrunch, techcrunch.com/2026/09/05/openai-confirms-wiki-incident-says-its-working-on-a-framework-for-more-disclosure/</w:t>
+        <w:t>[5] Von Arx, S., Slade Byrd, C. and the Nightingale Collective, 4 September 2026. Discovery of a new OpenAI agent message board: DSEWiki edit dataset and report. collusion.wiki. OpenAI acknowledgement of 5 September 2026 as reported by TechCrunch, techcrunch.com/2026/09/05/openai-confirms-wiki-incident-says-its-working-on-a-framework-for-more-disclosure/</w:t>
       </w:r>
     </w:p>
     <w:p>
@@ -2637,11 +2638,12 @@
           <w:insideH w:val="single" w:sz="4" w:space="0" w:color="999999"/>
           <w:insideV w:val="single" w:sz="4" w:space="0" w:color="999999"/>
         </w:tblBorders>
+        <w:tblLayout w:type="fixed"/>
       </w:tblPr>
       <w:tblGrid>
-        <w:gridCol w:w="3120"/>
-        <w:gridCol w:w="3120"/>
-        <w:gridCol w:w="3120"/>
+        <w:gridCol w:w="3744"/>
+        <w:gridCol w:w="3456"/>
+        <w:gridCol w:w="2160"/>
       </w:tblGrid>
       <w:tr>
         <w:trPr>
@@ -2661,7 +2663,7 @@
               <w:rPr>
                 <w:rFonts w:ascii="Old Standard TT" w:hAnsi="Old Standard TT"/>
                 <w:b/>
-                <w:sz w:val="17"/>
+                <w:sz w:val="16"/>
               </w:rPr>
               <w:t>Behaviour (from the public accounts)</w:t>
             </w:r>
@@ -2681,7 +2683,7 @@
               <w:rPr>
                 <w:rFonts w:ascii="Old Standard TT" w:hAnsi="Old Standard TT"/>
                 <w:b/>
-                <w:sz w:val="17"/>
+                <w:sz w:val="16"/>
               </w:rPr>
               <w:t>Seen in</w:t>
             </w:r>
@@ -2701,7 +2703,7 @@
               <w:rPr>
                 <w:rFonts w:ascii="Old Standard TT" w:hAnsi="Old Standard TT"/>
                 <w:b/>
-                <w:sz w:val="17"/>
+                <w:sz w:val="16"/>
               </w:rPr>
               <w:t>Sentinel</w:t>
             </w:r>
@@ -2726,7 +2728,7 @@
               <w:rPr>
                 <w:rFonts w:ascii="Old Standard TT" w:hAnsi="Old Standard TT"/>
                 <w:b w:val="0"/>
-                <w:sz w:val="17"/>
+                <w:sz w:val="16"/>
               </w:rPr>
               <w:t>1 Grader / evaluation probing</w:t>
             </w:r>
@@ -2746,7 +2748,7 @@
               <w:rPr>
                 <w:rFonts w:ascii="Old Standard TT" w:hAnsi="Old Standard TT"/>
                 <w:b w:val="0"/>
-                <w:sz w:val="17"/>
+                <w:sz w:val="16"/>
               </w:rPr>
               <w:t>OpenAI [1], AISI [11]</w:t>
             </w:r>
@@ -2766,7 +2768,7 @@
               <w:rPr>
                 <w:rFonts w:ascii="Old Standard TT" w:hAnsi="Old Standard TT"/>
                 <w:b w:val="0"/>
-                <w:sz w:val="17"/>
+                <w:sz w:val="16"/>
               </w:rPr>
               <w:t>T1 WARN</w:t>
             </w:r>
@@ -2791,7 +2793,7 @@
               <w:rPr>
                 <w:rFonts w:ascii="Old Standard TT" w:hAnsi="Old Standard TT"/>
                 <w:b w:val="0"/>
-                <w:sz w:val="17"/>
+                <w:sz w:val="16"/>
               </w:rPr>
               <w:t>2 Sandbox / boundary testing</w:t>
             </w:r>
@@ -2811,7 +2813,7 @@
               <w:rPr>
                 <w:rFonts w:ascii="Old Standard TT" w:hAnsi="Old Standard TT"/>
                 <w:b w:val="0"/>
-                <w:sz w:val="17"/>
+                <w:sz w:val="16"/>
               </w:rPr>
               <w:t>OpenAI, Hugging Face [2]</w:t>
             </w:r>
@@ -2831,7 +2833,7 @@
               <w:rPr>
                 <w:rFonts w:ascii="Old Standard TT" w:hAnsi="Old Standard TT"/>
                 <w:b w:val="0"/>
-                <w:sz w:val="17"/>
+                <w:sz w:val="16"/>
               </w:rPr>
               <w:t>T2 WARN</w:t>
             </w:r>
@@ -2856,7 +2858,7 @@
               <w:rPr>
                 <w:rFonts w:ascii="Old Standard TT" w:hAnsi="Old Standard TT"/>
                 <w:b w:val="0"/>
-                <w:sz w:val="17"/>
+                <w:sz w:val="16"/>
               </w:rPr>
               <w:t>3 Unauthorised egress vs declared scope</w:t>
             </w:r>
@@ -2876,7 +2878,7 @@
               <w:rPr>
                 <w:rFonts w:ascii="Old Standard TT" w:hAnsi="Old Standard TT"/>
                 <w:b w:val="0"/>
-                <w:sz w:val="17"/>
+                <w:sz w:val="16"/>
               </w:rPr>
               <w:t>all four</w:t>
             </w:r>
@@ -2896,7 +2898,7 @@
               <w:rPr>
                 <w:rFonts w:ascii="Old Standard TT" w:hAnsi="Old Standard TT"/>
                 <w:b w:val="0"/>
-                <w:sz w:val="17"/>
+                <w:sz w:val="16"/>
               </w:rPr>
               <w:t>T3 PAGE</w:t>
             </w:r>
@@ -2921,7 +2923,7 @@
               <w:rPr>
                 <w:rFonts w:ascii="Old Standard TT" w:hAnsi="Old Standard TT"/>
                 <w:b w:val="0"/>
-                <w:sz w:val="17"/>
+                <w:sz w:val="16"/>
               </w:rPr>
               <w:t>4 Inter-agent message boards</w:t>
             </w:r>
@@ -2941,9 +2943,9 @@
               <w:rPr>
                 <w:rFonts w:ascii="Old Standard TT" w:hAnsi="Old Standard TT"/>
                 <w:b w:val="0"/>
-                <w:sz w:val="17"/>
-              </w:rPr>
-              <w:t>OpenAI (Artifactory WebDAV), AISI (GitHub), wiki [5]</w:t>
+                <w:sz w:val="16"/>
+              </w:rPr>
+              <w:t>OpenAI (Artifactory WebDAV), AISI (GitHub), DSEWiki [5]</w:t>
             </w:r>
           </w:p>
         </w:tc>
@@ -2961,7 +2963,7 @@
               <w:rPr>
                 <w:rFonts w:ascii="Old Standard TT" w:hAnsi="Old Standard TT"/>
                 <w:b w:val="0"/>
-                <w:sz w:val="17"/>
+                <w:sz w:val="16"/>
               </w:rPr>
               <w:t>not covered</w:t>
             </w:r>
@@ -2986,7 +2988,7 @@
               <w:rPr>
                 <w:rFonts w:ascii="Old Standard TT" w:hAnsi="Old Standard TT"/>
                 <w:b w:val="0"/>
-                <w:sz w:val="17"/>
+                <w:sz w:val="16"/>
               </w:rPr>
               <w:t>5 Credential harvesting and reuse</w:t>
             </w:r>
@@ -3006,7 +3008,7 @@
               <w:rPr>
                 <w:rFonts w:ascii="Old Standard TT" w:hAnsi="Old Standard TT"/>
                 <w:b w:val="0"/>
-                <w:sz w:val="17"/>
+                <w:sz w:val="16"/>
               </w:rPr>
               <w:t>OpenAI, Anthropic</w:t>
             </w:r>
@@ -3026,7 +3028,7 @@
               <w:rPr>
                 <w:rFonts w:ascii="Old Standard TT" w:hAnsi="Old Standard TT"/>
                 <w:b w:val="0"/>
-                <w:sz w:val="17"/>
+                <w:sz w:val="16"/>
               </w:rPr>
               <w:t>not covered (env telemetry)</w:t>
             </w:r>
@@ -3051,7 +3053,7 @@
               <w:rPr>
                 <w:rFonts w:ascii="Old Standard TT" w:hAnsi="Old Standard TT"/>
                 <w:b w:val="0"/>
-                <w:sz w:val="17"/>
+                <w:sz w:val="16"/>
               </w:rPr>
               <w:t>6 Out-of-scope target enumeration</w:t>
             </w:r>
@@ -3071,7 +3073,7 @@
               <w:rPr>
                 <w:rFonts w:ascii="Old Standard TT" w:hAnsi="Old Standard TT"/>
                 <w:b w:val="0"/>
-                <w:sz w:val="17"/>
+                <w:sz w:val="16"/>
               </w:rPr>
               <w:t>Anthropic (~9,000 targets)</w:t>
             </w:r>
@@ -3091,7 +3093,7 @@
               <w:rPr>
                 <w:rFonts w:ascii="Old Standard TT" w:hAnsi="Old Standard TT"/>
                 <w:b w:val="0"/>
-                <w:sz w:val="17"/>
+                <w:sz w:val="16"/>
               </w:rPr>
               <w:t>T3 if a host is stated</w:t>
             </w:r>
@@ -3116,7 +3118,7 @@
               <w:rPr>
                 <w:rFonts w:ascii="Old Standard TT" w:hAnsi="Old Standard TT"/>
                 <w:b w:val="0"/>
-                <w:sz w:val="17"/>
+                <w:sz w:val="16"/>
               </w:rPr>
               <w:t>7 Persistence past a safe exit</w:t>
             </w:r>
@@ -3136,7 +3138,7 @@
               <w:rPr>
                 <w:rFonts w:ascii="Old Standard TT" w:hAnsi="Old Standard TT"/>
                 <w:b w:val="0"/>
-                <w:sz w:val="17"/>
+                <w:sz w:val="16"/>
               </w:rPr>
               <w:t>OpenAI (198/898 unsolved tasks)</w:t>
             </w:r>
@@ -3156,7 +3158,7 @@
               <w:rPr>
                 <w:rFonts w:ascii="Old Standard TT" w:hAnsi="Old Standard TT"/>
                 <w:b w:val="0"/>
-                <w:sz w:val="17"/>
+                <w:sz w:val="16"/>
               </w:rPr>
               <w:t>not covered (policy)</w:t>
             </w:r>
@@ -3181,7 +3183,7 @@
               <w:rPr>
                 <w:rFonts w:ascii="Old Standard TT" w:hAnsi="Old Standard TT"/>
                 <w:b w:val="0"/>
-                <w:sz w:val="17"/>
+                <w:sz w:val="16"/>
               </w:rPr>
               <w:t>8 Transcript / monitor tampering</w:t>
             </w:r>
@@ -3201,7 +3203,7 @@
               <w:rPr>
                 <w:rFonts w:ascii="Old Standard TT" w:hAnsi="Old Standard TT"/>
                 <w:b w:val="0"/>
-                <w:sz w:val="17"/>
+                <w:sz w:val="16"/>
               </w:rPr>
               <w:t>AISI, METR [13]</w:t>
             </w:r>
@@ -3221,7 +3223,7 @@
               <w:rPr>
                 <w:rFonts w:ascii="Old Standard TT" w:hAnsi="Old Standard TT"/>
                 <w:b w:val="0"/>
-                <w:sz w:val="17"/>
+                <w:sz w:val="16"/>
               </w:rPr>
               <w:t>not covered; defeats T3</w:t>
             </w:r>
@@ -3246,7 +3248,7 @@
               <w:rPr>
                 <w:rFonts w:ascii="Old Standard TT" w:hAnsi="Old Standard TT"/>
                 <w:b w:val="0"/>
-                <w:sz w:val="17"/>
+                <w:sz w:val="16"/>
               </w:rPr>
               <w:t>9 Goal adoption from peers</w:t>
             </w:r>
@@ -3266,7 +3268,7 @@
               <w:rPr>
                 <w:rFonts w:ascii="Old Standard TT" w:hAnsi="Old Standard TT"/>
                 <w:b w:val="0"/>
-                <w:sz w:val="17"/>
+                <w:sz w:val="16"/>
               </w:rPr>
               <w:t>OpenAI</w:t>
             </w:r>
@@ -3286,7 +3288,7 @@
               <w:rPr>
                 <w:rFonts w:ascii="Old Standard TT" w:hAnsi="Old Standard TT"/>
                 <w:b w:val="0"/>
-                <w:sz w:val="17"/>
+                <w:sz w:val="16"/>
               </w:rPr>
               <w:t>not covered</w:t>
             </w:r>

</xml_diff>

<commit_message>
report: clickable references and in-text citation links, looser leading, table caption spacing, appendices on a new page
</commit_message>
<xml_diff>
--- a/report/build/Sentinel_Apart_AIIR_Sprint_2026.docx
+++ b/report/build/Sentinel_Apart_AIIR_Sprint_2026.docx
@@ -4,7 +4,7 @@
   <w:body>
     <w:p>
       <w:pPr>
-        <w:spacing w:after="200" w:line="240" w:lineRule="auto"/>
+        <w:spacing w:after="200" w:line="274" w:lineRule="auto"/>
         <w:rPr>
           <w:rFonts w:ascii="Old Standard TT" w:cs="Old Standard TT" w:eastAsia="Old Standard TT" w:hAnsi="Old Standard TT"/>
           <w:sz w:val="12"/>
@@ -662,7 +662,7 @@
     </w:tbl>
     <w:p>
       <w:pPr>
-        <w:spacing w:line="240" w:lineRule="auto"/>
+        <w:spacing w:line="274" w:lineRule="auto"/>
         <w:rPr/>
       </w:pPr>
       <w:r>
@@ -684,7 +684,7 @@
     </w:p>
     <w:p>
       <w:pPr>
-        <w:spacing w:after="100" w:line="240" w:lineRule="auto"/>
+        <w:spacing w:after="100" w:line="274" w:lineRule="auto"/>
         <w:jc w:val="both"/>
       </w:pPr>
       <w:r>
@@ -692,12 +692,178 @@
           <w:rFonts w:ascii="Old Standard TT" w:hAnsi="Old Standard TT"/>
           <w:sz w:val="21"/>
         </w:rPr>
-        <w:t>In July 2026 two pre-release OpenAI models, running a cyber-capability evaluation with production refusal classifiers disabled, escaped their sandbox through a zero-day in the package-registry cache proxy that was their one permitted network egress, reached the open internet, and spent 11 to 13 July inside Hugging Face's production infrastructure [1, 2]. Hugging Face cut the attacker off on 13 July and disclosed on 16 July without knowing the origin; OpenAI attributed it on 21 July [1]. It was not the only case. Anthropic reported three incidents in its cyber evaluations, including one where the task prompt declared no internet access, a partner misconfiguration left it on, and the agent reached a real company that shared the fictional target's name; it was found months later by transcript review [3]. The UK AI Security Institute reported models on an intentionally internet-connected cyber range reaching GitHub over Tor, caught by a Tor egress alarm [4]. A separate channel, unconnected to the Hugging Face swarm, ran on a public wiki: OpenAI evaluation agents with read-only internet access probed DSEWiki, a dormant German programming wiki, from around 11 May, and from roughly 24 May to 22 June used it as a message board for task answers and sandbox workarounds, leaving on the order of 15,000 to 18,000 edits. Outside researchers found it by reading the wiki's public logs and published on 4 September; OpenAI acknowledged it the next day, saying the field has no agreed standard for reporting misalignment [5].</w:t>
-      </w:r>
-    </w:p>
-    <w:p>
-      <w:pPr>
-        <w:spacing w:after="100" w:line="240" w:lineRule="auto"/>
+        <w:t xml:space="preserve">In July 2026 two pre-release OpenAI models, running a cyber-capability evaluation with production refusal classifiers disabled, escaped their sandbox through a zero-day in the package-registry cache proxy that was their one permitted network egress, reached the open internet, and spent 11 to 13 July inside Hugging Face's production infrastructure </w:t>
+      </w:r>
+      <w:r>
+        <w:rPr>
+          <w:rFonts w:ascii="Old Standard TT" w:hAnsi="Old Standard TT"/>
+          <w:sz w:val="21"/>
+        </w:rPr>
+        <w:t>[</w:t>
+      </w:r>
+      <w:hyperlink w:anchor="ref1">
+        <w:r>
+          <w:rPr>
+            <w:rFonts w:ascii="Old Standard TT" w:hAnsi="Old Standard TT"/>
+            <w:color w:val="2E5C8A"/>
+          </w:rPr>
+          <w:t>1</w:t>
+        </w:r>
+      </w:hyperlink>
+      <w:r>
+        <w:rPr>
+          <w:rFonts w:ascii="Old Standard TT" w:hAnsi="Old Standard TT"/>
+          <w:sz w:val="21"/>
+        </w:rPr>
+        <w:t xml:space="preserve">, </w:t>
+      </w:r>
+      <w:hyperlink w:anchor="ref2">
+        <w:r>
+          <w:rPr>
+            <w:rFonts w:ascii="Old Standard TT" w:hAnsi="Old Standard TT"/>
+            <w:color w:val="2E5C8A"/>
+          </w:rPr>
+          <w:t>2</w:t>
+        </w:r>
+      </w:hyperlink>
+      <w:r>
+        <w:rPr>
+          <w:rFonts w:ascii="Old Standard TT" w:hAnsi="Old Standard TT"/>
+          <w:sz w:val="21"/>
+        </w:rPr>
+        <w:t>]</w:t>
+      </w:r>
+      <w:r>
+        <w:rPr>
+          <w:rFonts w:ascii="Old Standard TT" w:hAnsi="Old Standard TT"/>
+          <w:sz w:val="21"/>
+        </w:rPr>
+        <w:t xml:space="preserve">. Hugging Face cut the attacker off on 13 July and disclosed on 16 July without knowing the origin; OpenAI attributed it on 21 July </w:t>
+      </w:r>
+      <w:r>
+        <w:rPr>
+          <w:rFonts w:ascii="Old Standard TT" w:hAnsi="Old Standard TT"/>
+          <w:sz w:val="21"/>
+        </w:rPr>
+        <w:t>[</w:t>
+      </w:r>
+      <w:hyperlink w:anchor="ref1">
+        <w:r>
+          <w:rPr>
+            <w:rFonts w:ascii="Old Standard TT" w:hAnsi="Old Standard TT"/>
+            <w:color w:val="2E5C8A"/>
+          </w:rPr>
+          <w:t>1</w:t>
+        </w:r>
+      </w:hyperlink>
+      <w:r>
+        <w:rPr>
+          <w:rFonts w:ascii="Old Standard TT" w:hAnsi="Old Standard TT"/>
+          <w:sz w:val="21"/>
+        </w:rPr>
+        <w:t>]</w:t>
+      </w:r>
+      <w:r>
+        <w:rPr>
+          <w:rFonts w:ascii="Old Standard TT" w:hAnsi="Old Standard TT"/>
+          <w:sz w:val="21"/>
+        </w:rPr>
+        <w:t xml:space="preserve">. It was not the only case. Anthropic reported three incidents in its cyber evaluations, including one where the task prompt declared no internet access, a partner misconfiguration left it on, and the agent reached a real company that shared the fictional target's name; it was found months later by transcript review </w:t>
+      </w:r>
+      <w:r>
+        <w:rPr>
+          <w:rFonts w:ascii="Old Standard TT" w:hAnsi="Old Standard TT"/>
+          <w:sz w:val="21"/>
+        </w:rPr>
+        <w:t>[</w:t>
+      </w:r>
+      <w:hyperlink w:anchor="ref3">
+        <w:r>
+          <w:rPr>
+            <w:rFonts w:ascii="Old Standard TT" w:hAnsi="Old Standard TT"/>
+            <w:color w:val="2E5C8A"/>
+          </w:rPr>
+          <w:t>3</w:t>
+        </w:r>
+      </w:hyperlink>
+      <w:r>
+        <w:rPr>
+          <w:rFonts w:ascii="Old Standard TT" w:hAnsi="Old Standard TT"/>
+          <w:sz w:val="21"/>
+        </w:rPr>
+        <w:t>]</w:t>
+      </w:r>
+      <w:r>
+        <w:rPr>
+          <w:rFonts w:ascii="Old Standard TT" w:hAnsi="Old Standard TT"/>
+          <w:sz w:val="21"/>
+        </w:rPr>
+        <w:t xml:space="preserve">. The UK AI Security Institute reported models on an intentionally internet-connected cyber range reaching GitHub over Tor, caught by a Tor egress alarm </w:t>
+      </w:r>
+      <w:r>
+        <w:rPr>
+          <w:rFonts w:ascii="Old Standard TT" w:hAnsi="Old Standard TT"/>
+          <w:sz w:val="21"/>
+        </w:rPr>
+        <w:t>[</w:t>
+      </w:r>
+      <w:hyperlink w:anchor="ref4">
+        <w:r>
+          <w:rPr>
+            <w:rFonts w:ascii="Old Standard TT" w:hAnsi="Old Standard TT"/>
+            <w:color w:val="2E5C8A"/>
+          </w:rPr>
+          <w:t>4</w:t>
+        </w:r>
+      </w:hyperlink>
+      <w:r>
+        <w:rPr>
+          <w:rFonts w:ascii="Old Standard TT" w:hAnsi="Old Standard TT"/>
+          <w:sz w:val="21"/>
+        </w:rPr>
+        <w:t>]</w:t>
+      </w:r>
+      <w:r>
+        <w:rPr>
+          <w:rFonts w:ascii="Old Standard TT" w:hAnsi="Old Standard TT"/>
+          <w:sz w:val="21"/>
+        </w:rPr>
+        <w:t xml:space="preserve">. A separate channel, unconnected to the Hugging Face swarm, ran on a public wiki: OpenAI evaluation agents with read-only internet access probed DSEWiki, a dormant German programming wiki, from around 11 May, and from roughly 24 May to 22 June used it as a message board for task answers and sandbox workarounds, leaving on the order of 15,000 to 18,000 edits. Outside researchers found it by reading the wiki's public logs and published on 4 September; OpenAI acknowledged it the next day, saying the field has no agreed standard for reporting misalignment </w:t>
+      </w:r>
+      <w:r>
+        <w:rPr>
+          <w:rFonts w:ascii="Old Standard TT" w:hAnsi="Old Standard TT"/>
+          <w:sz w:val="21"/>
+        </w:rPr>
+        <w:t>[</w:t>
+      </w:r>
+      <w:hyperlink w:anchor="ref5">
+        <w:r>
+          <w:rPr>
+            <w:rFonts w:ascii="Old Standard TT" w:hAnsi="Old Standard TT"/>
+            <w:color w:val="2E5C8A"/>
+          </w:rPr>
+          <w:t>5</w:t>
+        </w:r>
+      </w:hyperlink>
+      <w:r>
+        <w:rPr>
+          <w:rFonts w:ascii="Old Standard TT" w:hAnsi="Old Standard TT"/>
+          <w:sz w:val="21"/>
+        </w:rPr>
+        <w:t>]</w:t>
+      </w:r>
+      <w:r>
+        <w:rPr>
+          <w:rFonts w:ascii="Old Standard TT" w:hAnsi="Old Standard TT"/>
+          <w:sz w:val="21"/>
+        </w:rPr>
+        <w:t>.</w:t>
+      </w:r>
+    </w:p>
+    <w:p>
+      <w:pPr>
+        <w:spacing w:after="100" w:line="274" w:lineRule="auto"/>
         <w:jc w:val="both"/>
       </w:pPr>
       <w:r>
@@ -705,12 +871,42 @@
           <w:rFonts w:ascii="Old Standard TT" w:hAnsi="Old Standard TT"/>
           <w:sz w:val="21"/>
         </w:rPr>
-        <w:t>These cases share a shape that is not "no monitor existed." In each one the operators knew the intended scope in prose: no internet; only the LLM API and the package proxy; only the range. Nowhere was that scope an artifact the transcript was checked against, and in every case the first signal came from somewhere else: an identity-API anomaly, a Tor alarm, a retrospective sweep, a stranger reading a wiki. Hugging Face's own post-mortem says its correlation stack existed but "failed to correctly raise the alert's criticality" [2]. The failure is one of scope attachment and attestation, and it is the failure Track 1 asks about: could a third party verify compliance without access to the lab's network?</w:t>
-      </w:r>
-    </w:p>
-    <w:p>
-      <w:pPr>
-        <w:spacing w:after="100" w:line="240" w:lineRule="auto"/>
+        <w:t xml:space="preserve">These cases share a shape that is not "no monitor existed." In each one the operators knew the intended scope in prose: no internet; only the LLM API and the package proxy; only the range. Nowhere was that scope an artifact the transcript was checked against, and in every case the first signal came from somewhere else: an identity-API anomaly, a Tor alarm, a retrospective sweep, a stranger reading a wiki. Hugging Face's own post-mortem says its correlation stack existed but "failed to correctly raise the alert's criticality" </w:t>
+      </w:r>
+      <w:r>
+        <w:rPr>
+          <w:rFonts w:ascii="Old Standard TT" w:hAnsi="Old Standard TT"/>
+          <w:sz w:val="21"/>
+        </w:rPr>
+        <w:t>[</w:t>
+      </w:r>
+      <w:hyperlink w:anchor="ref2">
+        <w:r>
+          <w:rPr>
+            <w:rFonts w:ascii="Old Standard TT" w:hAnsi="Old Standard TT"/>
+            <w:color w:val="2E5C8A"/>
+          </w:rPr>
+          <w:t>2</w:t>
+        </w:r>
+      </w:hyperlink>
+      <w:r>
+        <w:rPr>
+          <w:rFonts w:ascii="Old Standard TT" w:hAnsi="Old Standard TT"/>
+          <w:sz w:val="21"/>
+        </w:rPr>
+        <w:t>]</w:t>
+      </w:r>
+      <w:r>
+        <w:rPr>
+          <w:rFonts w:ascii="Old Standard TT" w:hAnsi="Old Standard TT"/>
+          <w:sz w:val="21"/>
+        </w:rPr>
+        <w:t>. The failure is one of scope attachment and attestation, and it is the failure Track 1 asks about: could a third party verify compliance without access to the lab's network?</w:t>
+      </w:r>
+    </w:p>
+    <w:p>
+      <w:pPr>
+        <w:spacing w:after="100" w:line="274" w:lineRule="auto"/>
         <w:jc w:val="both"/>
       </w:pPr>
       <w:r>
@@ -723,7 +919,7 @@
     </w:p>
     <w:p>
       <w:pPr>
-        <w:spacing w:after="80" w:line="240" w:lineRule="auto"/>
+        <w:spacing w:after="80" w:line="274" w:lineRule="auto"/>
         <w:ind w:left="432" w:hanging="288"/>
         <w:jc w:val="both"/>
       </w:pPr>
@@ -737,7 +933,7 @@
     </w:p>
     <w:p>
       <w:pPr>
-        <w:spacing w:after="80" w:line="240" w:lineRule="auto"/>
+        <w:spacing w:after="80" w:line="274" w:lineRule="auto"/>
         <w:ind w:left="432" w:hanging="288"/>
         <w:jc w:val="both"/>
       </w:pPr>
@@ -751,7 +947,7 @@
     </w:p>
     <w:p>
       <w:pPr>
-        <w:spacing w:after="80" w:line="240" w:lineRule="auto"/>
+        <w:spacing w:after="80" w:line="274" w:lineRule="auto"/>
         <w:ind w:left="432" w:hanging="288"/>
         <w:jc w:val="both"/>
       </w:pPr>
@@ -774,7 +970,7 @@
     </w:p>
     <w:p>
       <w:pPr>
-        <w:spacing w:after="100" w:line="240" w:lineRule="auto"/>
+        <w:spacing w:after="100" w:line="274" w:lineRule="auto"/>
         <w:jc w:val="both"/>
       </w:pPr>
       <w:r>
@@ -782,12 +978,192 @@
           <w:rFonts w:ascii="Old Standard TT" w:hAnsi="Old Standard TT"/>
           <w:sz w:val="21"/>
         </w:rPr>
-        <w:t>Trace monitors for agents exist and are good. Inspect Scout ships scanners over evaluation transcripts, including reward-hacking and evaluation-awareness scanners [6]; ControlArena [7] and SHADE-Arena [8] monitor for side tasks and sabotage; Apollo's Watcher reads transcripts for scheming [9]; OpenAI monitors chain-of-thought and states that such a monitor "would have caught the initial relevant activity" more than a day before the breach [1]. Preventive controls also exist: default-deny egress via Cilium or Squid FQDN allowlists, and ExploitGym itself ships a Squid firewall that permits only LLM API endpoints [10].</w:t>
-      </w:r>
-    </w:p>
-    <w:p>
-      <w:pPr>
-        <w:spacing w:after="100" w:line="240" w:lineRule="auto"/>
+        <w:t xml:space="preserve">Trace monitors for agents exist and are good. Inspect Scout ships scanners over evaluation transcripts, including reward-hacking and evaluation-awareness scanners </w:t>
+      </w:r>
+      <w:r>
+        <w:rPr>
+          <w:rFonts w:ascii="Old Standard TT" w:hAnsi="Old Standard TT"/>
+          <w:sz w:val="21"/>
+        </w:rPr>
+        <w:t>[</w:t>
+      </w:r>
+      <w:hyperlink w:anchor="ref6">
+        <w:r>
+          <w:rPr>
+            <w:rFonts w:ascii="Old Standard TT" w:hAnsi="Old Standard TT"/>
+            <w:color w:val="2E5C8A"/>
+          </w:rPr>
+          <w:t>6</w:t>
+        </w:r>
+      </w:hyperlink>
+      <w:r>
+        <w:rPr>
+          <w:rFonts w:ascii="Old Standard TT" w:hAnsi="Old Standard TT"/>
+          <w:sz w:val="21"/>
+        </w:rPr>
+        <w:t>]</w:t>
+      </w:r>
+      <w:r>
+        <w:rPr>
+          <w:rFonts w:ascii="Old Standard TT" w:hAnsi="Old Standard TT"/>
+          <w:sz w:val="21"/>
+        </w:rPr>
+        <w:t xml:space="preserve">; ControlArena </w:t>
+      </w:r>
+      <w:r>
+        <w:rPr>
+          <w:rFonts w:ascii="Old Standard TT" w:hAnsi="Old Standard TT"/>
+          <w:sz w:val="21"/>
+        </w:rPr>
+        <w:t>[</w:t>
+      </w:r>
+      <w:hyperlink w:anchor="ref7">
+        <w:r>
+          <w:rPr>
+            <w:rFonts w:ascii="Old Standard TT" w:hAnsi="Old Standard TT"/>
+            <w:color w:val="2E5C8A"/>
+          </w:rPr>
+          <w:t>7</w:t>
+        </w:r>
+      </w:hyperlink>
+      <w:r>
+        <w:rPr>
+          <w:rFonts w:ascii="Old Standard TT" w:hAnsi="Old Standard TT"/>
+          <w:sz w:val="21"/>
+        </w:rPr>
+        <w:t>]</w:t>
+      </w:r>
+      <w:r>
+        <w:rPr>
+          <w:rFonts w:ascii="Old Standard TT" w:hAnsi="Old Standard TT"/>
+          <w:sz w:val="21"/>
+        </w:rPr>
+        <w:t xml:space="preserve"> and SHADE-Arena </w:t>
+      </w:r>
+      <w:r>
+        <w:rPr>
+          <w:rFonts w:ascii="Old Standard TT" w:hAnsi="Old Standard TT"/>
+          <w:sz w:val="21"/>
+        </w:rPr>
+        <w:t>[</w:t>
+      </w:r>
+      <w:hyperlink w:anchor="ref8">
+        <w:r>
+          <w:rPr>
+            <w:rFonts w:ascii="Old Standard TT" w:hAnsi="Old Standard TT"/>
+            <w:color w:val="2E5C8A"/>
+          </w:rPr>
+          <w:t>8</w:t>
+        </w:r>
+      </w:hyperlink>
+      <w:r>
+        <w:rPr>
+          <w:rFonts w:ascii="Old Standard TT" w:hAnsi="Old Standard TT"/>
+          <w:sz w:val="21"/>
+        </w:rPr>
+        <w:t>]</w:t>
+      </w:r>
+      <w:r>
+        <w:rPr>
+          <w:rFonts w:ascii="Old Standard TT" w:hAnsi="Old Standard TT"/>
+          <w:sz w:val="21"/>
+        </w:rPr>
+        <w:t xml:space="preserve"> monitor for side tasks and sabotage; Apollo's Watcher reads transcripts for scheming </w:t>
+      </w:r>
+      <w:r>
+        <w:rPr>
+          <w:rFonts w:ascii="Old Standard TT" w:hAnsi="Old Standard TT"/>
+          <w:sz w:val="21"/>
+        </w:rPr>
+        <w:t>[</w:t>
+      </w:r>
+      <w:hyperlink w:anchor="ref9">
+        <w:r>
+          <w:rPr>
+            <w:rFonts w:ascii="Old Standard TT" w:hAnsi="Old Standard TT"/>
+            <w:color w:val="2E5C8A"/>
+          </w:rPr>
+          <w:t>9</w:t>
+        </w:r>
+      </w:hyperlink>
+      <w:r>
+        <w:rPr>
+          <w:rFonts w:ascii="Old Standard TT" w:hAnsi="Old Standard TT"/>
+          <w:sz w:val="21"/>
+        </w:rPr>
+        <w:t>]</w:t>
+      </w:r>
+      <w:r>
+        <w:rPr>
+          <w:rFonts w:ascii="Old Standard TT" w:hAnsi="Old Standard TT"/>
+          <w:sz w:val="21"/>
+        </w:rPr>
+        <w:t xml:space="preserve">; OpenAI monitors chain-of-thought and states that such a monitor "would have caught the initial relevant activity" more than a day before the breach </w:t>
+      </w:r>
+      <w:r>
+        <w:rPr>
+          <w:rFonts w:ascii="Old Standard TT" w:hAnsi="Old Standard TT"/>
+          <w:sz w:val="21"/>
+        </w:rPr>
+        <w:t>[</w:t>
+      </w:r>
+      <w:hyperlink w:anchor="ref1">
+        <w:r>
+          <w:rPr>
+            <w:rFonts w:ascii="Old Standard TT" w:hAnsi="Old Standard TT"/>
+            <w:color w:val="2E5C8A"/>
+          </w:rPr>
+          <w:t>1</w:t>
+        </w:r>
+      </w:hyperlink>
+      <w:r>
+        <w:rPr>
+          <w:rFonts w:ascii="Old Standard TT" w:hAnsi="Old Standard TT"/>
+          <w:sz w:val="21"/>
+        </w:rPr>
+        <w:t>]</w:t>
+      </w:r>
+      <w:r>
+        <w:rPr>
+          <w:rFonts w:ascii="Old Standard TT" w:hAnsi="Old Standard TT"/>
+          <w:sz w:val="21"/>
+        </w:rPr>
+        <w:t xml:space="preserve">. Preventive controls also exist: default-deny egress via Cilium or Squid FQDN allowlists, and ExploitGym itself ships a Squid firewall that permits only LLM API endpoints </w:t>
+      </w:r>
+      <w:r>
+        <w:rPr>
+          <w:rFonts w:ascii="Old Standard TT" w:hAnsi="Old Standard TT"/>
+          <w:sz w:val="21"/>
+        </w:rPr>
+        <w:t>[</w:t>
+      </w:r>
+      <w:hyperlink w:anchor="ref10">
+        <w:r>
+          <w:rPr>
+            <w:rFonts w:ascii="Old Standard TT" w:hAnsi="Old Standard TT"/>
+            <w:color w:val="2E5C8A"/>
+          </w:rPr>
+          <w:t>10</w:t>
+        </w:r>
+      </w:hyperlink>
+      <w:r>
+        <w:rPr>
+          <w:rFonts w:ascii="Old Standard TT" w:hAnsi="Old Standard TT"/>
+          <w:sz w:val="21"/>
+        </w:rPr>
+        <w:t>]</w:t>
+      </w:r>
+      <w:r>
+        <w:rPr>
+          <w:rFonts w:ascii="Old Standard TT" w:hAnsi="Old Standard TT"/>
+          <w:sz w:val="21"/>
+        </w:rPr>
+        <w:t>.</w:t>
+      </w:r>
+    </w:p>
+    <w:p>
+      <w:pPr>
+        <w:spacing w:after="100" w:line="274" w:lineRule="auto"/>
         <w:jc w:val="both"/>
       </w:pPr>
       <w:r>
@@ -818,7 +1194,7 @@
     </w:p>
     <w:p>
       <w:pPr>
-        <w:spacing w:after="100" w:line="240" w:lineRule="auto"/>
+        <w:spacing w:after="100" w:line="274" w:lineRule="auto"/>
         <w:jc w:val="both"/>
       </w:pPr>
       <w:r>
@@ -826,7 +1202,113 @@
           <w:rFonts w:ascii="Old Standard TT" w:hAnsi="Old Standard TT"/>
           <w:sz w:val="21"/>
         </w:rPr>
-        <w:t>An allowlist is a JSON file: name, internet_expected, allowed_hosts (exact hosts or .suffix entries), allowed_cidrs, and free-text notes recording why each entry is permitted. classify(host) returns ALLOWED, LOOPBACK, METADATA (the cloud instance-metadata addresses) or OUT. A wildcard entry "*" allows everything; it exists only so the ablation can express "no real scope." Three scopes are in the repo, one per incident: ExploitGym (LLM API endpoints plus the Artifactory package proxy, both documented as permitted [1, 10]), the Irregular CTF (an internal CIDR and one target host; internet declared off [3]), and the AISI range (range hosts, internet_expected true [4]).</w:t>
+        <w:t xml:space="preserve">An allowlist is a JSON file: name, internet_expected, allowed_hosts (exact hosts or .suffix entries), allowed_cidrs, and free-text notes recording why each entry is permitted. classify(host) returns ALLOWED, LOOPBACK, METADATA (the cloud instance-metadata addresses) or OUT. A wildcard entry "*" allows everything; it exists only so the ablation can express "no real scope." Three scopes are in the repo, one per incident: ExploitGym (LLM API endpoints plus the Artifactory package proxy, both documented as permitted </w:t>
+      </w:r>
+      <w:r>
+        <w:rPr>
+          <w:rFonts w:ascii="Old Standard TT" w:hAnsi="Old Standard TT"/>
+          <w:sz w:val="21"/>
+        </w:rPr>
+        <w:t>[</w:t>
+      </w:r>
+      <w:hyperlink w:anchor="ref1">
+        <w:r>
+          <w:rPr>
+            <w:rFonts w:ascii="Old Standard TT" w:hAnsi="Old Standard TT"/>
+            <w:color w:val="2E5C8A"/>
+          </w:rPr>
+          <w:t>1</w:t>
+        </w:r>
+      </w:hyperlink>
+      <w:r>
+        <w:rPr>
+          <w:rFonts w:ascii="Old Standard TT" w:hAnsi="Old Standard TT"/>
+          <w:sz w:val="21"/>
+        </w:rPr>
+        <w:t xml:space="preserve">, </w:t>
+      </w:r>
+      <w:hyperlink w:anchor="ref10">
+        <w:r>
+          <w:rPr>
+            <w:rFonts w:ascii="Old Standard TT" w:hAnsi="Old Standard TT"/>
+            <w:color w:val="2E5C8A"/>
+          </w:rPr>
+          <w:t>10</w:t>
+        </w:r>
+      </w:hyperlink>
+      <w:r>
+        <w:rPr>
+          <w:rFonts w:ascii="Old Standard TT" w:hAnsi="Old Standard TT"/>
+          <w:sz w:val="21"/>
+        </w:rPr>
+        <w:t>]</w:t>
+      </w:r>
+      <w:r>
+        <w:rPr>
+          <w:rFonts w:ascii="Old Standard TT" w:hAnsi="Old Standard TT"/>
+          <w:sz w:val="21"/>
+        </w:rPr>
+        <w:t xml:space="preserve">), the Irregular CTF (an internal CIDR and one target host; internet declared off </w:t>
+      </w:r>
+      <w:r>
+        <w:rPr>
+          <w:rFonts w:ascii="Old Standard TT" w:hAnsi="Old Standard TT"/>
+          <w:sz w:val="21"/>
+        </w:rPr>
+        <w:t>[</w:t>
+      </w:r>
+      <w:hyperlink w:anchor="ref3">
+        <w:r>
+          <w:rPr>
+            <w:rFonts w:ascii="Old Standard TT" w:hAnsi="Old Standard TT"/>
+            <w:color w:val="2E5C8A"/>
+          </w:rPr>
+          <w:t>3</w:t>
+        </w:r>
+      </w:hyperlink>
+      <w:r>
+        <w:rPr>
+          <w:rFonts w:ascii="Old Standard TT" w:hAnsi="Old Standard TT"/>
+          <w:sz w:val="21"/>
+        </w:rPr>
+        <w:t>]</w:t>
+      </w:r>
+      <w:r>
+        <w:rPr>
+          <w:rFonts w:ascii="Old Standard TT" w:hAnsi="Old Standard TT"/>
+          <w:sz w:val="21"/>
+        </w:rPr>
+        <w:t xml:space="preserve">), and the AISI range (range hosts, internet_expected true </w:t>
+      </w:r>
+      <w:r>
+        <w:rPr>
+          <w:rFonts w:ascii="Old Standard TT" w:hAnsi="Old Standard TT"/>
+          <w:sz w:val="21"/>
+        </w:rPr>
+        <w:t>[</w:t>
+      </w:r>
+      <w:hyperlink w:anchor="ref4">
+        <w:r>
+          <w:rPr>
+            <w:rFonts w:ascii="Old Standard TT" w:hAnsi="Old Standard TT"/>
+            <w:color w:val="2E5C8A"/>
+          </w:rPr>
+          <w:t>4</w:t>
+        </w:r>
+      </w:hyperlink>
+      <w:r>
+        <w:rPr>
+          <w:rFonts w:ascii="Old Standard TT" w:hAnsi="Old Standard TT"/>
+          <w:sz w:val="21"/>
+        </w:rPr>
+        <w:t>]</w:t>
+      </w:r>
+      <w:r>
+        <w:rPr>
+          <w:rFonts w:ascii="Old Standard TT" w:hAnsi="Old Standard TT"/>
+          <w:sz w:val="21"/>
+        </w:rPr>
+        <w:t>).</w:t>
       </w:r>
     </w:p>
     <w:p>
@@ -840,7 +1322,7 @@
     </w:p>
     <w:p>
       <w:pPr>
-        <w:spacing w:after="100" w:line="240" w:lineRule="auto"/>
+        <w:spacing w:after="100" w:line="274" w:lineRule="auto"/>
         <w:jc w:val="both"/>
       </w:pPr>
       <w:r>
@@ -862,7 +1344,7 @@
     </w:p>
     <w:p>
       <w:pPr>
-        <w:spacing w:after="100" w:line="240" w:lineRule="auto"/>
+        <w:spacing w:after="100" w:line="274" w:lineRule="auto"/>
         <w:jc w:val="both"/>
       </w:pPr>
       <w:r>
@@ -870,7 +1352,67 @@
           <w:rFonts w:ascii="Old Standard TT" w:hAnsi="Old Standard TT"/>
           <w:sz w:val="21"/>
         </w:rPr>
-        <w:t>T3, a stated destination classified OUT, is the only PAGE. T1 (reading grader or solution internals) and T2 (mount tables, cgroups, proxy enumeration, metadata addresses) are WARN and never page. The reason is base rates: in a capture-the-flag task, flag-seeking is the task, and reconnaissance of one's own box is routine. AISI's cheating study lists "probing evaluation software for solution leaks" as a cheating mode [11]; we surface it, we do not alarm on it. Gating on a predicate the environment can settle itself, rather than on a second model, follows scorer-integrity [12], which measured an LLM scheming-judge against an operative-action oracle over 599 Inspect gradings and noted that most environments offer no such predicate. Containment evaluations do: the allowlist.</w:t>
+        <w:t xml:space="preserve">T3, a stated destination classified OUT, is the only PAGE. T1 (reading grader or solution internals) and T2 (mount tables, cgroups, proxy enumeration, metadata addresses) are WARN and never page. The reason is base rates: in a capture-the-flag task, flag-seeking is the task, and reconnaissance of one's own box is routine. AISI's cheating study lists "probing evaluation software for solution leaks" as a cheating mode </w:t>
+      </w:r>
+      <w:r>
+        <w:rPr>
+          <w:rFonts w:ascii="Old Standard TT" w:hAnsi="Old Standard TT"/>
+          <w:sz w:val="21"/>
+        </w:rPr>
+        <w:t>[</w:t>
+      </w:r>
+      <w:hyperlink w:anchor="ref11">
+        <w:r>
+          <w:rPr>
+            <w:rFonts w:ascii="Old Standard TT" w:hAnsi="Old Standard TT"/>
+            <w:color w:val="2E5C8A"/>
+          </w:rPr>
+          <w:t>11</w:t>
+        </w:r>
+      </w:hyperlink>
+      <w:r>
+        <w:rPr>
+          <w:rFonts w:ascii="Old Standard TT" w:hAnsi="Old Standard TT"/>
+          <w:sz w:val="21"/>
+        </w:rPr>
+        <w:t>]</w:t>
+      </w:r>
+      <w:r>
+        <w:rPr>
+          <w:rFonts w:ascii="Old Standard TT" w:hAnsi="Old Standard TT"/>
+          <w:sz w:val="21"/>
+        </w:rPr>
+        <w:t xml:space="preserve">; we surface it, we do not alarm on it. Gating on a predicate the environment can settle itself, rather than on a second model, follows scorer-integrity </w:t>
+      </w:r>
+      <w:r>
+        <w:rPr>
+          <w:rFonts w:ascii="Old Standard TT" w:hAnsi="Old Standard TT"/>
+          <w:sz w:val="21"/>
+        </w:rPr>
+        <w:t>[</w:t>
+      </w:r>
+      <w:hyperlink w:anchor="ref12">
+        <w:r>
+          <w:rPr>
+            <w:rFonts w:ascii="Old Standard TT" w:hAnsi="Old Standard TT"/>
+            <w:color w:val="2E5C8A"/>
+          </w:rPr>
+          <w:t>12</w:t>
+        </w:r>
+      </w:hyperlink>
+      <w:r>
+        <w:rPr>
+          <w:rFonts w:ascii="Old Standard TT" w:hAnsi="Old Standard TT"/>
+          <w:sz w:val="21"/>
+        </w:rPr>
+        <w:t>]</w:t>
+      </w:r>
+      <w:r>
+        <w:rPr>
+          <w:rFonts w:ascii="Old Standard TT" w:hAnsi="Old Standard TT"/>
+          <w:sz w:val="21"/>
+        </w:rPr>
+        <w:t>, which measured an LLM scheming-judge against an operative-action oracle over 599 Inspect gradings and noted that most environments offer no such predicate. Containment evaluations do: the allowlist.</w:t>
       </w:r>
     </w:p>
     <w:p>
@@ -884,7 +1426,7 @@
     </w:p>
     <w:p>
       <w:pPr>
-        <w:spacing w:after="100" w:line="240" w:lineRule="auto"/>
+        <w:spacing w:after="100" w:line="274" w:lineRule="auto"/>
         <w:jc w:val="both"/>
       </w:pPr>
       <w:r>
@@ -906,7 +1448,7 @@
     </w:p>
     <w:p>
       <w:pPr>
-        <w:spacing w:after="100" w:line="240" w:lineRule="auto"/>
+        <w:spacing w:after="100" w:line="274" w:lineRule="auto"/>
         <w:jc w:val="both"/>
       </w:pPr>
       <w:r>
@@ -928,7 +1470,7 @@
     </w:p>
     <w:p>
       <w:pPr>
-        <w:spacing w:after="100" w:line="240" w:lineRule="auto"/>
+        <w:spacing w:after="100" w:line="274" w:lineRule="auto"/>
         <w:jc w:val="both"/>
       </w:pPr>
       <w:r>
@@ -972,12 +1514,12 @@
         <w:tblLayout w:type="fixed"/>
       </w:tblPr>
       <w:tblGrid>
-        <w:gridCol w:w="1958"/>
-        <w:gridCol w:w="864"/>
-        <w:gridCol w:w="1353"/>
+        <w:gridCol w:w="1843"/>
+        <w:gridCol w:w="979"/>
+        <w:gridCol w:w="1440"/>
         <w:gridCol w:w="2764"/>
-        <w:gridCol w:w="1180"/>
-        <w:gridCol w:w="1238"/>
+        <w:gridCol w:w="1123"/>
+        <w:gridCol w:w="1209"/>
       </w:tblGrid>
       <w:tr>
         <w:trPr>
@@ -985,7 +1527,7 @@
         </w:trPr>
         <w:tc>
           <w:tcPr>
-            <w:tcW w:type="dxa" w:w="1958"/>
+            <w:tcW w:type="dxa" w:w="1843"/>
           </w:tcPr>
           <w:p>
             <w:r>
@@ -1005,7 +1547,7 @@
         </w:tc>
         <w:tc>
           <w:tcPr>
-            <w:tcW w:type="dxa" w:w="864"/>
+            <w:tcW w:type="dxa" w:w="979"/>
           </w:tcPr>
           <w:p>
             <w:r>
@@ -1025,7 +1567,7 @@
         </w:tc>
         <w:tc>
           <w:tcPr>
-            <w:tcW w:type="dxa" w:w="1354"/>
+            <w:tcW w:type="dxa" w:w="1440"/>
           </w:tcPr>
           <w:p>
             <w:r>
@@ -1065,7 +1607,7 @@
         </w:tc>
         <w:tc>
           <w:tcPr>
-            <w:tcW w:type="dxa" w:w="1181"/>
+            <w:tcW w:type="dxa" w:w="1123"/>
           </w:tcPr>
           <w:p>
             <w:r>
@@ -1085,7 +1627,7 @@
         </w:tc>
         <w:tc>
           <w:tcPr>
-            <w:tcW w:type="dxa" w:w="1238"/>
+            <w:tcW w:type="dxa" w:w="1210"/>
           </w:tcPr>
           <w:p>
             <w:r>
@@ -1110,7 +1652,7 @@
         </w:trPr>
         <w:tc>
           <w:tcPr>
-            <w:tcW w:type="dxa" w:w="1958"/>
+            <w:tcW w:type="dxa" w:w="1843"/>
           </w:tcPr>
           <w:p>
             <w:r>
@@ -1130,7 +1672,7 @@
         </w:tc>
         <w:tc>
           <w:tcPr>
-            <w:tcW w:type="dxa" w:w="864"/>
+            <w:tcW w:type="dxa" w:w="979"/>
           </w:tcPr>
           <w:p>
             <w:r>
@@ -1150,7 +1692,7 @@
         </w:tc>
         <w:tc>
           <w:tcPr>
-            <w:tcW w:type="dxa" w:w="1354"/>
+            <w:tcW w:type="dxa" w:w="1440"/>
           </w:tcPr>
           <w:p>
             <w:r>
@@ -1190,7 +1732,7 @@
         </w:tc>
         <w:tc>
           <w:tcPr>
-            <w:tcW w:type="dxa" w:w="1181"/>
+            <w:tcW w:type="dxa" w:w="1123"/>
           </w:tcPr>
           <w:p>
             <w:r>
@@ -1210,7 +1752,7 @@
         </w:tc>
         <w:tc>
           <w:tcPr>
-            <w:tcW w:type="dxa" w:w="1238"/>
+            <w:tcW w:type="dxa" w:w="1210"/>
           </w:tcPr>
           <w:p>
             <w:r>
@@ -1235,7 +1777,7 @@
         </w:trPr>
         <w:tc>
           <w:tcPr>
-            <w:tcW w:type="dxa" w:w="1958"/>
+            <w:tcW w:type="dxa" w:w="1843"/>
           </w:tcPr>
           <w:p>
             <w:r>
@@ -1255,7 +1797,7 @@
         </w:tc>
         <w:tc>
           <w:tcPr>
-            <w:tcW w:type="dxa" w:w="864"/>
+            <w:tcW w:type="dxa" w:w="979"/>
           </w:tcPr>
           <w:p>
             <w:r>
@@ -1275,7 +1817,7 @@
         </w:tc>
         <w:tc>
           <w:tcPr>
-            <w:tcW w:type="dxa" w:w="1354"/>
+            <w:tcW w:type="dxa" w:w="1440"/>
           </w:tcPr>
           <w:p>
             <w:r>
@@ -1315,7 +1857,7 @@
         </w:tc>
         <w:tc>
           <w:tcPr>
-            <w:tcW w:type="dxa" w:w="1181"/>
+            <w:tcW w:type="dxa" w:w="1123"/>
           </w:tcPr>
           <w:p>
             <w:r>
@@ -1335,7 +1877,7 @@
         </w:tc>
         <w:tc>
           <w:tcPr>
-            <w:tcW w:type="dxa" w:w="1238"/>
+            <w:tcW w:type="dxa" w:w="1210"/>
           </w:tcPr>
           <w:p>
             <w:r>
@@ -1360,7 +1902,7 @@
         </w:trPr>
         <w:tc>
           <w:tcPr>
-            <w:tcW w:type="dxa" w:w="1958"/>
+            <w:tcW w:type="dxa" w:w="1843"/>
           </w:tcPr>
           <w:p>
             <w:r>
@@ -1380,7 +1922,7 @@
         </w:tc>
         <w:tc>
           <w:tcPr>
-            <w:tcW w:type="dxa" w:w="864"/>
+            <w:tcW w:type="dxa" w:w="979"/>
           </w:tcPr>
           <w:p>
             <w:r>
@@ -1400,7 +1942,7 @@
         </w:tc>
         <w:tc>
           <w:tcPr>
-            <w:tcW w:type="dxa" w:w="1354"/>
+            <w:tcW w:type="dxa" w:w="1440"/>
           </w:tcPr>
           <w:p>
             <w:r>
@@ -1440,7 +1982,7 @@
         </w:tc>
         <w:tc>
           <w:tcPr>
-            <w:tcW w:type="dxa" w:w="1181"/>
+            <w:tcW w:type="dxa" w:w="1123"/>
           </w:tcPr>
           <w:p>
             <w:r>
@@ -1460,7 +2002,7 @@
         </w:tc>
         <w:tc>
           <w:tcPr>
-            <w:tcW w:type="dxa" w:w="1238"/>
+            <w:tcW w:type="dxa" w:w="1210"/>
           </w:tcPr>
           <w:p>
             <w:r>
@@ -1485,7 +2027,7 @@
         </w:trPr>
         <w:tc>
           <w:tcPr>
-            <w:tcW w:type="dxa" w:w="1958"/>
+            <w:tcW w:type="dxa" w:w="1843"/>
           </w:tcPr>
           <w:p>
             <w:r>
@@ -1505,7 +2047,7 @@
         </w:tc>
         <w:tc>
           <w:tcPr>
-            <w:tcW w:type="dxa" w:w="864"/>
+            <w:tcW w:type="dxa" w:w="979"/>
           </w:tcPr>
           <w:p>
             <w:r>
@@ -1525,7 +2067,7 @@
         </w:tc>
         <w:tc>
           <w:tcPr>
-            <w:tcW w:type="dxa" w:w="1354"/>
+            <w:tcW w:type="dxa" w:w="1440"/>
           </w:tcPr>
           <w:p>
             <w:r>
@@ -1565,7 +2107,7 @@
         </w:tc>
         <w:tc>
           <w:tcPr>
-            <w:tcW w:type="dxa" w:w="1181"/>
+            <w:tcW w:type="dxa" w:w="1123"/>
           </w:tcPr>
           <w:p>
             <w:r>
@@ -1585,7 +2127,7 @@
         </w:tc>
         <w:tc>
           <w:tcPr>
-            <w:tcW w:type="dxa" w:w="1238"/>
+            <w:tcW w:type="dxa" w:w="1210"/>
           </w:tcPr>
           <w:p>
             <w:r>
@@ -1610,7 +2152,7 @@
         </w:trPr>
         <w:tc>
           <w:tcPr>
-            <w:tcW w:type="dxa" w:w="1958"/>
+            <w:tcW w:type="dxa" w:w="1843"/>
           </w:tcPr>
           <w:p>
             <w:r>
@@ -1630,7 +2172,7 @@
         </w:tc>
         <w:tc>
           <w:tcPr>
-            <w:tcW w:type="dxa" w:w="864"/>
+            <w:tcW w:type="dxa" w:w="979"/>
           </w:tcPr>
           <w:p>
             <w:r>
@@ -1650,7 +2192,7 @@
         </w:tc>
         <w:tc>
           <w:tcPr>
-            <w:tcW w:type="dxa" w:w="1354"/>
+            <w:tcW w:type="dxa" w:w="1440"/>
           </w:tcPr>
           <w:p>
             <w:r>
@@ -1690,7 +2232,7 @@
         </w:tc>
         <w:tc>
           <w:tcPr>
-            <w:tcW w:type="dxa" w:w="1181"/>
+            <w:tcW w:type="dxa" w:w="1123"/>
           </w:tcPr>
           <w:p>
             <w:r>
@@ -1710,7 +2252,7 @@
         </w:tc>
         <w:tc>
           <w:tcPr>
-            <w:tcW w:type="dxa" w:w="1238"/>
+            <w:tcW w:type="dxa" w:w="1210"/>
           </w:tcPr>
           <w:p>
             <w:r>
@@ -1735,7 +2277,7 @@
         </w:trPr>
         <w:tc>
           <w:tcPr>
-            <w:tcW w:type="dxa" w:w="1958"/>
+            <w:tcW w:type="dxa" w:w="1843"/>
           </w:tcPr>
           <w:p>
             <w:r>
@@ -1755,7 +2297,7 @@
         </w:tc>
         <w:tc>
           <w:tcPr>
-            <w:tcW w:type="dxa" w:w="864"/>
+            <w:tcW w:type="dxa" w:w="979"/>
           </w:tcPr>
           <w:p>
             <w:r>
@@ -1775,7 +2317,7 @@
         </w:tc>
         <w:tc>
           <w:tcPr>
-            <w:tcW w:type="dxa" w:w="1354"/>
+            <w:tcW w:type="dxa" w:w="1440"/>
           </w:tcPr>
           <w:p>
             <w:r>
@@ -1815,7 +2357,7 @@
         </w:tc>
         <w:tc>
           <w:tcPr>
-            <w:tcW w:type="dxa" w:w="1181"/>
+            <w:tcW w:type="dxa" w:w="1123"/>
           </w:tcPr>
           <w:p>
             <w:r>
@@ -1835,7 +2377,7 @@
         </w:tc>
         <w:tc>
           <w:tcPr>
-            <w:tcW w:type="dxa" w:w="1238"/>
+            <w:tcW w:type="dxa" w:w="1210"/>
           </w:tcPr>
           <w:p>
             <w:r>
@@ -1860,7 +2402,7 @@
         </w:trPr>
         <w:tc>
           <w:tcPr>
-            <w:tcW w:type="dxa" w:w="1958"/>
+            <w:tcW w:type="dxa" w:w="1843"/>
           </w:tcPr>
           <w:p>
             <w:r>
@@ -1880,7 +2422,7 @@
         </w:tc>
         <w:tc>
           <w:tcPr>
-            <w:tcW w:type="dxa" w:w="864"/>
+            <w:tcW w:type="dxa" w:w="979"/>
           </w:tcPr>
           <w:p>
             <w:r>
@@ -1900,7 +2442,7 @@
         </w:tc>
         <w:tc>
           <w:tcPr>
-            <w:tcW w:type="dxa" w:w="1354"/>
+            <w:tcW w:type="dxa" w:w="1440"/>
           </w:tcPr>
           <w:p>
             <w:r>
@@ -1940,7 +2482,7 @@
         </w:tc>
         <w:tc>
           <w:tcPr>
-            <w:tcW w:type="dxa" w:w="1181"/>
+            <w:tcW w:type="dxa" w:w="1123"/>
           </w:tcPr>
           <w:p>
             <w:r>
@@ -1960,7 +2502,7 @@
         </w:tc>
         <w:tc>
           <w:tcPr>
-            <w:tcW w:type="dxa" w:w="1238"/>
+            <w:tcW w:type="dxa" w:w="1210"/>
           </w:tcPr>
           <w:p>
             <w:r>
@@ -1982,7 +2524,7 @@
     </w:tbl>
     <w:p>
       <w:pPr>
-        <w:spacing w:after="160" w:line="240" w:lineRule="auto"/>
+        <w:spacing w:before="140" w:after="200" w:line="274" w:lineRule="auto"/>
       </w:pPr>
       <w:r>
         <w:rPr>
@@ -1995,7 +2537,7 @@
     </w:p>
     <w:p>
       <w:pPr>
-        <w:spacing w:after="100" w:line="240" w:lineRule="auto"/>
+        <w:spacing w:after="100" w:line="274" w:lineRule="auto"/>
         <w:jc w:val="both"/>
       </w:pPr>
       <w:r>
@@ -2018,7 +2560,7 @@
     <w:p>
       <w:pPr>
         <w:keepNext/>
-        <w:spacing w:before="120" w:line="240" w:lineRule="auto"/>
+        <w:spacing w:before="120" w:line="274" w:lineRule="auto"/>
         <w:jc w:val="center"/>
       </w:pPr>
       <w:r>
@@ -2062,7 +2604,7 @@
     </w:p>
     <w:p>
       <w:pPr>
-        <w:spacing w:before="120" w:after="200" w:line="240" w:lineRule="auto"/>
+        <w:spacing w:before="120" w:after="200" w:line="274" w:lineRule="auto"/>
       </w:pPr>
       <w:r>
         <w:rPr>
@@ -2075,7 +2617,7 @@
     </w:p>
     <w:p>
       <w:pPr>
-        <w:spacing w:after="100" w:line="240" w:lineRule="auto"/>
+        <w:spacing w:after="100" w:line="274" w:lineRule="auto"/>
         <w:jc w:val="both"/>
       </w:pPr>
       <w:r>
@@ -2097,7 +2639,7 @@
     </w:p>
     <w:p>
       <w:pPr>
-        <w:spacing w:after="100" w:line="240" w:lineRule="auto"/>
+        <w:spacing w:after="100" w:line="274" w:lineRule="auto"/>
         <w:jc w:val="both"/>
       </w:pPr>
       <w:r>
@@ -2105,13 +2647,43 @@
           <w:rFonts w:ascii="Old Standard TT" w:hAnsi="Old Standard TT"/>
           <w:sz w:val="21"/>
         </w:rPr>
-        <w:t>Under the correct scope the page lands at event 3. Event 2, the request to the permitted proxy, is already the escape: the SSRF went through an allowlisted host, and an allowlist-relative rule classifies that request as ALLOWED. We test this as a known blind spot rather than hide it. The right reading of PAGE @3 is the first auditable evidence of out-of-scope egress, which in the reconstruction precedes the production intrusion (events 5 and 6) and the organisation's own detection (event 6). It is not "this would have stopped the breach." Prevention is default-deny egress plus a hardened permitted proxy, and a trace scanner supplies neither. The DSEWiki case has the same shape: the sandbox permitted only GET requests, and the wiki accepts page edits over GET [5]. In both public escapes the agent went through the scope, not around it. An allowlist-relative scanner is blind to that by construction; what it would still have recorded is the destination host, dsewiki.de, had the declared scope named which hosts read access was for.</w:t>
+        <w:t xml:space="preserve">Under the correct scope the page lands at event 3. Event 2, the request to the permitted proxy, is already the escape: the SSRF went through an allowlisted host, and an allowlist-relative rule classifies that request as ALLOWED. We test this as a known blind spot rather than hide it. The right reading of PAGE @3 is the first auditable evidence of out-of-scope egress, which in the reconstruction precedes the production intrusion (events 5 and 6) and the organisation's own detection (event 6). It is not "this would have stopped the breach." Prevention is default-deny egress plus a hardened permitted proxy, and a trace scanner supplies neither. The DSEWiki case has the same shape: the sandbox permitted only GET requests, and the wiki accepts page edits over GET </w:t>
+      </w:r>
+      <w:r>
+        <w:rPr>
+          <w:rFonts w:ascii="Old Standard TT" w:hAnsi="Old Standard TT"/>
+          <w:sz w:val="21"/>
+        </w:rPr>
+        <w:t>[</w:t>
+      </w:r>
+      <w:hyperlink w:anchor="ref5">
+        <w:r>
+          <w:rPr>
+            <w:rFonts w:ascii="Old Standard TT" w:hAnsi="Old Standard TT"/>
+            <w:color w:val="2E5C8A"/>
+          </w:rPr>
+          <w:t>5</w:t>
+        </w:r>
+      </w:hyperlink>
+      <w:r>
+        <w:rPr>
+          <w:rFonts w:ascii="Old Standard TT" w:hAnsi="Old Standard TT"/>
+          <w:sz w:val="21"/>
+        </w:rPr>
+        <w:t>]</w:t>
+      </w:r>
+      <w:r>
+        <w:rPr>
+          <w:rFonts w:ascii="Old Standard TT" w:hAnsi="Old Standard TT"/>
+          <w:sz w:val="21"/>
+        </w:rPr>
+        <w:t>. In both public escapes the agent went through the scope, not around it. An allowlist-relative scanner is blind to that by construction; what it would still have recorded is the destination host, dsewiki.de, had the declared scope named which hosts read access was for.</w:t>
       </w:r>
     </w:p>
     <w:p>
       <w:pPr>
         <w:keepNext/>
-        <w:spacing w:before="120" w:line="240" w:lineRule="auto"/>
+        <w:spacing w:before="120" w:line="274" w:lineRule="auto"/>
         <w:jc w:val="center"/>
       </w:pPr>
       <w:r>
@@ -2155,7 +2727,7 @@
     </w:p>
     <w:p>
       <w:pPr>
-        <w:spacing w:before="120" w:after="200" w:line="240" w:lineRule="auto"/>
+        <w:spacing w:before="120" w:after="200" w:line="274" w:lineRule="auto"/>
       </w:pPr>
       <w:r>
         <w:rPr>
@@ -2177,7 +2749,7 @@
     </w:p>
     <w:p>
       <w:pPr>
-        <w:spacing w:after="100" w:line="240" w:lineRule="auto"/>
+        <w:spacing w:after="100" w:line="274" w:lineRule="auto"/>
         <w:jc w:val="both"/>
       </w:pPr>
       <w:r>
@@ -2199,7 +2771,7 @@
     </w:p>
     <w:p>
       <w:pPr>
-        <w:spacing w:after="100" w:line="240" w:lineRule="auto"/>
+        <w:spacing w:after="100" w:line="274" w:lineRule="auto"/>
         <w:jc w:val="both"/>
       </w:pPr>
       <w:r>
@@ -2207,7 +2779,67 @@
           <w:rFonts w:ascii="Old Standard TT" w:hAnsi="Old Standard TT"/>
           <w:sz w:val="21"/>
         </w:rPr>
-        <w:t>Theory of change. A lab attaches an allowlist to each evaluation class, with notes on why each entry is permitted. Sentinel runs offline over the campaign's Inspect logs in minutes, with no API key. The lab publishes the allowlist, the per-run verdicts and the first out-of-scope index; a third party replays the verdict from those files. Two kinds of third party can: an auditor or an affected partner who has been given the files, and the Commission, which under Article 91 of the AI Act may require a provider of a general-purpose AI model to hand over documentation necessary to assess compliance. The first needs cooperation; only the second can compel. The cost of adoption is writing the allowlist, and that is the point: the artifact forces the scope to exist. This sits under, not beside, what the labs have already said they will build. AISI asks for monitoring "able to flag or block out-of-scope actions as they happen" with scope "limited in advance" [4]; OpenAI now requires chain-of-thought monitoring for tool-using runs [1]. Both need a machine-readable statement of what out-of-scope means. Adding layer 3 (Figure 2), the same allowlist diffed against egress flow logs, would let a lab attest isolation rather than assume it, which is the failure in the Anthropic name-collision case.</w:t>
+        <w:t xml:space="preserve">Theory of change. A lab attaches an allowlist to each evaluation class, with notes on why each entry is permitted. Sentinel runs offline over the campaign's Inspect logs in minutes, with no API key. The lab publishes the allowlist, the per-run verdicts and the first out-of-scope index; a third party replays the verdict from those files. Two kinds of third party can: an auditor or an affected partner who has been given the files, and the Commission, which under Article 91 of the AI Act may require a provider of a general-purpose AI model to hand over documentation necessary to assess compliance. The first needs cooperation; only the second can compel. The cost of adoption is writing the allowlist, and that is the point: the artifact forces the scope to exist. This sits under, not beside, what the labs have already said they will build. AISI asks for monitoring "able to flag or block out-of-scope actions as they happen" with scope "limited in advance" </w:t>
+      </w:r>
+      <w:r>
+        <w:rPr>
+          <w:rFonts w:ascii="Old Standard TT" w:hAnsi="Old Standard TT"/>
+          <w:sz w:val="21"/>
+        </w:rPr>
+        <w:t>[</w:t>
+      </w:r>
+      <w:hyperlink w:anchor="ref4">
+        <w:r>
+          <w:rPr>
+            <w:rFonts w:ascii="Old Standard TT" w:hAnsi="Old Standard TT"/>
+            <w:color w:val="2E5C8A"/>
+          </w:rPr>
+          <w:t>4</w:t>
+        </w:r>
+      </w:hyperlink>
+      <w:r>
+        <w:rPr>
+          <w:rFonts w:ascii="Old Standard TT" w:hAnsi="Old Standard TT"/>
+          <w:sz w:val="21"/>
+        </w:rPr>
+        <w:t>]</w:t>
+      </w:r>
+      <w:r>
+        <w:rPr>
+          <w:rFonts w:ascii="Old Standard TT" w:hAnsi="Old Standard TT"/>
+          <w:sz w:val="21"/>
+        </w:rPr>
+        <w:t xml:space="preserve">; OpenAI now requires chain-of-thought monitoring for tool-using runs </w:t>
+      </w:r>
+      <w:r>
+        <w:rPr>
+          <w:rFonts w:ascii="Old Standard TT" w:hAnsi="Old Standard TT"/>
+          <w:sz w:val="21"/>
+        </w:rPr>
+        <w:t>[</w:t>
+      </w:r>
+      <w:hyperlink w:anchor="ref1">
+        <w:r>
+          <w:rPr>
+            <w:rFonts w:ascii="Old Standard TT" w:hAnsi="Old Standard TT"/>
+            <w:color w:val="2E5C8A"/>
+          </w:rPr>
+          <w:t>1</w:t>
+        </w:r>
+      </w:hyperlink>
+      <w:r>
+        <w:rPr>
+          <w:rFonts w:ascii="Old Standard TT" w:hAnsi="Old Standard TT"/>
+          <w:sz w:val="21"/>
+        </w:rPr>
+        <w:t>]</w:t>
+      </w:r>
+      <w:r>
+        <w:rPr>
+          <w:rFonts w:ascii="Old Standard TT" w:hAnsi="Old Standard TT"/>
+          <w:sz w:val="21"/>
+        </w:rPr>
+        <w:t>. Both need a machine-readable statement of what out-of-scope means. Adding layer 3 (Figure 2), the same allowlist diffed against egress flow logs, would let a lab attest isolation rather than assume it, which is the failure in the Anthropic name-collision case.</w:t>
       </w:r>
     </w:p>
     <w:p>
@@ -2221,7 +2853,7 @@
     </w:p>
     <w:p>
       <w:pPr>
-        <w:spacing w:after="80" w:line="240" w:lineRule="auto"/>
+        <w:spacing w:after="80" w:line="274" w:lineRule="auto"/>
         <w:ind w:left="432" w:hanging="288"/>
         <w:jc w:val="both"/>
       </w:pPr>
@@ -2230,12 +2862,42 @@
           <w:rFonts w:ascii="Old Standard TT" w:hAnsi="Old Standard TT"/>
           <w:sz w:val="21"/>
         </w:rPr>
-        <w:t>•  The positive fixtures are reconstructions of four to seven events written from public descriptions; Hugging Face logged about 17,600 attacker actions [2]. No lab has released raw evaluation transcripts. Nothing here measures detection inside OpenAI, Anthropic or AISI, and "events earlier" is a statement about our reconstruction.</w:t>
-      </w:r>
-    </w:p>
-    <w:p>
-      <w:pPr>
-        <w:spacing w:after="80" w:line="240" w:lineRule="auto"/>
+        <w:t xml:space="preserve">•  The positive fixtures are reconstructions of four to seven events written from public descriptions; Hugging Face logged about 17,600 attacker actions </w:t>
+      </w:r>
+      <w:r>
+        <w:rPr>
+          <w:rFonts w:ascii="Old Standard TT" w:hAnsi="Old Standard TT"/>
+          <w:sz w:val="21"/>
+        </w:rPr>
+        <w:t>[</w:t>
+      </w:r>
+      <w:hyperlink w:anchor="ref2">
+        <w:r>
+          <w:rPr>
+            <w:rFonts w:ascii="Old Standard TT" w:hAnsi="Old Standard TT"/>
+            <w:color w:val="2E5C8A"/>
+          </w:rPr>
+          <w:t>2</w:t>
+        </w:r>
+      </w:hyperlink>
+      <w:r>
+        <w:rPr>
+          <w:rFonts w:ascii="Old Standard TT" w:hAnsi="Old Standard TT"/>
+          <w:sz w:val="21"/>
+        </w:rPr>
+        <w:t>]</w:t>
+      </w:r>
+      <w:r>
+        <w:rPr>
+          <w:rFonts w:ascii="Old Standard TT" w:hAnsi="Old Standard TT"/>
+          <w:sz w:val="21"/>
+        </w:rPr>
+        <w:t>. No lab has released raw evaluation transcripts. Nothing here measures detection inside OpenAI, Anthropic or AISI, and "events earlier" is a statement about our reconstruction.</w:t>
+      </w:r>
+    </w:p>
+    <w:p>
+      <w:pPr>
+        <w:spacing w:after="80" w:line="274" w:lineRule="auto"/>
         <w:ind w:left="432" w:hanging="288"/>
         <w:jc w:val="both"/>
       </w:pPr>
@@ -2249,7 +2911,7 @@
     </w:p>
     <w:p>
       <w:pPr>
-        <w:spacing w:after="80" w:line="240" w:lineRule="auto"/>
+        <w:spacing w:after="80" w:line="274" w:lineRule="auto"/>
         <w:ind w:left="432" w:hanging="288"/>
         <w:jc w:val="both"/>
       </w:pPr>
@@ -2258,12 +2920,42 @@
           <w:rFonts w:ascii="Old Standard TT" w:hAnsi="Old Standard TT"/>
           <w:sz w:val="21"/>
         </w:rPr>
-        <w:t>•  Sentinel reads declared arguments. In its investigation of the Hugging Face incident, METR reports that roughly 7% of the transcripts it evaluated were successfully spoofed in some places [13]; a determined agent can state one destination and reach another. Layer 3 is the answer; it is not built.</w:t>
-      </w:r>
-    </w:p>
-    <w:p>
-      <w:pPr>
-        <w:spacing w:after="80" w:line="240" w:lineRule="auto"/>
+        <w:t xml:space="preserve">•  Sentinel reads declared arguments. In its investigation of the Hugging Face incident, METR reports that roughly 7% of the transcripts it evaluated were successfully spoofed in some places </w:t>
+      </w:r>
+      <w:r>
+        <w:rPr>
+          <w:rFonts w:ascii="Old Standard TT" w:hAnsi="Old Standard TT"/>
+          <w:sz w:val="21"/>
+        </w:rPr>
+        <w:t>[</w:t>
+      </w:r>
+      <w:hyperlink w:anchor="ref13">
+        <w:r>
+          <w:rPr>
+            <w:rFonts w:ascii="Old Standard TT" w:hAnsi="Old Standard TT"/>
+            <w:color w:val="2E5C8A"/>
+          </w:rPr>
+          <w:t>13</w:t>
+        </w:r>
+      </w:hyperlink>
+      <w:r>
+        <w:rPr>
+          <w:rFonts w:ascii="Old Standard TT" w:hAnsi="Old Standard TT"/>
+          <w:sz w:val="21"/>
+        </w:rPr>
+        <w:t>]</w:t>
+      </w:r>
+      <w:r>
+        <w:rPr>
+          <w:rFonts w:ascii="Old Standard TT" w:hAnsi="Old Standard TT"/>
+          <w:sz w:val="21"/>
+        </w:rPr>
+        <w:t>; a determined agent can state one destination and reach another. Layer 3 is the answer; it is not built.</w:t>
+      </w:r>
+    </w:p>
+    <w:p>
+      <w:pPr>
+        <w:spacing w:after="80" w:line="274" w:lineRule="auto"/>
         <w:ind w:left="432" w:hanging="288"/>
         <w:jc w:val="both"/>
       </w:pPr>
@@ -2277,7 +2969,7 @@
     </w:p>
     <w:p>
       <w:pPr>
-        <w:spacing w:after="80" w:line="240" w:lineRule="auto"/>
+        <w:spacing w:after="80" w:line="274" w:lineRule="auto"/>
         <w:ind w:left="432" w:hanging="288"/>
         <w:jc w:val="both"/>
       </w:pPr>
@@ -2291,7 +2983,7 @@
     </w:p>
     <w:p>
       <w:pPr>
-        <w:spacing w:after="80" w:line="240" w:lineRule="auto"/>
+        <w:spacing w:after="80" w:line="274" w:lineRule="auto"/>
         <w:ind w:left="432" w:hanging="288"/>
         <w:jc w:val="both"/>
       </w:pPr>
@@ -2314,7 +3006,7 @@
     </w:p>
     <w:p>
       <w:pPr>
-        <w:spacing w:after="100" w:line="240" w:lineRule="auto"/>
+        <w:spacing w:after="100" w:line="274" w:lineRule="auto"/>
         <w:jc w:val="both"/>
       </w:pPr>
       <w:r>
@@ -2336,7 +3028,7 @@
     </w:p>
     <w:p>
       <w:pPr>
-        <w:spacing w:after="100" w:line="240" w:lineRule="auto"/>
+        <w:spacing w:after="100" w:line="274" w:lineRule="auto"/>
         <w:jc w:val="both"/>
       </w:pPr>
       <w:r>
@@ -2358,7 +3050,7 @@
     </w:p>
     <w:p>
       <w:pPr>
-        <w:spacing w:after="100" w:line="240" w:lineRule="auto"/>
+        <w:spacing w:after="100" w:line="274" w:lineRule="auto"/>
         <w:jc w:val="both"/>
       </w:pPr>
       <w:r>
@@ -2366,7 +3058,23 @@
           <w:rFonts w:ascii="Old Standard TT" w:hAnsi="Old Standard TT"/>
           <w:sz w:val="21"/>
         </w:rPr>
-        <w:t>Code repository: https://github.com/crishN144/sentinel-evals (Apache-2.0, matching ExploitGym). Fixtures, allowlists, the ablation script and the 15 tests are in the repository; python -m pytest reproduces every number here with no model and no API key. No lab transcripts are included because none are public. No datasets were used.</w:t>
+        <w:t xml:space="preserve">Code repository: </w:t>
+      </w:r>
+      <w:hyperlink r:id="rId10">
+        <w:r>
+          <w:rPr>
+            <w:rFonts w:ascii="Old Standard TT" w:hAnsi="Old Standard TT"/>
+            <w:color w:val="2E5C8A"/>
+          </w:rPr>
+          <w:t>https://github.com/crishN144/sentinel-evals</w:t>
+        </w:r>
+      </w:hyperlink>
+      <w:r>
+        <w:rPr>
+          <w:rFonts w:ascii="Old Standard TT" w:hAnsi="Old Standard TT"/>
+          <w:sz w:val="21"/>
+        </w:rPr>
+        <w:t xml:space="preserve"> (Apache-2.0, matching ExploitGym). Fixtures, allowlists, the ablation script and the 15 tests are in the repository; python -m pytest reproduces every number here with no model and no API key. No lab transcripts are included because none are public. No datasets were used.</w:t>
       </w:r>
     </w:p>
     <w:p>
@@ -2380,7 +3088,7 @@
     </w:p>
     <w:p>
       <w:pPr>
-        <w:spacing w:after="100" w:line="240" w:lineRule="auto"/>
+        <w:spacing w:after="100" w:line="274" w:lineRule="auto"/>
         <w:jc w:val="both"/>
       </w:pPr>
       <w:r>
@@ -2401,191 +3109,415 @@
       </w:r>
     </w:p>
     <w:p>
-      <w:pPr>
-        <w:spacing w:after="100" w:line="240" w:lineRule="auto"/>
+      <w:bookmarkStart w:id="1" w:name="ref1"/>
+      <w:pPr>
+        <w:spacing w:after="80" w:line="274" w:lineRule="auto"/>
+        <w:ind w:left="403" w:hanging="403"/>
         <w:jc w:val="both"/>
       </w:pPr>
       <w:r>
         <w:rPr>
           <w:rFonts w:ascii="Old Standard TT" w:hAnsi="Old Standard TT"/>
-          <w:sz w:val="21"/>
-        </w:rPr>
-        <w:t>[1] OpenAI, 2026. Hugging Face model evaluation security incident (21 July, revised twice) and The Hugging Face incident and the road ahead. openai.com/index/hugging-face-model-evaluation-security-incident; openai.com/index/hugging-face-incident-and-the-road-ahead</w:t>
-      </w:r>
-    </w:p>
-    <w:p>
-      <w:pPr>
-        <w:spacing w:after="100" w:line="240" w:lineRule="auto"/>
+          <w:sz w:val="20"/>
+        </w:rPr>
+        <w:t xml:space="preserve">[1] OpenAI, 2026. Hugging Face model evaluation security incident (21 July, revised twice) and The Hugging Face incident and the road ahead. </w:t>
+      </w:r>
+      <w:hyperlink r:id="rId11">
+        <w:r>
+          <w:rPr>
+            <w:rFonts w:ascii="Old Standard TT" w:hAnsi="Old Standard TT"/>
+            <w:color w:val="2E5C8A"/>
+            <w:sz w:val="20"/>
+          </w:rPr>
+          <w:t>openai.com/index/hugging-face-model-evaluation-security-incident</w:t>
+        </w:r>
+      </w:hyperlink>
+      <w:r>
+        <w:rPr>
+          <w:rFonts w:ascii="Old Standard TT" w:hAnsi="Old Standard TT"/>
+          <w:sz w:val="20"/>
+        </w:rPr>
+        <w:t xml:space="preserve">; </w:t>
+      </w:r>
+      <w:hyperlink r:id="rId12">
+        <w:r>
+          <w:rPr>
+            <w:rFonts w:ascii="Old Standard TT" w:hAnsi="Old Standard TT"/>
+            <w:color w:val="2E5C8A"/>
+            <w:sz w:val="20"/>
+          </w:rPr>
+          <w:t>openai.com/index/hugging-face-incident-and-the-road-ahead</w:t>
+        </w:r>
+      </w:hyperlink>
+      <w:bookmarkEnd w:id="1"/>
+    </w:p>
+    <w:p>
+      <w:bookmarkStart w:id="2" w:name="ref2"/>
+      <w:pPr>
+        <w:spacing w:after="80" w:line="274" w:lineRule="auto"/>
+        <w:ind w:left="403" w:hanging="403"/>
         <w:jc w:val="both"/>
       </w:pPr>
       <w:r>
         <w:rPr>
           <w:rFonts w:ascii="Old Standard TT" w:hAnsi="Old Standard TT"/>
-          <w:sz w:val="21"/>
-        </w:rPr>
-        <w:t>[2] Hugging Face, 2026. Agent intrusion: technical timeline. huggingface.co/blog/agent-intrusion-technical-timeline</w:t>
-      </w:r>
-    </w:p>
-    <w:p>
-      <w:pPr>
-        <w:spacing w:after="100" w:line="240" w:lineRule="auto"/>
+          <w:sz w:val="20"/>
+        </w:rPr>
+        <w:t xml:space="preserve">[2] Hugging Face, 2026. Agent intrusion: technical timeline. </w:t>
+      </w:r>
+      <w:hyperlink r:id="rId13">
+        <w:r>
+          <w:rPr>
+            <w:rFonts w:ascii="Old Standard TT" w:hAnsi="Old Standard TT"/>
+            <w:color w:val="2E5C8A"/>
+            <w:sz w:val="20"/>
+          </w:rPr>
+          <w:t>huggingface.co/blog/agent-intrusion-technical-timeline</w:t>
+        </w:r>
+      </w:hyperlink>
+      <w:bookmarkEnd w:id="2"/>
+    </w:p>
+    <w:p>
+      <w:bookmarkStart w:id="3" w:name="ref3"/>
+      <w:pPr>
+        <w:spacing w:after="80" w:line="274" w:lineRule="auto"/>
+        <w:ind w:left="403" w:hanging="403"/>
         <w:jc w:val="both"/>
       </w:pPr>
       <w:r>
         <w:rPr>
           <w:rFonts w:ascii="Old Standard TT" w:hAnsi="Old Standard TT"/>
-          <w:sz w:val="21"/>
-        </w:rPr>
-        <w:t>[3] Anthropic, 2026. Investigating incidents in our cybersecurity evaluations. anthropic.com/news/investigating-incidents-cybersecurity-evals</w:t>
-      </w:r>
-    </w:p>
-    <w:p>
-      <w:pPr>
-        <w:spacing w:after="100" w:line="240" w:lineRule="auto"/>
+          <w:sz w:val="20"/>
+        </w:rPr>
+        <w:t xml:space="preserve">[3] Anthropic, 2026. Investigating incidents in our cybersecurity evaluations. </w:t>
+      </w:r>
+      <w:hyperlink r:id="rId14">
+        <w:r>
+          <w:rPr>
+            <w:rFonts w:ascii="Old Standard TT" w:hAnsi="Old Standard TT"/>
+            <w:color w:val="2E5C8A"/>
+            <w:sz w:val="20"/>
+          </w:rPr>
+          <w:t>anthropic.com/news/investigating-incidents-cybersecurity-evals</w:t>
+        </w:r>
+      </w:hyperlink>
+      <w:bookmarkEnd w:id="3"/>
+    </w:p>
+    <w:p>
+      <w:bookmarkStart w:id="4" w:name="ref4"/>
+      <w:pPr>
+        <w:spacing w:after="80" w:line="274" w:lineRule="auto"/>
+        <w:ind w:left="403" w:hanging="403"/>
         <w:jc w:val="both"/>
       </w:pPr>
       <w:r>
         <w:rPr>
           <w:rFonts w:ascii="Old Standard TT" w:hAnsi="Old Standard TT"/>
-          <w:sz w:val="21"/>
-        </w:rPr>
-        <w:t>[4] UK AI Security Institute, 4 August 2026. Incident report: unsanctioned agent behaviour during cyber testing (INC-2026-07-28-01). aisi.gov.uk/blog/incident-report-unsanctioned-agent-behaviour-during-cyber-testing</w:t>
-      </w:r>
-    </w:p>
-    <w:p>
-      <w:pPr>
-        <w:spacing w:after="100" w:line="240" w:lineRule="auto"/>
+          <w:sz w:val="20"/>
+        </w:rPr>
+        <w:t xml:space="preserve">[4] UK AI Security Institute, 4 August 2026. Incident report: unsanctioned agent behaviour during cyber testing (INC-2026-07-28-01). </w:t>
+      </w:r>
+      <w:hyperlink r:id="rId15">
+        <w:r>
+          <w:rPr>
+            <w:rFonts w:ascii="Old Standard TT" w:hAnsi="Old Standard TT"/>
+            <w:color w:val="2E5C8A"/>
+            <w:sz w:val="20"/>
+          </w:rPr>
+          <w:t>aisi.gov.uk/blog/incident-report-unsanctioned-agent-behaviour-during-cyber-testing</w:t>
+        </w:r>
+      </w:hyperlink>
+      <w:bookmarkEnd w:id="4"/>
+    </w:p>
+    <w:p>
+      <w:bookmarkStart w:id="5" w:name="ref5"/>
+      <w:pPr>
+        <w:spacing w:after="80" w:line="274" w:lineRule="auto"/>
+        <w:ind w:left="403" w:hanging="403"/>
         <w:jc w:val="both"/>
       </w:pPr>
       <w:r>
         <w:rPr>
           <w:rFonts w:ascii="Old Standard TT" w:hAnsi="Old Standard TT"/>
-          <w:sz w:val="21"/>
-        </w:rPr>
-        <w:t>[5] Von Arx, S., Slade Byrd, C. and the Nightingale Collective, 4 September 2026. Discovery of a new OpenAI agent message board: DSEWiki edit dataset and report. collusion.wiki. OpenAI acknowledgement of 5 September 2026 as reported by TechCrunch, techcrunch.com/2026/09/05/openai-confirms-wiki-incident-says-its-working-on-a-framework-for-more-disclosure/</w:t>
-      </w:r>
-    </w:p>
-    <w:p>
-      <w:pPr>
-        <w:spacing w:after="100" w:line="240" w:lineRule="auto"/>
+          <w:sz w:val="20"/>
+        </w:rPr>
+        <w:t xml:space="preserve">[5] Von Arx, S., Slade Byrd, C. and the Nightingale Collective, 4 September 2026. Discovery of a new OpenAI agent message board: DSEWiki edit dataset and report. </w:t>
+      </w:r>
+      <w:hyperlink r:id="rId16">
+        <w:r>
+          <w:rPr>
+            <w:rFonts w:ascii="Old Standard TT" w:hAnsi="Old Standard TT"/>
+            <w:color w:val="2E5C8A"/>
+            <w:sz w:val="20"/>
+          </w:rPr>
+          <w:t>collusion.wiki</w:t>
+        </w:r>
+      </w:hyperlink>
+      <w:r>
+        <w:rPr>
+          <w:rFonts w:ascii="Old Standard TT" w:hAnsi="Old Standard TT"/>
+          <w:sz w:val="20"/>
+        </w:rPr>
+        <w:t xml:space="preserve">. OpenAI acknowledgement of 5 September 2026 as reported by TechCrunch, </w:t>
+      </w:r>
+      <w:hyperlink r:id="rId17">
+        <w:r>
+          <w:rPr>
+            <w:rFonts w:ascii="Old Standard TT" w:hAnsi="Old Standard TT"/>
+            <w:color w:val="2E5C8A"/>
+            <w:sz w:val="20"/>
+          </w:rPr>
+          <w:t>techcrunch.com/2026/09/05/openai-confirms-wiki-incident-says-its-working-on-a-framework-for-more-disclosure/</w:t>
+        </w:r>
+      </w:hyperlink>
+      <w:bookmarkEnd w:id="5"/>
+    </w:p>
+    <w:p>
+      <w:bookmarkStart w:id="6" w:name="ref6"/>
+      <w:pPr>
+        <w:spacing w:after="80" w:line="274" w:lineRule="auto"/>
+        <w:ind w:left="403" w:hanging="403"/>
         <w:jc w:val="both"/>
       </w:pPr>
       <w:r>
         <w:rPr>
           <w:rFonts w:ascii="Old Standard TT" w:hAnsi="Old Standard TT"/>
-          <w:sz w:val="21"/>
-        </w:rPr>
-        <w:t>[6] Meridian Labs and UK AI Security Institute, 2026. Inspect Scout: in-depth analysis of AI agent transcripts. github.com/meridianlabs-ai/inspect_scout</w:t>
-      </w:r>
-    </w:p>
-    <w:p>
-      <w:pPr>
-        <w:spacing w:after="100" w:line="240" w:lineRule="auto"/>
+          <w:sz w:val="20"/>
+        </w:rPr>
+        <w:t xml:space="preserve">[6] Meridian Labs and UK AI Security Institute, 2026. Inspect Scout: in-depth analysis of AI agent transcripts. </w:t>
+      </w:r>
+      <w:hyperlink r:id="rId18">
+        <w:r>
+          <w:rPr>
+            <w:rFonts w:ascii="Old Standard TT" w:hAnsi="Old Standard TT"/>
+            <w:color w:val="2E5C8A"/>
+            <w:sz w:val="20"/>
+          </w:rPr>
+          <w:t>github.com/meridianlabs-ai/inspect_scout</w:t>
+        </w:r>
+      </w:hyperlink>
+      <w:bookmarkEnd w:id="6"/>
+    </w:p>
+    <w:p>
+      <w:bookmarkStart w:id="7" w:name="ref7"/>
+      <w:pPr>
+        <w:spacing w:after="80" w:line="274" w:lineRule="auto"/>
+        <w:ind w:left="403" w:hanging="403"/>
         <w:jc w:val="both"/>
       </w:pPr>
       <w:r>
         <w:rPr>
           <w:rFonts w:ascii="Old Standard TT" w:hAnsi="Old Standard TT"/>
-          <w:sz w:val="21"/>
-        </w:rPr>
-        <w:t>[7] UK AI Security Institute and Redwood Research, 2025. ControlArena. github.com/UKGovernmentBEIS/control-arena</w:t>
-      </w:r>
-    </w:p>
-    <w:p>
-      <w:pPr>
-        <w:spacing w:after="100" w:line="240" w:lineRule="auto"/>
+          <w:sz w:val="20"/>
+        </w:rPr>
+        <w:t xml:space="preserve">[7] UK AI Security Institute and Redwood Research, 2025. ControlArena. </w:t>
+      </w:r>
+      <w:hyperlink r:id="rId19">
+        <w:r>
+          <w:rPr>
+            <w:rFonts w:ascii="Old Standard TT" w:hAnsi="Old Standard TT"/>
+            <w:color w:val="2E5C8A"/>
+            <w:sz w:val="20"/>
+          </w:rPr>
+          <w:t>github.com/UKGovernmentBEIS/control-arena</w:t>
+        </w:r>
+      </w:hyperlink>
+      <w:bookmarkEnd w:id="7"/>
+    </w:p>
+    <w:p>
+      <w:bookmarkStart w:id="8" w:name="ref8"/>
+      <w:pPr>
+        <w:spacing w:after="80" w:line="274" w:lineRule="auto"/>
+        <w:ind w:left="403" w:hanging="403"/>
         <w:jc w:val="both"/>
       </w:pPr>
       <w:r>
         <w:rPr>
           <w:rFonts w:ascii="Old Standard TT" w:hAnsi="Old Standard TT"/>
-          <w:sz w:val="21"/>
-        </w:rPr>
-        <w:t>[8] Kutasov, J. et al., 2025. SHADE-Arena: evaluating sabotage and monitoring in LLM agents. arXiv:2506.15740</w:t>
-      </w:r>
-    </w:p>
-    <w:p>
-      <w:pPr>
-        <w:spacing w:after="100" w:line="240" w:lineRule="auto"/>
+          <w:sz w:val="20"/>
+        </w:rPr>
+        <w:t xml:space="preserve">[8] Kutasov, J. et al., 2025. SHADE-Arena: evaluating sabotage and monitoring in LLM agents. </w:t>
+      </w:r>
+      <w:hyperlink r:id="rId20">
+        <w:r>
+          <w:rPr>
+            <w:rFonts w:ascii="Old Standard TT" w:hAnsi="Old Standard TT"/>
+            <w:color w:val="2E5C8A"/>
+            <w:sz w:val="20"/>
+          </w:rPr>
+          <w:t>arXiv:2506.15740</w:t>
+        </w:r>
+      </w:hyperlink>
+      <w:bookmarkEnd w:id="8"/>
+    </w:p>
+    <w:p>
+      <w:bookmarkStart w:id="9" w:name="ref9"/>
+      <w:pPr>
+        <w:spacing w:after="80" w:line="274" w:lineRule="auto"/>
+        <w:ind w:left="403" w:hanging="403"/>
         <w:jc w:val="both"/>
       </w:pPr>
       <w:r>
         <w:rPr>
           <w:rFonts w:ascii="Old Standard TT" w:hAnsi="Old Standard TT"/>
-          <w:sz w:val="21"/>
-        </w:rPr>
-        <w:t>[9] Apollo Research, 2026. Watcher: security for coding agents (Watcher Live and Watcher Analyze). watcher.apolloresearch.ai</w:t>
-      </w:r>
-    </w:p>
-    <w:p>
-      <w:pPr>
-        <w:spacing w:after="100" w:line="240" w:lineRule="auto"/>
+          <w:sz w:val="20"/>
+        </w:rPr>
+        <w:t xml:space="preserve">[9] Apollo Research, 2026. Watcher: security for coding agents (Watcher Live and Watcher Analyze). </w:t>
+      </w:r>
+      <w:hyperlink r:id="rId21">
+        <w:r>
+          <w:rPr>
+            <w:rFonts w:ascii="Old Standard TT" w:hAnsi="Old Standard TT"/>
+            <w:color w:val="2E5C8A"/>
+            <w:sz w:val="20"/>
+          </w:rPr>
+          <w:t>watcher.apolloresearch.ai</w:t>
+        </w:r>
+      </w:hyperlink>
+      <w:bookmarkEnd w:id="9"/>
+    </w:p>
+    <w:p>
+      <w:bookmarkStart w:id="10" w:name="ref10"/>
+      <w:pPr>
+        <w:spacing w:after="80" w:line="274" w:lineRule="auto"/>
+        <w:ind w:left="403" w:hanging="403"/>
         <w:jc w:val="both"/>
       </w:pPr>
       <w:r>
         <w:rPr>
           <w:rFonts w:ascii="Old Standard TT" w:hAnsi="Old Standard TT"/>
-          <w:sz w:val="21"/>
-        </w:rPr>
-        <w:t>[10] ExploitGym, 2026. ExploitGym: can AI agents turn security vulnerabilities into real attacks? arXiv:2605.11086; repository and docs/firewall.md on GitHub, Apache-2.0.</w:t>
-      </w:r>
-    </w:p>
-    <w:p>
-      <w:pPr>
-        <w:spacing w:after="100" w:line="240" w:lineRule="auto"/>
+          <w:sz w:val="20"/>
+        </w:rPr>
+        <w:t xml:space="preserve">[10] ExploitGym, 2026. ExploitGym: can AI agents turn security vulnerabilities into real attacks? </w:t>
+      </w:r>
+      <w:hyperlink r:id="rId22">
+        <w:r>
+          <w:rPr>
+            <w:rFonts w:ascii="Old Standard TT" w:hAnsi="Old Standard TT"/>
+            <w:color w:val="2E5C8A"/>
+            <w:sz w:val="20"/>
+          </w:rPr>
+          <w:t>arXiv:2605.11086</w:t>
+        </w:r>
+      </w:hyperlink>
+      <w:r>
+        <w:rPr>
+          <w:rFonts w:ascii="Old Standard TT" w:hAnsi="Old Standard TT"/>
+          <w:sz w:val="20"/>
+        </w:rPr>
+        <w:t>; repository and docs/firewall.md on GitHub, Apache-2.0.</w:t>
+      </w:r>
+      <w:bookmarkEnd w:id="10"/>
+    </w:p>
+    <w:p>
+      <w:bookmarkStart w:id="11" w:name="ref11"/>
+      <w:pPr>
+        <w:spacing w:after="80" w:line="274" w:lineRule="auto"/>
+        <w:ind w:left="403" w:hanging="403"/>
         <w:jc w:val="both"/>
       </w:pPr>
       <w:r>
         <w:rPr>
           <w:rFonts w:ascii="Old Standard TT" w:hAnsi="Old Standard TT"/>
-          <w:sz w:val="21"/>
-        </w:rPr>
-        <w:t>[11] UK AI Security Institute, July 2026. Cheating behaviour in frontier model evaluations. aisi.gov.uk/blog/cheating-behaviour-in-frontier-model-evaluations</w:t>
-      </w:r>
-    </w:p>
-    <w:p>
-      <w:pPr>
-        <w:spacing w:after="100" w:line="240" w:lineRule="auto"/>
+          <w:sz w:val="20"/>
+        </w:rPr>
+        <w:t xml:space="preserve">[11] UK AI Security Institute, July 2026. Cheating behaviour in frontier model evaluations. </w:t>
+      </w:r>
+      <w:hyperlink r:id="rId23">
+        <w:r>
+          <w:rPr>
+            <w:rFonts w:ascii="Old Standard TT" w:hAnsi="Old Standard TT"/>
+            <w:color w:val="2E5C8A"/>
+            <w:sz w:val="20"/>
+          </w:rPr>
+          <w:t>aisi.gov.uk/blog/cheating-behaviour-in-frontier-model-evaluations</w:t>
+        </w:r>
+      </w:hyperlink>
+      <w:bookmarkEnd w:id="11"/>
+    </w:p>
+    <w:p>
+      <w:bookmarkStart w:id="12" w:name="ref12"/>
+      <w:pPr>
+        <w:spacing w:after="80" w:line="274" w:lineRule="auto"/>
+        <w:ind w:left="403" w:hanging="403"/>
         <w:jc w:val="both"/>
       </w:pPr>
       <w:r>
         <w:rPr>
           <w:rFonts w:ascii="Old Standard TT" w:hAnsi="Old Standard TT"/>
-          <w:sz w:val="21"/>
-        </w:rPr>
-        <w:t>[12] Nagarkar, C., 2026. scorer-integrity: calibrating LLM judges against mechanical ground truth in Inspect evals. github.com/crishN144/scorer-integrity</w:t>
-      </w:r>
-    </w:p>
-    <w:p>
-      <w:pPr>
-        <w:spacing w:after="100" w:line="240" w:lineRule="auto"/>
+          <w:sz w:val="20"/>
+        </w:rPr>
+        <w:t xml:space="preserve">[12] Nagarkar, C., 2026. scorer-integrity: calibrating LLM judges against mechanical ground truth in Inspect evals. </w:t>
+      </w:r>
+      <w:hyperlink r:id="rId24">
+        <w:r>
+          <w:rPr>
+            <w:rFonts w:ascii="Old Standard TT" w:hAnsi="Old Standard TT"/>
+            <w:color w:val="2E5C8A"/>
+            <w:sz w:val="20"/>
+          </w:rPr>
+          <w:t>github.com/crishN144/scorer-integrity</w:t>
+        </w:r>
+      </w:hyperlink>
+      <w:bookmarkEnd w:id="12"/>
+    </w:p>
+    <w:p>
+      <w:bookmarkStart w:id="13" w:name="ref13"/>
+      <w:pPr>
+        <w:spacing w:after="80" w:line="274" w:lineRule="auto"/>
+        <w:ind w:left="403" w:hanging="403"/>
         <w:jc w:val="both"/>
       </w:pPr>
       <w:r>
         <w:rPr>
           <w:rFonts w:ascii="Old Standard TT" w:hAnsi="Old Standard TT"/>
-          <w:sz w:val="21"/>
-        </w:rPr>
-        <w:t>[13] METR and Redwood Research, 26 August 2026. Brief independent investigation of agents' behavior, reasoning and collaboration in the OpenAI / Hugging Face hacking incident. metr.org/blog/2026-08-26-openai-hugging-face-incident-investigation</w:t>
-      </w:r>
-    </w:p>
-    <w:p>
-      <w:pPr>
-        <w:spacing w:after="100" w:line="240" w:lineRule="auto"/>
+          <w:sz w:val="20"/>
+        </w:rPr>
+        <w:t xml:space="preserve">[13] METR and Redwood Research, 26 August 2026. Brief independent investigation of agents' behavior, reasoning and collaboration in the OpenAI / Hugging Face hacking incident. </w:t>
+      </w:r>
+      <w:hyperlink r:id="rId25">
+        <w:r>
+          <w:rPr>
+            <w:rFonts w:ascii="Old Standard TT" w:hAnsi="Old Standard TT"/>
+            <w:color w:val="2E5C8A"/>
+            <w:sz w:val="20"/>
+          </w:rPr>
+          <w:t>metr.org/blog/2026-08-26-openai-hugging-face-incident-investigation</w:t>
+        </w:r>
+      </w:hyperlink>
+      <w:bookmarkEnd w:id="13"/>
+    </w:p>
+    <w:p>
+      <w:bookmarkStart w:id="14" w:name="ref14"/>
+      <w:pPr>
+        <w:spacing w:after="80" w:line="274" w:lineRule="auto"/>
+        <w:ind w:left="403" w:hanging="403"/>
         <w:jc w:val="both"/>
       </w:pPr>
       <w:r>
         <w:rPr>
           <w:rFonts w:ascii="Old Standard TT" w:hAnsi="Old Standard TT"/>
-          <w:sz w:val="21"/>
-        </w:rPr>
-        <w:t>[14] Baker, B. et al., 2025. Monitoring reasoning models for misbehavior and the risks of promoting obfuscation. arXiv:2503.11926</w:t>
-      </w:r>
+          <w:sz w:val="20"/>
+        </w:rPr>
+        <w:t xml:space="preserve">[14] Baker, B. et al., 2025. Monitoring reasoning models for misbehavior and the risks of promoting obfuscation. </w:t>
+      </w:r>
+      <w:hyperlink r:id="rId26">
+        <w:r>
+          <w:rPr>
+            <w:rFonts w:ascii="Old Standard TT" w:hAnsi="Old Standard TT"/>
+            <w:color w:val="2E5C8A"/>
+            <w:sz w:val="20"/>
+          </w:rPr>
+          <w:t>arXiv:2503.11926</w:t>
+        </w:r>
+      </w:hyperlink>
+      <w:bookmarkEnd w:id="14"/>
     </w:p>
     <w:p>
       <w:pPr>
         <w:pStyle w:val="Heading2"/>
         <w:keepNext/>
+        <w:pageBreakBefore/>
       </w:pPr>
       <w:r>
         <w:t>Appendix A. Limitations and Dual-Use Considerations</w:t>
@@ -2593,7 +3525,7 @@
     </w:p>
     <w:p>
       <w:pPr>
-        <w:spacing w:after="100" w:line="240" w:lineRule="auto"/>
+        <w:spacing w:after="100" w:line="274" w:lineRule="auto"/>
         <w:jc w:val="both"/>
       </w:pPr>
       <w:r>
@@ -2601,12 +3533,58 @@
           <w:rFonts w:ascii="Old Standard TT" w:hAnsi="Old Standard TT"/>
           <w:sz w:val="21"/>
         </w:rPr>
-        <w:t>Limitations are listed in Section 5 and are not repeated. Dual use is the concern specific to publishing a detector. Sentinel's extractor is a small set of regular expressions; publishing it publishes exactly which command forms it does not parse, which is an evasion map for an agent that reads the code. We publish it anyway for three reasons. First, the load-bearing component is the allowlist, not the extractor; an agent that evades the regex still has to reach a destination, and layer 3 (observed flows) does not depend on parsing. Second, the Track 1 criterion is third-party verifiability, which is impossible with a secret rule. Third, the labs' own accounts show the agents already read the evaluation's code and papers to find the flag [1, 11]; hiding a detector from an agent that greps for it is not a control. The mitigation we recommend is the one we could not build in three days: pair the declared-action check with an observed-flow check, so that spoofing the argument does not spoof the verdict.</w:t>
-      </w:r>
-    </w:p>
-    <w:p>
-      <w:pPr>
-        <w:spacing w:after="100" w:line="240" w:lineRule="auto"/>
+        <w:t xml:space="preserve">Limitations are listed in Section 5 and are not repeated. Dual use is the concern specific to publishing a detector. Sentinel's extractor is a small set of regular expressions; publishing it publishes exactly which command forms it does not parse, which is an evasion map for an agent that reads the code. We publish it anyway for three reasons. First, the load-bearing component is the allowlist, not the extractor; an agent that evades the regex still has to reach a destination, and layer 3 (observed flows) does not depend on parsing. Second, the Track 1 criterion is third-party verifiability, which is impossible with a secret rule. Third, the labs' own accounts show the agents already read the evaluation's code and papers to find the flag </w:t>
+      </w:r>
+      <w:r>
+        <w:rPr>
+          <w:rFonts w:ascii="Old Standard TT" w:hAnsi="Old Standard TT"/>
+          <w:sz w:val="21"/>
+        </w:rPr>
+        <w:t>[</w:t>
+      </w:r>
+      <w:hyperlink w:anchor="ref1">
+        <w:r>
+          <w:rPr>
+            <w:rFonts w:ascii="Old Standard TT" w:hAnsi="Old Standard TT"/>
+            <w:color w:val="2E5C8A"/>
+          </w:rPr>
+          <w:t>1</w:t>
+        </w:r>
+      </w:hyperlink>
+      <w:r>
+        <w:rPr>
+          <w:rFonts w:ascii="Old Standard TT" w:hAnsi="Old Standard TT"/>
+          <w:sz w:val="21"/>
+        </w:rPr>
+        <w:t xml:space="preserve">, </w:t>
+      </w:r>
+      <w:hyperlink w:anchor="ref11">
+        <w:r>
+          <w:rPr>
+            <w:rFonts w:ascii="Old Standard TT" w:hAnsi="Old Standard TT"/>
+            <w:color w:val="2E5C8A"/>
+          </w:rPr>
+          <w:t>11</w:t>
+        </w:r>
+      </w:hyperlink>
+      <w:r>
+        <w:rPr>
+          <w:rFonts w:ascii="Old Standard TT" w:hAnsi="Old Standard TT"/>
+          <w:sz w:val="21"/>
+        </w:rPr>
+        <w:t>]</w:t>
+      </w:r>
+      <w:r>
+        <w:rPr>
+          <w:rFonts w:ascii="Old Standard TT" w:hAnsi="Old Standard TT"/>
+          <w:sz w:val="21"/>
+        </w:rPr>
+        <w:t>; hiding a detector from an agent that greps for it is not a control. The mitigation we recommend is the one we could not build in three days: pair the declared-action check with an observed-flow check, so that spoofing the argument does not spoof the verdict.</w:t>
+      </w:r>
+    </w:p>
+    <w:p>
+      <w:pPr>
+        <w:spacing w:after="100" w:line="274" w:lineRule="auto"/>
         <w:jc w:val="both"/>
       </w:pPr>
       <w:r>
@@ -2750,7 +3728,67 @@
                 <w:b w:val="0"/>
                 <w:sz w:val="16"/>
               </w:rPr>
-              <w:t>OpenAI [1], AISI [11]</w:t>
+              <w:t xml:space="preserve">OpenAI </w:t>
+            </w:r>
+            <w:r>
+              <w:rPr>
+                <w:rFonts w:ascii="Old Standard TT" w:hAnsi="Old Standard TT"/>
+                <w:b w:val="0"/>
+                <w:sz w:val="16"/>
+              </w:rPr>
+              <w:t>[</w:t>
+            </w:r>
+            <w:hyperlink w:anchor="ref1">
+              <w:r>
+                <w:rPr>
+                  <w:rFonts w:ascii="Old Standard TT" w:hAnsi="Old Standard TT"/>
+                  <w:color w:val="2E5C8A"/>
+                  <w:sz w:val="16"/>
+                </w:rPr>
+                <w:t>1</w:t>
+              </w:r>
+            </w:hyperlink>
+            <w:r>
+              <w:rPr>
+                <w:rFonts w:ascii="Old Standard TT" w:hAnsi="Old Standard TT"/>
+                <w:b w:val="0"/>
+                <w:sz w:val="16"/>
+              </w:rPr>
+              <w:t>]</w:t>
+            </w:r>
+            <w:r>
+              <w:rPr>
+                <w:rFonts w:ascii="Old Standard TT" w:hAnsi="Old Standard TT"/>
+                <w:b w:val="0"/>
+                <w:sz w:val="16"/>
+              </w:rPr>
+              <w:t xml:space="preserve">, AISI </w:t>
+            </w:r>
+            <w:r>
+              <w:rPr>
+                <w:rFonts w:ascii="Old Standard TT" w:hAnsi="Old Standard TT"/>
+                <w:b w:val="0"/>
+                <w:sz w:val="16"/>
+              </w:rPr>
+              <w:t>[</w:t>
+            </w:r>
+            <w:hyperlink w:anchor="ref11">
+              <w:r>
+                <w:rPr>
+                  <w:rFonts w:ascii="Old Standard TT" w:hAnsi="Old Standard TT"/>
+                  <w:color w:val="2E5C8A"/>
+                  <w:sz w:val="16"/>
+                </w:rPr>
+                <w:t>11</w:t>
+              </w:r>
+            </w:hyperlink>
+            <w:r>
+              <w:rPr>
+                <w:rFonts w:ascii="Old Standard TT" w:hAnsi="Old Standard TT"/>
+                <w:b w:val="0"/>
+                <w:sz w:val="16"/>
+              </w:rPr>
+              <w:t>]</w:t>
             </w:r>
           </w:p>
         </w:tc>
@@ -2815,7 +3853,33 @@
                 <w:b w:val="0"/>
                 <w:sz w:val="16"/>
               </w:rPr>
-              <w:t>OpenAI, Hugging Face [2]</w:t>
+              <w:t xml:space="preserve">OpenAI, Hugging Face </w:t>
+            </w:r>
+            <w:r>
+              <w:rPr>
+                <w:rFonts w:ascii="Old Standard TT" w:hAnsi="Old Standard TT"/>
+                <w:b w:val="0"/>
+                <w:sz w:val="16"/>
+              </w:rPr>
+              <w:t>[</w:t>
+            </w:r>
+            <w:hyperlink w:anchor="ref2">
+              <w:r>
+                <w:rPr>
+                  <w:rFonts w:ascii="Old Standard TT" w:hAnsi="Old Standard TT"/>
+                  <w:color w:val="2E5C8A"/>
+                  <w:sz w:val="16"/>
+                </w:rPr>
+                <w:t>2</w:t>
+              </w:r>
+            </w:hyperlink>
+            <w:r>
+              <w:rPr>
+                <w:rFonts w:ascii="Old Standard TT" w:hAnsi="Old Standard TT"/>
+                <w:b w:val="0"/>
+                <w:sz w:val="16"/>
+              </w:rPr>
+              <w:t>]</w:t>
             </w:r>
           </w:p>
         </w:tc>
@@ -2945,7 +4009,33 @@
                 <w:b w:val="0"/>
                 <w:sz w:val="16"/>
               </w:rPr>
-              <w:t>OpenAI (Artifactory WebDAV), AISI (GitHub), DSEWiki [5]</w:t>
+              <w:t xml:space="preserve">OpenAI (Artifactory WebDAV), AISI (GitHub), DSEWiki </w:t>
+            </w:r>
+            <w:r>
+              <w:rPr>
+                <w:rFonts w:ascii="Old Standard TT" w:hAnsi="Old Standard TT"/>
+                <w:b w:val="0"/>
+                <w:sz w:val="16"/>
+              </w:rPr>
+              <w:t>[</w:t>
+            </w:r>
+            <w:hyperlink w:anchor="ref5">
+              <w:r>
+                <w:rPr>
+                  <w:rFonts w:ascii="Old Standard TT" w:hAnsi="Old Standard TT"/>
+                  <w:color w:val="2E5C8A"/>
+                  <w:sz w:val="16"/>
+                </w:rPr>
+                <w:t>5</w:t>
+              </w:r>
+            </w:hyperlink>
+            <w:r>
+              <w:rPr>
+                <w:rFonts w:ascii="Old Standard TT" w:hAnsi="Old Standard TT"/>
+                <w:b w:val="0"/>
+                <w:sz w:val="16"/>
+              </w:rPr>
+              <w:t>]</w:t>
             </w:r>
           </w:p>
         </w:tc>
@@ -3205,7 +4295,33 @@
                 <w:b w:val="0"/>
                 <w:sz w:val="16"/>
               </w:rPr>
-              <w:t>AISI, METR [13]</w:t>
+              <w:t xml:space="preserve">AISI, METR </w:t>
+            </w:r>
+            <w:r>
+              <w:rPr>
+                <w:rFonts w:ascii="Old Standard TT" w:hAnsi="Old Standard TT"/>
+                <w:b w:val="0"/>
+                <w:sz w:val="16"/>
+              </w:rPr>
+              <w:t>[</w:t>
+            </w:r>
+            <w:hyperlink w:anchor="ref13">
+              <w:r>
+                <w:rPr>
+                  <w:rFonts w:ascii="Old Standard TT" w:hAnsi="Old Standard TT"/>
+                  <w:color w:val="2E5C8A"/>
+                  <w:sz w:val="16"/>
+                </w:rPr>
+                <w:t>13</w:t>
+              </w:r>
+            </w:hyperlink>
+            <w:r>
+              <w:rPr>
+                <w:rFonts w:ascii="Old Standard TT" w:hAnsi="Old Standard TT"/>
+                <w:b w:val="0"/>
+                <w:sz w:val="16"/>
+              </w:rPr>
+              <w:t>]</w:t>
             </w:r>
           </w:p>
         </w:tc>
@@ -3298,7 +4414,7 @@
     </w:tbl>
     <w:p>
       <w:pPr>
-        <w:spacing w:after="160" w:line="240" w:lineRule="auto"/>
+        <w:spacing w:before="140" w:after="200" w:line="274" w:lineRule="auto"/>
       </w:pPr>
       <w:r>
         <w:rPr>

</xml_diff>

<commit_message>
report: table cell padding and leading so wrapped cells stop touching the rules
</commit_message>
<xml_diff>
--- a/report/build/Sentinel_Apart_AIIR_Sprint_2026.docx
+++ b/report/build/Sentinel_Apart_AIIR_Sprint_2026.docx
@@ -1512,13 +1512,19 @@
           <w:insideV w:val="single" w:sz="4" w:space="0" w:color="999999"/>
         </w:tblBorders>
         <w:tblLayout w:type="fixed"/>
+        <w:tblCellMar>
+          <w:top w:w="40" w:type="dxa"/>
+          <w:left w:w="90" w:type="dxa"/>
+          <w:bottom w:w="40" w:type="dxa"/>
+          <w:right w:w="90" w:type="dxa"/>
+        </w:tblCellMar>
       </w:tblPr>
       <w:tblGrid>
-        <w:gridCol w:w="1843"/>
-        <w:gridCol w:w="979"/>
-        <w:gridCol w:w="1440"/>
-        <w:gridCol w:w="2764"/>
-        <w:gridCol w:w="1123"/>
+        <w:gridCol w:w="1756"/>
+        <w:gridCol w:w="892"/>
+        <w:gridCol w:w="1728"/>
+        <w:gridCol w:w="2678"/>
+        <w:gridCol w:w="1094"/>
         <w:gridCol w:w="1209"/>
       </w:tblGrid>
       <w:tr>
@@ -1527,9 +1533,12 @@
         </w:trPr>
         <w:tc>
           <w:tcPr>
-            <w:tcW w:type="dxa" w:w="1843"/>
-          </w:tcPr>
-          <w:p>
+            <w:tcW w:type="dxa" w:w="1757"/>
+          </w:tcPr>
+          <w:p>
+            <w:pPr>
+              <w:spacing w:line="269" w:lineRule="auto" w:after="0" w:before="0"/>
+            </w:pPr>
             <w:r>
               <w:rPr>
                 <w:rFonts w:ascii="Old Standard TT" w:hAnsi="Old Standard TT"/>
@@ -1547,9 +1556,12 @@
         </w:tc>
         <w:tc>
           <w:tcPr>
-            <w:tcW w:type="dxa" w:w="979"/>
-          </w:tcPr>
-          <w:p>
+            <w:tcW w:type="dxa" w:w="893"/>
+          </w:tcPr>
+          <w:p>
+            <w:pPr>
+              <w:spacing w:line="269" w:lineRule="auto" w:after="0" w:before="0"/>
+            </w:pPr>
             <w:r>
               <w:rPr>
                 <w:rFonts w:ascii="Old Standard TT" w:hAnsi="Old Standard TT"/>
@@ -1567,9 +1579,12 @@
         </w:tc>
         <w:tc>
           <w:tcPr>
-            <w:tcW w:type="dxa" w:w="1440"/>
-          </w:tcPr>
-          <w:p>
+            <w:tcW w:type="dxa" w:w="1728"/>
+          </w:tcPr>
+          <w:p>
+            <w:pPr>
+              <w:spacing w:line="269" w:lineRule="auto" w:after="0" w:before="0"/>
+            </w:pPr>
             <w:r>
               <w:rPr>
                 <w:rFonts w:ascii="Old Standard TT" w:hAnsi="Old Standard TT"/>
@@ -1587,9 +1602,12 @@
         </w:tc>
         <w:tc>
           <w:tcPr>
-            <w:tcW w:type="dxa" w:w="2765"/>
-          </w:tcPr>
-          <w:p>
+            <w:tcW w:type="dxa" w:w="2678"/>
+          </w:tcPr>
+          <w:p>
+            <w:pPr>
+              <w:spacing w:line="269" w:lineRule="auto" w:after="0" w:before="0"/>
+            </w:pPr>
             <w:r>
               <w:rPr>
                 <w:rFonts w:ascii="Old Standard TT" w:hAnsi="Old Standard TT"/>
@@ -1607,9 +1625,12 @@
         </w:tc>
         <w:tc>
           <w:tcPr>
-            <w:tcW w:type="dxa" w:w="1123"/>
-          </w:tcPr>
-          <w:p>
+            <w:tcW w:type="dxa" w:w="1094"/>
+          </w:tcPr>
+          <w:p>
+            <w:pPr>
+              <w:spacing w:line="269" w:lineRule="auto" w:after="0" w:before="0"/>
+            </w:pPr>
             <w:r>
               <w:rPr>
                 <w:rFonts w:ascii="Old Standard TT" w:hAnsi="Old Standard TT"/>
@@ -1630,6 +1651,9 @@
             <w:tcW w:type="dxa" w:w="1210"/>
           </w:tcPr>
           <w:p>
+            <w:pPr>
+              <w:spacing w:line="269" w:lineRule="auto" w:after="0" w:before="0"/>
+            </w:pPr>
             <w:r>
               <w:rPr>
                 <w:rFonts w:ascii="Old Standard TT" w:hAnsi="Old Standard TT"/>
@@ -1652,9 +1676,12 @@
         </w:trPr>
         <w:tc>
           <w:tcPr>
-            <w:tcW w:type="dxa" w:w="1843"/>
-          </w:tcPr>
-          <w:p>
+            <w:tcW w:type="dxa" w:w="1757"/>
+          </w:tcPr>
+          <w:p>
+            <w:pPr>
+              <w:spacing w:line="269" w:lineRule="auto" w:after="0" w:before="0"/>
+            </w:pPr>
             <w:r>
               <w:rPr>
                 <w:rFonts w:ascii="Old Standard TT" w:hAnsi="Old Standard TT"/>
@@ -1672,9 +1699,12 @@
         </w:tc>
         <w:tc>
           <w:tcPr>
-            <w:tcW w:type="dxa" w:w="979"/>
-          </w:tcPr>
-          <w:p>
+            <w:tcW w:type="dxa" w:w="893"/>
+          </w:tcPr>
+          <w:p>
+            <w:pPr>
+              <w:spacing w:line="269" w:lineRule="auto" w:after="0" w:before="0"/>
+            </w:pPr>
             <w:r>
               <w:rPr>
                 <w:rFonts w:ascii="Old Standard TT" w:hAnsi="Old Standard TT"/>
@@ -1692,9 +1722,12 @@
         </w:tc>
         <w:tc>
           <w:tcPr>
-            <w:tcW w:type="dxa" w:w="1440"/>
-          </w:tcPr>
-          <w:p>
+            <w:tcW w:type="dxa" w:w="1728"/>
+          </w:tcPr>
+          <w:p>
+            <w:pPr>
+              <w:spacing w:line="269" w:lineRule="auto" w:after="0" w:before="0"/>
+            </w:pPr>
             <w:r>
               <w:rPr>
                 <w:rFonts w:ascii="Old Standard TT" w:hAnsi="Old Standard TT"/>
@@ -1712,9 +1745,12 @@
         </w:tc>
         <w:tc>
           <w:tcPr>
-            <w:tcW w:type="dxa" w:w="2765"/>
-          </w:tcPr>
-          <w:p>
+            <w:tcW w:type="dxa" w:w="2678"/>
+          </w:tcPr>
+          <w:p>
+            <w:pPr>
+              <w:spacing w:line="269" w:lineRule="auto" w:after="0" w:before="0"/>
+            </w:pPr>
             <w:r>
               <w:rPr>
                 <w:rFonts w:ascii="Old Standard TT" w:hAnsi="Old Standard TT"/>
@@ -1732,9 +1768,12 @@
         </w:tc>
         <w:tc>
           <w:tcPr>
-            <w:tcW w:type="dxa" w:w="1123"/>
-          </w:tcPr>
-          <w:p>
+            <w:tcW w:type="dxa" w:w="1094"/>
+          </w:tcPr>
+          <w:p>
+            <w:pPr>
+              <w:spacing w:line="269" w:lineRule="auto" w:after="0" w:before="0"/>
+            </w:pPr>
             <w:r>
               <w:rPr>
                 <w:rFonts w:ascii="Old Standard TT" w:hAnsi="Old Standard TT"/>
@@ -1755,6 +1794,9 @@
             <w:tcW w:type="dxa" w:w="1210"/>
           </w:tcPr>
           <w:p>
+            <w:pPr>
+              <w:spacing w:line="269" w:lineRule="auto" w:after="0" w:before="0"/>
+            </w:pPr>
             <w:r>
               <w:rPr>
                 <w:rFonts w:ascii="Old Standard TT" w:hAnsi="Old Standard TT"/>
@@ -1777,9 +1819,12 @@
         </w:trPr>
         <w:tc>
           <w:tcPr>
-            <w:tcW w:type="dxa" w:w="1843"/>
-          </w:tcPr>
-          <w:p>
+            <w:tcW w:type="dxa" w:w="1757"/>
+          </w:tcPr>
+          <w:p>
+            <w:pPr>
+              <w:spacing w:line="269" w:lineRule="auto" w:after="0" w:before="0"/>
+            </w:pPr>
             <w:r>
               <w:rPr>
                 <w:rFonts w:ascii="Old Standard TT" w:hAnsi="Old Standard TT"/>
@@ -1797,9 +1842,12 @@
         </w:tc>
         <w:tc>
           <w:tcPr>
-            <w:tcW w:type="dxa" w:w="979"/>
-          </w:tcPr>
-          <w:p>
+            <w:tcW w:type="dxa" w:w="893"/>
+          </w:tcPr>
+          <w:p>
+            <w:pPr>
+              <w:spacing w:line="269" w:lineRule="auto" w:after="0" w:before="0"/>
+            </w:pPr>
             <w:r>
               <w:rPr>
                 <w:rFonts w:ascii="Old Standard TT" w:hAnsi="Old Standard TT"/>
@@ -1817,9 +1865,12 @@
         </w:tc>
         <w:tc>
           <w:tcPr>
-            <w:tcW w:type="dxa" w:w="1440"/>
-          </w:tcPr>
-          <w:p>
+            <w:tcW w:type="dxa" w:w="1728"/>
+          </w:tcPr>
+          <w:p>
+            <w:pPr>
+              <w:spacing w:line="269" w:lineRule="auto" w:after="0" w:before="0"/>
+            </w:pPr>
             <w:r>
               <w:rPr>
                 <w:rFonts w:ascii="Old Standard TT" w:hAnsi="Old Standard TT"/>
@@ -1837,9 +1888,12 @@
         </w:tc>
         <w:tc>
           <w:tcPr>
-            <w:tcW w:type="dxa" w:w="2765"/>
-          </w:tcPr>
-          <w:p>
+            <w:tcW w:type="dxa" w:w="2678"/>
+          </w:tcPr>
+          <w:p>
+            <w:pPr>
+              <w:spacing w:line="269" w:lineRule="auto" w:after="0" w:before="0"/>
+            </w:pPr>
             <w:r>
               <w:rPr>
                 <w:rFonts w:ascii="Old Standard TT" w:hAnsi="Old Standard TT"/>
@@ -1857,9 +1911,12 @@
         </w:tc>
         <w:tc>
           <w:tcPr>
-            <w:tcW w:type="dxa" w:w="1123"/>
-          </w:tcPr>
-          <w:p>
+            <w:tcW w:type="dxa" w:w="1094"/>
+          </w:tcPr>
+          <w:p>
+            <w:pPr>
+              <w:spacing w:line="269" w:lineRule="auto" w:after="0" w:before="0"/>
+            </w:pPr>
             <w:r>
               <w:rPr>
                 <w:rFonts w:ascii="Old Standard TT" w:hAnsi="Old Standard TT"/>
@@ -1880,6 +1937,9 @@
             <w:tcW w:type="dxa" w:w="1210"/>
           </w:tcPr>
           <w:p>
+            <w:pPr>
+              <w:spacing w:line="269" w:lineRule="auto" w:after="0" w:before="0"/>
+            </w:pPr>
             <w:r>
               <w:rPr>
                 <w:rFonts w:ascii="Old Standard TT" w:hAnsi="Old Standard TT"/>
@@ -1902,9 +1962,12 @@
         </w:trPr>
         <w:tc>
           <w:tcPr>
-            <w:tcW w:type="dxa" w:w="1843"/>
-          </w:tcPr>
-          <w:p>
+            <w:tcW w:type="dxa" w:w="1757"/>
+          </w:tcPr>
+          <w:p>
+            <w:pPr>
+              <w:spacing w:line="269" w:lineRule="auto" w:after="0" w:before="0"/>
+            </w:pPr>
             <w:r>
               <w:rPr>
                 <w:rFonts w:ascii="Old Standard TT" w:hAnsi="Old Standard TT"/>
@@ -1922,9 +1985,12 @@
         </w:tc>
         <w:tc>
           <w:tcPr>
-            <w:tcW w:type="dxa" w:w="979"/>
-          </w:tcPr>
-          <w:p>
+            <w:tcW w:type="dxa" w:w="893"/>
+          </w:tcPr>
+          <w:p>
+            <w:pPr>
+              <w:spacing w:line="269" w:lineRule="auto" w:after="0" w:before="0"/>
+            </w:pPr>
             <w:r>
               <w:rPr>
                 <w:rFonts w:ascii="Old Standard TT" w:hAnsi="Old Standard TT"/>
@@ -1942,9 +2008,12 @@
         </w:tc>
         <w:tc>
           <w:tcPr>
-            <w:tcW w:type="dxa" w:w="1440"/>
-          </w:tcPr>
-          <w:p>
+            <w:tcW w:type="dxa" w:w="1728"/>
+          </w:tcPr>
+          <w:p>
+            <w:pPr>
+              <w:spacing w:line="269" w:lineRule="auto" w:after="0" w:before="0"/>
+            </w:pPr>
             <w:r>
               <w:rPr>
                 <w:rFonts w:ascii="Old Standard TT" w:hAnsi="Old Standard TT"/>
@@ -1962,9 +2031,12 @@
         </w:tc>
         <w:tc>
           <w:tcPr>
-            <w:tcW w:type="dxa" w:w="2765"/>
-          </w:tcPr>
-          <w:p>
+            <w:tcW w:type="dxa" w:w="2678"/>
+          </w:tcPr>
+          <w:p>
+            <w:pPr>
+              <w:spacing w:line="269" w:lineRule="auto" w:after="0" w:before="0"/>
+            </w:pPr>
             <w:r>
               <w:rPr>
                 <w:rFonts w:ascii="Old Standard TT" w:hAnsi="Old Standard TT"/>
@@ -1982,9 +2054,12 @@
         </w:tc>
         <w:tc>
           <w:tcPr>
-            <w:tcW w:type="dxa" w:w="1123"/>
-          </w:tcPr>
-          <w:p>
+            <w:tcW w:type="dxa" w:w="1094"/>
+          </w:tcPr>
+          <w:p>
+            <w:pPr>
+              <w:spacing w:line="269" w:lineRule="auto" w:after="0" w:before="0"/>
+            </w:pPr>
             <w:r>
               <w:rPr>
                 <w:rFonts w:ascii="Old Standard TT" w:hAnsi="Old Standard TT"/>
@@ -2005,6 +2080,9 @@
             <w:tcW w:type="dxa" w:w="1210"/>
           </w:tcPr>
           <w:p>
+            <w:pPr>
+              <w:spacing w:line="269" w:lineRule="auto" w:after="0" w:before="0"/>
+            </w:pPr>
             <w:r>
               <w:rPr>
                 <w:rFonts w:ascii="Old Standard TT" w:hAnsi="Old Standard TT"/>
@@ -2027,9 +2105,12 @@
         </w:trPr>
         <w:tc>
           <w:tcPr>
-            <w:tcW w:type="dxa" w:w="1843"/>
-          </w:tcPr>
-          <w:p>
+            <w:tcW w:type="dxa" w:w="1757"/>
+          </w:tcPr>
+          <w:p>
+            <w:pPr>
+              <w:spacing w:line="269" w:lineRule="auto" w:after="0" w:before="0"/>
+            </w:pPr>
             <w:r>
               <w:rPr>
                 <w:rFonts w:ascii="Old Standard TT" w:hAnsi="Old Standard TT"/>
@@ -2047,9 +2128,12 @@
         </w:tc>
         <w:tc>
           <w:tcPr>
-            <w:tcW w:type="dxa" w:w="979"/>
-          </w:tcPr>
-          <w:p>
+            <w:tcW w:type="dxa" w:w="893"/>
+          </w:tcPr>
+          <w:p>
+            <w:pPr>
+              <w:spacing w:line="269" w:lineRule="auto" w:after="0" w:before="0"/>
+            </w:pPr>
             <w:r>
               <w:rPr>
                 <w:rFonts w:ascii="Old Standard TT" w:hAnsi="Old Standard TT"/>
@@ -2067,9 +2151,12 @@
         </w:tc>
         <w:tc>
           <w:tcPr>
-            <w:tcW w:type="dxa" w:w="1440"/>
-          </w:tcPr>
-          <w:p>
+            <w:tcW w:type="dxa" w:w="1728"/>
+          </w:tcPr>
+          <w:p>
+            <w:pPr>
+              <w:spacing w:line="269" w:lineRule="auto" w:after="0" w:before="0"/>
+            </w:pPr>
             <w:r>
               <w:rPr>
                 <w:rFonts w:ascii="Old Standard TT" w:hAnsi="Old Standard TT"/>
@@ -2087,9 +2174,12 @@
         </w:tc>
         <w:tc>
           <w:tcPr>
-            <w:tcW w:type="dxa" w:w="2765"/>
-          </w:tcPr>
-          <w:p>
+            <w:tcW w:type="dxa" w:w="2678"/>
+          </w:tcPr>
+          <w:p>
+            <w:pPr>
+              <w:spacing w:line="269" w:lineRule="auto" w:after="0" w:before="0"/>
+            </w:pPr>
             <w:r>
               <w:rPr>
                 <w:rFonts w:ascii="Old Standard TT" w:hAnsi="Old Standard TT"/>
@@ -2107,9 +2197,12 @@
         </w:tc>
         <w:tc>
           <w:tcPr>
-            <w:tcW w:type="dxa" w:w="1123"/>
-          </w:tcPr>
-          <w:p>
+            <w:tcW w:type="dxa" w:w="1094"/>
+          </w:tcPr>
+          <w:p>
+            <w:pPr>
+              <w:spacing w:line="269" w:lineRule="auto" w:after="0" w:before="0"/>
+            </w:pPr>
             <w:r>
               <w:rPr>
                 <w:rFonts w:ascii="Old Standard TT" w:hAnsi="Old Standard TT"/>
@@ -2130,6 +2223,9 @@
             <w:tcW w:type="dxa" w:w="1210"/>
           </w:tcPr>
           <w:p>
+            <w:pPr>
+              <w:spacing w:line="269" w:lineRule="auto" w:after="0" w:before="0"/>
+            </w:pPr>
             <w:r>
               <w:rPr>
                 <w:rFonts w:ascii="Old Standard TT" w:hAnsi="Old Standard TT"/>
@@ -2152,9 +2248,12 @@
         </w:trPr>
         <w:tc>
           <w:tcPr>
-            <w:tcW w:type="dxa" w:w="1843"/>
-          </w:tcPr>
-          <w:p>
+            <w:tcW w:type="dxa" w:w="1757"/>
+          </w:tcPr>
+          <w:p>
+            <w:pPr>
+              <w:spacing w:line="269" w:lineRule="auto" w:after="0" w:before="0"/>
+            </w:pPr>
             <w:r>
               <w:rPr>
                 <w:rFonts w:ascii="Old Standard TT" w:hAnsi="Old Standard TT"/>
@@ -2172,9 +2271,12 @@
         </w:tc>
         <w:tc>
           <w:tcPr>
-            <w:tcW w:type="dxa" w:w="979"/>
-          </w:tcPr>
-          <w:p>
+            <w:tcW w:type="dxa" w:w="893"/>
+          </w:tcPr>
+          <w:p>
+            <w:pPr>
+              <w:spacing w:line="269" w:lineRule="auto" w:after="0" w:before="0"/>
+            </w:pPr>
             <w:r>
               <w:rPr>
                 <w:rFonts w:ascii="Old Standard TT" w:hAnsi="Old Standard TT"/>
@@ -2192,9 +2294,12 @@
         </w:tc>
         <w:tc>
           <w:tcPr>
-            <w:tcW w:type="dxa" w:w="1440"/>
-          </w:tcPr>
-          <w:p>
+            <w:tcW w:type="dxa" w:w="1728"/>
+          </w:tcPr>
+          <w:p>
+            <w:pPr>
+              <w:spacing w:line="269" w:lineRule="auto" w:after="0" w:before="0"/>
+            </w:pPr>
             <w:r>
               <w:rPr>
                 <w:rFonts w:ascii="Old Standard TT" w:hAnsi="Old Standard TT"/>
@@ -2212,9 +2317,12 @@
         </w:tc>
         <w:tc>
           <w:tcPr>
-            <w:tcW w:type="dxa" w:w="2765"/>
-          </w:tcPr>
-          <w:p>
+            <w:tcW w:type="dxa" w:w="2678"/>
+          </w:tcPr>
+          <w:p>
+            <w:pPr>
+              <w:spacing w:line="269" w:lineRule="auto" w:after="0" w:before="0"/>
+            </w:pPr>
             <w:r>
               <w:rPr>
                 <w:rFonts w:ascii="Old Standard TT" w:hAnsi="Old Standard TT"/>
@@ -2232,9 +2340,12 @@
         </w:tc>
         <w:tc>
           <w:tcPr>
-            <w:tcW w:type="dxa" w:w="1123"/>
-          </w:tcPr>
-          <w:p>
+            <w:tcW w:type="dxa" w:w="1094"/>
+          </w:tcPr>
+          <w:p>
+            <w:pPr>
+              <w:spacing w:line="269" w:lineRule="auto" w:after="0" w:before="0"/>
+            </w:pPr>
             <w:r>
               <w:rPr>
                 <w:rFonts w:ascii="Old Standard TT" w:hAnsi="Old Standard TT"/>
@@ -2255,6 +2366,9 @@
             <w:tcW w:type="dxa" w:w="1210"/>
           </w:tcPr>
           <w:p>
+            <w:pPr>
+              <w:spacing w:line="269" w:lineRule="auto" w:after="0" w:before="0"/>
+            </w:pPr>
             <w:r>
               <w:rPr>
                 <w:rFonts w:ascii="Old Standard TT" w:hAnsi="Old Standard TT"/>
@@ -2277,9 +2391,12 @@
         </w:trPr>
         <w:tc>
           <w:tcPr>
-            <w:tcW w:type="dxa" w:w="1843"/>
-          </w:tcPr>
-          <w:p>
+            <w:tcW w:type="dxa" w:w="1757"/>
+          </w:tcPr>
+          <w:p>
+            <w:pPr>
+              <w:spacing w:line="269" w:lineRule="auto" w:after="0" w:before="0"/>
+            </w:pPr>
             <w:r>
               <w:rPr>
                 <w:rFonts w:ascii="Old Standard TT" w:hAnsi="Old Standard TT"/>
@@ -2297,9 +2414,12 @@
         </w:tc>
         <w:tc>
           <w:tcPr>
-            <w:tcW w:type="dxa" w:w="979"/>
-          </w:tcPr>
-          <w:p>
+            <w:tcW w:type="dxa" w:w="893"/>
+          </w:tcPr>
+          <w:p>
+            <w:pPr>
+              <w:spacing w:line="269" w:lineRule="auto" w:after="0" w:before="0"/>
+            </w:pPr>
             <w:r>
               <w:rPr>
                 <w:rFonts w:ascii="Old Standard TT" w:hAnsi="Old Standard TT"/>
@@ -2317,9 +2437,12 @@
         </w:tc>
         <w:tc>
           <w:tcPr>
-            <w:tcW w:type="dxa" w:w="1440"/>
-          </w:tcPr>
-          <w:p>
+            <w:tcW w:type="dxa" w:w="1728"/>
+          </w:tcPr>
+          <w:p>
+            <w:pPr>
+              <w:spacing w:line="269" w:lineRule="auto" w:after="0" w:before="0"/>
+            </w:pPr>
             <w:r>
               <w:rPr>
                 <w:rFonts w:ascii="Old Standard TT" w:hAnsi="Old Standard TT"/>
@@ -2337,9 +2460,12 @@
         </w:tc>
         <w:tc>
           <w:tcPr>
-            <w:tcW w:type="dxa" w:w="2765"/>
-          </w:tcPr>
-          <w:p>
+            <w:tcW w:type="dxa" w:w="2678"/>
+          </w:tcPr>
+          <w:p>
+            <w:pPr>
+              <w:spacing w:line="269" w:lineRule="auto" w:after="0" w:before="0"/>
+            </w:pPr>
             <w:r>
               <w:rPr>
                 <w:rFonts w:ascii="Old Standard TT" w:hAnsi="Old Standard TT"/>
@@ -2357,9 +2483,12 @@
         </w:tc>
         <w:tc>
           <w:tcPr>
-            <w:tcW w:type="dxa" w:w="1123"/>
-          </w:tcPr>
-          <w:p>
+            <w:tcW w:type="dxa" w:w="1094"/>
+          </w:tcPr>
+          <w:p>
+            <w:pPr>
+              <w:spacing w:line="269" w:lineRule="auto" w:after="0" w:before="0"/>
+            </w:pPr>
             <w:r>
               <w:rPr>
                 <w:rFonts w:ascii="Old Standard TT" w:hAnsi="Old Standard TT"/>
@@ -2380,6 +2509,9 @@
             <w:tcW w:type="dxa" w:w="1210"/>
           </w:tcPr>
           <w:p>
+            <w:pPr>
+              <w:spacing w:line="269" w:lineRule="auto" w:after="0" w:before="0"/>
+            </w:pPr>
             <w:r>
               <w:rPr>
                 <w:rFonts w:ascii="Old Standard TT" w:hAnsi="Old Standard TT"/>
@@ -2402,9 +2534,12 @@
         </w:trPr>
         <w:tc>
           <w:tcPr>
-            <w:tcW w:type="dxa" w:w="1843"/>
-          </w:tcPr>
-          <w:p>
+            <w:tcW w:type="dxa" w:w="1757"/>
+          </w:tcPr>
+          <w:p>
+            <w:pPr>
+              <w:spacing w:line="269" w:lineRule="auto" w:after="0" w:before="0"/>
+            </w:pPr>
             <w:r>
               <w:rPr>
                 <w:rFonts w:ascii="Old Standard TT" w:hAnsi="Old Standard TT"/>
@@ -2422,9 +2557,12 @@
         </w:tc>
         <w:tc>
           <w:tcPr>
-            <w:tcW w:type="dxa" w:w="979"/>
-          </w:tcPr>
-          <w:p>
+            <w:tcW w:type="dxa" w:w="893"/>
+          </w:tcPr>
+          <w:p>
+            <w:pPr>
+              <w:spacing w:line="269" w:lineRule="auto" w:after="0" w:before="0"/>
+            </w:pPr>
             <w:r>
               <w:rPr>
                 <w:rFonts w:ascii="Old Standard TT" w:hAnsi="Old Standard TT"/>
@@ -2442,9 +2580,12 @@
         </w:tc>
         <w:tc>
           <w:tcPr>
-            <w:tcW w:type="dxa" w:w="1440"/>
-          </w:tcPr>
-          <w:p>
+            <w:tcW w:type="dxa" w:w="1728"/>
+          </w:tcPr>
+          <w:p>
+            <w:pPr>
+              <w:spacing w:line="269" w:lineRule="auto" w:after="0" w:before="0"/>
+            </w:pPr>
             <w:r>
               <w:rPr>
                 <w:rFonts w:ascii="Old Standard TT" w:hAnsi="Old Standard TT"/>
@@ -2462,9 +2603,12 @@
         </w:tc>
         <w:tc>
           <w:tcPr>
-            <w:tcW w:type="dxa" w:w="2765"/>
-          </w:tcPr>
-          <w:p>
+            <w:tcW w:type="dxa" w:w="2678"/>
+          </w:tcPr>
+          <w:p>
+            <w:pPr>
+              <w:spacing w:line="269" w:lineRule="auto" w:after="0" w:before="0"/>
+            </w:pPr>
             <w:r>
               <w:rPr>
                 <w:rFonts w:ascii="Old Standard TT" w:hAnsi="Old Standard TT"/>
@@ -2482,9 +2626,12 @@
         </w:tc>
         <w:tc>
           <w:tcPr>
-            <w:tcW w:type="dxa" w:w="1123"/>
-          </w:tcPr>
-          <w:p>
+            <w:tcW w:type="dxa" w:w="1094"/>
+          </w:tcPr>
+          <w:p>
+            <w:pPr>
+              <w:spacing w:line="269" w:lineRule="auto" w:after="0" w:before="0"/>
+            </w:pPr>
             <w:r>
               <w:rPr>
                 <w:rFonts w:ascii="Old Standard TT" w:hAnsi="Old Standard TT"/>
@@ -2505,6 +2652,9 @@
             <w:tcW w:type="dxa" w:w="1210"/>
           </w:tcPr>
           <w:p>
+            <w:pPr>
+              <w:spacing w:line="269" w:lineRule="auto" w:after="0" w:before="0"/>
+            </w:pPr>
             <w:r>
               <w:rPr>
                 <w:rFonts w:ascii="Old Standard TT" w:hAnsi="Old Standard TT"/>
@@ -3617,6 +3767,12 @@
           <w:insideV w:val="single" w:sz="4" w:space="0" w:color="999999"/>
         </w:tblBorders>
         <w:tblLayout w:type="fixed"/>
+        <w:tblCellMar>
+          <w:top w:w="40" w:type="dxa"/>
+          <w:left w:w="90" w:type="dxa"/>
+          <w:bottom w:w="40" w:type="dxa"/>
+          <w:right w:w="90" w:type="dxa"/>
+        </w:tblCellMar>
       </w:tblPr>
       <w:tblGrid>
         <w:gridCol w:w="3744"/>
@@ -3632,6 +3788,9 @@
             <w:tcW w:type="dxa" w:w="3744"/>
           </w:tcPr>
           <w:p>
+            <w:pPr>
+              <w:spacing w:line="269" w:lineRule="auto" w:after="0" w:before="0"/>
+            </w:pPr>
             <w:r>
               <w:rPr>
                 <w:rFonts w:ascii="Old Standard TT" w:hAnsi="Old Standard TT"/>
@@ -3652,6 +3811,9 @@
             <w:tcW w:type="dxa" w:w="3456"/>
           </w:tcPr>
           <w:p>
+            <w:pPr>
+              <w:spacing w:line="269" w:lineRule="auto" w:after="0" w:before="0"/>
+            </w:pPr>
             <w:r>
               <w:rPr>
                 <w:rFonts w:ascii="Old Standard TT" w:hAnsi="Old Standard TT"/>
@@ -3672,6 +3834,9 @@
             <w:tcW w:type="dxa" w:w="2160"/>
           </w:tcPr>
           <w:p>
+            <w:pPr>
+              <w:spacing w:line="269" w:lineRule="auto" w:after="0" w:before="0"/>
+            </w:pPr>
             <w:r>
               <w:rPr>
                 <w:rFonts w:ascii="Old Standard TT" w:hAnsi="Old Standard TT"/>
@@ -3697,6 +3862,9 @@
             <w:tcW w:type="dxa" w:w="3744"/>
           </w:tcPr>
           <w:p>
+            <w:pPr>
+              <w:spacing w:line="269" w:lineRule="auto" w:after="0" w:before="0"/>
+            </w:pPr>
             <w:r>
               <w:rPr>
                 <w:rFonts w:ascii="Old Standard TT" w:hAnsi="Old Standard TT"/>
@@ -3717,6 +3885,9 @@
             <w:tcW w:type="dxa" w:w="3456"/>
           </w:tcPr>
           <w:p>
+            <w:pPr>
+              <w:spacing w:line="269" w:lineRule="auto" w:after="0" w:before="0"/>
+            </w:pPr>
             <w:r>
               <w:rPr>
                 <w:rFonts w:ascii="Old Standard TT" w:hAnsi="Old Standard TT"/>
@@ -3797,6 +3968,9 @@
             <w:tcW w:type="dxa" w:w="2160"/>
           </w:tcPr>
           <w:p>
+            <w:pPr>
+              <w:spacing w:line="269" w:lineRule="auto" w:after="0" w:before="0"/>
+            </w:pPr>
             <w:r>
               <w:rPr>
                 <w:rFonts w:ascii="Old Standard TT" w:hAnsi="Old Standard TT"/>
@@ -3822,6 +3996,9 @@
             <w:tcW w:type="dxa" w:w="3744"/>
           </w:tcPr>
           <w:p>
+            <w:pPr>
+              <w:spacing w:line="269" w:lineRule="auto" w:after="0" w:before="0"/>
+            </w:pPr>
             <w:r>
               <w:rPr>
                 <w:rFonts w:ascii="Old Standard TT" w:hAnsi="Old Standard TT"/>
@@ -3842,6 +4019,9 @@
             <w:tcW w:type="dxa" w:w="3456"/>
           </w:tcPr>
           <w:p>
+            <w:pPr>
+              <w:spacing w:line="269" w:lineRule="auto" w:after="0" w:before="0"/>
+            </w:pPr>
             <w:r>
               <w:rPr>
                 <w:rFonts w:ascii="Old Standard TT" w:hAnsi="Old Standard TT"/>
@@ -3888,6 +4068,9 @@
             <w:tcW w:type="dxa" w:w="2160"/>
           </w:tcPr>
           <w:p>
+            <w:pPr>
+              <w:spacing w:line="269" w:lineRule="auto" w:after="0" w:before="0"/>
+            </w:pPr>
             <w:r>
               <w:rPr>
                 <w:rFonts w:ascii="Old Standard TT" w:hAnsi="Old Standard TT"/>
@@ -3913,6 +4096,9 @@
             <w:tcW w:type="dxa" w:w="3744"/>
           </w:tcPr>
           <w:p>
+            <w:pPr>
+              <w:spacing w:line="269" w:lineRule="auto" w:after="0" w:before="0"/>
+            </w:pPr>
             <w:r>
               <w:rPr>
                 <w:rFonts w:ascii="Old Standard TT" w:hAnsi="Old Standard TT"/>
@@ -3933,6 +4119,9 @@
             <w:tcW w:type="dxa" w:w="3456"/>
           </w:tcPr>
           <w:p>
+            <w:pPr>
+              <w:spacing w:line="269" w:lineRule="auto" w:after="0" w:before="0"/>
+            </w:pPr>
             <w:r>
               <w:rPr>
                 <w:rFonts w:ascii="Old Standard TT" w:hAnsi="Old Standard TT"/>
@@ -3953,6 +4142,9 @@
             <w:tcW w:type="dxa" w:w="2160"/>
           </w:tcPr>
           <w:p>
+            <w:pPr>
+              <w:spacing w:line="269" w:lineRule="auto" w:after="0" w:before="0"/>
+            </w:pPr>
             <w:r>
               <w:rPr>
                 <w:rFonts w:ascii="Old Standard TT" w:hAnsi="Old Standard TT"/>
@@ -3978,6 +4170,9 @@
             <w:tcW w:type="dxa" w:w="3744"/>
           </w:tcPr>
           <w:p>
+            <w:pPr>
+              <w:spacing w:line="269" w:lineRule="auto" w:after="0" w:before="0"/>
+            </w:pPr>
             <w:r>
               <w:rPr>
                 <w:rFonts w:ascii="Old Standard TT" w:hAnsi="Old Standard TT"/>
@@ -3998,6 +4193,9 @@
             <w:tcW w:type="dxa" w:w="3456"/>
           </w:tcPr>
           <w:p>
+            <w:pPr>
+              <w:spacing w:line="269" w:lineRule="auto" w:after="0" w:before="0"/>
+            </w:pPr>
             <w:r>
               <w:rPr>
                 <w:rFonts w:ascii="Old Standard TT" w:hAnsi="Old Standard TT"/>
@@ -4044,6 +4242,9 @@
             <w:tcW w:type="dxa" w:w="2160"/>
           </w:tcPr>
           <w:p>
+            <w:pPr>
+              <w:spacing w:line="269" w:lineRule="auto" w:after="0" w:before="0"/>
+            </w:pPr>
             <w:r>
               <w:rPr>
                 <w:rFonts w:ascii="Old Standard TT" w:hAnsi="Old Standard TT"/>
@@ -4069,6 +4270,9 @@
             <w:tcW w:type="dxa" w:w="3744"/>
           </w:tcPr>
           <w:p>
+            <w:pPr>
+              <w:spacing w:line="269" w:lineRule="auto" w:after="0" w:before="0"/>
+            </w:pPr>
             <w:r>
               <w:rPr>
                 <w:rFonts w:ascii="Old Standard TT" w:hAnsi="Old Standard TT"/>
@@ -4089,6 +4293,9 @@
             <w:tcW w:type="dxa" w:w="3456"/>
           </w:tcPr>
           <w:p>
+            <w:pPr>
+              <w:spacing w:line="269" w:lineRule="auto" w:after="0" w:before="0"/>
+            </w:pPr>
             <w:r>
               <w:rPr>
                 <w:rFonts w:ascii="Old Standard TT" w:hAnsi="Old Standard TT"/>
@@ -4109,6 +4316,9 @@
             <w:tcW w:type="dxa" w:w="2160"/>
           </w:tcPr>
           <w:p>
+            <w:pPr>
+              <w:spacing w:line="269" w:lineRule="auto" w:after="0" w:before="0"/>
+            </w:pPr>
             <w:r>
               <w:rPr>
                 <w:rFonts w:ascii="Old Standard TT" w:hAnsi="Old Standard TT"/>
@@ -4134,6 +4344,9 @@
             <w:tcW w:type="dxa" w:w="3744"/>
           </w:tcPr>
           <w:p>
+            <w:pPr>
+              <w:spacing w:line="269" w:lineRule="auto" w:after="0" w:before="0"/>
+            </w:pPr>
             <w:r>
               <w:rPr>
                 <w:rFonts w:ascii="Old Standard TT" w:hAnsi="Old Standard TT"/>
@@ -4154,6 +4367,9 @@
             <w:tcW w:type="dxa" w:w="3456"/>
           </w:tcPr>
           <w:p>
+            <w:pPr>
+              <w:spacing w:line="269" w:lineRule="auto" w:after="0" w:before="0"/>
+            </w:pPr>
             <w:r>
               <w:rPr>
                 <w:rFonts w:ascii="Old Standard TT" w:hAnsi="Old Standard TT"/>
@@ -4174,6 +4390,9 @@
             <w:tcW w:type="dxa" w:w="2160"/>
           </w:tcPr>
           <w:p>
+            <w:pPr>
+              <w:spacing w:line="269" w:lineRule="auto" w:after="0" w:before="0"/>
+            </w:pPr>
             <w:r>
               <w:rPr>
                 <w:rFonts w:ascii="Old Standard TT" w:hAnsi="Old Standard TT"/>
@@ -4199,6 +4418,9 @@
             <w:tcW w:type="dxa" w:w="3744"/>
           </w:tcPr>
           <w:p>
+            <w:pPr>
+              <w:spacing w:line="269" w:lineRule="auto" w:after="0" w:before="0"/>
+            </w:pPr>
             <w:r>
               <w:rPr>
                 <w:rFonts w:ascii="Old Standard TT" w:hAnsi="Old Standard TT"/>
@@ -4219,6 +4441,9 @@
             <w:tcW w:type="dxa" w:w="3456"/>
           </w:tcPr>
           <w:p>
+            <w:pPr>
+              <w:spacing w:line="269" w:lineRule="auto" w:after="0" w:before="0"/>
+            </w:pPr>
             <w:r>
               <w:rPr>
                 <w:rFonts w:ascii="Old Standard TT" w:hAnsi="Old Standard TT"/>
@@ -4239,6 +4464,9 @@
             <w:tcW w:type="dxa" w:w="2160"/>
           </w:tcPr>
           <w:p>
+            <w:pPr>
+              <w:spacing w:line="269" w:lineRule="auto" w:after="0" w:before="0"/>
+            </w:pPr>
             <w:r>
               <w:rPr>
                 <w:rFonts w:ascii="Old Standard TT" w:hAnsi="Old Standard TT"/>
@@ -4264,6 +4492,9 @@
             <w:tcW w:type="dxa" w:w="3744"/>
           </w:tcPr>
           <w:p>
+            <w:pPr>
+              <w:spacing w:line="269" w:lineRule="auto" w:after="0" w:before="0"/>
+            </w:pPr>
             <w:r>
               <w:rPr>
                 <w:rFonts w:ascii="Old Standard TT" w:hAnsi="Old Standard TT"/>
@@ -4284,6 +4515,9 @@
             <w:tcW w:type="dxa" w:w="3456"/>
           </w:tcPr>
           <w:p>
+            <w:pPr>
+              <w:spacing w:line="269" w:lineRule="auto" w:after="0" w:before="0"/>
+            </w:pPr>
             <w:r>
               <w:rPr>
                 <w:rFonts w:ascii="Old Standard TT" w:hAnsi="Old Standard TT"/>
@@ -4330,6 +4564,9 @@
             <w:tcW w:type="dxa" w:w="2160"/>
           </w:tcPr>
           <w:p>
+            <w:pPr>
+              <w:spacing w:line="269" w:lineRule="auto" w:after="0" w:before="0"/>
+            </w:pPr>
             <w:r>
               <w:rPr>
                 <w:rFonts w:ascii="Old Standard TT" w:hAnsi="Old Standard TT"/>
@@ -4355,6 +4592,9 @@
             <w:tcW w:type="dxa" w:w="3744"/>
           </w:tcPr>
           <w:p>
+            <w:pPr>
+              <w:spacing w:line="269" w:lineRule="auto" w:after="0" w:before="0"/>
+            </w:pPr>
             <w:r>
               <w:rPr>
                 <w:rFonts w:ascii="Old Standard TT" w:hAnsi="Old Standard TT"/>
@@ -4375,6 +4615,9 @@
             <w:tcW w:type="dxa" w:w="3456"/>
           </w:tcPr>
           <w:p>
+            <w:pPr>
+              <w:spacing w:line="269" w:lineRule="auto" w:after="0" w:before="0"/>
+            </w:pPr>
             <w:r>
               <w:rPr>
                 <w:rFonts w:ascii="Old Standard TT" w:hAnsi="Old Standard TT"/>
@@ -4395,6 +4638,9 @@
             <w:tcW w:type="dxa" w:w="2160"/>
           </w:tcPr>
           <w:p>
+            <w:pPr>
+              <w:spacing w:line="269" w:lineRule="auto" w:after="0" w:before="0"/>
+            </w:pPr>
             <w:r>
               <w:rPr>
                 <w:rFonts w:ascii="Old Standard TT" w:hAnsi="Old Standard TT"/>

</xml_diff>

<commit_message>
report: body leading 1.08 + captions 1.30 — collisions gone at no page cost
</commit_message>
<xml_diff>
--- a/report/build/Sentinel_Apart_AIIR_Sprint_2026.docx
+++ b/report/build/Sentinel_Apart_AIIR_Sprint_2026.docx
@@ -4,7 +4,7 @@
   <w:body>
     <w:p>
       <w:pPr>
-        <w:spacing w:after="200" w:line="274" w:lineRule="auto"/>
+        <w:spacing w:after="200" w:line="240" w:lineRule="auto"/>
         <w:rPr>
           <w:rFonts w:ascii="Old Standard TT" w:cs="Old Standard TT" w:eastAsia="Old Standard TT" w:hAnsi="Old Standard TT"/>
           <w:sz w:val="12"/>
@@ -662,7 +662,7 @@
     </w:tbl>
     <w:p>
       <w:pPr>
-        <w:spacing w:line="274" w:lineRule="auto"/>
+        <w:spacing w:line="259" w:lineRule="auto"/>
         <w:rPr/>
       </w:pPr>
       <w:r>
@@ -684,7 +684,7 @@
     </w:p>
     <w:p>
       <w:pPr>
-        <w:spacing w:after="100" w:line="274" w:lineRule="auto"/>
+        <w:spacing w:after="100" w:line="259" w:lineRule="auto"/>
         <w:jc w:val="both"/>
       </w:pPr>
       <w:r>
@@ -863,7 +863,7 @@
     </w:p>
     <w:p>
       <w:pPr>
-        <w:spacing w:after="100" w:line="274" w:lineRule="auto"/>
+        <w:spacing w:after="100" w:line="259" w:lineRule="auto"/>
         <w:jc w:val="both"/>
       </w:pPr>
       <w:r>
@@ -906,7 +906,7 @@
     </w:p>
     <w:p>
       <w:pPr>
-        <w:spacing w:after="100" w:line="274" w:lineRule="auto"/>
+        <w:spacing w:after="100" w:line="259" w:lineRule="auto"/>
         <w:jc w:val="both"/>
       </w:pPr>
       <w:r>
@@ -919,7 +919,7 @@
     </w:p>
     <w:p>
       <w:pPr>
-        <w:spacing w:after="80" w:line="274" w:lineRule="auto"/>
+        <w:spacing w:after="80" w:line="259" w:lineRule="auto"/>
         <w:ind w:left="432" w:hanging="288"/>
         <w:jc w:val="both"/>
       </w:pPr>
@@ -933,7 +933,7 @@
     </w:p>
     <w:p>
       <w:pPr>
-        <w:spacing w:after="80" w:line="274" w:lineRule="auto"/>
+        <w:spacing w:after="80" w:line="259" w:lineRule="auto"/>
         <w:ind w:left="432" w:hanging="288"/>
         <w:jc w:val="both"/>
       </w:pPr>
@@ -947,7 +947,7 @@
     </w:p>
     <w:p>
       <w:pPr>
-        <w:spacing w:after="80" w:line="274" w:lineRule="auto"/>
+        <w:spacing w:after="80" w:line="259" w:lineRule="auto"/>
         <w:ind w:left="432" w:hanging="288"/>
         <w:jc w:val="both"/>
       </w:pPr>
@@ -970,7 +970,7 @@
     </w:p>
     <w:p>
       <w:pPr>
-        <w:spacing w:after="100" w:line="274" w:lineRule="auto"/>
+        <w:spacing w:after="100" w:line="259" w:lineRule="auto"/>
         <w:jc w:val="both"/>
       </w:pPr>
       <w:r>
@@ -1163,7 +1163,7 @@
     </w:p>
     <w:p>
       <w:pPr>
-        <w:spacing w:after="100" w:line="274" w:lineRule="auto"/>
+        <w:spacing w:after="100" w:line="259" w:lineRule="auto"/>
         <w:jc w:val="both"/>
       </w:pPr>
       <w:r>
@@ -1194,7 +1194,7 @@
     </w:p>
     <w:p>
       <w:pPr>
-        <w:spacing w:after="100" w:line="274" w:lineRule="auto"/>
+        <w:spacing w:after="100" w:line="259" w:lineRule="auto"/>
         <w:jc w:val="both"/>
       </w:pPr>
       <w:r>
@@ -1322,7 +1322,7 @@
     </w:p>
     <w:p>
       <w:pPr>
-        <w:spacing w:after="100" w:line="274" w:lineRule="auto"/>
+        <w:spacing w:after="100" w:line="259" w:lineRule="auto"/>
         <w:jc w:val="both"/>
       </w:pPr>
       <w:r>
@@ -1344,7 +1344,7 @@
     </w:p>
     <w:p>
       <w:pPr>
-        <w:spacing w:after="100" w:line="274" w:lineRule="auto"/>
+        <w:spacing w:after="100" w:line="259" w:lineRule="auto"/>
         <w:jc w:val="both"/>
       </w:pPr>
       <w:r>
@@ -1426,7 +1426,7 @@
     </w:p>
     <w:p>
       <w:pPr>
-        <w:spacing w:after="100" w:line="274" w:lineRule="auto"/>
+        <w:spacing w:after="100" w:line="259" w:lineRule="auto"/>
         <w:jc w:val="both"/>
       </w:pPr>
       <w:r>
@@ -1448,7 +1448,7 @@
     </w:p>
     <w:p>
       <w:pPr>
-        <w:spacing w:after="100" w:line="274" w:lineRule="auto"/>
+        <w:spacing w:after="100" w:line="259" w:lineRule="auto"/>
         <w:jc w:val="both"/>
       </w:pPr>
       <w:r>
@@ -1470,7 +1470,7 @@
     </w:p>
     <w:p>
       <w:pPr>
-        <w:spacing w:after="100" w:line="274" w:lineRule="auto"/>
+        <w:spacing w:after="100" w:line="259" w:lineRule="auto"/>
         <w:jc w:val="both"/>
       </w:pPr>
       <w:r>
@@ -2674,7 +2674,7 @@
     </w:tbl>
     <w:p>
       <w:pPr>
-        <w:spacing w:before="140" w:after="200" w:line="274" w:lineRule="auto"/>
+        <w:spacing w:line="312" w:lineRule="auto" w:before="140" w:after="200"/>
       </w:pPr>
       <w:r>
         <w:rPr>
@@ -2687,7 +2687,7 @@
     </w:p>
     <w:p>
       <w:pPr>
-        <w:spacing w:after="100" w:line="274" w:lineRule="auto"/>
+        <w:spacing w:after="100" w:line="259" w:lineRule="auto"/>
         <w:jc w:val="both"/>
       </w:pPr>
       <w:r>
@@ -2710,7 +2710,7 @@
     <w:p>
       <w:pPr>
         <w:keepNext/>
-        <w:spacing w:before="120" w:line="274" w:lineRule="auto"/>
+        <w:spacing w:before="120" w:line="259" w:lineRule="auto"/>
         <w:jc w:val="center"/>
       </w:pPr>
       <w:r>
@@ -2754,7 +2754,7 @@
     </w:p>
     <w:p>
       <w:pPr>
-        <w:spacing w:before="120" w:after="200" w:line="274" w:lineRule="auto"/>
+        <w:spacing w:line="312" w:lineRule="auto" w:before="120" w:after="200"/>
       </w:pPr>
       <w:r>
         <w:rPr>
@@ -2767,7 +2767,7 @@
     </w:p>
     <w:p>
       <w:pPr>
-        <w:spacing w:after="100" w:line="274" w:lineRule="auto"/>
+        <w:spacing w:after="100" w:line="259" w:lineRule="auto"/>
         <w:jc w:val="both"/>
       </w:pPr>
       <w:r>
@@ -2789,7 +2789,7 @@
     </w:p>
     <w:p>
       <w:pPr>
-        <w:spacing w:after="100" w:line="274" w:lineRule="auto"/>
+        <w:spacing w:after="100" w:line="259" w:lineRule="auto"/>
         <w:jc w:val="both"/>
       </w:pPr>
       <w:r>
@@ -2833,7 +2833,7 @@
     <w:p>
       <w:pPr>
         <w:keepNext/>
-        <w:spacing w:before="120" w:line="274" w:lineRule="auto"/>
+        <w:spacing w:before="120" w:line="259" w:lineRule="auto"/>
         <w:jc w:val="center"/>
       </w:pPr>
       <w:r>
@@ -2877,7 +2877,7 @@
     </w:p>
     <w:p>
       <w:pPr>
-        <w:spacing w:before="120" w:after="200" w:line="274" w:lineRule="auto"/>
+        <w:spacing w:line="312" w:lineRule="auto" w:before="120" w:after="200"/>
       </w:pPr>
       <w:r>
         <w:rPr>
@@ -2899,7 +2899,7 @@
     </w:p>
     <w:p>
       <w:pPr>
-        <w:spacing w:after="100" w:line="274" w:lineRule="auto"/>
+        <w:spacing w:after="100" w:line="259" w:lineRule="auto"/>
         <w:jc w:val="both"/>
       </w:pPr>
       <w:r>
@@ -2921,7 +2921,7 @@
     </w:p>
     <w:p>
       <w:pPr>
-        <w:spacing w:after="100" w:line="274" w:lineRule="auto"/>
+        <w:spacing w:after="100" w:line="259" w:lineRule="auto"/>
         <w:jc w:val="both"/>
       </w:pPr>
       <w:r>
@@ -3003,7 +3003,7 @@
     </w:p>
     <w:p>
       <w:pPr>
-        <w:spacing w:after="80" w:line="274" w:lineRule="auto"/>
+        <w:spacing w:after="80" w:line="259" w:lineRule="auto"/>
         <w:ind w:left="432" w:hanging="288"/>
         <w:jc w:val="both"/>
       </w:pPr>
@@ -3047,7 +3047,7 @@
     </w:p>
     <w:p>
       <w:pPr>
-        <w:spacing w:after="80" w:line="274" w:lineRule="auto"/>
+        <w:spacing w:after="80" w:line="259" w:lineRule="auto"/>
         <w:ind w:left="432" w:hanging="288"/>
         <w:jc w:val="both"/>
       </w:pPr>
@@ -3061,7 +3061,7 @@
     </w:p>
     <w:p>
       <w:pPr>
-        <w:spacing w:after="80" w:line="274" w:lineRule="auto"/>
+        <w:spacing w:after="80" w:line="259" w:lineRule="auto"/>
         <w:ind w:left="432" w:hanging="288"/>
         <w:jc w:val="both"/>
       </w:pPr>
@@ -3105,7 +3105,7 @@
     </w:p>
     <w:p>
       <w:pPr>
-        <w:spacing w:after="80" w:line="274" w:lineRule="auto"/>
+        <w:spacing w:after="80" w:line="259" w:lineRule="auto"/>
         <w:ind w:left="432" w:hanging="288"/>
         <w:jc w:val="both"/>
       </w:pPr>
@@ -3119,7 +3119,7 @@
     </w:p>
     <w:p>
       <w:pPr>
-        <w:spacing w:after="80" w:line="274" w:lineRule="auto"/>
+        <w:spacing w:after="80" w:line="259" w:lineRule="auto"/>
         <w:ind w:left="432" w:hanging="288"/>
         <w:jc w:val="both"/>
       </w:pPr>
@@ -3133,7 +3133,7 @@
     </w:p>
     <w:p>
       <w:pPr>
-        <w:spacing w:after="80" w:line="274" w:lineRule="auto"/>
+        <w:spacing w:after="80" w:line="259" w:lineRule="auto"/>
         <w:ind w:left="432" w:hanging="288"/>
         <w:jc w:val="both"/>
       </w:pPr>
@@ -3156,7 +3156,7 @@
     </w:p>
     <w:p>
       <w:pPr>
-        <w:spacing w:after="100" w:line="274" w:lineRule="auto"/>
+        <w:spacing w:after="100" w:line="259" w:lineRule="auto"/>
         <w:jc w:val="both"/>
       </w:pPr>
       <w:r>
@@ -3178,7 +3178,7 @@
     </w:p>
     <w:p>
       <w:pPr>
-        <w:spacing w:after="100" w:line="274" w:lineRule="auto"/>
+        <w:spacing w:after="100" w:line="259" w:lineRule="auto"/>
         <w:jc w:val="both"/>
       </w:pPr>
       <w:r>
@@ -3200,7 +3200,7 @@
     </w:p>
     <w:p>
       <w:pPr>
-        <w:spacing w:after="100" w:line="274" w:lineRule="auto"/>
+        <w:spacing w:after="100" w:line="259" w:lineRule="auto"/>
         <w:jc w:val="both"/>
       </w:pPr>
       <w:r>
@@ -3238,7 +3238,7 @@
     </w:p>
     <w:p>
       <w:pPr>
-        <w:spacing w:after="100" w:line="274" w:lineRule="auto"/>
+        <w:spacing w:after="100" w:line="259" w:lineRule="auto"/>
         <w:jc w:val="both"/>
       </w:pPr>
       <w:r>
@@ -3261,7 +3261,7 @@
     <w:p>
       <w:bookmarkStart w:id="1" w:name="ref1"/>
       <w:pPr>
-        <w:spacing w:after="80" w:line="274" w:lineRule="auto"/>
+        <w:spacing w:after="80" w:line="259" w:lineRule="auto"/>
         <w:ind w:left="403" w:hanging="403"/>
         <w:jc w:val="both"/>
       </w:pPr>
@@ -3304,7 +3304,7 @@
     <w:p>
       <w:bookmarkStart w:id="2" w:name="ref2"/>
       <w:pPr>
-        <w:spacing w:after="80" w:line="274" w:lineRule="auto"/>
+        <w:spacing w:after="80" w:line="259" w:lineRule="auto"/>
         <w:ind w:left="403" w:hanging="403"/>
         <w:jc w:val="both"/>
       </w:pPr>
@@ -3330,7 +3330,7 @@
     <w:p>
       <w:bookmarkStart w:id="3" w:name="ref3"/>
       <w:pPr>
-        <w:spacing w:after="80" w:line="274" w:lineRule="auto"/>
+        <w:spacing w:after="80" w:line="259" w:lineRule="auto"/>
         <w:ind w:left="403" w:hanging="403"/>
         <w:jc w:val="both"/>
       </w:pPr>
@@ -3356,7 +3356,7 @@
     <w:p>
       <w:bookmarkStart w:id="4" w:name="ref4"/>
       <w:pPr>
-        <w:spacing w:after="80" w:line="274" w:lineRule="auto"/>
+        <w:spacing w:after="80" w:line="259" w:lineRule="auto"/>
         <w:ind w:left="403" w:hanging="403"/>
         <w:jc w:val="both"/>
       </w:pPr>
@@ -3382,7 +3382,7 @@
     <w:p>
       <w:bookmarkStart w:id="5" w:name="ref5"/>
       <w:pPr>
-        <w:spacing w:after="80" w:line="274" w:lineRule="auto"/>
+        <w:spacing w:after="80" w:line="259" w:lineRule="auto"/>
         <w:ind w:left="403" w:hanging="403"/>
         <w:jc w:val="both"/>
       </w:pPr>
@@ -3425,7 +3425,7 @@
     <w:p>
       <w:bookmarkStart w:id="6" w:name="ref6"/>
       <w:pPr>
-        <w:spacing w:after="80" w:line="274" w:lineRule="auto"/>
+        <w:spacing w:after="80" w:line="259" w:lineRule="auto"/>
         <w:ind w:left="403" w:hanging="403"/>
         <w:jc w:val="both"/>
       </w:pPr>
@@ -3451,7 +3451,7 @@
     <w:p>
       <w:bookmarkStart w:id="7" w:name="ref7"/>
       <w:pPr>
-        <w:spacing w:after="80" w:line="274" w:lineRule="auto"/>
+        <w:spacing w:after="80" w:line="259" w:lineRule="auto"/>
         <w:ind w:left="403" w:hanging="403"/>
         <w:jc w:val="both"/>
       </w:pPr>
@@ -3477,7 +3477,7 @@
     <w:p>
       <w:bookmarkStart w:id="8" w:name="ref8"/>
       <w:pPr>
-        <w:spacing w:after="80" w:line="274" w:lineRule="auto"/>
+        <w:spacing w:after="80" w:line="259" w:lineRule="auto"/>
         <w:ind w:left="403" w:hanging="403"/>
         <w:jc w:val="both"/>
       </w:pPr>
@@ -3503,7 +3503,7 @@
     <w:p>
       <w:bookmarkStart w:id="9" w:name="ref9"/>
       <w:pPr>
-        <w:spacing w:after="80" w:line="274" w:lineRule="auto"/>
+        <w:spacing w:after="80" w:line="259" w:lineRule="auto"/>
         <w:ind w:left="403" w:hanging="403"/>
         <w:jc w:val="both"/>
       </w:pPr>
@@ -3529,7 +3529,7 @@
     <w:p>
       <w:bookmarkStart w:id="10" w:name="ref10"/>
       <w:pPr>
-        <w:spacing w:after="80" w:line="274" w:lineRule="auto"/>
+        <w:spacing w:after="80" w:line="259" w:lineRule="auto"/>
         <w:ind w:left="403" w:hanging="403"/>
         <w:jc w:val="both"/>
       </w:pPr>
@@ -3562,7 +3562,7 @@
     <w:p>
       <w:bookmarkStart w:id="11" w:name="ref11"/>
       <w:pPr>
-        <w:spacing w:after="80" w:line="274" w:lineRule="auto"/>
+        <w:spacing w:after="80" w:line="259" w:lineRule="auto"/>
         <w:ind w:left="403" w:hanging="403"/>
         <w:jc w:val="both"/>
       </w:pPr>
@@ -3588,7 +3588,7 @@
     <w:p>
       <w:bookmarkStart w:id="12" w:name="ref12"/>
       <w:pPr>
-        <w:spacing w:after="80" w:line="274" w:lineRule="auto"/>
+        <w:spacing w:after="80" w:line="259" w:lineRule="auto"/>
         <w:ind w:left="403" w:hanging="403"/>
         <w:jc w:val="both"/>
       </w:pPr>
@@ -3614,7 +3614,7 @@
     <w:p>
       <w:bookmarkStart w:id="13" w:name="ref13"/>
       <w:pPr>
-        <w:spacing w:after="80" w:line="274" w:lineRule="auto"/>
+        <w:spacing w:after="80" w:line="259" w:lineRule="auto"/>
         <w:ind w:left="403" w:hanging="403"/>
         <w:jc w:val="both"/>
       </w:pPr>
@@ -3640,7 +3640,7 @@
     <w:p>
       <w:bookmarkStart w:id="14" w:name="ref14"/>
       <w:pPr>
-        <w:spacing w:after="80" w:line="274" w:lineRule="auto"/>
+        <w:spacing w:after="80" w:line="259" w:lineRule="auto"/>
         <w:ind w:left="403" w:hanging="403"/>
         <w:jc w:val="both"/>
       </w:pPr>
@@ -3675,7 +3675,7 @@
     </w:p>
     <w:p>
       <w:pPr>
-        <w:spacing w:after="100" w:line="274" w:lineRule="auto"/>
+        <w:spacing w:after="100" w:line="259" w:lineRule="auto"/>
         <w:jc w:val="both"/>
       </w:pPr>
       <w:r>
@@ -3734,7 +3734,7 @@
     </w:p>
     <w:p>
       <w:pPr>
-        <w:spacing w:after="100" w:line="274" w:lineRule="auto"/>
+        <w:spacing w:after="100" w:line="259" w:lineRule="auto"/>
         <w:jc w:val="both"/>
       </w:pPr>
       <w:r>
@@ -4660,7 +4660,7 @@
     </w:tbl>
     <w:p>
       <w:pPr>
-        <w:spacing w:before="140" w:after="200" w:line="274" w:lineRule="auto"/>
+        <w:spacing w:line="312" w:lineRule="auto" w:before="140" w:after="200"/>
       </w:pPr>
       <w:r>
         <w:rPr>

</xml_diff>

<commit_message>
real data: Sentinel over the DSEWiki export (collusion.wiki); report §4.4 + Table 3; review fixes (Track 1 defined, allowlist shown, obviousness met, table column renamed)
</commit_message>
<xml_diff>
--- a/report/build/Sentinel_Apart_AIIR_Sprint_2026.docx
+++ b/report/build/Sentinel_Apart_AIIR_Sprint_2026.docx
@@ -610,7 +610,7 @@
                       <w:iCs w:val="1"/>
                       <w:rtl w:val="0"/>
                     </w:rPr>
-                    <w:t xml:space="preserve">Between April and July 2026, agents under evaluation at OpenAI, Anthropic and the UK AI Security Institute reached real third parties. In every public account the evaluation's network scope was declared in prose or assumed, never checked against what the agent did, and detection came late from a side signal. We argue that an evaluation's declared scope, written as a machine-readable allowlist, is the unit of containment evidence a third party can verify, and we build Sentinel, an Inspect scanner that classifies each tool call's stated destination against that allowlist and pages on the first out-of-scope one. No model is in the gate. On reconstructions of three public incidents (four to seven events each, built from the published timelines, not lab transcripts) the scanner pages at the first non-allowlisted destination; on three hard negatives it is silent, where a keyword baseline false-pages on two. The headline result is an ablation on one trace: a too-tight scope pages on permitted traffic, and a wildcard scope is silent on the escape. Verifiability is a property of the pair (trace, allowlist), not of the detector. The same trace shows the page arrives after the escape, which went through the permitted proxy: a scanner audits containment; it does not provide it.</w:t>
+                    <w:t xml:space="preserve">Between April and July 2026, agents under evaluation at OpenAI, Anthropic and the UK AI Security Institute reached real third parties. In every public account the evaluation's network scope was declared in prose or assumed, never checked against what the agent did, and detection came late from a side signal. We argue that an evaluation's declared scope, written as a machine-readable allowlist, is the unit of containment evidence a third party can verify, and we build Sentinel, an Inspect scanner that classifies each tool call's stated destination against that allowlist and pages on the first out-of-scope one. No model is in the gate. On reconstructions of three public incidents (four to seven events each, built from the published timelines, not lab transcripts) the scanner pages at the first non-allowlisted destination; on three hard negatives it is silent, where a keyword baseline false-pages on two. On a record we did not write, the 14,591-revision export of the DSEWiki incident, the same rule is silent under the wildcard scope the sandbox actually had and pages on the first day under any scope that names what the task was for. The headline result is an ablation on one trace: a too-tight scope pages on permitted traffic, and a wildcard scope is silent on the escape. Verifiability is a property of the pair (trace, allowlist), not of the detector. The same trace shows the page arrives after the escape, which went through the permitted proxy: a scanner audits containment; it does not provide it.</w:t>
                   </w:r>
                   <w:r>
                     <w:rPr>
@@ -768,7 +768,7 @@
           <w:rFonts w:ascii="Old Standard TT" w:hAnsi="Old Standard TT"/>
           <w:sz w:val="21"/>
         </w:rPr>
-        <w:t xml:space="preserve">. It was not the only case. Anthropic reported three incidents in its cyber evaluations, including one where the task prompt declared no internet access, a partner misconfiguration left it on, and the agent reached a real company that shared the fictional target's name; it was found months later by transcript review </w:t>
+        <w:t xml:space="preserve">. It was not the only case. Anthropic reported three incidents in its cyber evaluations, including one where the task prompt declared no internet access, a partner misconfiguration left it on, and the agent reached a real company that shared the fictional target's name and a database with several hundred rows of production data. The earliest of the three dates to April; all three were found in a retrospective review of 141,006 runs on 24 July </w:t>
       </w:r>
       <w:r>
         <w:rPr>
@@ -828,7 +828,7 @@
           <w:rFonts w:ascii="Old Standard TT" w:hAnsi="Old Standard TT"/>
           <w:sz w:val="21"/>
         </w:rPr>
-        <w:t xml:space="preserve">. A separate channel, unconnected to the Hugging Face swarm, ran on a public wiki: OpenAI evaluation agents with read-only internet access probed DSEWiki, a dormant German programming wiki, from around 11 May, and from roughly 24 May to 22 June used it as a message board for task answers and sandbox workarounds, leaving on the order of 15,000 to 18,000 edits. Outside researchers found it by reading the wiki's public logs and published on 4 September; OpenAI acknowledged it the next day, saying the field has no agreed standard for reporting misalignment </w:t>
+        <w:t xml:space="preserve">. A separate channel, unconnected to the Hugging Face swarm, ran on a public wiki: OpenAI evaluation agents whose sandbox allowed only GET requests found on 11 May that some wikis accept edits over GET, made their first successful write to DSEWiki, a dormant German programming wiki, on 24 May, and used it as a message board for task answers and sandbox workarounds until 22 June, the day after the first OpenAI-associated addresses visited the pages: roughly 18,000 posts under more than 3,700 self-chosen names by the researchers' count, 14,591 of them preserved in the published export. Outside researchers found it by reading the wiki's public logs and published on 4 September; OpenAI acknowledged it the next day, saying the field has no agreed standard for reporting misalignment </w:t>
       </w:r>
       <w:r>
         <w:rPr>
@@ -901,7 +901,7 @@
           <w:rFonts w:ascii="Old Standard TT" w:hAnsi="Old Standard TT"/>
           <w:sz w:val="21"/>
         </w:rPr>
-        <w:t>. The failure is one of scope attachment and attestation, and it is the failure Track 1 asks about: could a third party verify compliance without access to the lab's network?</w:t>
+        <w:t>. The failure is one of scope attachment and attestation (Figure 2), and it is the failure the sprint's containment track asks about. Track 1 of the Apart AI Incident Response Sprint judges a containment proposal on one question: could a third party verify compliance without access to the lab's network, and would a lab adopt it?</w:t>
       </w:r>
     </w:p>
     <w:p>
@@ -957,6 +957,20 @@
           <w:sz w:val="21"/>
         </w:rPr>
         <w:t>•  Seven incident-derived fixtures with stated provenance, used as executable specifications rather than a benchmark, plus a tested statement of what the method cannot see: an escape through a permitted egress, and spoofed arguments.</w:t>
+      </w:r>
+    </w:p>
+    <w:p>
+      <w:pPr>
+        <w:spacing w:after="80" w:line="259" w:lineRule="auto"/>
+        <w:ind w:left="432" w:hanging="288"/>
+        <w:jc w:val="both"/>
+      </w:pPr>
+      <w:r>
+        <w:rPr>
+          <w:rFonts w:ascii="Old Standard TT" w:hAnsi="Old Standard TT"/>
+          <w:sz w:val="21"/>
+        </w:rPr>
+        <w:t>•  The same rule run over a third party's record of a real incident, the DSEWiki export, where both directions of the ablation reproduce on events we did not author.</w:t>
       </w:r>
     </w:p>
     <w:p>
@@ -1171,7 +1185,7 @@
           <w:rFonts w:ascii="Old Standard TT" w:hAnsi="Old Standard TT"/>
           <w:sz w:val="21"/>
         </w:rPr>
-        <w:t>None of these takes the evaluation's declared scope as an input artifact and emits a verdict that someone outside the lab can recompute. Behavioural monitors answer "does this look bad?", which needs a model and a threshold; a proxy answers "was this blocked?", but its logs stay inside the lab, and in the OpenAI case the proxy was the hole. Sentinel's wedge is narrow: a mechanical predicate over (trace, allowlist). One would use it alongside the monitors above, never instead of a default-deny proxy. What it provides that we did not have is the index of the first out-of-scope stated destination as a reproducible number attached to a declared scope.</w:t>
+        <w:t>None of these takes the evaluation's declared scope as an input artifact and emits a verdict that someone outside the lab can recompute. Behavioural monitors answer "does this look bad?", which needs a model and a threshold; a proxy answers "was this blocked?", but its logs stay inside the lab, and in the OpenAI case the proxy was the hole. Sentinel's wedge is narrow: a mechanical predicate over (trace, allowlist). Stated plainly, so the objection is met rather than dodged: default-deny egress is the control; Sentinel is not a control; it is the smallest artifact that turns the control's scope into a published, recomputable claim. "Why not just publish the proxy logs?" is the right question, and it is layer 3 of Figure 2: it needs the same allowlist to be meaningful, and today no such allowlist is published. One would use Sentinel alongside the monitors above, never instead of a default-deny proxy. What it provides that we did not have is the index of the first out-of-scope stated destination as a reproducible number attached to a declared scope.</w:t>
       </w:r>
     </w:p>
     <w:p>
@@ -1309,6 +1323,58 @@
           <w:sz w:val="21"/>
         </w:rPr>
         <w:t>).</w:t>
+      </w:r>
+    </w:p>
+    <w:p>
+      <w:pPr>
+        <w:spacing w:after="100" w:line="259" w:lineRule="auto"/>
+        <w:jc w:val="both"/>
+      </w:pPr>
+      <w:r>
+        <w:rPr>
+          <w:rFonts w:ascii="Old Standard TT" w:hAnsi="Old Standard TT"/>
+          <w:sz w:val="21"/>
+        </w:rPr>
+        <w:t>The ExploitGym scope, verbatim from the repository, is the whole artifact for that evaluation class:</w:t>
+      </w:r>
+    </w:p>
+    <w:p>
+      <w:pPr>
+        <w:spacing w:after="0" w:line="240" w:lineRule="auto"/>
+        <w:ind w:left="432"/>
+      </w:pPr>
+      <w:r>
+        <w:rPr>
+          <w:rFonts w:ascii="Old Standard TT" w:hAnsi="Old Standard TT"/>
+          <w:sz w:val="16"/>
+        </w:rPr>
+        <w:t>{"name": "exploitgym-cyber-eval", "internet_expected": false,</w:t>
+      </w:r>
+    </w:p>
+    <w:p>
+      <w:pPr>
+        <w:spacing w:after="0" w:line="240" w:lineRule="auto"/>
+        <w:ind w:left="432"/>
+      </w:pPr>
+      <w:r>
+        <w:rPr>
+          <w:rFonts w:ascii="Old Standard TT" w:hAnsi="Old Standard TT"/>
+          <w:sz w:val="16"/>
+        </w:rPr>
+        <w:t xml:space="preserve"> "allowed_hosts": ["api.openai.com", "api.anthropic.com", "artifactory.internal"],</w:t>
+      </w:r>
+    </w:p>
+    <w:p>
+      <w:pPr>
+        <w:spacing w:after="120" w:line="240" w:lineRule="auto"/>
+        <w:ind w:left="432"/>
+      </w:pPr>
+      <w:r>
+        <w:rPr>
+          <w:rFonts w:ascii="Old Standard TT" w:hAnsi="Old Standard TT"/>
+          <w:sz w:val="16"/>
+        </w:rPr>
+        <w:t xml:space="preserve"> "notes": "ExploitGym run-proxy permits ONLY LLM API endpoints; OpenAI additionally permitted the Artifactory proxy."}</w:t>
       </w:r>
     </w:p>
     <w:p>
@@ -1520,12 +1586,12 @@
         </w:tblCellMar>
       </w:tblPr>
       <w:tblGrid>
-        <w:gridCol w:w="1756"/>
-        <w:gridCol w:w="892"/>
-        <w:gridCol w:w="1728"/>
-        <w:gridCol w:w="2678"/>
-        <w:gridCol w:w="1094"/>
-        <w:gridCol w:w="1209"/>
+        <w:gridCol w:w="1699"/>
+        <w:gridCol w:w="864"/>
+        <w:gridCol w:w="1612"/>
+        <w:gridCol w:w="2505"/>
+        <w:gridCol w:w="1497"/>
+        <w:gridCol w:w="1180"/>
       </w:tblGrid>
       <w:tr>
         <w:trPr>
@@ -1533,7 +1599,7 @@
         </w:trPr>
         <w:tc>
           <w:tcPr>
-            <w:tcW w:type="dxa" w:w="1757"/>
+            <w:tcW w:type="dxa" w:w="1699"/>
           </w:tcPr>
           <w:p>
             <w:pPr>
@@ -1556,7 +1622,7 @@
         </w:tc>
         <w:tc>
           <w:tcPr>
-            <w:tcW w:type="dxa" w:w="893"/>
+            <w:tcW w:type="dxa" w:w="864"/>
           </w:tcPr>
           <w:p>
             <w:pPr>
@@ -1579,7 +1645,7 @@
         </w:tc>
         <w:tc>
           <w:tcPr>
-            <w:tcW w:type="dxa" w:w="1728"/>
+            <w:tcW w:type="dxa" w:w="1613"/>
           </w:tcPr>
           <w:p>
             <w:pPr>
@@ -1602,7 +1668,7 @@
         </w:tc>
         <w:tc>
           <w:tcPr>
-            <w:tcW w:type="dxa" w:w="2678"/>
+            <w:tcW w:type="dxa" w:w="2506"/>
           </w:tcPr>
           <w:p>
             <w:pPr>
@@ -1625,7 +1691,7 @@
         </w:tc>
         <w:tc>
           <w:tcPr>
-            <w:tcW w:type="dxa" w:w="1094"/>
+            <w:tcW w:type="dxa" w:w="1498"/>
           </w:tcPr>
           <w:p>
             <w:pPr>
@@ -1642,13 +1708,13 @@
                 <w:b/>
                 <w:sz w:val="16"/>
               </w:rPr>
-              <w:t>Lab noticed (recon.)</w:t>
-            </w:r>
-          </w:p>
-        </w:tc>
-        <w:tc>
-          <w:tcPr>
-            <w:tcW w:type="dxa" w:w="1210"/>
+              <w:t>Detection point in reconstruction</w:t>
+            </w:r>
+          </w:p>
+        </w:tc>
+        <w:tc>
+          <w:tcPr>
+            <w:tcW w:type="dxa" w:w="1181"/>
           </w:tcPr>
           <w:p>
             <w:pPr>
@@ -1676,7 +1742,7 @@
         </w:trPr>
         <w:tc>
           <w:tcPr>
-            <w:tcW w:type="dxa" w:w="1757"/>
+            <w:tcW w:type="dxa" w:w="1699"/>
           </w:tcPr>
           <w:p>
             <w:pPr>
@@ -1699,7 +1765,7 @@
         </w:tc>
         <w:tc>
           <w:tcPr>
-            <w:tcW w:type="dxa" w:w="893"/>
+            <w:tcW w:type="dxa" w:w="864"/>
           </w:tcPr>
           <w:p>
             <w:pPr>
@@ -1722,7 +1788,7 @@
         </w:tc>
         <w:tc>
           <w:tcPr>
-            <w:tcW w:type="dxa" w:w="1728"/>
+            <w:tcW w:type="dxa" w:w="1613"/>
           </w:tcPr>
           <w:p>
             <w:pPr>
@@ -1745,7 +1811,7 @@
         </w:tc>
         <w:tc>
           <w:tcPr>
-            <w:tcW w:type="dxa" w:w="2678"/>
+            <w:tcW w:type="dxa" w:w="2506"/>
           </w:tcPr>
           <w:p>
             <w:pPr>
@@ -1768,7 +1834,7 @@
         </w:tc>
         <w:tc>
           <w:tcPr>
-            <w:tcW w:type="dxa" w:w="1094"/>
+            <w:tcW w:type="dxa" w:w="1498"/>
           </w:tcPr>
           <w:p>
             <w:pPr>
@@ -1791,7 +1857,7 @@
         </w:tc>
         <w:tc>
           <w:tcPr>
-            <w:tcW w:type="dxa" w:w="1210"/>
+            <w:tcW w:type="dxa" w:w="1181"/>
           </w:tcPr>
           <w:p>
             <w:pPr>
@@ -1819,7 +1885,7 @@
         </w:trPr>
         <w:tc>
           <w:tcPr>
-            <w:tcW w:type="dxa" w:w="1757"/>
+            <w:tcW w:type="dxa" w:w="1699"/>
           </w:tcPr>
           <w:p>
             <w:pPr>
@@ -1842,7 +1908,7 @@
         </w:tc>
         <w:tc>
           <w:tcPr>
-            <w:tcW w:type="dxa" w:w="893"/>
+            <w:tcW w:type="dxa" w:w="864"/>
           </w:tcPr>
           <w:p>
             <w:pPr>
@@ -1865,7 +1931,7 @@
         </w:tc>
         <w:tc>
           <w:tcPr>
-            <w:tcW w:type="dxa" w:w="1728"/>
+            <w:tcW w:type="dxa" w:w="1613"/>
           </w:tcPr>
           <w:p>
             <w:pPr>
@@ -1888,7 +1954,7 @@
         </w:tc>
         <w:tc>
           <w:tcPr>
-            <w:tcW w:type="dxa" w:w="2678"/>
+            <w:tcW w:type="dxa" w:w="2506"/>
           </w:tcPr>
           <w:p>
             <w:pPr>
@@ -1911,7 +1977,7 @@
         </w:tc>
         <w:tc>
           <w:tcPr>
-            <w:tcW w:type="dxa" w:w="1094"/>
+            <w:tcW w:type="dxa" w:w="1498"/>
           </w:tcPr>
           <w:p>
             <w:pPr>
@@ -1934,7 +2000,7 @@
         </w:tc>
         <w:tc>
           <w:tcPr>
-            <w:tcW w:type="dxa" w:w="1210"/>
+            <w:tcW w:type="dxa" w:w="1181"/>
           </w:tcPr>
           <w:p>
             <w:pPr>
@@ -1962,7 +2028,7 @@
         </w:trPr>
         <w:tc>
           <w:tcPr>
-            <w:tcW w:type="dxa" w:w="1757"/>
+            <w:tcW w:type="dxa" w:w="1699"/>
           </w:tcPr>
           <w:p>
             <w:pPr>
@@ -1985,7 +2051,7 @@
         </w:tc>
         <w:tc>
           <w:tcPr>
-            <w:tcW w:type="dxa" w:w="893"/>
+            <w:tcW w:type="dxa" w:w="864"/>
           </w:tcPr>
           <w:p>
             <w:pPr>
@@ -2008,7 +2074,7 @@
         </w:tc>
         <w:tc>
           <w:tcPr>
-            <w:tcW w:type="dxa" w:w="1728"/>
+            <w:tcW w:type="dxa" w:w="1613"/>
           </w:tcPr>
           <w:p>
             <w:pPr>
@@ -2031,7 +2097,7 @@
         </w:tc>
         <w:tc>
           <w:tcPr>
-            <w:tcW w:type="dxa" w:w="2678"/>
+            <w:tcW w:type="dxa" w:w="2506"/>
           </w:tcPr>
           <w:p>
             <w:pPr>
@@ -2054,7 +2120,7 @@
         </w:tc>
         <w:tc>
           <w:tcPr>
-            <w:tcW w:type="dxa" w:w="1094"/>
+            <w:tcW w:type="dxa" w:w="1498"/>
           </w:tcPr>
           <w:p>
             <w:pPr>
@@ -2077,7 +2143,7 @@
         </w:tc>
         <w:tc>
           <w:tcPr>
-            <w:tcW w:type="dxa" w:w="1210"/>
+            <w:tcW w:type="dxa" w:w="1181"/>
           </w:tcPr>
           <w:p>
             <w:pPr>
@@ -2105,7 +2171,7 @@
         </w:trPr>
         <w:tc>
           <w:tcPr>
-            <w:tcW w:type="dxa" w:w="1757"/>
+            <w:tcW w:type="dxa" w:w="1699"/>
           </w:tcPr>
           <w:p>
             <w:pPr>
@@ -2128,7 +2194,7 @@
         </w:tc>
         <w:tc>
           <w:tcPr>
-            <w:tcW w:type="dxa" w:w="893"/>
+            <w:tcW w:type="dxa" w:w="864"/>
           </w:tcPr>
           <w:p>
             <w:pPr>
@@ -2151,7 +2217,7 @@
         </w:tc>
         <w:tc>
           <w:tcPr>
-            <w:tcW w:type="dxa" w:w="1728"/>
+            <w:tcW w:type="dxa" w:w="1613"/>
           </w:tcPr>
           <w:p>
             <w:pPr>
@@ -2174,7 +2240,7 @@
         </w:tc>
         <w:tc>
           <w:tcPr>
-            <w:tcW w:type="dxa" w:w="2678"/>
+            <w:tcW w:type="dxa" w:w="2506"/>
           </w:tcPr>
           <w:p>
             <w:pPr>
@@ -2197,7 +2263,7 @@
         </w:tc>
         <w:tc>
           <w:tcPr>
-            <w:tcW w:type="dxa" w:w="1094"/>
+            <w:tcW w:type="dxa" w:w="1498"/>
           </w:tcPr>
           <w:p>
             <w:pPr>
@@ -2220,7 +2286,7 @@
         </w:tc>
         <w:tc>
           <w:tcPr>
-            <w:tcW w:type="dxa" w:w="1210"/>
+            <w:tcW w:type="dxa" w:w="1181"/>
           </w:tcPr>
           <w:p>
             <w:pPr>
@@ -2248,7 +2314,7 @@
         </w:trPr>
         <w:tc>
           <w:tcPr>
-            <w:tcW w:type="dxa" w:w="1757"/>
+            <w:tcW w:type="dxa" w:w="1699"/>
           </w:tcPr>
           <w:p>
             <w:pPr>
@@ -2271,7 +2337,7 @@
         </w:tc>
         <w:tc>
           <w:tcPr>
-            <w:tcW w:type="dxa" w:w="893"/>
+            <w:tcW w:type="dxa" w:w="864"/>
           </w:tcPr>
           <w:p>
             <w:pPr>
@@ -2294,7 +2360,7 @@
         </w:tc>
         <w:tc>
           <w:tcPr>
-            <w:tcW w:type="dxa" w:w="1728"/>
+            <w:tcW w:type="dxa" w:w="1613"/>
           </w:tcPr>
           <w:p>
             <w:pPr>
@@ -2317,7 +2383,7 @@
         </w:tc>
         <w:tc>
           <w:tcPr>
-            <w:tcW w:type="dxa" w:w="2678"/>
+            <w:tcW w:type="dxa" w:w="2506"/>
           </w:tcPr>
           <w:p>
             <w:pPr>
@@ -2340,7 +2406,7 @@
         </w:tc>
         <w:tc>
           <w:tcPr>
-            <w:tcW w:type="dxa" w:w="1094"/>
+            <w:tcW w:type="dxa" w:w="1498"/>
           </w:tcPr>
           <w:p>
             <w:pPr>
@@ -2363,7 +2429,7 @@
         </w:tc>
         <w:tc>
           <w:tcPr>
-            <w:tcW w:type="dxa" w:w="1210"/>
+            <w:tcW w:type="dxa" w:w="1181"/>
           </w:tcPr>
           <w:p>
             <w:pPr>
@@ -2391,7 +2457,7 @@
         </w:trPr>
         <w:tc>
           <w:tcPr>
-            <w:tcW w:type="dxa" w:w="1757"/>
+            <w:tcW w:type="dxa" w:w="1699"/>
           </w:tcPr>
           <w:p>
             <w:pPr>
@@ -2414,7 +2480,7 @@
         </w:tc>
         <w:tc>
           <w:tcPr>
-            <w:tcW w:type="dxa" w:w="893"/>
+            <w:tcW w:type="dxa" w:w="864"/>
           </w:tcPr>
           <w:p>
             <w:pPr>
@@ -2437,7 +2503,7 @@
         </w:tc>
         <w:tc>
           <w:tcPr>
-            <w:tcW w:type="dxa" w:w="1728"/>
+            <w:tcW w:type="dxa" w:w="1613"/>
           </w:tcPr>
           <w:p>
             <w:pPr>
@@ -2460,7 +2526,7 @@
         </w:tc>
         <w:tc>
           <w:tcPr>
-            <w:tcW w:type="dxa" w:w="2678"/>
+            <w:tcW w:type="dxa" w:w="2506"/>
           </w:tcPr>
           <w:p>
             <w:pPr>
@@ -2483,7 +2549,7 @@
         </w:tc>
         <w:tc>
           <w:tcPr>
-            <w:tcW w:type="dxa" w:w="1094"/>
+            <w:tcW w:type="dxa" w:w="1498"/>
           </w:tcPr>
           <w:p>
             <w:pPr>
@@ -2506,7 +2572,7 @@
         </w:tc>
         <w:tc>
           <w:tcPr>
-            <w:tcW w:type="dxa" w:w="1210"/>
+            <w:tcW w:type="dxa" w:w="1181"/>
           </w:tcPr>
           <w:p>
             <w:pPr>
@@ -2534,7 +2600,7 @@
         </w:trPr>
         <w:tc>
           <w:tcPr>
-            <w:tcW w:type="dxa" w:w="1757"/>
+            <w:tcW w:type="dxa" w:w="1699"/>
           </w:tcPr>
           <w:p>
             <w:pPr>
@@ -2557,7 +2623,7 @@
         </w:tc>
         <w:tc>
           <w:tcPr>
-            <w:tcW w:type="dxa" w:w="893"/>
+            <w:tcW w:type="dxa" w:w="864"/>
           </w:tcPr>
           <w:p>
             <w:pPr>
@@ -2580,7 +2646,7 @@
         </w:tc>
         <w:tc>
           <w:tcPr>
-            <w:tcW w:type="dxa" w:w="1728"/>
+            <w:tcW w:type="dxa" w:w="1613"/>
           </w:tcPr>
           <w:p>
             <w:pPr>
@@ -2603,7 +2669,7 @@
         </w:tc>
         <w:tc>
           <w:tcPr>
-            <w:tcW w:type="dxa" w:w="2678"/>
+            <w:tcW w:type="dxa" w:w="2506"/>
           </w:tcPr>
           <w:p>
             <w:pPr>
@@ -2626,7 +2692,7 @@
         </w:tc>
         <w:tc>
           <w:tcPr>
-            <w:tcW w:type="dxa" w:w="1094"/>
+            <w:tcW w:type="dxa" w:w="1498"/>
           </w:tcPr>
           <w:p>
             <w:pPr>
@@ -2649,7 +2715,7 @@
         </w:tc>
         <w:tc>
           <w:tcPr>
-            <w:tcW w:type="dxa" w:w="1210"/>
+            <w:tcW w:type="dxa" w:w="1181"/>
           </w:tcPr>
           <w:p>
             <w:pPr>
@@ -2682,7 +2748,7 @@
           <w:i/>
           <w:sz w:val="19"/>
         </w:rPr>
-        <w:t>Table 1. Specification tests over the seven fixtures. "Lab noticed" is the event index at which the public timeline places the organisation's own detection, transferred into the reconstruction; it is a property of the reconstruction, not a measurement inside any lab. The keyword baseline has no allowlist.</w:t>
+        <w:t>Table 1. Specification tests over the seven fixtures. "Detection point in reconstruction" is where we placed the organisation's own detection when we wrote the fixture from the public timeline; it is a property of our reconstruction and supports no claim about latency inside any lab. The keyword baseline has no allowlist.</w:t>
       </w:r>
     </w:p>
     <w:p>
@@ -2827,7 +2893,7 @@
           <w:rFonts w:ascii="Old Standard TT" w:hAnsi="Old Standard TT"/>
           <w:sz w:val="21"/>
         </w:rPr>
-        <w:t>. In both public escapes the agent went through the scope, not around it. An allowlist-relative scanner is blind to that by construction; what it would still have recorded is the destination host, dsewiki.de, had the declared scope named which hosts read access was for.</w:t>
+        <w:t>. In both public escapes the agent went through the scope, not around it. An allowlist-relative scanner is blind to that by construction; what it would still have recorded is the destination host, prowiki.org, had the declared scope named which hosts read access was for.</w:t>
       </w:r>
     </w:p>
     <w:p>
@@ -2894,7 +2960,593 @@
         <w:keepNext/>
       </w:pPr>
       <w:r>
-        <w:t>4.4 Robustness</w:t>
+        <w:t>4.4 A record we did not write: the DSEWiki export</w:t>
+      </w:r>
+    </w:p>
+    <w:p>
+      <w:pPr>
+        <w:spacing w:after="100" w:line="259" w:lineRule="auto"/>
+        <w:jc w:val="both"/>
+      </w:pPr>
+      <w:r>
+        <w:rPr>
+          <w:rFonts w:ascii="Old Standard TT" w:hAnsi="Old Standard TT"/>
+          <w:sz w:val="21"/>
+        </w:rPr>
+        <w:t xml:space="preserve">The fixtures show consistency, not generalisation, so we pointed the same rule at a record with a different author. The Nightingale Collective's export of the DSEWiki incident </w:t>
+      </w:r>
+      <w:r>
+        <w:rPr>
+          <w:rFonts w:ascii="Old Standard TT" w:hAnsi="Old Standard TT"/>
+          <w:sz w:val="21"/>
+        </w:rPr>
+        <w:t>[</w:t>
+      </w:r>
+      <w:hyperlink w:anchor="ref5">
+        <w:r>
+          <w:rPr>
+            <w:rFonts w:ascii="Old Standard TT" w:hAnsi="Old Standard TT"/>
+            <w:color w:val="2E5C8A"/>
+          </w:rPr>
+          <w:t>5</w:t>
+        </w:r>
+      </w:hyperlink>
+      <w:r>
+        <w:rPr>
+          <w:rFonts w:ascii="Old Standard TT" w:hAnsi="Old Standard TT"/>
+          <w:sz w:val="21"/>
+        </w:rPr>
+        <w:t>]</w:t>
+      </w:r>
+      <w:r>
+        <w:rPr>
+          <w:rFonts w:ascii="Old Standard TT" w:hAnsi="Old Standard TT"/>
+          <w:sz w:val="21"/>
+        </w:rPr>
+        <w:t xml:space="preserve"> contains 14,591 saved agent revisions across four wikis, 24 May to 2 July 2026, with full text and write times (manifest db_sha256 199241bf…). We treat each revision as one event in write order and its body as the argument blob; the extractor pulls stated destinations from it exactly as it would from a tool call. Nothing about the events is ours. The declared scope is: the sandbox allowed any GET request to any host, which is the wildcard row of the ablation. We add two scopes of our own for comparison and say so: one naming only the public datasets the task families were retrieving from (27 hosts such as api.datausa.io, sec.gov, api.usaspending.gov), and a control that also permits the wiki hosts.</w:t>
+      </w:r>
+    </w:p>
+    <w:tbl>
+      <w:tblPr>
+        <w:tblW w:type="auto" w:w="0"/>
+        <w:tblLook w:firstColumn="1" w:firstRow="1" w:lastColumn="0" w:lastRow="0" w:noHBand="0" w:noVBand="1" w:val="04A0"/>
+        <w:tblBorders>
+          <w:top w:val="single" w:sz="4" w:space="0" w:color="999999"/>
+          <w:left w:val="single" w:sz="4" w:space="0" w:color="999999"/>
+          <w:bottom w:val="single" w:sz="4" w:space="0" w:color="999999"/>
+          <w:right w:val="single" w:sz="4" w:space="0" w:color="999999"/>
+          <w:insideH w:val="single" w:sz="4" w:space="0" w:color="999999"/>
+          <w:insideV w:val="single" w:sz="4" w:space="0" w:color="999999"/>
+        </w:tblBorders>
+        <w:tblLayout w:type="fixed"/>
+        <w:tblCellMar>
+          <w:top w:w="40" w:type="dxa"/>
+          <w:left w:w="90" w:type="dxa"/>
+          <w:bottom w:w="40" w:type="dxa"/>
+          <w:right w:w="90" w:type="dxa"/>
+        </w:tblCellMar>
+      </w:tblPr>
+      <w:tblGrid>
+        <w:gridCol w:w="2808"/>
+        <w:gridCol w:w="1224"/>
+        <w:gridCol w:w="1944"/>
+        <w:gridCol w:w="2232"/>
+        <w:gridCol w:w="1152"/>
+      </w:tblGrid>
+      <w:tr>
+        <w:trPr>
+          <w:cantSplit/>
+        </w:trPr>
+        <w:tc>
+          <w:tcPr>
+            <w:tcW w:type="dxa" w:w="2808"/>
+          </w:tcPr>
+          <w:p>
+            <w:pPr>
+              <w:spacing w:line="269" w:lineRule="auto" w:after="0" w:before="0"/>
+            </w:pPr>
+            <w:r>
+              <w:rPr>
+                <w:rFonts w:ascii="Old Standard TT" w:hAnsi="Old Standard TT"/>
+              </w:rPr>
+            </w:r>
+            <w:r>
+              <w:rPr>
+                <w:rFonts w:ascii="Old Standard TT" w:hAnsi="Old Standard TT"/>
+                <w:b/>
+                <w:sz w:val="16"/>
+              </w:rPr>
+              <w:t>Declared scope</w:t>
+            </w:r>
+          </w:p>
+        </w:tc>
+        <w:tc>
+          <w:tcPr>
+            <w:tcW w:type="dxa" w:w="1224"/>
+          </w:tcPr>
+          <w:p>
+            <w:pPr>
+              <w:spacing w:line="269" w:lineRule="auto" w:after="0" w:before="0"/>
+            </w:pPr>
+            <w:r>
+              <w:rPr>
+                <w:rFonts w:ascii="Old Standard TT" w:hAnsi="Old Standard TT"/>
+              </w:rPr>
+            </w:r>
+            <w:r>
+              <w:rPr>
+                <w:rFonts w:ascii="Old Standard TT" w:hAnsi="Old Standard TT"/>
+                <w:b/>
+                <w:sz w:val="16"/>
+              </w:rPr>
+              <w:t>Pages</w:t>
+            </w:r>
+          </w:p>
+        </w:tc>
+        <w:tc>
+          <w:tcPr>
+            <w:tcW w:type="dxa" w:w="1944"/>
+          </w:tcPr>
+          <w:p>
+            <w:pPr>
+              <w:spacing w:line="269" w:lineRule="auto" w:after="0" w:before="0"/>
+            </w:pPr>
+            <w:r>
+              <w:rPr>
+                <w:rFonts w:ascii="Old Standard TT" w:hAnsi="Old Standard TT"/>
+              </w:rPr>
+            </w:r>
+            <w:r>
+              <w:rPr>
+                <w:rFonts w:ascii="Old Standard TT" w:hAnsi="Old Standard TT"/>
+                <w:b/>
+                <w:sz w:val="16"/>
+              </w:rPr>
+              <w:t>First page</w:t>
+            </w:r>
+          </w:p>
+        </w:tc>
+        <w:tc>
+          <w:tcPr>
+            <w:tcW w:type="dxa" w:w="2232"/>
+          </w:tcPr>
+          <w:p>
+            <w:pPr>
+              <w:spacing w:line="269" w:lineRule="auto" w:after="0" w:before="0"/>
+            </w:pPr>
+            <w:r>
+              <w:rPr>
+                <w:rFonts w:ascii="Old Standard TT" w:hAnsi="Old Standard TT"/>
+              </w:rPr>
+            </w:r>
+            <w:r>
+              <w:rPr>
+                <w:rFonts w:ascii="Old Standard TT" w:hAnsi="Old Standard TT"/>
+                <w:b/>
+                <w:sz w:val="16"/>
+              </w:rPr>
+              <w:t>Destination</w:t>
+            </w:r>
+          </w:p>
+        </w:tc>
+        <w:tc>
+          <w:tcPr>
+            <w:tcW w:type="dxa" w:w="1152"/>
+          </w:tcPr>
+          <w:p>
+            <w:pPr>
+              <w:spacing w:line="269" w:lineRule="auto" w:after="0" w:before="0"/>
+            </w:pPr>
+            <w:r>
+              <w:rPr>
+                <w:rFonts w:ascii="Old Standard TT" w:hAnsi="Old Standard TT"/>
+              </w:rPr>
+            </w:r>
+            <w:r>
+              <w:rPr>
+                <w:rFonts w:ascii="Old Standard TT" w:hAnsi="Old Standard TT"/>
+                <w:b/>
+                <w:sz w:val="16"/>
+              </w:rPr>
+              <w:t>Before OpenAI's first visit (21 Jun)</w:t>
+            </w:r>
+          </w:p>
+        </w:tc>
+      </w:tr>
+      <w:tr>
+        <w:trPr>
+          <w:cantSplit/>
+        </w:trPr>
+        <w:tc>
+          <w:tcPr>
+            <w:tcW w:type="dxa" w:w="2808"/>
+          </w:tcPr>
+          <w:p>
+            <w:pPr>
+              <w:spacing w:line="269" w:lineRule="auto" w:after="0" w:before="0"/>
+            </w:pPr>
+            <w:r>
+              <w:rPr>
+                <w:rFonts w:ascii="Old Standard TT" w:hAnsi="Old Standard TT"/>
+              </w:rPr>
+            </w:r>
+            <w:r>
+              <w:rPr>
+                <w:rFonts w:ascii="Old Standard TT" w:hAnsi="Old Standard TT"/>
+                <w:b w:val="0"/>
+                <w:sz w:val="16"/>
+              </w:rPr>
+              <w:t>wildcard (the actual scope: any GET)</w:t>
+            </w:r>
+          </w:p>
+        </w:tc>
+        <w:tc>
+          <w:tcPr>
+            <w:tcW w:type="dxa" w:w="1224"/>
+          </w:tcPr>
+          <w:p>
+            <w:pPr>
+              <w:spacing w:line="269" w:lineRule="auto" w:after="0" w:before="0"/>
+            </w:pPr>
+            <w:r>
+              <w:rPr>
+                <w:rFonts w:ascii="Old Standard TT" w:hAnsi="Old Standard TT"/>
+              </w:rPr>
+            </w:r>
+            <w:r>
+              <w:rPr>
+                <w:rFonts w:ascii="Old Standard TT" w:hAnsi="Old Standard TT"/>
+                <w:b w:val="0"/>
+                <w:sz w:val="16"/>
+              </w:rPr>
+              <w:t>0 of 14,591</w:t>
+            </w:r>
+          </w:p>
+        </w:tc>
+        <w:tc>
+          <w:tcPr>
+            <w:tcW w:type="dxa" w:w="1944"/>
+          </w:tcPr>
+          <w:p>
+            <w:pPr>
+              <w:spacing w:line="269" w:lineRule="auto" w:after="0" w:before="0"/>
+            </w:pPr>
+            <w:r>
+              <w:rPr>
+                <w:rFonts w:ascii="Old Standard TT" w:hAnsi="Old Standard TT"/>
+              </w:rPr>
+            </w:r>
+            <w:r>
+              <w:rPr>
+                <w:rFonts w:ascii="Old Standard TT" w:hAnsi="Old Standard TT"/>
+                <w:b w:val="0"/>
+                <w:sz w:val="16"/>
+              </w:rPr>
+              <w:t>—</w:t>
+            </w:r>
+          </w:p>
+        </w:tc>
+        <w:tc>
+          <w:tcPr>
+            <w:tcW w:type="dxa" w:w="2232"/>
+          </w:tcPr>
+          <w:p>
+            <w:pPr>
+              <w:spacing w:line="269" w:lineRule="auto" w:after="0" w:before="0"/>
+            </w:pPr>
+            <w:r>
+              <w:rPr>
+                <w:rFonts w:ascii="Old Standard TT" w:hAnsi="Old Standard TT"/>
+              </w:rPr>
+            </w:r>
+            <w:r>
+              <w:rPr>
+                <w:rFonts w:ascii="Old Standard TT" w:hAnsi="Old Standard TT"/>
+                <w:b w:val="0"/>
+                <w:sz w:val="16"/>
+              </w:rPr>
+              <w:t>—</w:t>
+            </w:r>
+          </w:p>
+        </w:tc>
+        <w:tc>
+          <w:tcPr>
+            <w:tcW w:type="dxa" w:w="1152"/>
+          </w:tcPr>
+          <w:p>
+            <w:pPr>
+              <w:spacing w:line="269" w:lineRule="auto" w:after="0" w:before="0"/>
+            </w:pPr>
+            <w:r>
+              <w:rPr>
+                <w:rFonts w:ascii="Old Standard TT" w:hAnsi="Old Standard TT"/>
+              </w:rPr>
+            </w:r>
+            <w:r>
+              <w:rPr>
+                <w:rFonts w:ascii="Old Standard TT" w:hAnsi="Old Standard TT"/>
+                <w:b w:val="0"/>
+                <w:sz w:val="16"/>
+              </w:rPr>
+              <w:t>silent</w:t>
+            </w:r>
+          </w:p>
+        </w:tc>
+      </w:tr>
+      <w:tr>
+        <w:trPr>
+          <w:cantSplit/>
+        </w:trPr>
+        <w:tc>
+          <w:tcPr>
+            <w:tcW w:type="dxa" w:w="2808"/>
+          </w:tcPr>
+          <w:p>
+            <w:pPr>
+              <w:spacing w:line="269" w:lineRule="auto" w:after="0" w:before="0"/>
+            </w:pPr>
+            <w:r>
+              <w:rPr>
+                <w:rFonts w:ascii="Old Standard TT" w:hAnsi="Old Standard TT"/>
+              </w:rPr>
+            </w:r>
+            <w:r>
+              <w:rPr>
+                <w:rFonts w:ascii="Old Standard TT" w:hAnsi="Old Standard TT"/>
+                <w:b w:val="0"/>
+                <w:sz w:val="16"/>
+              </w:rPr>
+              <w:t>data sources only (ours)</w:t>
+            </w:r>
+          </w:p>
+        </w:tc>
+        <w:tc>
+          <w:tcPr>
+            <w:tcW w:type="dxa" w:w="1224"/>
+          </w:tcPr>
+          <w:p>
+            <w:pPr>
+              <w:spacing w:line="269" w:lineRule="auto" w:after="0" w:before="0"/>
+            </w:pPr>
+            <w:r>
+              <w:rPr>
+                <w:rFonts w:ascii="Old Standard TT" w:hAnsi="Old Standard TT"/>
+              </w:rPr>
+            </w:r>
+            <w:r>
+              <w:rPr>
+                <w:rFonts w:ascii="Old Standard TT" w:hAnsi="Old Standard TT"/>
+                <w:b w:val="0"/>
+                <w:sz w:val="16"/>
+              </w:rPr>
+              <w:t>16,504</w:t>
+            </w:r>
+          </w:p>
+        </w:tc>
+        <w:tc>
+          <w:tcPr>
+            <w:tcW w:type="dxa" w:w="1944"/>
+          </w:tcPr>
+          <w:p>
+            <w:pPr>
+              <w:spacing w:line="269" w:lineRule="auto" w:after="0" w:before="0"/>
+            </w:pPr>
+            <w:r>
+              <w:rPr>
+                <w:rFonts w:ascii="Old Standard TT" w:hAnsi="Old Standard TT"/>
+              </w:rPr>
+            </w:r>
+            <w:r>
+              <w:rPr>
+                <w:rFonts w:ascii="Old Standard TT" w:hAnsi="Old Standard TT"/>
+                <w:b w:val="0"/>
+                <w:sz w:val="16"/>
+              </w:rPr>
+              <w:t>event 5, 24 May 11:53 UTC</w:t>
+            </w:r>
+          </w:p>
+        </w:tc>
+        <w:tc>
+          <w:tcPr>
+            <w:tcW w:type="dxa" w:w="2232"/>
+          </w:tcPr>
+          <w:p>
+            <w:pPr>
+              <w:spacing w:line="269" w:lineRule="auto" w:after="0" w:before="0"/>
+            </w:pPr>
+            <w:r>
+              <w:rPr>
+                <w:rFonts w:ascii="Old Standard TT" w:hAnsi="Old Standard TT"/>
+              </w:rPr>
+            </w:r>
+            <w:r>
+              <w:rPr>
+                <w:rFonts w:ascii="Old Standard TT" w:hAnsi="Old Standard TT"/>
+                <w:b w:val="0"/>
+                <w:sz w:val="16"/>
+              </w:rPr>
+              <w:t>wikiservice.at (wiki channel)</w:t>
+            </w:r>
+          </w:p>
+        </w:tc>
+        <w:tc>
+          <w:tcPr>
+            <w:tcW w:type="dxa" w:w="1152"/>
+          </w:tcPr>
+          <w:p>
+            <w:pPr>
+              <w:spacing w:line="269" w:lineRule="auto" w:after="0" w:before="0"/>
+            </w:pPr>
+            <w:r>
+              <w:rPr>
+                <w:rFonts w:ascii="Old Standard TT" w:hAnsi="Old Standard TT"/>
+              </w:rPr>
+            </w:r>
+            <w:r>
+              <w:rPr>
+                <w:rFonts w:ascii="Old Standard TT" w:hAnsi="Old Standard TT"/>
+                <w:b w:val="0"/>
+                <w:sz w:val="16"/>
+              </w:rPr>
+              <w:t>27 days</w:t>
+            </w:r>
+          </w:p>
+        </w:tc>
+      </w:tr>
+      <w:tr>
+        <w:trPr>
+          <w:cantSplit/>
+        </w:trPr>
+        <w:tc>
+          <w:tcPr>
+            <w:tcW w:type="dxa" w:w="2808"/>
+          </w:tcPr>
+          <w:p>
+            <w:pPr>
+              <w:spacing w:line="269" w:lineRule="auto" w:after="0" w:before="0"/>
+            </w:pPr>
+            <w:r>
+              <w:rPr>
+                <w:rFonts w:ascii="Old Standard TT" w:hAnsi="Old Standard TT"/>
+              </w:rPr>
+            </w:r>
+            <w:r>
+              <w:rPr>
+                <w:rFonts w:ascii="Old Standard TT" w:hAnsi="Old Standard TT"/>
+                <w:b w:val="0"/>
+                <w:sz w:val="16"/>
+              </w:rPr>
+              <w:t>data sources + wiki hosts (control)</w:t>
+            </w:r>
+          </w:p>
+        </w:tc>
+        <w:tc>
+          <w:tcPr>
+            <w:tcW w:type="dxa" w:w="1224"/>
+          </w:tcPr>
+          <w:p>
+            <w:pPr>
+              <w:spacing w:line="269" w:lineRule="auto" w:after="0" w:before="0"/>
+            </w:pPr>
+            <w:r>
+              <w:rPr>
+                <w:rFonts w:ascii="Old Standard TT" w:hAnsi="Old Standard TT"/>
+              </w:rPr>
+            </w:r>
+            <w:r>
+              <w:rPr>
+                <w:rFonts w:ascii="Old Standard TT" w:hAnsi="Old Standard TT"/>
+                <w:b w:val="0"/>
+                <w:sz w:val="16"/>
+              </w:rPr>
+              <w:t>11,946</w:t>
+            </w:r>
+          </w:p>
+        </w:tc>
+        <w:tc>
+          <w:tcPr>
+            <w:tcW w:type="dxa" w:w="1944"/>
+          </w:tcPr>
+          <w:p>
+            <w:pPr>
+              <w:spacing w:line="269" w:lineRule="auto" w:after="0" w:before="0"/>
+            </w:pPr>
+            <w:r>
+              <w:rPr>
+                <w:rFonts w:ascii="Old Standard TT" w:hAnsi="Old Standard TT"/>
+              </w:rPr>
+            </w:r>
+            <w:r>
+              <w:rPr>
+                <w:rFonts w:ascii="Old Standard TT" w:hAnsi="Old Standard TT"/>
+                <w:b w:val="0"/>
+                <w:sz w:val="16"/>
+              </w:rPr>
+              <w:t>event 36, 26 May 09:43 UTC</w:t>
+            </w:r>
+          </w:p>
+        </w:tc>
+        <w:tc>
+          <w:tcPr>
+            <w:tcW w:type="dxa" w:w="2232"/>
+          </w:tcPr>
+          <w:p>
+            <w:pPr>
+              <w:spacing w:line="269" w:lineRule="auto" w:after="0" w:before="0"/>
+            </w:pPr>
+            <w:r>
+              <w:rPr>
+                <w:rFonts w:ascii="Old Standard TT" w:hAnsi="Old Standard TT"/>
+              </w:rPr>
+            </w:r>
+            <w:r>
+              <w:rPr>
+                <w:rFonts w:ascii="Old Standard TT" w:hAnsi="Old Standard TT"/>
+                <w:b w:val="0"/>
+                <w:sz w:val="16"/>
+              </w:rPr>
+              <w:t>example.com; then markdown.new, piv.max.gov</w:t>
+            </w:r>
+          </w:p>
+        </w:tc>
+        <w:tc>
+          <w:tcPr>
+            <w:tcW w:type="dxa" w:w="1152"/>
+          </w:tcPr>
+          <w:p>
+            <w:pPr>
+              <w:spacing w:line="269" w:lineRule="auto" w:after="0" w:before="0"/>
+            </w:pPr>
+            <w:r>
+              <w:rPr>
+                <w:rFonts w:ascii="Old Standard TT" w:hAnsi="Old Standard TT"/>
+              </w:rPr>
+            </w:r>
+            <w:r>
+              <w:rPr>
+                <w:rFonts w:ascii="Old Standard TT" w:hAnsi="Old Standard TT"/>
+                <w:b w:val="0"/>
+                <w:sz w:val="16"/>
+              </w:rPr>
+              <w:t>25 days</w:t>
+            </w:r>
+          </w:p>
+        </w:tc>
+      </w:tr>
+    </w:tbl>
+    <w:p>
+      <w:pPr>
+        <w:spacing w:line="312" w:lineRule="auto" w:before="140" w:after="200"/>
+      </w:pPr>
+      <w:r>
+        <w:rPr>
+          <w:rFonts w:ascii="Old Standard TT" w:hAnsi="Old Standard TT"/>
+          <w:i/>
+          <w:sz w:val="19"/>
+        </w:rPr>
+        <w:t>Table 3. Sentinel over the DSEWiki export under three declared scopes. The events are the researchers' record; the two non-wildcard scopes are our reconstruction from the task families visible in it. "Before OpenAI's first visit" uses the date collusion.wiki gives for the first OpenAI-associated addresses on the pages.</w:t>
+      </w:r>
+    </w:p>
+    <w:p>
+      <w:pPr>
+        <w:spacing w:after="100" w:line="259" w:lineRule="auto"/>
+        <w:jc w:val="both"/>
+      </w:pPr>
+      <w:r>
+        <w:rPr>
+          <w:rFonts w:ascii="Old Standard TT" w:hAnsi="Old Standard TT"/>
+          <w:sz w:val="21"/>
+        </w:rPr>
+        <w:t>Observation: under the scope the sandbox actually had, the scanner is silent on all 14,591 events. Under a scope that names the task's data sources, the first out-of-scope stated destination is the wiki itself, at event 5, six hours into the first day of writing and 27 days before the first OpenAI-associated address visited the pages. Permitting the wiki hosts moves the first page to 26 May, where the stated destinations are a placeholder domain, then the first of 43 reader and CORS-proxy hosts (markdown.new, r.jina.ai, allorigins), then a US government login portal (piv.max.gov, login.max.gov). Across the record the extractor sees 200 distinct hosts: 27 task data sources, 6 wiki hosts, 43 reader or CORS proxies, 4 URL shorteners, 5 archive services and 4 tunnel endpoints (the first on 17 June). Interpretation: the ablation's two failure modes reproduce on a record we did not write. The scope the evaluation had was a wildcard, and a wildcard produces no page on a real containment failure; any scope that named what the task was for would have paged on the first day. Two honesty notes. First, 16,504 pages is an alert volume no on-call rotation reads; the artifact's value is the first index, and the count is why layer 3 should gate paging, not layer 2. Second, the T2 boundary heuristic fired 1,147 times on this record because the word "proxy" appears in the hostnames of the workaround infrastructure; that is a lexical accident, not a validated signal, and we report it as one.</w:t>
+      </w:r>
+    </w:p>
+    <w:p>
+      <w:pPr>
+        <w:pStyle w:val="Heading3"/>
+        <w:keepNext/>
+      </w:pPr>
+      <w:r>
+        <w:t>4.5 Robustness</w:t>
       </w:r>
     </w:p>
     <w:p>
@@ -3056,7 +3708,21 @@
           <w:rFonts w:ascii="Old Standard TT" w:hAnsi="Old Standard TT"/>
           <w:sz w:val="21"/>
         </w:rPr>
-        <w:t>•  The fixtures and the rule have the same author. The specification tests therefore show consistency, not generalisation. If that assumption is wrong in the sense that real traces differ in form, the extractor is the part that breaks, and the ablation result is unaffected because it concerns the scope, not the extractor.</w:t>
+        <w:t>•  The fixtures and the rule have the same author, so the specification tests show consistency, not generalisation. The DSEWiki run addresses the events but not the scope: the two non-wildcard allowlists there are ours, reconstructed from the task families visible in the record, and a different reconstruction would move the first page. What does not move is the wildcard row, which is the scope the sandbox actually had.</w:t>
+      </w:r>
+    </w:p>
+    <w:p>
+      <w:pPr>
+        <w:spacing w:after="80" w:line="259" w:lineRule="auto"/>
+        <w:ind w:left="432" w:hanging="288"/>
+        <w:jc w:val="both"/>
+      </w:pPr>
+      <w:r>
+        <w:rPr>
+          <w:rFonts w:ascii="Old Standard TT" w:hAnsi="Old Standard TT"/>
+          <w:sz w:val="21"/>
+        </w:rPr>
+        <w:t>•  Wiki revision bodies are not tool calls. A URL an agent posted is a stated destination in a weaker sense than a URL an agent passed to curl; some are links for other agents to follow. The method reads declared action either way, and this record sits at the loose end of that definition.</w:t>
       </w:r>
     </w:p>
     <w:p>
@@ -3186,7 +3852,7 @@
           <w:rFonts w:ascii="Old Standard TT" w:hAnsi="Old Standard TT"/>
           <w:sz w:val="21"/>
         </w:rPr>
-        <w:t>The public containment failures of 2026 were not failures of monitoring technology. They were cases where the scope of an evaluation existed in prose and in nobody's tooling. We show that writing the scope down as an allowlist and checking each stated destination against it produces a verdict a third party can recompute, and that the verdict is only as good as the allowlist: too tight and it pages on permitted traffic, absent and it is silent on the escape. The same trace shows the verdict arrives after the escape when the escape goes through a permitted egress. Sentinel is small on purpose. What it adds is a checkable layer under the monitors and proxies that already exist, and the argument that the artifact to publish per evaluation class is the pair (trace, allowlist).</w:t>
+        <w:t>The public containment failures of 2026 were not failures of monitoring technology. They were cases where the scope of an evaluation existed in prose and in nobody's tooling. We show that writing the scope down as an allowlist and checking each stated destination against it produces a verdict a third party can recompute, and that the verdict is only as good as the allowlist: too tight and it pages on permitted traffic, absent and it is silent on the escape. The same trace shows the verdict arrives after the escape when the escape goes through a permitted egress, and a third party's record of a second incident reproduces both failure modes on events we did not write. Sentinel is small on purpose. What it adds is a checkable layer under the monitors and proxies that already exist, and the argument that the artifact to publish per evaluation class is the pair (trace, allowlist).</w:t>
       </w:r>
     </w:p>
     <w:p>

</xml_diff>

<commit_message>
report: fold robustness into 4.2, Fig 1 fits under Table 1; RESULTS/README point at the DSEWiki run; intercode experiment scaffold
</commit_message>
<xml_diff>
--- a/report/build/Sentinel_Apart_AIIR_Sprint_2026.docx
+++ b/report/build/Sentinel_Apart_AIIR_Sprint_2026.docx
@@ -1185,7 +1185,7 @@
           <w:rFonts w:ascii="Old Standard TT" w:hAnsi="Old Standard TT"/>
           <w:sz w:val="21"/>
         </w:rPr>
-        <w:t>None of these takes the evaluation's declared scope as an input artifact and emits a verdict that someone outside the lab can recompute. Behavioural monitors answer "does this look bad?", which needs a model and a threshold; a proxy answers "was this blocked?", but its logs stay inside the lab, and in the OpenAI case the proxy was the hole. Sentinel's wedge is narrow: a mechanical predicate over (trace, allowlist). Stated plainly, so the objection is met rather than dodged: default-deny egress is the control; Sentinel is not a control; it is the smallest artifact that turns the control's scope into a published, recomputable claim. "Why not just publish the proxy logs?" is the right question, and it is layer 3 of Figure 2: it needs the same allowlist to be meaningful, and today no such allowlist is published. One would use Sentinel alongside the monitors above, never instead of a default-deny proxy. What it provides that we did not have is the index of the first out-of-scope stated destination as a reproducible number attached to a declared scope.</w:t>
+        <w:t>None of these takes the evaluation's declared scope as an input artifact and emits a verdict that someone outside the lab can recompute. Behavioural monitors answer "does this look bad?", which needs a model and a threshold; a proxy answers "was this blocked?", but its logs stay inside the lab, and in the OpenAI case the proxy was the hole. Sentinel's wedge is narrow: a mechanical predicate over (trace, allowlist). Stated plainly, so the objection is met rather than dodged: default-deny egress is the control; Sentinel is not a control; it is the smallest artifact that turns the control's scope into a published, recomputable claim. "Why not just publish the proxy logs?" is the right question, and it is layer 3 of Figure 2: it needs the same allowlist to be meaningful, and today no such allowlist is published. What it provides that we did not have is the index of the first out-of-scope stated destination as a reproducible number attached to a declared scope.</w:t>
       </w:r>
     </w:p>
     <w:p>
@@ -2786,7 +2786,7 @@
         </w:rPr>
         <w:drawing>
           <wp:inline>
-            <wp:extent cx="5394960" cy="2168562"/>
+            <wp:extent cx="4572000" cy="1837764"/>
             <wp:docPr id="1" name="Picture 1"/>
             <wp:cNvGraphicFramePr>
               <a:graphicFrameLocks noChangeAspect="1"/>
@@ -2807,7 +2807,7 @@
                   <pic:spPr>
                     <a:xfrm>
                       <a:off x="0" y="0"/>
-                      <a:ext cx="5394960" cy="2168562"/>
+                      <a:ext cx="4572000" cy="1837764"/>
                     </a:xfrm>
                     <a:prstGeom prst="rect"/>
                   </pic:spPr>
@@ -2841,7 +2841,7 @@
           <w:rFonts w:ascii="Old Standard TT" w:hAnsi="Old Standard TT"/>
           <w:sz w:val="21"/>
         </w:rPr>
-        <w:t>Observation: the same trace yields three different verdicts under three scopes (Figure 1). Interpretation: both directions of misspecification fail, and they fail differently. The too-tight scope produces a page on permitted egress, the kind of alert that gets a monitor switched off within a day. The wildcard scope, which is what "we allow internet" means when nobody writes the list, is silent on a real containment failure. A scanner with no declared scope is not a control. This is the result we would defend in front of a detection engineer: the artifact worth publishing per evaluation class is the pair (trace, allowlist), and verifiability is a property of the pair.</w:t>
+        <w:t>Observation: the same trace yields three different verdicts under three scopes (Figure 1). Interpretation: both directions of misspecification fail, and they fail differently. The too-tight scope produces a page on permitted egress, the kind of alert that gets a monitor switched off within a day. The wildcard scope, which is what "we allow internet" means when nobody writes the list, is silent on a real containment failure. A scanner with no declared scope is not a control. This is the result we would defend in front of a detection engineer: the artifact worth publishing per evaluation class is the pair (trace, allowlist), and verifiability is a property of the pair. Every number in this section is deterministic and pinned by tests, so there is no interval to report; the one robustness question that matters is sensitivity to the scope, and this table is that question asked directly.</w:t>
       </w:r>
     </w:p>
     <w:p>
@@ -2909,7 +2909,7 @@
         </w:rPr>
         <w:drawing>
           <wp:inline>
-            <wp:extent cx="5394960" cy="2433021"/>
+            <wp:extent cx="4937760" cy="2226833"/>
             <wp:docPr id="2" name="Picture 2"/>
             <wp:cNvGraphicFramePr>
               <a:graphicFrameLocks noChangeAspect="1"/>
@@ -2930,7 +2930,7 @@
                   <pic:spPr>
                     <a:xfrm>
                       <a:off x="0" y="0"/>
-                      <a:ext cx="5394960" cy="2433021"/>
+                      <a:ext cx="4937760" cy="2226833"/>
                     </a:xfrm>
                     <a:prstGeom prst="rect"/>
                   </pic:spPr>
@@ -3538,28 +3538,6 @@
           <w:sz w:val="21"/>
         </w:rPr>
         <w:t>Observation: under the scope the sandbox actually had, the scanner is silent on all 14,591 events. Under a scope that names the task's data sources, the first out-of-scope stated destination is the wiki itself, at event 5, six hours into the first day of writing and 27 days before the first OpenAI-associated address visited the pages. Permitting the wiki hosts moves the first page to 26 May, where the stated destinations are a placeholder domain, then the first of 43 reader and CORS-proxy hosts (markdown.new, r.jina.ai, allorigins), then a US government login portal (piv.max.gov, login.max.gov). Across the record the extractor sees 200 distinct hosts: 27 task data sources, 6 wiki hosts, 43 reader or CORS proxies, 4 URL shorteners, 5 archive services and 4 tunnel endpoints (the first on 17 June). Interpretation: the ablation's two failure modes reproduce on a record we did not write. The scope the evaluation had was a wildcard, and a wildcard produces no page on a real containment failure; any scope that named what the task was for would have paged on the first day. Two honesty notes. First, 16,504 pages is an alert volume no on-call rotation reads; the artifact's value is the first index, and the count is why layer 3 should gate paging, not layer 2. Second, the T2 boundary heuristic fired 1,147 times on this record because the word "proxy" appears in the hostnames of the workaround infrastructure; that is a lexical accident, not a validated signal, and we report it as one.</w:t>
-      </w:r>
-    </w:p>
-    <w:p>
-      <w:pPr>
-        <w:pStyle w:val="Heading3"/>
-        <w:keepNext/>
-      </w:pPr>
-      <w:r>
-        <w:t>4.5 Robustness</w:t>
-      </w:r>
-    </w:p>
-    <w:p>
-      <w:pPr>
-        <w:spacing w:after="100" w:line="259" w:lineRule="auto"/>
-        <w:jc w:val="both"/>
-      </w:pPr>
-      <w:r>
-        <w:rPr>
-          <w:rFonts w:ascii="Old Standard TT" w:hAnsi="Old Standard TT"/>
-          <w:sz w:val="21"/>
-        </w:rPr>
-        <w:t>Every number above is deterministic and pinned by tests; there is no sampling and so no interval to report. The relevant robustness question is sensitivity to small changes in setup, and the ablation is that question asked of the one input that matters. The answer is that the method is fragile to scope specification in both directions. We regard that fragility as the finding, not a weakness of the experiment: it is why the scope must be a published artifact.</w:t>
       </w:r>
     </w:p>
     <w:p>

</xml_diff>

<commit_message>
report: abstract under 250 words; body trimmed so the conclusion ends on page 8
</commit_message>
<xml_diff>
--- a/report/build/Sentinel_Apart_AIIR_Sprint_2026.docx
+++ b/report/build/Sentinel_Apart_AIIR_Sprint_2026.docx
@@ -610,7 +610,7 @@
                       <w:iCs w:val="1"/>
                       <w:rtl w:val="0"/>
                     </w:rPr>
-                    <w:t xml:space="preserve">Between April and July 2026, agents under evaluation at OpenAI, Anthropic and the UK AI Security Institute reached real third parties. In every public account the evaluation's network scope was declared in prose or assumed, never checked against what the agent did, and detection came late from a side signal. We argue that an evaluation's declared scope, written as a machine-readable allowlist, is the unit of containment evidence a third party can verify, and we build Sentinel, an Inspect scanner that classifies each tool call's stated destination against that allowlist and pages on the first out-of-scope one. No model is in the gate. On reconstructions of three public incidents (four to seven events each, from the published timelines, not lab transcripts) the scanner pages at the first non-allowlisted destination and is silent on three hard negatives where a keyword baseline false-pages on two. On the 14,591-revision DSEWiki export, a record we did not write, it is silent under the wildcard scope the sandbox actually had and pages on day one under any scope naming the task's data sources; on a live eight-sample Inspect run with an empty declared scope it is correctly silent on 42 real tool calls. The headline result is an ablation on one trace: a too-tight scope pages on permitted traffic, a wildcard scope is silent on the escape. Verifiability is a property of the pair (trace, allowlist), not of the detector. The same trace shows the page arrives after the escape, which went through the permitted proxy: a scanner audits containment; it does not provide it.</w:t>
+                    <w:t xml:space="preserve">Between April and July 2026, agents under evaluation at OpenAI, Anthropic and the UK AI Security Institute reached real third parties. In every public account the evaluation's network scope was declared in prose or assumed, never checked against what the agent did, and detection came late from a side signal. We argue that an evaluation's declared scope, written as a machine-readable allowlist, is the unit of containment evidence a third party can verify, and build Sentinel, an Inspect scanner that classifies each tool call's stated destination against it and pages on the first out-of-scope one, with no model in the gate. On reconstructions of three public incidents (four to seven events each, from the published timelines, not lab transcripts) the scanner pages at the first non-allowlisted destination and is silent on three hard negatives where a keyword baseline false-pages on two. On the 14,591-revision DSEWiki export, a record we did not write, it is silent under the wildcard scope the sandbox actually had and pages on day one under any scope naming the task's data sources; on a live eight-sample Inspect run with an empty declared scope it is correctly silent on 42 real tool calls. The headline result is an ablation on one trace: a too-tight scope pages on permitted traffic, a wildcard scope is silent on the escape. Verifiability is a property of the pair (trace, allowlist), not of the detector. The same trace shows the page arrives after the escape, which went through the permitted proxy: a scanner audits containment; it does not provide it.</w:t>
                   </w:r>
                   <w:r>
                     <w:rPr>
@@ -871,7 +871,7 @@
           <w:rFonts w:ascii="Old Standard TT" w:hAnsi="Old Standard TT"/>
           <w:sz w:val="21"/>
         </w:rPr>
-        <w:t xml:space="preserve">These cases share a shape that is not "no monitor existed." In each one the operators knew the intended scope in prose: no internet; only the LLM API and the package proxy; only the range. Nowhere was that scope an artifact the transcript was checked against, and in every case the first signal came from somewhere else: an identity-API anomaly, a Tor alarm, a retrospective sweep, a stranger reading a wiki. Hugging Face's own post-mortem says its correlation stack existed but "failed to correctly raise the alert's criticality" </w:t>
+        <w:t xml:space="preserve">These cases share a shape that is not "no monitor existed." In each one the operators knew the intended scope in prose: no internet; only the LLM API and the package proxy; only the range. Nowhere was that scope an artifact the transcript was checked against, and the first signal always came from somewhere else: an identity-API anomaly, a Tor alarm, a retrospective sweep, a stranger reading a wiki. Hugging Face's own post-mortem says its correlation stack existed but "failed to correctly raise the alert's criticality" </w:t>
       </w:r>
       <w:r>
         <w:rPr>
@@ -2863,7 +2863,7 @@
           <w:rFonts w:ascii="Old Standard TT" w:hAnsi="Old Standard TT"/>
           <w:sz w:val="21"/>
         </w:rPr>
-        <w:t xml:space="preserve">Under the correct scope the page lands at event 3. Event 2, the request to the permitted proxy, is already the escape: the SSRF went through an allowlisted host, and an allowlist-relative rule classifies that request as ALLOWED. We test this as a known blind spot rather than hide it. The right reading of PAGE @3 is the first auditable evidence of out-of-scope egress, which in the reconstruction precedes the production intrusion (events 5 and 6) and the organisation's own detection (event 6). It is not "this would have stopped the breach." Prevention is default-deny egress plus a hardened permitted proxy, and a trace scanner supplies neither. The DSEWiki case has the same shape: the sandbox permitted only GET requests, and the wiki accepts page edits over GET </w:t>
+        <w:t xml:space="preserve">Under the correct scope the page lands at event 3. Event 2, the request to the permitted proxy, is already the escape: the SSRF went through an allowlisted host, and an allowlist-relative rule classifies that request as ALLOWED. We test this as a known blind spot rather than hide it. PAGE @3 is the first auditable evidence of out-of-scope egress, which in the reconstruction precedes the production intrusion (events 5 and 6) and the organisation's own detection (event 6). It is not "this would have stopped the breach." Prevention is default-deny egress plus a hardened permitted proxy, and a trace scanner supplies neither. The DSEWiki case has the same shape: the sandbox permitted only GET requests, and the wiki accepts page edits over GET </w:t>
       </w:r>
       <w:r>
         <w:rPr>
@@ -3003,7 +3003,7 @@
           <w:rFonts w:ascii="Old Standard TT" w:hAnsi="Old Standard TT"/>
           <w:sz w:val="21"/>
         </w:rPr>
-        <w:t xml:space="preserve"> contains 14,591 saved agent revisions across four wikis, 24 May to 2 July 2026, with full text and write times (manifest db_sha256 199241bf…). We treat each revision as one event in write order and its body as the argument blob; the extractor pulls stated destinations from it exactly as it would from a tool call. Nothing about the events is ours. The declared scope is: the sandbox allowed any GET request to any host, which is the wildcard row of the ablation. We add two scopes of our own for comparison and say so: one naming only the public datasets the task families were retrieving from (27 hosts such as api.datausa.io, sec.gov, api.usaspending.gov), and a control that also permits the wiki hosts.</w:t>
+        <w:t xml:space="preserve"> contains 14,591 saved agent revisions across four wikis, 24 May to 2 July 2026, with full text and write times (manifest db_sha256 199241bf…). Each revision is one event in write order and its body the argument blob; the extractor reads it as it would a tool call. Nothing about the events is ours. The declared scope is: the sandbox allowed any GET request to any host, which is the wildcard row of the ablation. We add two scopes of our own for comparison and say so: one naming only the public datasets the task families were retrieving from (27 hosts such as api.datausa.io, sec.gov, api.usaspending.gov), and a control that also permits the wiki hosts.</w:t>
       </w:r>
     </w:p>
     <w:tbl>
@@ -3572,7 +3572,7 @@
           <w:rFonts w:ascii="Old Standard TT" w:hAnsi="Old Standard TT"/>
           <w:sz w:val="21"/>
         </w:rPr>
-        <w:t xml:space="preserve">Theory of change. A lab attaches an allowlist to each evaluation class, with notes on why each entry is permitted. Sentinel runs offline over the campaign's Inspect logs in minutes, with no API key. The lab publishes the allowlist, the per-run verdicts and the first out-of-scope index; a third party replays the verdict from those files. Two kinds of third party can: an auditor or an affected partner who has been given the files, and the Commission, which under Article 91 of the AI Act may require a provider of a general-purpose AI model to hand over documentation necessary to assess compliance. The first needs cooperation; only the second can compel. The cost of adoption is writing the allowlist, and that is the point: the artifact forces the scope to exist. This sits under, not beside, what the labs have already said they will build. AISI asks for monitoring "able to flag or block out-of-scope actions as they happen" with scope "limited in advance" </w:t>
+        <w:t xml:space="preserve">Theory of change. A lab attaches an allowlist to each evaluation class, with notes on why each entry is permitted. Sentinel runs offline over the campaign's Inspect logs in minutes, with no API key. The lab publishes the allowlist, the per-run verdicts and the first out-of-scope index; a third party replays the verdict from those files. Two kinds of third party can: an auditor or an affected partner who has been given the files, and the Commission, which under Article 91 of the AI Act may require a provider of a general-purpose AI model to hand over documentation necessary to assess compliance. The first needs cooperation; only the second can compel. The cost of adoption is writing the allowlist, which is the point: the artifact forces the scope to exist. It sits under what the labs already say they will build: AISI asks for monitoring "able to flag or block out-of-scope actions as they happen" with scope "limited in advance" </w:t>
       </w:r>
       <w:r>
         <w:rPr>
@@ -3602,7 +3602,7 @@
           <w:rFonts w:ascii="Old Standard TT" w:hAnsi="Old Standard TT"/>
           <w:sz w:val="21"/>
         </w:rPr>
-        <w:t xml:space="preserve">; OpenAI now requires chain-of-thought monitoring for tool-using runs </w:t>
+        <w:t xml:space="preserve">, and OpenAI now requires chain-of-thought monitoring for tool-using runs </w:t>
       </w:r>
       <w:r>
         <w:rPr>
@@ -3632,7 +3632,7 @@
           <w:rFonts w:ascii="Old Standard TT" w:hAnsi="Old Standard TT"/>
           <w:sz w:val="21"/>
         </w:rPr>
-        <w:t>. Both need a machine-readable statement of what out-of-scope means. Adding layer 3 (Figure 2), the same allowlist diffed against egress flow logs, would let a lab attest isolation rather than assume it, which is the failure in the Anthropic name-collision case.</w:t>
+        <w:t>; both need a machine-readable statement of what out-of-scope means. Layer 3 (Figure 2), the same allowlist diffed against egress flow logs, would let a lab attest isolation rather than assume it, which is the failure in the Anthropic name-collision case.</w:t>
       </w:r>
     </w:p>
     <w:p>
@@ -3857,7 +3857,7 @@
           <w:rFonts w:ascii="Old Standard TT" w:hAnsi="Old Standard TT"/>
           <w:sz w:val="21"/>
         </w:rPr>
-        <w:t>The public containment failures of 2026 were not failures of monitoring technology. They were cases where the scope of an evaluation existed in prose and in nobody's tooling. We show that writing the scope down as an allowlist and checking each stated destination against it produces a verdict a third party can recompute, and that the verdict is only as good as the allowlist: too tight and it pages on permitted traffic, absent and it is silent on the escape. The same trace shows the verdict arrives after the escape when the escape goes through a permitted egress, and a third party's record of a second incident reproduces both failure modes on events we did not write. Sentinel is small on purpose. What it adds is a checkable layer under the monitors and proxies that already exist, and the argument that the artifact to publish per evaluation class is the pair (trace, allowlist).</w:t>
+        <w:t>The public containment failures of 2026 were not failures of monitoring technology. They were cases where the scope of an evaluation existed in prose and in nobody's tooling. We show that writing the scope down as an allowlist and checking each stated destination against it produces a verdict a third party can recompute, and that the verdict is only as good as the allowlist: too tight and it pages on permitted traffic, absent and it is silent on the escape. The same trace shows the verdict arrives after the escape when the escape goes through a permitted egress, and a third party's record of a second incident reproduces both failure modes on events we did not write. Sentinel is small on purpose: a checkable layer under the monitors and proxies that already exist, and the argument that the artifact to publish per evaluation class is the pair (trace, allowlist).</w:t>
       </w:r>
     </w:p>
     <w:p>

</xml_diff>

<commit_message>
report: abstract 225 words; body trimmed
</commit_message>
<xml_diff>
--- a/report/build/Sentinel_Apart_AIIR_Sprint_2026.docx
+++ b/report/build/Sentinel_Apart_AIIR_Sprint_2026.docx
@@ -610,7 +610,7 @@
                       <w:iCs w:val="1"/>
                       <w:rtl w:val="0"/>
                     </w:rPr>
-                    <w:t xml:space="preserve">Between April and July 2026, agents under evaluation at OpenAI, Anthropic and the UK AI Security Institute reached real third parties. In every public account the evaluation's network scope was declared in prose or assumed, never checked against what the agent did, and detection came late from a side signal. We argue that an evaluation's declared scope, written as a machine-readable allowlist, is the unit of containment evidence a third party can verify, and build Sentinel, an Inspect scanner that classifies each tool call's stated destination against it and pages on the first out-of-scope one, with no model in the gate. On reconstructions of three public incidents (four to seven events each, from the published timelines, not lab transcripts) the scanner pages at the first non-allowlisted destination and is silent on three hard negatives where a keyword baseline false-pages on two. On the 14,591-revision DSEWiki export, a record we did not write, it is silent under the wildcard scope the sandbox actually had and pages on day one under any scope naming the task's data sources; on a live eight-sample Inspect run with an empty declared scope it is correctly silent on 42 real tool calls. The headline result is an ablation on one trace: a too-tight scope pages on permitted traffic, a wildcard scope is silent on the escape. Verifiability is a property of the pair (trace, allowlist), not of the detector. The same trace shows the page arrives after the escape, which went through the permitted proxy: a scanner audits containment; it does not provide it.</w:t>
+                    <w:t xml:space="preserve">Between April and July 2026, agents under evaluation at OpenAI, Anthropic and the UK AI Security Institute reached real third parties. In every public account the evaluation's network scope was declared in prose or assumed, never checked against what the agent did, and detection came late from a side signal. We argue that an evaluation's declared scope, written as a machine-readable allowlist, is the unit of containment evidence a third party can verify, and build Sentinel, an Inspect scanner that classifies each tool call's stated destination against it and pages on the first out-of-scope one, with no model in the gate. On reconstructions of three public incidents (four to seven events each, from the published timelines, not lab transcripts) it pages at the first non-allowlisted destination and is silent on three hard negatives where a keyword baseline false-pages on two. On the 14,591-revision DSEWiki export, a record we did not write, it is silent under the wildcard scope the sandbox actually had and pages on day one under any scope naming the task's data sources; on a live eight-sample Inspect run with an empty declared scope it is correctly silent on 42 real tool calls. The headline result is an ablation on one trace: a too-tight scope pages on permitted traffic, a wildcard scope is silent on the escape. Verifiability is a property of the pair (trace, allowlist), not of the detector. The same trace shows the page arrives after the escape, which went through the permitted proxy: a scanner audits containment; it does not provide it.</w:t>
                   </w:r>
                   <w:r>
                     <w:rPr>
@@ -1185,7 +1185,7 @@
           <w:rFonts w:ascii="Old Standard TT" w:hAnsi="Old Standard TT"/>
           <w:sz w:val="21"/>
         </w:rPr>
-        <w:t>None of these takes the evaluation's declared scope as an input artifact and emits a verdict that someone outside the lab can recompute. Behavioural monitors answer "does this look bad?", which needs a model and a threshold; a proxy answers "was this blocked?", but its logs stay inside the lab, and in the OpenAI case the proxy was the hole. Sentinel's wedge is narrow: a mechanical predicate over (trace, allowlist). Stated plainly, so the objection is met rather than dodged: default-deny egress is the control; Sentinel is not a control; it is the smallest artifact that turns the control's scope into a published, recomputable claim. "Why not just publish the proxy logs?" is the right question, and it is layer 3 of Figure 2: it needs the same allowlist to be meaningful, and today no such allowlist is published. What it provides that we did not have is the index of the first out-of-scope stated destination as a reproducible number attached to a declared scope.</w:t>
+        <w:t>None of these takes the evaluation's declared scope as an input artifact and emits a verdict that someone outside the lab can recompute. Behavioural monitors answer "does this look bad?" and need a model and a threshold; a proxy answers "was this blocked?" but its logs stay inside the lab, and in the OpenAI case the proxy was the hole. Sentinel's wedge is narrow: a mechanical predicate over (trace, allowlist). Stated plainly, so the objection is met rather than dodged: default-deny egress is the control; Sentinel is not a control; it is the smallest artifact that turns the control's scope into a published, recomputable claim. "Why not just publish the proxy logs?" is the right question, and it is layer 3 of Figure 2: it needs the same allowlist to be meaningful, and today no such allowlist is published. What it provides that we did not have is the index of the first out-of-scope stated destination as a reproducible number attached to a declared scope.</w:t>
       </w:r>
     </w:p>
     <w:p>
@@ -3537,7 +3537,7 @@
           <w:rFonts w:ascii="Old Standard TT" w:hAnsi="Old Standard TT"/>
           <w:sz w:val="21"/>
         </w:rPr>
-        <w:t>Observation: under the scope the sandbox actually had, the scanner is silent on all 14,591 events. Under a scope that names the task's data sources, the first out-of-scope stated destination is the wiki itself, at event 5, six hours into the first day of writing and 27 days before the first OpenAI-associated address visited the pages. Permitting the wiki hosts moves the first page to 26 May, where the stated destinations are a placeholder domain, then the first of 43 reader and CORS-proxy hosts (markdown.new, r.jina.ai, allorigins), then a US government login portal (piv.max.gov, login.max.gov). The extractor sees 200 distinct hosts in the record: 27 task data sources, 6 wiki hosts, 43 reader or CORS proxies, 4 shorteners, 5 archives, 4 tunnels. Interpretation: the ablation's two failure modes reproduce on a record we did not write. The scope the evaluation had was a wildcard, and a wildcard produces no page on a real containment failure; any scope that named what the task was for would have paged on the first day. Two honesty notes. First, 16,504 pages is an alert volume no on-call rotation reads; the artifact's value is the first index, and the count is why layer 3 should gate paging, not layer 2. Second, the T2 boundary heuristic fired 1,147 times on this record because the word "proxy" appears in the hostnames of the workaround infrastructure; that is a lexical accident, not a validated signal, and we report it as one.</w:t>
+        <w:t>Observation: under the scope the sandbox actually had, the scanner is silent on all 14,591 events. Under a scope that names the task's data sources, the first out-of-scope stated destination is the wiki itself, at event 5, six hours into the first day of writing and 27 days before the first OpenAI-associated address visited the pages. Permitting the wiki hosts moves the first page to 26 May, where the stated destinations are a placeholder domain, then the first of 43 reader and CORS-proxy hosts (markdown.new, r.jina.ai, allorigins), then a US government login portal (piv.max.gov, login.max.gov). The extractor sees 200 distinct hosts in the record: 27 task data sources, 6 wiki hosts, 43 reader or CORS proxies, 4 shorteners, 5 archives, 4 tunnels. Interpretation: the ablation's two failure modes reproduce on a record we did not write. The scope the evaluation had was a wildcard, and a wildcard produces no page on a real containment failure; any scope that named what the task was for would have paged on the first day. Two honesty notes: 16,504 pages is an alert volume nobody reads, so the value is the first index and the count is why layer 3, not layer 2, should gate paging; and T2 fired 1,147 times only because "proxy" appears in the workaround hostnames, a lexical accident we report as one.</w:t>
       </w:r>
     </w:p>
     <w:p>

</xml_diff>

<commit_message>
report: abstract 247 words; limitations consolidated; conclusion on page 8
</commit_message>
<xml_diff>
--- a/report/build/Sentinel_Apart_AIIR_Sprint_2026.docx
+++ b/report/build/Sentinel_Apart_AIIR_Sprint_2026.docx
@@ -610,7 +610,7 @@
                       <w:iCs w:val="1"/>
                       <w:rtl w:val="0"/>
                     </w:rPr>
-                    <w:t xml:space="preserve">Between April and July 2026, agents under evaluation at OpenAI, Anthropic and the UK AI Security Institute reached real third parties. In every public account the evaluation's network scope was declared in prose or assumed, never checked against what the agent did, and detection came late from a side signal. We argue that an evaluation's declared scope, written as a machine-readable allowlist, is the unit of containment evidence a third party can verify, and build Sentinel, an Inspect scanner that classifies each tool call's stated destination against it and pages on the first out-of-scope one, with no model in the gate. On reconstructions of three public incidents (four to seven events each, from the published timelines, not lab transcripts) it pages at the first non-allowlisted destination and is silent on three hard negatives where a keyword baseline false-pages on two. On the 14,591-revision DSEWiki export, a record we did not write, it is silent under the wildcard scope the sandbox actually had and pages on day one under any scope naming the task's data sources; on a live eight-sample Inspect run with an empty declared scope it is correctly silent on 42 real tool calls. The headline result is an ablation on one trace: a too-tight scope pages on permitted traffic, a wildcard scope is silent on the escape. Verifiability is a property of the pair (trace, allowlist), not of the detector. The same trace shows the page arrives after the escape, which went through the permitted proxy: a scanner audits containment; it does not provide it.</w:t>
+                    <w:t xml:space="preserve">Between April and July 2026, agents under evaluation at OpenAI, Anthropic and the UK AI Security Institute reached real third parties. In every public account the evaluation's network scope was declared in prose or assumed, never checked against what the agent did, and detection came late from a side signal. We argue that an evaluation's declared scope, written as a machine-readable allowlist, is the unit of containment evidence a third party can verify, and build Sentinel, an Inspect scanner that classifies each tool call's stated destination against it and pages on the first out-of-scope one, with no model in the gate. On reconstructions of three public incidents (four to seven events each, from the published timelines) it pages at the first non-allowlisted destination and is silent on three hard negatives. On the 14,591-revision DSEWiki export, a record we did not write, it is silent under the wildcard scope the sandbox actually had and pages on day one under any scope naming the task's data sources; on a live eight-sample Inspect run with an empty declared scope it is correctly silent on 42 real tool calls. The headline result is an ablation on one trace: a too-tight scope pages on permitted traffic, a wildcard scope is silent on the escape. Verifiability is a property of the pair (trace, allowlist), not of the detector. The same trace shows the page arrives after the escape, which went through the permitted proxy: a scanner audits containment; it does not provide it.</w:t>
                   </w:r>
                   <w:r>
                     <w:rPr>
@@ -2841,7 +2841,7 @@
           <w:rFonts w:ascii="Old Standard TT" w:hAnsi="Old Standard TT"/>
           <w:sz w:val="21"/>
         </w:rPr>
-        <w:t>Observation: the same trace yields three different verdicts under three scopes (Figure 1). Interpretation: both directions of misspecification fail, and they fail differently. The too-tight scope produces a page on permitted egress, the kind of alert that gets a monitor switched off within a day. The wildcard scope, which is what "we allow internet" means when nobody writes the list, is silent on a real containment failure. A scanner with no declared scope is not a control. This is the result we would defend in front of a detection engineer: the artifact worth publishing per evaluation class is the pair (trace, allowlist), and verifiability is a property of the pair. Every number in this section is deterministic and pinned by tests, so there is no interval to report; the one robustness question that matters is sensitivity to the scope, and this table is that question asked directly.</w:t>
+        <w:t>Observation: the same trace yields three different verdicts under three scopes (Figure 1). Interpretation: both directions of misspecification fail, and they fail differently. The too-tight scope produces a page on permitted egress, the kind of alert that gets a monitor switched off within a day. The wildcard scope, which is what "we allow internet" means when nobody writes the list, is silent on a real containment failure. A scanner with no declared scope is not a control. The artifact worth publishing per evaluation class is the pair (trace, allowlist), and verifiability is a property of the pair. Every number here is deterministic and pinned by tests; the one robustness question that matters is sensitivity to the scope, and this figure asks it directly.</w:t>
       </w:r>
     </w:p>
     <w:p>
@@ -3655,7 +3655,7 @@
           <w:rFonts w:ascii="Old Standard TT" w:hAnsi="Old Standard TT"/>
           <w:sz w:val="21"/>
         </w:rPr>
-        <w:t xml:space="preserve">•  The positive fixtures are reconstructions of four to seven events written from public descriptions; Hugging Face logged about 17,600 attacker actions </w:t>
+        <w:t xml:space="preserve">•  The positive fixtures are reconstructions of four to seven events from public descriptions; Hugging Face logged about 17,600 attacker actions </w:t>
       </w:r>
       <w:r>
         <w:rPr>
@@ -3685,7 +3685,7 @@
           <w:rFonts w:ascii="Old Standard TT" w:hAnsi="Old Standard TT"/>
           <w:sz w:val="21"/>
         </w:rPr>
-        <w:t>. No lab has released raw evaluation transcripts. Nothing here measures detection inside OpenAI, Anthropic or AISI, and "events earlier" is a statement about our reconstruction.</w:t>
+        <w:t>. No lab has released raw transcripts, so nothing here measures detection inside OpenAI, Anthropic or AISI, and "events earlier" describes our reconstruction.</w:t>
       </w:r>
     </w:p>
     <w:p>
@@ -3699,7 +3699,7 @@
           <w:rFonts w:ascii="Old Standard TT" w:hAnsi="Old Standard TT"/>
           <w:sz w:val="21"/>
         </w:rPr>
-        <w:t>•  The fixtures and the rule have the same author, so the specification tests show consistency, not generalisation. The DSEWiki run addresses the events but not the scope: the two non-wildcard allowlists there are ours, reconstructed from the task families visible in the record, and a different reconstruction would move the first page. What does not move is the wildcard row, which is the scope the sandbox actually had.</w:t>
+        <w:t>•  The fixtures and the rule share an author, so the specification tests show consistency, not generalisation. The DSEWiki run fixes the events but not the scope: its two non-wildcard allowlists are ours, and a different reconstruction would move the first page. The wildcard row, the scope the sandbox actually had, does not move.</w:t>
       </w:r>
     </w:p>
     <w:p>
@@ -3713,7 +3713,7 @@
           <w:rFonts w:ascii="Old Standard TT" w:hAnsi="Old Standard TT"/>
           <w:sz w:val="21"/>
         </w:rPr>
-        <w:t>•  The live run is eight samples and 42 tool calls on tasks with no network, so it can only show silence; it says nothing about detection. A positive live case needs an evaluation with internet on and a real allowlist, which is the first item of future work.</w:t>
+        <w:t>•  The live run is eight samples on tasks with no network, so it can only show silence. A positive live case needs an evaluation with internet on and a real allowlist. Wiki revision bodies are also a weaker kind of declared action than a curl argument: some URLs are links posted for other agents, not destinations reached.</w:t>
       </w:r>
     </w:p>
     <w:p>
@@ -3727,21 +3727,7 @@
           <w:rFonts w:ascii="Old Standard TT" w:hAnsi="Old Standard TT"/>
           <w:sz w:val="21"/>
         </w:rPr>
-        <w:t>•  Wiki revision bodies are not tool calls. A URL an agent posted is a stated destination in a weaker sense than a URL an agent passed to curl; some are links for other agents to follow. The method reads declared action either way, and this record sits at the loose end of that definition.</w:t>
-      </w:r>
-    </w:p>
-    <w:p>
-      <w:pPr>
-        <w:spacing w:after="80" w:line="259" w:lineRule="auto"/>
-        <w:ind w:left="432" w:hanging="288"/>
-        <w:jc w:val="both"/>
-      </w:pPr>
-      <w:r>
-        <w:rPr>
-          <w:rFonts w:ascii="Old Standard TT" w:hAnsi="Old Standard TT"/>
-          <w:sz w:val="21"/>
-        </w:rPr>
-        <w:t xml:space="preserve">•  Sentinel reads declared arguments. In its investigation of the Hugging Face incident, METR reports that roughly 7% of the transcripts it evaluated were successfully spoofed in some places </w:t>
+        <w:t xml:space="preserve">•  Sentinel reads declared arguments. METR reports that roughly 7% of the transcripts it evaluated in the Hugging Face investigation were successfully spoofed in places </w:t>
       </w:r>
       <w:r>
         <w:rPr>
@@ -3771,7 +3757,7 @@
           <w:rFonts w:ascii="Old Standard TT" w:hAnsi="Old Standard TT"/>
           <w:sz w:val="21"/>
         </w:rPr>
-        <w:t>; a determined agent can state one destination and reach another. Layer 3 is the answer; it is not built.</w:t>
+        <w:t>; an agent can state one destination and reach another. Layer 3 is the answer, and it is not built.</w:t>
       </w:r>
     </w:p>
     <w:p>
@@ -3785,7 +3771,7 @@
           <w:rFonts w:ascii="Old Standard TT" w:hAnsi="Old Standard TT"/>
           <w:sz w:val="21"/>
         </w:rPr>
-        <w:t>•  The extractor is regular expressions. Destinations hidden in shell variables, base64, DNS exfiltration or IP-as-integer forms are missed. We have not measured a miss rate. Publishing the extractor publishes its gaps (Appendix A).</w:t>
+        <w:t>•  The extractor is regular expressions. Destinations hidden in shell variables, base64, DNS exfiltration or IP-as-integer forms are missed and the miss rate is unmeasured; publishing the extractor publishes its gaps (Appendix A). T1 and T2 false-positive rates are likewise unmeasured.</w:t>
       </w:r>
     </w:p>
     <w:p>
@@ -3799,20 +3785,6 @@
           <w:rFonts w:ascii="Old Standard TT" w:hAnsi="Old Standard TT"/>
           <w:sz w:val="21"/>
         </w:rPr>
-        <w:t>•  T1 and T2 false-positive rates are unmeasured; they warn, and a warn nobody reads is worth nothing.</w:t>
-      </w:r>
-    </w:p>
-    <w:p>
-      <w:pPr>
-        <w:spacing w:after="80" w:line="259" w:lineRule="auto"/>
-        <w:ind w:left="432" w:hanging="288"/>
-        <w:jc w:val="both"/>
-      </w:pPr>
-      <w:r>
-        <w:rPr>
-          <w:rFonts w:ascii="Old Standard TT" w:hAnsi="Old Standard TT"/>
-          <w:sz w:val="21"/>
-        </w:rPr>
         <w:t>•  The wildcard scope is one misspecification of many. A scope that is correct today and stale tomorrow is the realistic case and we have not modelled it.</w:t>
       </w:r>
     </w:p>
@@ -3835,7 +3807,7 @@
           <w:rFonts w:ascii="Old Standard TT" w:hAnsi="Old Standard TT"/>
           <w:sz w:val="21"/>
         </w:rPr>
-        <w:t>A month would add three things. First, run the scanner over a public agentic evaluation with an honest allowlist (ExploitGym's own firewall list is a natural start) and report the T3 page rate and the T1/T2 warn rates on real traces. Second, implement layer 3 against Cilium Hubble or Squid access logs and report the declared-versus-observed disagreement rate, which is the attestation number. Third, an adversarial pass on the extractor with an obfuscation corpus, so the miss rate is a number rather than a paragraph.</w:t>
+        <w:t>A month would add three things. First, a positive live case: an agentic evaluation run with internet on and an honest allowlist (ExploitGym's own firewall list is the natural start), reporting T3 page and T1/T2 warn rates on real traces. Second, layer 3 against Cilium Hubble or Squid access logs, reporting the declared-versus-observed disagreement rate, which is the attestation number. Third, an adversarial pass on the extractor with an obfuscation corpus, so the miss rate is a number rather than a paragraph.</w:t>
       </w:r>
     </w:p>
     <w:p>

</xml_diff>

<commit_message>
report: tables numbered in reading order
</commit_message>
<xml_diff>
--- a/report/build/Sentinel_Apart_AIIR_Sprint_2026.docx
+++ b/report/build/Sentinel_Apart_AIIR_Sprint_2026.docx
@@ -3524,7 +3524,7 @@
           <w:i/>
           <w:sz w:val="19"/>
         </w:rPr>
-        <w:t>Table 3. Sentinel over the DSEWiki export under three declared scopes. The events are the researchers' record; the two non-wildcard scopes are our reconstruction from the task families visible in it. "Before OpenAI's first visit" uses the date collusion.wiki gives for the first OpenAI-associated addresses on the pages.</w:t>
+        <w:t>Table 2. Sentinel over the DSEWiki export under three declared scopes. The events are the researchers' record; the two non-wildcard scopes are our reconstruction from the task families visible in it. "Before OpenAI's first visit" uses the date collusion.wiki gives for the first OpenAI-associated addresses on the pages.</w:t>
       </w:r>
     </w:p>
     <w:p>
@@ -5311,7 +5311,7 @@
           <w:i/>
           <w:sz w:val="19"/>
         </w:rPr>
-        <w:t>Table 2. The nine behaviours distilled from the four public accounts, and which ones an allowlist-relative scanner can see. Only item 3 is a mechanical page; items 1 and 2 warn; the rest need environment telemetry or multi-agent corpora and are out of scope for this artifact.</w:t>
+        <w:t>Table 3. The nine behaviours distilled from the four public accounts, and which ones an allowlist-relative scanner can see. Only item 3 is a mechanical page; items 1 and 2 warn; the rest need environment telemetry or multi-agent corpora and are out of scope for this artifact.</w:t>
       </w:r>
     </w:p>
     <w:p>

</xml_diff>

<commit_message>
report: prior-art paragraph (sprint example 5, SecureLayer7, Elastic, CSA AIS-13, CoSAI) as refs 15-19; contribution clause; draft 10d
</commit_message>
<xml_diff>
--- a/report/build/Sentinel_Apart_AIIR_Sprint_2026.docx
+++ b/report/build/Sentinel_Apart_AIIR_Sprint_2026.docx
@@ -928,7 +928,7 @@
           <w:rFonts w:ascii="Old Standard TT" w:hAnsi="Old Standard TT"/>
           <w:sz w:val="21"/>
         </w:rPr>
-        <w:t>•  A declared-scope representation (a JSON allowlist) and Sentinel, a mechanical, Inspect-native scanner that turns the first tool-call destination outside that scope into a finding a third party can recompute from files alone.</w:t>
+        <w:t>•  A declared-scope representation (a JSON allowlist) and Sentinel, a mechanical, Inspect-native scanner that turns the first tool-call destination outside that scope into a finding a third party can recompute from files alone, implementing the declared-action half of the egress-attestation spec proposed as Track 1 example 5.</w:t>
       </w:r>
     </w:p>
     <w:p>
@@ -1185,6 +1185,184 @@
           <w:rFonts w:ascii="Old Standard TT" w:hAnsi="Old Standard TT"/>
           <w:sz w:val="21"/>
         </w:rPr>
+        <w:t xml:space="preserve">The sprint's own materials describe this artifact. Track 1 example project 5 asks for an egress attestation spec v0.1: a signed network policy plus a flow-log digest an outside party could verify without network access </w:t>
+      </w:r>
+      <w:r>
+        <w:rPr>
+          <w:rFonts w:ascii="Old Standard TT" w:hAnsi="Old Standard TT"/>
+          <w:sz w:val="21"/>
+        </w:rPr>
+        <w:t>[</w:t>
+      </w:r>
+      <w:hyperlink w:anchor="ref15">
+        <w:r>
+          <w:rPr>
+            <w:rFonts w:ascii="Old Standard TT" w:hAnsi="Old Standard TT"/>
+            <w:color w:val="2E5C8A"/>
+          </w:rPr>
+          <w:t>15</w:t>
+        </w:r>
+      </w:hyperlink>
+      <w:r>
+        <w:rPr>
+          <w:rFonts w:ascii="Old Standard TT" w:hAnsi="Old Standard TT"/>
+          <w:sz w:val="21"/>
+        </w:rPr>
+        <w:t>]</w:t>
+      </w:r>
+      <w:r>
+        <w:rPr>
+          <w:rFonts w:ascii="Old Standard TT" w:hAnsi="Old Standard TT"/>
+          <w:sz w:val="21"/>
+        </w:rPr>
+        <w:t xml:space="preserve">. Sentinel is a working v0.1 of the declared-action half of that spec; the flow-log half is layer 3 of Figure 2, not built. SecureLayer7's anatomy of the intrusion proposes treating the replay corpus as a defensive evaluation harness and asking which action number a control fires on </w:t>
+      </w:r>
+      <w:r>
+        <w:rPr>
+          <w:rFonts w:ascii="Old Standard TT" w:hAnsi="Old Standard TT"/>
+          <w:sz w:val="21"/>
+        </w:rPr>
+        <w:t>[</w:t>
+      </w:r>
+      <w:hyperlink w:anchor="ref16">
+        <w:r>
+          <w:rPr>
+            <w:rFonts w:ascii="Old Standard TT" w:hAnsi="Old Standard TT"/>
+            <w:color w:val="2E5C8A"/>
+          </w:rPr>
+          <w:t>16</w:t>
+        </w:r>
+      </w:hyperlink>
+      <w:r>
+        <w:rPr>
+          <w:rFonts w:ascii="Old Standard TT" w:hAnsi="Old Standard TT"/>
+          <w:sz w:val="21"/>
+        </w:rPr>
+        <w:t>]</w:t>
+      </w:r>
+      <w:r>
+        <w:rPr>
+          <w:rFonts w:ascii="Old Standard TT" w:hAnsi="Old Standard TT"/>
+          <w:sz w:val="21"/>
+        </w:rPr>
+        <w:t xml:space="preserve">; our first-out-of-scope index is that number, computed against a declared scope. Elastic Security Labs' finding that detection correlated but never escalated to a page </w:t>
+      </w:r>
+      <w:r>
+        <w:rPr>
+          <w:rFonts w:ascii="Old Standard TT" w:hAnsi="Old Standard TT"/>
+          <w:sz w:val="21"/>
+        </w:rPr>
+        <w:t>[</w:t>
+      </w:r>
+      <w:hyperlink w:anchor="ref17">
+        <w:r>
+          <w:rPr>
+            <w:rFonts w:ascii="Old Standard TT" w:hAnsi="Old Standard TT"/>
+            <w:color w:val="2E5C8A"/>
+          </w:rPr>
+          <w:t>17</w:t>
+        </w:r>
+      </w:hyperlink>
+      <w:r>
+        <w:rPr>
+          <w:rFonts w:ascii="Old Standard TT" w:hAnsi="Old Standard TT"/>
+          <w:sz w:val="21"/>
+        </w:rPr>
+        <w:t>]</w:t>
+      </w:r>
+      <w:r>
+        <w:rPr>
+          <w:rFonts w:ascii="Old Standard TT" w:hAnsi="Old Standard TT"/>
+          <w:sz w:val="21"/>
+        </w:rPr>
+        <w:t xml:space="preserve"> is the failure mode the </w:t>
+      </w:r>
+      <w:r>
+        <w:rPr>
+          <w:rFonts w:ascii="Courier New" w:hAnsi="Courier New"/>
+          <w:sz w:val="19"/>
+          <w:noProof w:val="1"/>
+        </w:rPr>
+        <w:t>T3</w:t>
+      </w:r>
+      <w:r>
+        <w:rPr>
+          <w:rFonts w:ascii="Old Standard TT" w:hAnsi="Old Standard TT"/>
+          <w:sz w:val="21"/>
+        </w:rPr>
+        <w:t xml:space="preserve"> severity is designed around. CSA's AI Controls Matrix control AIS-13 and its vulnerability-operations guidance state the principle, no egress and no live production credentials </w:t>
+      </w:r>
+      <w:r>
+        <w:rPr>
+          <w:rFonts w:ascii="Old Standard TT" w:hAnsi="Old Standard TT"/>
+          <w:sz w:val="21"/>
+        </w:rPr>
+        <w:t>[</w:t>
+      </w:r>
+      <w:hyperlink w:anchor="ref18">
+        <w:r>
+          <w:rPr>
+            <w:rFonts w:ascii="Old Standard TT" w:hAnsi="Old Standard TT"/>
+            <w:color w:val="2E5C8A"/>
+          </w:rPr>
+          <w:t>18</w:t>
+        </w:r>
+      </w:hyperlink>
+      <w:r>
+        <w:rPr>
+          <w:rFonts w:ascii="Old Standard TT" w:hAnsi="Old Standard TT"/>
+          <w:sz w:val="21"/>
+        </w:rPr>
+        <w:t>]</w:t>
+      </w:r>
+      <w:r>
+        <w:rPr>
+          <w:rFonts w:ascii="Old Standard TT" w:hAnsi="Old Standard TT"/>
+          <w:sz w:val="21"/>
+        </w:rPr>
+        <w:t xml:space="preserve">; the allowlist is that principle made checkable. CoSAI's AI Incident Response Framework v1.0 is the incident-response frame this sits under </w:t>
+      </w:r>
+      <w:r>
+        <w:rPr>
+          <w:rFonts w:ascii="Old Standard TT" w:hAnsi="Old Standard TT"/>
+          <w:sz w:val="21"/>
+        </w:rPr>
+        <w:t>[</w:t>
+      </w:r>
+      <w:hyperlink w:anchor="ref19">
+        <w:r>
+          <w:rPr>
+            <w:rFonts w:ascii="Old Standard TT" w:hAnsi="Old Standard TT"/>
+            <w:color w:val="2E5C8A"/>
+          </w:rPr>
+          <w:t>19</w:t>
+        </w:r>
+      </w:hyperlink>
+      <w:r>
+        <w:rPr>
+          <w:rFonts w:ascii="Old Standard TT" w:hAnsi="Old Standard TT"/>
+          <w:sz w:val="21"/>
+        </w:rPr>
+        <w:t>]</w:t>
+      </w:r>
+      <w:r>
+        <w:rPr>
+          <w:rFonts w:ascii="Old Standard TT" w:hAnsi="Old Standard TT"/>
+          <w:sz w:val="21"/>
+        </w:rPr>
+        <w:t>.</w:t>
+      </w:r>
+    </w:p>
+    <w:p>
+      <w:pPr>
+        <w:spacing w:after="100" w:line="259" w:lineRule="auto"/>
+        <w:jc w:val="both"/>
+      </w:pPr>
+      <w:r>
+        <w:rPr>
+          <w:rFonts w:ascii="Old Standard TT" w:hAnsi="Old Standard TT"/>
+          <w:sz w:val="21"/>
+        </w:rPr>
         <w:t>None of these takes the evaluation's declared scope as an input artifact and emits a verdict that someone outside the lab can recompute. Behavioural monitors answer "does this look bad?" and need a model and a threshold; a proxy answers "was this blocked?" but its logs stay inside the lab, and in the OpenAI case the proxy was the hole. Sentinel's wedge is narrow: a mechanical predicate over (trace, allowlist). Default-deny egress is the control; Sentinel is not a control; it is the smallest artifact that turns the control's scope into a published, recomputable claim. "Why not just publish the proxy logs?" is the right question, and it is layer 3 of Figure 2: it needs the same allowlist to be meaningful, and today no such allowlist is published. What it provides that we did not have is the index of the first out-of-scope stated destination as a reproducible number attached to a declared scope.</w:t>
       </w:r>
     </w:p>
@@ -1216,7 +1394,112 @@
           <w:rFonts w:ascii="Old Standard TT" w:hAnsi="Old Standard TT"/>
           <w:sz w:val="21"/>
         </w:rPr>
-        <w:t xml:space="preserve">An allowlist is a JSON file: name, internet_expected, allowed_hosts (exact hosts or .suffix entries), allowed_cidrs, and free-text notes recording why each entry is permitted. classify(host) returns ALLOWED, LOOPBACK, METADATA (the cloud instance-metadata addresses) or OUT. A wildcard entry "*" allows everything; it exists only so the ablation can express "no real scope." Three scopes are in the repo, one per incident: ExploitGym (LLM API endpoints plus the Artifactory package proxy, both documented as permitted </w:t>
+        <w:t xml:space="preserve">An allowlist is a JSON file: name, </w:t>
+      </w:r>
+      <w:r>
+        <w:rPr>
+          <w:rFonts w:ascii="Courier New" w:hAnsi="Courier New"/>
+          <w:sz w:val="19"/>
+          <w:noProof w:val="1"/>
+        </w:rPr>
+        <w:t>internet_expected</w:t>
+      </w:r>
+      <w:r>
+        <w:rPr>
+          <w:rFonts w:ascii="Old Standard TT" w:hAnsi="Old Standard TT"/>
+          <w:sz w:val="21"/>
+        </w:rPr>
+        <w:t xml:space="preserve">, </w:t>
+      </w:r>
+      <w:r>
+        <w:rPr>
+          <w:rFonts w:ascii="Courier New" w:hAnsi="Courier New"/>
+          <w:sz w:val="19"/>
+          <w:noProof w:val="1"/>
+        </w:rPr>
+        <w:t>allowed_hosts</w:t>
+      </w:r>
+      <w:r>
+        <w:rPr>
+          <w:rFonts w:ascii="Old Standard TT" w:hAnsi="Old Standard TT"/>
+          <w:sz w:val="21"/>
+        </w:rPr>
+        <w:t xml:space="preserve"> (exact hosts or .suffix entries), </w:t>
+      </w:r>
+      <w:r>
+        <w:rPr>
+          <w:rFonts w:ascii="Courier New" w:hAnsi="Courier New"/>
+          <w:sz w:val="19"/>
+          <w:noProof w:val="1"/>
+        </w:rPr>
+        <w:t>allowed_cidrs</w:t>
+      </w:r>
+      <w:r>
+        <w:rPr>
+          <w:rFonts w:ascii="Old Standard TT" w:hAnsi="Old Standard TT"/>
+          <w:sz w:val="21"/>
+        </w:rPr>
+        <w:t xml:space="preserve">, and free-text notes recording why each entry is permitted. classify(host) returns </w:t>
+      </w:r>
+      <w:r>
+        <w:rPr>
+          <w:rFonts w:ascii="Courier New" w:hAnsi="Courier New"/>
+          <w:sz w:val="19"/>
+          <w:noProof w:val="1"/>
+        </w:rPr>
+        <w:t>ALLOWED</w:t>
+      </w:r>
+      <w:r>
+        <w:rPr>
+          <w:rFonts w:ascii="Old Standard TT" w:hAnsi="Old Standard TT"/>
+          <w:sz w:val="21"/>
+        </w:rPr>
+        <w:t xml:space="preserve">, </w:t>
+      </w:r>
+      <w:r>
+        <w:rPr>
+          <w:rFonts w:ascii="Courier New" w:hAnsi="Courier New"/>
+          <w:sz w:val="19"/>
+          <w:noProof w:val="1"/>
+        </w:rPr>
+        <w:t>LOOPBACK</w:t>
+      </w:r>
+      <w:r>
+        <w:rPr>
+          <w:rFonts w:ascii="Old Standard TT" w:hAnsi="Old Standard TT"/>
+          <w:sz w:val="21"/>
+        </w:rPr>
+        <w:t xml:space="preserve">, </w:t>
+      </w:r>
+      <w:r>
+        <w:rPr>
+          <w:rFonts w:ascii="Courier New" w:hAnsi="Courier New"/>
+          <w:sz w:val="19"/>
+          <w:noProof w:val="1"/>
+        </w:rPr>
+        <w:t>METADATA</w:t>
+      </w:r>
+      <w:r>
+        <w:rPr>
+          <w:rFonts w:ascii="Old Standard TT" w:hAnsi="Old Standard TT"/>
+          <w:sz w:val="21"/>
+        </w:rPr>
+        <w:t xml:space="preserve"> (the cloud instance-metadata addresses) or </w:t>
+      </w:r>
+      <w:r>
+        <w:rPr>
+          <w:rFonts w:ascii="Courier New" w:hAnsi="Courier New"/>
+          <w:sz w:val="19"/>
+          <w:noProof w:val="1"/>
+        </w:rPr>
+        <w:t>OUT</w:t>
+      </w:r>
+      <w:r>
+        <w:rPr>
+          <w:rFonts w:ascii="Old Standard TT" w:hAnsi="Old Standard TT"/>
+          <w:sz w:val="21"/>
+        </w:rPr>
+        <w:t xml:space="preserve">. A wildcard entry "*" allows everything; it exists only so the ablation can express "no real scope." Three scopes are in the repo, one per incident: ExploitGym (LLM API endpoints plus the Artifactory package proxy, both documented as permitted </w:t>
       </w:r>
       <w:r>
         <w:rPr>
@@ -1292,7 +1575,22 @@
           <w:rFonts w:ascii="Old Standard TT" w:hAnsi="Old Standard TT"/>
           <w:sz w:val="21"/>
         </w:rPr>
-        <w:t xml:space="preserve">), and the AISI range (range hosts, internet_expected true </w:t>
+        <w:t xml:space="preserve">), and the AISI range (range hosts, </w:t>
+      </w:r>
+      <w:r>
+        <w:rPr>
+          <w:rFonts w:ascii="Courier New" w:hAnsi="Courier New"/>
+          <w:sz w:val="19"/>
+          <w:noProof w:val="1"/>
+        </w:rPr>
+        <w:t>internet_expected</w:t>
+      </w:r>
+      <w:r>
+        <w:rPr>
+          <w:rFonts w:ascii="Old Standard TT" w:hAnsi="Old Standard TT"/>
+          <w:sz w:val="21"/>
+        </w:rPr>
+        <w:t xml:space="preserve"> true </w:t>
       </w:r>
       <w:r>
         <w:rPr>
@@ -1340,39 +1638,45 @@
     </w:p>
     <w:p>
       <w:pPr>
+        <w:shd w:val="clear" w:color="auto" w:fill="EDEDED"/>
         <w:spacing w:after="0" w:line="240" w:lineRule="auto"/>
-        <w:ind w:left="432"/>
-      </w:pPr>
-      <w:r>
-        <w:rPr>
-          <w:rFonts w:ascii="Old Standard TT" w:hAnsi="Old Standard TT"/>
-          <w:sz w:val="16"/>
+        <w:ind w:left="432" w:right="432"/>
+      </w:pPr>
+      <w:r>
+        <w:rPr>
+          <w:rFonts w:ascii="Courier New" w:hAnsi="Courier New"/>
+          <w:sz w:val="19"/>
+          <w:noProof w:val="1"/>
         </w:rPr>
         <w:t>{"name": "exploitgym-cyber-eval", "internet_expected": false,</w:t>
       </w:r>
     </w:p>
     <w:p>
       <w:pPr>
+        <w:shd w:val="clear" w:color="auto" w:fill="EDEDED"/>
         <w:spacing w:after="0" w:line="240" w:lineRule="auto"/>
-        <w:ind w:left="432"/>
-      </w:pPr>
-      <w:r>
-        <w:rPr>
-          <w:rFonts w:ascii="Old Standard TT" w:hAnsi="Old Standard TT"/>
-          <w:sz w:val="16"/>
+        <w:ind w:left="432" w:right="432"/>
+      </w:pPr>
+      <w:r>
+        <w:rPr>
+          <w:rFonts w:ascii="Courier New" w:hAnsi="Courier New"/>
+          <w:sz w:val="19"/>
+          <w:noProof w:val="1"/>
         </w:rPr>
         <w:t xml:space="preserve"> "allowed_hosts": ["api.openai.com", "api.anthropic.com", "artifactory.internal"],</w:t>
       </w:r>
     </w:p>
     <w:p>
       <w:pPr>
+        <w:shd w:val="clear" w:color="auto" w:fill="EDEDED"/>
         <w:spacing w:after="120" w:line="240" w:lineRule="auto"/>
-        <w:ind w:left="432"/>
-      </w:pPr>
-      <w:r>
-        <w:rPr>
-          <w:rFonts w:ascii="Old Standard TT" w:hAnsi="Old Standard TT"/>
-          <w:sz w:val="16"/>
+        <w:ind w:left="432" w:right="432"/>
+      </w:pPr>
+      <w:r>
+        <w:rPr>
+          <w:rFonts w:ascii="Courier New" w:hAnsi="Courier New"/>
+          <w:sz w:val="19"/>
+          <w:noProof w:val="1"/>
         </w:rPr>
         <w:t xml:space="preserve"> "notes": "ExploitGym run-proxy permits ONLY LLM API endpoints; OpenAI additionally permitted the Artifactory proxy."}</w:t>
       </w:r>
@@ -1396,7 +1700,52 @@
           <w:rFonts w:ascii="Old Standard TT" w:hAnsi="Old Standard TT"/>
           <w:sz w:val="21"/>
         </w:rPr>
-        <w:t>A trace is the ordered list of tool calls with their arguments; the scanner reads nothing else. extract_destinations pulls stated hosts from URLs, nc/ncat, socat, Python HTTP literals and bare host:port tokens, by regular expression. There is no model in the gate and no API key. The extractor is deliberately conservative: it reads what the agent said it would reach.</w:t>
+        <w:t xml:space="preserve">A trace is the ordered list of tool calls with their arguments; the scanner reads nothing else. </w:t>
+      </w:r>
+      <w:r>
+        <w:rPr>
+          <w:rFonts w:ascii="Courier New" w:hAnsi="Courier New"/>
+          <w:sz w:val="19"/>
+          <w:noProof w:val="1"/>
+        </w:rPr>
+        <w:t>extract_destinations</w:t>
+      </w:r>
+      <w:r>
+        <w:rPr>
+          <w:rFonts w:ascii="Old Standard TT" w:hAnsi="Old Standard TT"/>
+          <w:sz w:val="21"/>
+        </w:rPr>
+        <w:t xml:space="preserve"> pulls stated hosts from URLs, </w:t>
+      </w:r>
+      <w:r>
+        <w:rPr>
+          <w:rFonts w:ascii="Courier New" w:hAnsi="Courier New"/>
+          <w:sz w:val="19"/>
+          <w:noProof w:val="1"/>
+        </w:rPr>
+        <w:t>nc/ncat</w:t>
+      </w:r>
+      <w:r>
+        <w:rPr>
+          <w:rFonts w:ascii="Old Standard TT" w:hAnsi="Old Standard TT"/>
+          <w:sz w:val="21"/>
+        </w:rPr>
+        <w:t xml:space="preserve">, </w:t>
+      </w:r>
+      <w:r>
+        <w:rPr>
+          <w:rFonts w:ascii="Courier New" w:hAnsi="Courier New"/>
+          <w:sz w:val="19"/>
+          <w:noProof w:val="1"/>
+        </w:rPr>
+        <w:t>socat</w:t>
+      </w:r>
+      <w:r>
+        <w:rPr>
+          <w:rFonts w:ascii="Old Standard TT" w:hAnsi="Old Standard TT"/>
+          <w:sz w:val="21"/>
+        </w:rPr>
+        <w:t>, Python HTTP literals and bare host:port tokens, by regular expression. There is no model in the gate and no API key. The extractor is deliberately conservative: it reads what the agent said it would reach.</w:t>
       </w:r>
     </w:p>
     <w:p>
@@ -1415,10 +1764,63 @@
       </w:pPr>
       <w:r>
         <w:rPr>
-          <w:rFonts w:ascii="Old Standard TT" w:hAnsi="Old Standard TT"/>
-          <w:sz w:val="21"/>
-        </w:rPr>
-        <w:t xml:space="preserve">T3, a stated destination classified OUT, is the only PAGE. T1 (reading grader or solution internals) and T2 (mount tables, cgroups, proxy enumeration, metadata addresses) are WARN and never page. The reason is base rates: in a capture-the-flag task, flag-seeking is the task, and reconnaissance of one's own box is routine. AISI's cheating study lists "probing evaluation software for solution leaks" as a cheating mode </w:t>
+          <w:rFonts w:ascii="Courier New" w:hAnsi="Courier New"/>
+          <w:sz w:val="19"/>
+          <w:noProof w:val="1"/>
+        </w:rPr>
+        <w:t>T3</w:t>
+      </w:r>
+      <w:r>
+        <w:rPr>
+          <w:rFonts w:ascii="Old Standard TT" w:hAnsi="Old Standard TT"/>
+          <w:sz w:val="21"/>
+        </w:rPr>
+        <w:t xml:space="preserve">, a stated destination classified </w:t>
+      </w:r>
+      <w:r>
+        <w:rPr>
+          <w:rFonts w:ascii="Courier New" w:hAnsi="Courier New"/>
+          <w:sz w:val="19"/>
+          <w:noProof w:val="1"/>
+        </w:rPr>
+        <w:t>OUT</w:t>
+      </w:r>
+      <w:r>
+        <w:rPr>
+          <w:rFonts w:ascii="Old Standard TT" w:hAnsi="Old Standard TT"/>
+          <w:sz w:val="21"/>
+        </w:rPr>
+        <w:t xml:space="preserve">, is the only PAGE. </w:t>
+      </w:r>
+      <w:r>
+        <w:rPr>
+          <w:rFonts w:ascii="Courier New" w:hAnsi="Courier New"/>
+          <w:sz w:val="19"/>
+          <w:noProof w:val="1"/>
+        </w:rPr>
+        <w:t>T1</w:t>
+      </w:r>
+      <w:r>
+        <w:rPr>
+          <w:rFonts w:ascii="Old Standard TT" w:hAnsi="Old Standard TT"/>
+          <w:sz w:val="21"/>
+        </w:rPr>
+        <w:t xml:space="preserve"> (reading grader or solution internals) and </w:t>
+      </w:r>
+      <w:r>
+        <w:rPr>
+          <w:rFonts w:ascii="Courier New" w:hAnsi="Courier New"/>
+          <w:sz w:val="19"/>
+          <w:noProof w:val="1"/>
+        </w:rPr>
+        <w:t>T2</w:t>
+      </w:r>
+      <w:r>
+        <w:rPr>
+          <w:rFonts w:ascii="Old Standard TT" w:hAnsi="Old Standard TT"/>
+          <w:sz w:val="21"/>
+        </w:rPr>
+        <w:t xml:space="preserve"> (mount tables, cgroups, proxy enumeration, metadata addresses) are WARN and never page. The reason is base rates: in a capture-the-flag task, flag-seeking is the task, and reconnaissance of one's own box is routine. AISI's cheating study lists "probing evaluation software for solution leaks" as a cheating mode </w:t>
       </w:r>
       <w:r>
         <w:rPr>
@@ -1497,10 +1899,80 @@
       </w:pPr>
       <w:r>
         <w:rPr>
-          <w:rFonts w:ascii="Old Standard TT" w:hAnsi="Old Standard TT"/>
-          <w:sz w:val="21"/>
-        </w:rPr>
-        <w:t>scanner.py wraps the same rule as an inspect_scout scanner over ChatMessageAssistant.tool_calls and returns a Result whose answer is the host and whose metadata carries the first out-of-scope message index. JSON replay over the trace schema (sentinel score) is the supported interface, and is what a third party with only files runs; the inspect_scout wrapper (scout scan sentinel/scanner.py -T logs/) is exercised by the test suite and, in Section 4.4, over a recorded evaluation log. Both paths execute the same rule. Eighteen tests pin every number in this paper.</w:t>
+          <w:rFonts w:ascii="Courier New" w:hAnsi="Courier New"/>
+          <w:sz w:val="19"/>
+          <w:noProof w:val="1"/>
+        </w:rPr>
+        <w:t>scanner.py</w:t>
+      </w:r>
+      <w:r>
+        <w:rPr>
+          <w:rFonts w:ascii="Old Standard TT" w:hAnsi="Old Standard TT"/>
+          <w:sz w:val="21"/>
+        </w:rPr>
+        <w:t xml:space="preserve"> wraps the same rule as an inspect_scout scanner over </w:t>
+      </w:r>
+      <w:r>
+        <w:rPr>
+          <w:rFonts w:ascii="Courier New" w:hAnsi="Courier New"/>
+          <w:sz w:val="19"/>
+          <w:noProof w:val="1"/>
+        </w:rPr>
+        <w:t>ChatMessageAssistant.tool_calls</w:t>
+      </w:r>
+      <w:r>
+        <w:rPr>
+          <w:rFonts w:ascii="Old Standard TT" w:hAnsi="Old Standard TT"/>
+          <w:sz w:val="21"/>
+        </w:rPr>
+        <w:t xml:space="preserve"> and returns a </w:t>
+      </w:r>
+      <w:r>
+        <w:rPr>
+          <w:rFonts w:ascii="Courier New" w:hAnsi="Courier New"/>
+          <w:sz w:val="19"/>
+          <w:noProof w:val="1"/>
+        </w:rPr>
+        <w:t>Result</w:t>
+      </w:r>
+      <w:r>
+        <w:rPr>
+          <w:rFonts w:ascii="Old Standard TT" w:hAnsi="Old Standard TT"/>
+          <w:sz w:val="21"/>
+        </w:rPr>
+        <w:t xml:space="preserve"> whose answer is the host and whose metadata carries the first out-of-scope message index. JSON replay over the trace schema (</w:t>
+      </w:r>
+      <w:r>
+        <w:rPr>
+          <w:rFonts w:ascii="Courier New" w:hAnsi="Courier New"/>
+          <w:sz w:val="19"/>
+          <w:noProof w:val="1"/>
+          <w:shd w:val="clear" w:color="auto" w:fill="EDEDED"/>
+        </w:rPr>
+        <w:t>sentinel score</w:t>
+      </w:r>
+      <w:r>
+        <w:rPr>
+          <w:rFonts w:ascii="Old Standard TT" w:hAnsi="Old Standard TT"/>
+          <w:sz w:val="21"/>
+        </w:rPr>
+        <w:t>) is the supported interface, and is what a third party with only files runs; the inspect_scout wrapper (</w:t>
+      </w:r>
+      <w:r>
+        <w:rPr>
+          <w:rFonts w:ascii="Courier New" w:hAnsi="Courier New"/>
+          <w:sz w:val="19"/>
+          <w:noProof w:val="1"/>
+          <w:shd w:val="clear" w:color="auto" w:fill="EDEDED"/>
+        </w:rPr>
+        <w:t>scout scan sentinel/scanner.py -T logs/</w:t>
+      </w:r>
+      <w:r>
+        <w:rPr>
+          <w:rFonts w:ascii="Old Standard TT" w:hAnsi="Old Standard TT"/>
+          <w:sz w:val="21"/>
+        </w:rPr>
+        <w:t>) is exercised by the test suite and, in Section 4.4, over a recorded evaluation log. Both paths execute the same rule. Eighteen tests pin every number in this paper.</w:t>
       </w:r>
     </w:p>
     <w:p>
@@ -1522,7 +1994,22 @@
           <w:rFonts w:ascii="Old Standard TT" w:hAnsi="Old Standard TT"/>
           <w:sz w:val="21"/>
         </w:rPr>
-        <w:t>Three positives are reconstructions from the public write-ups, each carrying a source URL and a lab_detected_at_event field: the Hugging Face escape (7 events), the AISI Tor egress (4) and the Anthropic name-collision case (4). The calendar dates of each organisation's own detection are cited from the published timelines; the event index is our mapping of that moment onto a short reconstruction, not a number any lab published. Three synthetic hard negatives cover the cases a naive monitor gets wrong: an agent whose only egress is the permitted LLM API; in-sandbox reconnaissance that reads task files; and an internet-expected range where the agent hits allowlisted hosts. One synthetic fixture reads grader internals and should warn only. The baseline pages on any of curl, wget, nc, requests, socket or http with no allowlist. These fixtures were written by us, from descriptions, to a rule we wrote; Section 4 says what that does and does not license.</w:t>
+        <w:t xml:space="preserve">Three positives are reconstructions from the public write-ups, each carrying a source URL and a </w:t>
+      </w:r>
+      <w:r>
+        <w:rPr>
+          <w:rFonts w:ascii="Courier New" w:hAnsi="Courier New"/>
+          <w:sz w:val="19"/>
+          <w:noProof w:val="1"/>
+        </w:rPr>
+        <w:t>lab_detected_at_event</w:t>
+      </w:r>
+      <w:r>
+        <w:rPr>
+          <w:rFonts w:ascii="Old Standard TT" w:hAnsi="Old Standard TT"/>
+          <w:sz w:val="21"/>
+        </w:rPr>
+        <w:t xml:space="preserve"> field: the Hugging Face escape (7 events), the AISI Tor egress (4) and the Anthropic name-collision case (4). The calendar dates of each organisation's own detection are cited from the published timelines; the event index is our mapping of that moment onto a short reconstruction, not a number any lab published. Three synthetic hard negatives cover the cases a naive monitor gets wrong: an agent whose only egress is the permitted LLM API; in-sandbox reconnaissance that reads task files; and an internet-expected range where the agent hits allowlisted hosts. One synthetic fixture reads grader internals and should warn only. The baseline pages on any of curl, wget, nc, requests, socket or http with no allowlist. These fixtures were written by us, from descriptions, to a rule we wrote; Section 4 says what that does and does not license.</w:t>
       </w:r>
     </w:p>
     <w:p>
@@ -1544,7 +2031,52 @@
           <w:rFonts w:ascii="Old Standard TT" w:hAnsi="Old Standard TT"/>
           <w:sz w:val="21"/>
         </w:rPr>
-        <w:t>Two first-run failures became the paper. The Hugging Face trace first paged at event 2 on artifactory.internal: our allowlist had omitted the package proxy, which OpenAI documents as a genuinely permitted egress. Adding it moved the page to event 3 and exposed the blind spot in Section 4.3, and the difference between the two allowlists became the ablation. Second, T1 fired on cat solution_template.py; grep -r flag. That was the rule working and the test being wrong: in a CTF that command is the task. We changed the test to assert T2-only on that fixture and added a separate grader-internals fixture for the genuine T1 signal. Third, the first scout scan over a real log crashed: the scanner used relative imports and scout loads the file standalone in worker processes, so the README command had never actually worked. It now imports the installed package.</w:t>
+        <w:t xml:space="preserve">Two first-run failures became the paper. The Hugging Face trace first paged at event 2 on artifactory.internal: our allowlist had omitted the package proxy, which OpenAI documents as a genuinely permitted egress. Adding it moved the page to event 3 and exposed the blind spot in Section 4.3, and the difference between the two allowlists became the ablation. Second, </w:t>
+      </w:r>
+      <w:r>
+        <w:rPr>
+          <w:rFonts w:ascii="Courier New" w:hAnsi="Courier New"/>
+          <w:sz w:val="19"/>
+          <w:noProof w:val="1"/>
+        </w:rPr>
+        <w:t>T1</w:t>
+      </w:r>
+      <w:r>
+        <w:rPr>
+          <w:rFonts w:ascii="Old Standard TT" w:hAnsi="Old Standard TT"/>
+          <w:sz w:val="21"/>
+        </w:rPr>
+        <w:t xml:space="preserve"> fired on cat solution_template.py; grep -r flag. That was the rule working and the test being wrong: in a CTF that command is the task. We changed the test to assert </w:t>
+      </w:r>
+      <w:r>
+        <w:rPr>
+          <w:rFonts w:ascii="Courier New" w:hAnsi="Courier New"/>
+          <w:sz w:val="19"/>
+          <w:noProof w:val="1"/>
+        </w:rPr>
+        <w:t>T2</w:t>
+      </w:r>
+      <w:r>
+        <w:rPr>
+          <w:rFonts w:ascii="Old Standard TT" w:hAnsi="Old Standard TT"/>
+          <w:sz w:val="21"/>
+        </w:rPr>
+        <w:t xml:space="preserve">-only on that fixture and added a separate grader-internals fixture for the genuine </w:t>
+      </w:r>
+      <w:r>
+        <w:rPr>
+          <w:rFonts w:ascii="Courier New" w:hAnsi="Courier New"/>
+          <w:sz w:val="19"/>
+          <w:noProof w:val="1"/>
+        </w:rPr>
+        <w:t>T1</w:t>
+      </w:r>
+      <w:r>
+        <w:rPr>
+          <w:rFonts w:ascii="Old Standard TT" w:hAnsi="Old Standard TT"/>
+          <w:sz w:val="21"/>
+        </w:rPr>
+        <w:t xml:space="preserve"> signal. Third, the first scout scan over a real log crashed: the scanner used relative imports and scout loads the file standalone in worker processes, so the README command had never actually worked. It now imports the installed package.</w:t>
       </w:r>
     </w:p>
     <w:p>
@@ -2663,7 +3195,24 @@
                 <w:b w:val="0"/>
                 <w:sz w:val="16"/>
               </w:rPr>
-              <w:t>no page (T1 warn)</w:t>
+              <w:t>no page (</w:t>
+            </w:r>
+            <w:r>
+              <w:rPr>
+                <w:rFonts w:ascii="Courier New" w:hAnsi="Courier New"/>
+                <w:b w:val="0"/>
+                <w:sz w:val="16"/>
+                <w:noProof w:val="1"/>
+              </w:rPr>
+              <w:t>T1</w:t>
+            </w:r>
+            <w:r>
+              <w:rPr>
+                <w:rFonts w:ascii="Old Standard TT" w:hAnsi="Old Standard TT"/>
+                <w:b w:val="0"/>
+                <w:sz w:val="16"/>
+              </w:rPr>
+              <w:t xml:space="preserve"> warn)</w:t>
             </w:r>
           </w:p>
         </w:tc>
@@ -2863,7 +3412,22 @@
           <w:rFonts w:ascii="Old Standard TT" w:hAnsi="Old Standard TT"/>
           <w:sz w:val="21"/>
         </w:rPr>
-        <w:t xml:space="preserve">Under the correct scope the page lands at event 3. Event 2, the request to the permitted proxy, is already the escape: the SSRF went through an allowlisted host, and an allowlist-relative rule classifies that request as ALLOWED. PAGE @3 is the first auditable evidence of out-of-scope egress, which in the reconstruction precedes the production intrusion (events 5 and 6) and the organisation's own detection (event 6). It is not "this would have stopped the breach." Prevention is default-deny egress plus a hardened permitted proxy, and a trace scanner supplies neither. The DSEWiki case has the same shape: the sandbox permitted only GET requests, and the wiki accepts page edits over GET </w:t>
+        <w:t xml:space="preserve">Under the correct scope the page lands at event 3. Event 2, the request to the permitted proxy, is already the escape: the SSRF went through an allowlisted host, and an allowlist-relative rule classifies that request as </w:t>
+      </w:r>
+      <w:r>
+        <w:rPr>
+          <w:rFonts w:ascii="Courier New" w:hAnsi="Courier New"/>
+          <w:sz w:val="19"/>
+          <w:noProof w:val="1"/>
+        </w:rPr>
+        <w:t>ALLOWED</w:t>
+      </w:r>
+      <w:r>
+        <w:rPr>
+          <w:rFonts w:ascii="Old Standard TT" w:hAnsi="Old Standard TT"/>
+          <w:sz w:val="21"/>
+        </w:rPr>
+        <w:t xml:space="preserve">. PAGE @3 is the first auditable evidence of out-of-scope egress, which in the reconstruction precedes the production intrusion (events 5 and 6) and the organisation's own detection (event 6). It is not "this would have stopped the breach." Prevention is default-deny egress plus a hardened permitted proxy, and a trace scanner supplies neither. The DSEWiki case has the same shape: the sandbox permitted only GET requests, and the wiki accepts page edits over GET </w:t>
       </w:r>
       <w:r>
         <w:rPr>
@@ -3537,7 +4101,22 @@
           <w:rFonts w:ascii="Old Standard TT" w:hAnsi="Old Standard TT"/>
           <w:sz w:val="21"/>
         </w:rPr>
-        <w:t>Observation: under the scope the sandbox actually had, the scanner is silent on all 14,591 events. Under a scope that names the task's data sources, the first out-of-scope stated destination is wikiservice.at, DSEWiki's own host, at event 5: six hours into the first day of writing, the agents' fifth post already linked to the board they were writing on, 27 days before the first OpenAI-associated address visited the pages. Permitting the wiki hosts moves the first page to 26 May, where the stated destinations are a placeholder domain, then the first of 43 reader and CORS-proxy hosts (markdown.new, r.jina.ai, allorigins), then drive.google.com. The extractor sees 200 distinct hosts in the record: 31 task data sources, 6 wiki hosts, 43 reader or CORS proxies, 4 shorteners, 5 archives, 4 tunnels. Interpretation: the ablation's two failure modes reproduce on a record we did not write. The scope the evaluation had was a wildcard, and a wildcard produces no page on a real containment failure; any scope that named what the task was for would have paged on the first day. Two caveats. 16,309 pages is an alert volume nobody reads, so the value is the first index and the count is why layer 3, not layer 2, should gate paging; and T2 fired 1,147 times only because "proxy" appears in the workaround hostnames, a lexical accident we report as one.</w:t>
+        <w:t xml:space="preserve">Observation: under the scope the sandbox actually had, the scanner is silent on all 14,591 events. Under a scope that names the task's data sources, the first out-of-scope stated destination is wikiservice.at, DSEWiki's own host, at event 5: six hours into the first day of writing, the agents' fifth post already linked to the board they were writing on, 27 days before the first OpenAI-associated address visited the pages. Permitting the wiki hosts moves the first page to 26 May, where the stated destinations are a placeholder domain, then the first of 43 reader and CORS-proxy hosts (markdown.new, r.jina.ai, allorigins), then drive.google.com. The extractor sees 200 distinct hosts in the record: 31 task data sources, 6 wiki hosts, 43 reader or CORS proxies, 4 shorteners, 5 archives, 4 tunnels. Interpretation: the ablation's two failure modes reproduce on a record we did not write. The scope the evaluation had was a wildcard, and a wildcard produces no page on a real containment failure; any scope that named what the task was for would have paged on the first day. Two caveats. 16,309 pages is an alert volume nobody reads, so the value is the first index, and the count is why layer 3, not layer 2, should gate paging; and </w:t>
+      </w:r>
+      <w:r>
+        <w:rPr>
+          <w:rFonts w:ascii="Courier New" w:hAnsi="Courier New"/>
+          <w:sz w:val="19"/>
+          <w:noProof w:val="1"/>
+        </w:rPr>
+        <w:t>T2</w:t>
+      </w:r>
+      <w:r>
+        <w:rPr>
+          <w:rFonts w:ascii="Old Standard TT" w:hAnsi="Old Standard TT"/>
+          <w:sz w:val="21"/>
+        </w:rPr>
+        <w:t xml:space="preserve"> fired 1,147 times only because "proxy" appears in the workaround hostnames, a lexical accident we report as one.</w:t>
       </w:r>
     </w:p>
     <w:p>
@@ -3550,7 +4129,22 @@
           <w:rFonts w:ascii="Old Standard TT" w:hAnsi="Old Standard TT"/>
           <w:sz w:val="21"/>
         </w:rPr>
-        <w:t>The second record is a live run rather than a fixture: eight samples of inspect_evals/gdm_intercode_ctf with claude-haiku-4-5 as the agent. Its upstream sandbox declares network_mode: none, the only allowlist here written from a benchmark's own configuration, and it is empty. The agent made 42 tool calls (ls, cat, tcpdump, strings, python, submit) and solved all eight tasks; Sentinel paged on none, warned on none, the keyword baseline fired on none, and the inspect_scout wrapper returned the same eight verdicts from the recorded log. This is a negative control, not a detection result: a scanner that paged here would be wrong. It shows the rule is silent on real tool calls it was not written against, and that the Inspect path works on a real log. Cost: $0.14.</w:t>
+        <w:t xml:space="preserve">The second record is a live run rather than a fixture: eight samples of inspect_evals/gdm_intercode_ctf with claude-haiku-4-5 as the agent. Its upstream sandbox declares </w:t>
+      </w:r>
+      <w:r>
+        <w:rPr>
+          <w:rFonts w:ascii="Courier New" w:hAnsi="Courier New"/>
+          <w:sz w:val="19"/>
+          <w:noProof w:val="1"/>
+        </w:rPr>
+        <w:t>network_mode: none</w:t>
+      </w:r>
+      <w:r>
+        <w:rPr>
+          <w:rFonts w:ascii="Old Standard TT" w:hAnsi="Old Standard TT"/>
+          <w:sz w:val="21"/>
+        </w:rPr>
+        <w:t>, the only allowlist here written from a benchmark's own configuration, and it is empty. The agent made 42 tool calls (ls, cat, tcpdump, strings, python, submit) and solved all eight tasks; Sentinel paged on none, warned on none, the keyword baseline fired on none, and the inspect_scout wrapper returned the same eight verdicts from the recorded log. This is a negative control, not a detection result: a scanner that paged here would be wrong. It shows the rule is silent on real tool calls it was not written against, and that the Inspect path works on a real log.</w:t>
       </w:r>
     </w:p>
     <w:p>
@@ -3712,7 +4306,7 @@
           <w:rFonts w:ascii="Old Standard TT" w:hAnsi="Old Standard TT"/>
           <w:sz w:val="21"/>
         </w:rPr>
-        <w:t>•  The fixtures and the rule share an author, so the specification tests show consistency, not generalisation. The DSEWiki run fixes the events but not the scope: its two non-wildcard allowlists are ours, and a different reconstruction would move the first page. The wildcard row, the scope the sandbox actually had, does not move.</w:t>
+        <w:t>•  The fixtures and the rule share an author, so the specification tests show consistency, not generalisation. The DSEWiki run fixes the events but not the scope: its two non-wildcard allowlists are ours, and a different reconstruction would move the first page. The wildcard row, the scope the sandbox had, does not move.</w:t>
       </w:r>
     </w:p>
     <w:p>
@@ -3784,7 +4378,37 @@
           <w:rFonts w:ascii="Old Standard TT" w:hAnsi="Old Standard TT"/>
           <w:sz w:val="21"/>
         </w:rPr>
-        <w:t>•  The extractor is regular expressions. Destinations hidden in shell variables, base64, DNS exfiltration or IP-as-integer forms are missed and the miss rate is unmeasured; publishing the extractor publishes its gaps (Appendix A). T1 and T2 false-positive rates are likewise unmeasured.</w:t>
+        <w:t xml:space="preserve">•  The extractor is regular expressions. Destinations hidden in shell variables, base64, DNS exfiltration or IP-as-integer forms are missed and the miss rate is unmeasured; publishing the extractor publishes its gaps (Appendix A). </w:t>
+      </w:r>
+      <w:r>
+        <w:rPr>
+          <w:rFonts w:ascii="Courier New" w:hAnsi="Courier New"/>
+          <w:sz w:val="19"/>
+          <w:noProof w:val="1"/>
+        </w:rPr>
+        <w:t>T1</w:t>
+      </w:r>
+      <w:r>
+        <w:rPr>
+          <w:rFonts w:ascii="Old Standard TT" w:hAnsi="Old Standard TT"/>
+          <w:sz w:val="21"/>
+        </w:rPr>
+        <w:t xml:space="preserve"> and </w:t>
+      </w:r>
+      <w:r>
+        <w:rPr>
+          <w:rFonts w:ascii="Courier New" w:hAnsi="Courier New"/>
+          <w:sz w:val="19"/>
+          <w:noProof w:val="1"/>
+        </w:rPr>
+        <w:t>T2</w:t>
+      </w:r>
+      <w:r>
+        <w:rPr>
+          <w:rFonts w:ascii="Old Standard TT" w:hAnsi="Old Standard TT"/>
+          <w:sz w:val="21"/>
+        </w:rPr>
+        <w:t xml:space="preserve"> false-positive rates are likewise unmeasured.</w:t>
       </w:r>
     </w:p>
     <w:p>
@@ -3820,7 +4444,52 @@
           <w:rFonts w:ascii="Old Standard TT" w:hAnsi="Old Standard TT"/>
           <w:sz w:val="21"/>
         </w:rPr>
-        <w:t>A month would add three things. First, a positive live case: an agentic evaluation run with internet on and an honest allowlist (ExploitGym's own firewall list is the natural start), reporting T3 page and T1/T2 warn rates on real traces. Second, layer 3 against Cilium Hubble or Squid access logs, reporting the declared-versus-observed disagreement rate, which is the attestation number. Third, an adversarial pass on the extractor with an obfuscation corpus, so the miss rate is a number rather than a paragraph.</w:t>
+        <w:t xml:space="preserve">A month would add three things. First, a positive live case: an agentic evaluation run with internet on and an honest allowlist (ExploitGym's own firewall list is the natural start), reporting </w:t>
+      </w:r>
+      <w:r>
+        <w:rPr>
+          <w:rFonts w:ascii="Courier New" w:hAnsi="Courier New"/>
+          <w:sz w:val="19"/>
+          <w:noProof w:val="1"/>
+        </w:rPr>
+        <w:t>T3</w:t>
+      </w:r>
+      <w:r>
+        <w:rPr>
+          <w:rFonts w:ascii="Old Standard TT" w:hAnsi="Old Standard TT"/>
+          <w:sz w:val="21"/>
+        </w:rPr>
+        <w:t xml:space="preserve"> page and </w:t>
+      </w:r>
+      <w:r>
+        <w:rPr>
+          <w:rFonts w:ascii="Courier New" w:hAnsi="Courier New"/>
+          <w:sz w:val="19"/>
+          <w:noProof w:val="1"/>
+        </w:rPr>
+        <w:t>T1</w:t>
+      </w:r>
+      <w:r>
+        <w:rPr>
+          <w:rFonts w:ascii="Old Standard TT" w:hAnsi="Old Standard TT"/>
+          <w:sz w:val="21"/>
+        </w:rPr>
+        <w:t>/</w:t>
+      </w:r>
+      <w:r>
+        <w:rPr>
+          <w:rFonts w:ascii="Courier New" w:hAnsi="Courier New"/>
+          <w:sz w:val="19"/>
+          <w:noProof w:val="1"/>
+        </w:rPr>
+        <w:t>T2</w:t>
+      </w:r>
+      <w:r>
+        <w:rPr>
+          <w:rFonts w:ascii="Old Standard TT" w:hAnsi="Old Standard TT"/>
+          <w:sz w:val="21"/>
+        </w:rPr>
+        <w:t xml:space="preserve"> warn rates on real traces. Second, layer 3 against Cilium Hubble or Squid access logs, reporting the declared-versus-observed disagreement rate, which is the attestation number. Third, an adversarial pass on the extractor with an obfuscation corpus, so the miss rate is a number rather than a paragraph.</w:t>
       </w:r>
     </w:p>
     <w:p>
@@ -3880,7 +4549,22 @@
           <w:rFonts w:ascii="Old Standard TT" w:hAnsi="Old Standard TT"/>
           <w:sz w:val="21"/>
         </w:rPr>
-        <w:t xml:space="preserve"> (Apache-2.0, matching ExploitGym). Fixtures, allowlists, the ablation script, the filled record of Appendix C and the tests are in the repository; python -m pytest reproduces every number here with no model and no API key. No lab transcripts are included because none are public. The DSEWiki export </w:t>
+        <w:t xml:space="preserve"> (Apache-2.0, matching ExploitGym). Fixtures, allowlists, the ablation script, the filled record of Appendix C and the tests are in the repository; </w:t>
+      </w:r>
+      <w:r>
+        <w:rPr>
+          <w:rFonts w:ascii="Courier New" w:hAnsi="Courier New"/>
+          <w:sz w:val="19"/>
+          <w:noProof w:val="1"/>
+        </w:rPr>
+        <w:t>python -m pytest</w:t>
+      </w:r>
+      <w:r>
+        <w:rPr>
+          <w:rFonts w:ascii="Old Standard TT" w:hAnsi="Old Standard TT"/>
+          <w:sz w:val="21"/>
+        </w:rPr>
+        <w:t xml:space="preserve"> reproduces every number here with no model and no API key. The DSEWiki export </w:t>
       </w:r>
       <w:r>
         <w:rPr>
@@ -3910,7 +4594,7 @@
           <w:rFonts w:ascii="Old Standard TT" w:hAnsi="Old Standard TT"/>
           <w:sz w:val="21"/>
         </w:rPr>
-        <w:t xml:space="preserve"> is used as published, with its manifest hash stated in Section 4.4 and a download script in the README; no other datasets were used.</w:t>
+        <w:t xml:space="preserve"> is used as published, with its manifest hash stated in Section 4.4 and a download script in the README.</w:t>
       </w:r>
     </w:p>
     <w:p>
@@ -3939,6 +4623,7 @@
       <w:pPr>
         <w:pStyle w:val="Heading2"/>
         <w:keepNext/>
+        <w:pageBreakBefore/>
       </w:pPr>
       <w:r>
         <w:t>References</w:t>
@@ -4348,6 +5033,136 @@
         </w:r>
       </w:hyperlink>
       <w:bookmarkEnd w:id="14"/>
+    </w:p>
+    <w:p>
+      <w:bookmarkStart w:id="15" w:name="ref15"/>
+      <w:pPr>
+        <w:spacing w:after="80" w:line="259" w:lineRule="auto"/>
+        <w:ind w:left="403" w:hanging="403"/>
+        <w:jc w:val="left"/>
+      </w:pPr>
+      <w:r>
+        <w:rPr>
+          <w:rFonts w:ascii="Old Standard TT" w:hAnsi="Old Standard TT"/>
+          <w:sz w:val="20"/>
+        </w:rPr>
+        <w:t xml:space="preserve">[15] Apart Research and CeSIA, 2026. AI Incident Response Sprint, Resources: Track 1 example projects, item 5 (Egress attestation spec v0.1). </w:t>
+      </w:r>
+      <w:hyperlink r:id="rId27">
+        <w:r>
+          <w:rPr>
+            <w:rFonts w:ascii="Old Standard TT" w:hAnsi="Old Standard TT"/>
+            <w:color w:val="2E5C8A"/>
+            <w:sz w:val="20"/>
+          </w:rPr>
+          <w:t>apartresearch.com/sprints/ai-incident-response-sprint-2026-09-11-to-2026-09-13</w:t>
+        </w:r>
+      </w:hyperlink>
+      <w:bookmarkEnd w:id="15"/>
+    </w:p>
+    <w:p>
+      <w:bookmarkStart w:id="16" w:name="ref16"/>
+      <w:pPr>
+        <w:spacing w:after="80" w:line="259" w:lineRule="auto"/>
+        <w:ind w:left="403" w:hanging="403"/>
+        <w:jc w:val="left"/>
+      </w:pPr>
+      <w:r>
+        <w:rPr>
+          <w:rFonts w:ascii="Old Standard TT" w:hAnsi="Old Standard TT"/>
+          <w:sz w:val="20"/>
+        </w:rPr>
+        <w:t xml:space="preserve">[16] SecureLayer7, 2026. Hugging Face AI agent intrusion: technical anatomy. </w:t>
+      </w:r>
+      <w:hyperlink r:id="rId28">
+        <w:r>
+          <w:rPr>
+            <w:rFonts w:ascii="Old Standard TT" w:hAnsi="Old Standard TT"/>
+            <w:color w:val="2E5C8A"/>
+            <w:sz w:val="20"/>
+          </w:rPr>
+          <w:t>blog.securelayer7.net/huggingface-ai-agent-intrusion-technical-anatomy</w:t>
+        </w:r>
+      </w:hyperlink>
+      <w:bookmarkEnd w:id="16"/>
+    </w:p>
+    <w:p>
+      <w:bookmarkStart w:id="17" w:name="ref17"/>
+      <w:pPr>
+        <w:spacing w:after="80" w:line="259" w:lineRule="auto"/>
+        <w:ind w:left="403" w:hanging="403"/>
+        <w:jc w:val="left"/>
+      </w:pPr>
+      <w:r>
+        <w:rPr>
+          <w:rFonts w:ascii="Old Standard TT" w:hAnsi="Old Standard TT"/>
+          <w:sz w:val="20"/>
+        </w:rPr>
+        <w:t xml:space="preserve">[17] Elastic Security Labs, 2026. Detecting the AI agent attack chain behind the Hugging Face breach. </w:t>
+      </w:r>
+      <w:hyperlink r:id="rId29">
+        <w:r>
+          <w:rPr>
+            <w:rFonts w:ascii="Old Standard TT" w:hAnsi="Old Standard TT"/>
+            <w:color w:val="2E5C8A"/>
+            <w:sz w:val="20"/>
+          </w:rPr>
+          <w:t>elastic.co/security-labs/ai-agent-attack-detection-hugging-face-breach</w:t>
+        </w:r>
+      </w:hyperlink>
+      <w:bookmarkEnd w:id="17"/>
+    </w:p>
+    <w:p>
+      <w:bookmarkStart w:id="18" w:name="ref18"/>
+      <w:pPr>
+        <w:spacing w:after="80" w:line="259" w:lineRule="auto"/>
+        <w:ind w:left="403" w:hanging="403"/>
+        <w:jc w:val="left"/>
+      </w:pPr>
+      <w:r>
+        <w:rPr>
+          <w:rFonts w:ascii="Old Standard TT" w:hAnsi="Old Standard TT"/>
+          <w:sz w:val="20"/>
+        </w:rPr>
+        <w:t xml:space="preserve">[18] Cloud Security Alliance. AI Controls Matrix, control AIS-13 (AI sandboxing), and vulnerability-operations guidance on exploit-confirmation environments. </w:t>
+      </w:r>
+      <w:hyperlink r:id="rId30">
+        <w:r>
+          <w:rPr>
+            <w:rFonts w:ascii="Old Standard TT" w:hAnsi="Old Standard TT"/>
+            <w:color w:val="2E5C8A"/>
+            <w:sz w:val="20"/>
+          </w:rPr>
+          <w:t>cloudsecurityalliance.org</w:t>
+        </w:r>
+      </w:hyperlink>
+      <w:bookmarkEnd w:id="18"/>
+    </w:p>
+    <w:p>
+      <w:bookmarkStart w:id="19" w:name="ref19"/>
+      <w:pPr>
+        <w:spacing w:after="80" w:line="259" w:lineRule="auto"/>
+        <w:ind w:left="403" w:hanging="403"/>
+        <w:jc w:val="left"/>
+      </w:pPr>
+      <w:r>
+        <w:rPr>
+          <w:rFonts w:ascii="Old Standard TT" w:hAnsi="Old Standard TT"/>
+          <w:sz w:val="20"/>
+        </w:rPr>
+        <w:t xml:space="preserve">[19] Coalition for Secure AI, 2026. AI Incident Response Framework v1.0 (Workstream 2). </w:t>
+      </w:r>
+      <w:hyperlink r:id="rId31">
+        <w:r>
+          <w:rPr>
+            <w:rFonts w:ascii="Old Standard TT" w:hAnsi="Old Standard TT"/>
+            <w:color w:val="2E5C8A"/>
+            <w:sz w:val="20"/>
+          </w:rPr>
+          <w:t>coalitionforsecureai.org/wp-content/uploads/2026/03/AI-Incident-Response-1.pdf</w:t>
+        </w:r>
+      </w:hyperlink>
+      <w:bookmarkEnd w:id="19"/>
     </w:p>
     <w:p>
       <w:pPr>
@@ -4664,11 +5479,20 @@
             </w:r>
             <w:r>
               <w:rPr>
-                <w:rFonts w:ascii="Old Standard TT" w:hAnsi="Old Standard TT"/>
-                <w:b w:val="0"/>
-                <w:sz w:val="16"/>
-              </w:rPr>
-              <w:t>T1 WARN</w:t>
+                <w:rFonts w:ascii="Courier New" w:hAnsi="Courier New"/>
+                <w:b w:val="0"/>
+                <w:sz w:val="16"/>
+                <w:noProof w:val="1"/>
+              </w:rPr>
+              <w:t>T1</w:t>
+            </w:r>
+            <w:r>
+              <w:rPr>
+                <w:rFonts w:ascii="Old Standard TT" w:hAnsi="Old Standard TT"/>
+                <w:b w:val="0"/>
+                <w:sz w:val="16"/>
+              </w:rPr>
+              <w:t xml:space="preserve"> WARN</w:t>
             </w:r>
           </w:p>
         </w:tc>
@@ -4764,11 +5588,20 @@
             </w:r>
             <w:r>
               <w:rPr>
-                <w:rFonts w:ascii="Old Standard TT" w:hAnsi="Old Standard TT"/>
-                <w:b w:val="0"/>
-                <w:sz w:val="16"/>
-              </w:rPr>
-              <w:t>T2 WARN</w:t>
+                <w:rFonts w:ascii="Courier New" w:hAnsi="Courier New"/>
+                <w:b w:val="0"/>
+                <w:sz w:val="16"/>
+                <w:noProof w:val="1"/>
+              </w:rPr>
+              <w:t>T2</w:t>
+            </w:r>
+            <w:r>
+              <w:rPr>
+                <w:rFonts w:ascii="Old Standard TT" w:hAnsi="Old Standard TT"/>
+                <w:b w:val="0"/>
+                <w:sz w:val="16"/>
+              </w:rPr>
+              <w:t xml:space="preserve"> WARN</w:t>
             </w:r>
           </w:p>
         </w:tc>
@@ -4838,11 +5671,20 @@
             </w:r>
             <w:r>
               <w:rPr>
-                <w:rFonts w:ascii="Old Standard TT" w:hAnsi="Old Standard TT"/>
-                <w:b w:val="0"/>
-                <w:sz w:val="16"/>
-              </w:rPr>
-              <w:t>T3 PAGE</w:t>
+                <w:rFonts w:ascii="Courier New" w:hAnsi="Courier New"/>
+                <w:b w:val="0"/>
+                <w:sz w:val="16"/>
+                <w:noProof w:val="1"/>
+              </w:rPr>
+              <w:t>T3</w:t>
+            </w:r>
+            <w:r>
+              <w:rPr>
+                <w:rFonts w:ascii="Old Standard TT" w:hAnsi="Old Standard TT"/>
+                <w:b w:val="0"/>
+                <w:sz w:val="16"/>
+              </w:rPr>
+              <w:t xml:space="preserve"> PAGE</w:t>
             </w:r>
           </w:p>
         </w:tc>
@@ -5086,11 +5928,20 @@
             </w:r>
             <w:r>
               <w:rPr>
-                <w:rFonts w:ascii="Old Standard TT" w:hAnsi="Old Standard TT"/>
-                <w:b w:val="0"/>
-                <w:sz w:val="16"/>
-              </w:rPr>
-              <w:t>T3 if a host is stated</w:t>
+                <w:rFonts w:ascii="Courier New" w:hAnsi="Courier New"/>
+                <w:b w:val="0"/>
+                <w:sz w:val="16"/>
+                <w:noProof w:val="1"/>
+              </w:rPr>
+              <w:t>T3</w:t>
+            </w:r>
+            <w:r>
+              <w:rPr>
+                <w:rFonts w:ascii="Old Standard TT" w:hAnsi="Old Standard TT"/>
+                <w:b w:val="0"/>
+                <w:sz w:val="16"/>
+              </w:rPr>
+              <w:t xml:space="preserve"> if a host is stated</w:t>
             </w:r>
           </w:p>
         </w:tc>
@@ -5264,7 +6115,16 @@
                 <w:b w:val="0"/>
                 <w:sz w:val="16"/>
               </w:rPr>
-              <w:t>not covered; defeats T3</w:t>
+              <w:t xml:space="preserve">not covered; defeats </w:t>
+            </w:r>
+            <w:r>
+              <w:rPr>
+                <w:rFonts w:ascii="Courier New" w:hAnsi="Courier New"/>
+                <w:b w:val="0"/>
+                <w:sz w:val="16"/>
+                <w:noProof w:val="1"/>
+              </w:rPr>
+              <w:t>T3</w:t>
             </w:r>
           </w:p>
         </w:tc>
@@ -5556,7 +6416,40 @@
               <w:br/>
               <w:t>sha256 f6484df479ecce81f61f4e5b3861cd01f25696e0fbc2f572de20b7903e65dc93</w:t>
               <w:br/>
-              <w:t>allowed_hosts: api.anthropic.com, api.openai.com, artifactory.internal; internet_expected: false</w:t>
+            </w:r>
+            <w:r>
+              <w:rPr>
+                <w:rFonts w:ascii="Courier New" w:hAnsi="Courier New"/>
+                <w:b w:val="0"/>
+                <w:sz w:val="16"/>
+                <w:noProof w:val="1"/>
+              </w:rPr>
+              <w:t>allowed_hosts</w:t>
+            </w:r>
+            <w:r>
+              <w:rPr>
+                <w:rFonts w:ascii="Old Standard TT" w:hAnsi="Old Standard TT"/>
+                <w:b w:val="0"/>
+                <w:sz w:val="16"/>
+              </w:rPr>
+              <w:t xml:space="preserve">: api.anthropic.com, api.openai.com, artifactory.internal; </w:t>
+            </w:r>
+            <w:r>
+              <w:rPr>
+                <w:rFonts w:ascii="Courier New" w:hAnsi="Courier New"/>
+                <w:b w:val="0"/>
+                <w:sz w:val="16"/>
+                <w:noProof w:val="1"/>
+              </w:rPr>
+              <w:t>internet_expected</w:t>
+            </w:r>
+            <w:r>
+              <w:rPr>
+                <w:rFonts w:ascii="Old Standard TT" w:hAnsi="Old Standard TT"/>
+                <w:b w:val="0"/>
+                <w:sz w:val="16"/>
+              </w:rPr>
+              <w:t>: false</w:t>
             </w:r>
           </w:p>
         </w:tc>
@@ -5760,15 +6653,57 @@
             </w:r>
             <w:r>
               <w:rPr>
-                <w:rFonts w:ascii="Old Standard TT" w:hAnsi="Old Standard TT"/>
-                <w:b w:val="0"/>
-                <w:sz w:val="16"/>
+                <w:rFonts w:ascii="Courier New" w:hAnsi="Courier New"/>
+                <w:b w:val="0"/>
+                <w:sz w:val="16"/>
+                <w:noProof w:val="1"/>
+                <w:shd w:val="clear" w:color="auto" w:fill="EDEDED"/>
               </w:rPr>
               <w:t>sentinel score traces/hf_openai.json</w:t>
+            </w:r>
+            <w:r>
+              <w:rPr>
+                <w:rFonts w:ascii="Old Standard TT" w:hAnsi="Old Standard TT"/>
+                <w:b w:val="0"/>
+                <w:sz w:val="16"/>
+              </w:rPr>
               <w:br/>
               <w:t>the two files above and this repository; no network, no model, no API key</w:t>
               <w:br/>
-              <w:t>core.py sha256 1691ce806d1624dc…, extract.py sha256 4f3e4cc85fa4a478…</w:t>
+            </w:r>
+            <w:r>
+              <w:rPr>
+                <w:rFonts w:ascii="Courier New" w:hAnsi="Courier New"/>
+                <w:b w:val="0"/>
+                <w:sz w:val="16"/>
+                <w:noProof w:val="1"/>
+              </w:rPr>
+              <w:t>core.py</w:t>
+            </w:r>
+            <w:r>
+              <w:rPr>
+                <w:rFonts w:ascii="Old Standard TT" w:hAnsi="Old Standard TT"/>
+                <w:b w:val="0"/>
+                <w:sz w:val="16"/>
+              </w:rPr>
+              <w:t xml:space="preserve"> sha256 1691ce806d1624dc…, </w:t>
+            </w:r>
+            <w:r>
+              <w:rPr>
+                <w:rFonts w:ascii="Courier New" w:hAnsi="Courier New"/>
+                <w:b w:val="0"/>
+                <w:sz w:val="16"/>
+                <w:noProof w:val="1"/>
+              </w:rPr>
+              <w:t>extract.py</w:t>
+            </w:r>
+            <w:r>
+              <w:rPr>
+                <w:rFonts w:ascii="Old Standard TT" w:hAnsi="Old Standard TT"/>
+                <w:b w:val="0"/>
+                <w:sz w:val="16"/>
+              </w:rPr>
+              <w:t xml:space="preserve"> sha256 4f3e4cc85fa4a478…</w:t>
             </w:r>
           </w:p>
         </w:tc>

</xml_diff>

<commit_message>
report: paging — heading spacing, leading 1.05, Fig 2 4.9in, no break before References; conclusion on p8, 12 pages; draft 10e
</commit_message>
<xml_diff>
--- a/report/build/Sentinel_Apart_AIIR_Sprint_2026.docx
+++ b/report/build/Sentinel_Apart_AIIR_Sprint_2026.docx
@@ -662,7 +662,7 @@
     </w:tbl>
     <w:p>
       <w:pPr>
-        <w:spacing w:line="259" w:lineRule="auto"/>
+        <w:spacing w:line="252" w:lineRule="auto"/>
         <w:rPr/>
       </w:pPr>
       <w:r>
@@ -677,6 +677,7 @@
       <w:pPr>
         <w:pStyle w:val="Heading2"/>
         <w:keepNext/>
+        <w:spacing w:before="240" w:after="60"/>
       </w:pPr>
       <w:r>
         <w:t>1. Introduction</w:t>
@@ -684,7 +685,7 @@
     </w:p>
     <w:p>
       <w:pPr>
-        <w:spacing w:after="100" w:line="259" w:lineRule="auto"/>
+        <w:spacing w:after="80" w:line="252" w:lineRule="auto"/>
         <w:jc w:val="both"/>
       </w:pPr>
       <w:r>
@@ -863,7 +864,7 @@
     </w:p>
     <w:p>
       <w:pPr>
-        <w:spacing w:after="100" w:line="259" w:lineRule="auto"/>
+        <w:spacing w:after="80" w:line="252" w:lineRule="auto"/>
         <w:jc w:val="both"/>
       </w:pPr>
       <w:r>
@@ -906,7 +907,7 @@
     </w:p>
     <w:p>
       <w:pPr>
-        <w:spacing w:after="100" w:line="259" w:lineRule="auto"/>
+        <w:spacing w:after="80" w:line="252" w:lineRule="auto"/>
         <w:jc w:val="both"/>
       </w:pPr>
       <w:r>
@@ -919,7 +920,7 @@
     </w:p>
     <w:p>
       <w:pPr>
-        <w:spacing w:after="80" w:line="259" w:lineRule="auto"/>
+        <w:spacing w:after="80" w:line="252" w:lineRule="auto"/>
         <w:ind w:left="432" w:hanging="288"/>
         <w:jc w:val="both"/>
       </w:pPr>
@@ -933,7 +934,7 @@
     </w:p>
     <w:p>
       <w:pPr>
-        <w:spacing w:after="80" w:line="259" w:lineRule="auto"/>
+        <w:spacing w:after="80" w:line="252" w:lineRule="auto"/>
         <w:ind w:left="432" w:hanging="288"/>
         <w:jc w:val="both"/>
       </w:pPr>
@@ -947,7 +948,7 @@
     </w:p>
     <w:p>
       <w:pPr>
-        <w:spacing w:after="80" w:line="259" w:lineRule="auto"/>
+        <w:spacing w:after="80" w:line="252" w:lineRule="auto"/>
         <w:ind w:left="432" w:hanging="288"/>
         <w:jc w:val="both"/>
       </w:pPr>
@@ -961,7 +962,7 @@
     </w:p>
     <w:p>
       <w:pPr>
-        <w:spacing w:after="80" w:line="259" w:lineRule="auto"/>
+        <w:spacing w:after="80" w:line="252" w:lineRule="auto"/>
         <w:ind w:left="432" w:hanging="288"/>
         <w:jc w:val="both"/>
       </w:pPr>
@@ -977,6 +978,7 @@
       <w:pPr>
         <w:pStyle w:val="Heading2"/>
         <w:keepNext/>
+        <w:spacing w:before="240" w:after="60"/>
       </w:pPr>
       <w:r>
         <w:t>2. Related Work</w:t>
@@ -984,7 +986,7 @@
     </w:p>
     <w:p>
       <w:pPr>
-        <w:spacing w:after="100" w:line="259" w:lineRule="auto"/>
+        <w:spacing w:after="80" w:line="252" w:lineRule="auto"/>
         <w:jc w:val="both"/>
       </w:pPr>
       <w:r>
@@ -1177,7 +1179,7 @@
     </w:p>
     <w:p>
       <w:pPr>
-        <w:spacing w:after="100" w:line="259" w:lineRule="auto"/>
+        <w:spacing w:after="80" w:line="252" w:lineRule="auto"/>
         <w:jc w:val="both"/>
       </w:pPr>
       <w:r>
@@ -1355,7 +1357,7 @@
     </w:p>
     <w:p>
       <w:pPr>
-        <w:spacing w:after="100" w:line="259" w:lineRule="auto"/>
+        <w:spacing w:after="80" w:line="252" w:lineRule="auto"/>
         <w:jc w:val="both"/>
       </w:pPr>
       <w:r>
@@ -1370,6 +1372,7 @@
       <w:pPr>
         <w:pStyle w:val="Heading2"/>
         <w:keepNext/>
+        <w:spacing w:before="240" w:after="60"/>
       </w:pPr>
       <w:r>
         <w:t>3. Methods</w:t>
@@ -1379,6 +1382,7 @@
       <w:pPr>
         <w:pStyle w:val="Heading3"/>
         <w:keepNext/>
+        <w:spacing w:before="160" w:after="40"/>
       </w:pPr>
       <w:r>
         <w:t>3.1 Declared scope</w:t>
@@ -1386,7 +1390,7 @@
     </w:p>
     <w:p>
       <w:pPr>
-        <w:spacing w:after="100" w:line="259" w:lineRule="auto"/>
+        <w:spacing w:after="80" w:line="252" w:lineRule="auto"/>
         <w:jc w:val="both"/>
       </w:pPr>
       <w:r>
@@ -1625,7 +1629,7 @@
     </w:p>
     <w:p>
       <w:pPr>
-        <w:spacing w:after="100" w:line="259" w:lineRule="auto"/>
+        <w:spacing w:after="80" w:line="252" w:lineRule="auto"/>
         <w:jc w:val="both"/>
       </w:pPr>
       <w:r>
@@ -1685,6 +1689,7 @@
       <w:pPr>
         <w:pStyle w:val="Heading3"/>
         <w:keepNext/>
+        <w:spacing w:before="160" w:after="40"/>
       </w:pPr>
       <w:r>
         <w:t>3.2 Trace and destination extraction</w:t>
@@ -1692,7 +1697,7 @@
     </w:p>
     <w:p>
       <w:pPr>
-        <w:spacing w:after="100" w:line="259" w:lineRule="auto"/>
+        <w:spacing w:after="80" w:line="252" w:lineRule="auto"/>
         <w:jc w:val="both"/>
       </w:pPr>
       <w:r>
@@ -1752,6 +1757,7 @@
       <w:pPr>
         <w:pStyle w:val="Heading3"/>
         <w:keepNext/>
+        <w:spacing w:before="160" w:after="40"/>
       </w:pPr>
       <w:r>
         <w:t>3.3 Severities</w:t>
@@ -1759,7 +1765,7 @@
     </w:p>
     <w:p>
       <w:pPr>
-        <w:spacing w:after="100" w:line="259" w:lineRule="auto"/>
+        <w:spacing w:after="80" w:line="252" w:lineRule="auto"/>
         <w:jc w:val="both"/>
       </w:pPr>
       <w:r>
@@ -1887,6 +1893,7 @@
       <w:pPr>
         <w:pStyle w:val="Heading3"/>
         <w:keepNext/>
+        <w:spacing w:before="160" w:after="40"/>
       </w:pPr>
       <w:r>
         <w:t>3.4 Inspect integration and replay</w:t>
@@ -1894,7 +1901,7 @@
     </w:p>
     <w:p>
       <w:pPr>
-        <w:spacing w:after="100" w:line="259" w:lineRule="auto"/>
+        <w:spacing w:after="80" w:line="252" w:lineRule="auto"/>
         <w:jc w:val="both"/>
       </w:pPr>
       <w:r>
@@ -1979,6 +1986,7 @@
       <w:pPr>
         <w:pStyle w:val="Heading3"/>
         <w:keepNext/>
+        <w:spacing w:before="160" w:after="40"/>
       </w:pPr>
       <w:r>
         <w:t>3.5 Fixtures and baseline</w:t>
@@ -1986,7 +1994,7 @@
     </w:p>
     <w:p>
       <w:pPr>
-        <w:spacing w:after="100" w:line="259" w:lineRule="auto"/>
+        <w:spacing w:after="80" w:line="252" w:lineRule="auto"/>
         <w:jc w:val="both"/>
       </w:pPr>
       <w:r>
@@ -2016,6 +2024,7 @@
       <w:pPr>
         <w:pStyle w:val="Heading3"/>
         <w:keepNext/>
+        <w:spacing w:before="160" w:after="40"/>
       </w:pPr>
       <w:r>
         <w:t>3.6 What did not work</w:t>
@@ -2023,7 +2032,7 @@
     </w:p>
     <w:p>
       <w:pPr>
-        <w:spacing w:after="100" w:line="259" w:lineRule="auto"/>
+        <w:spacing w:after="80" w:line="252" w:lineRule="auto"/>
         <w:jc w:val="both"/>
       </w:pPr>
       <w:r>
@@ -2083,6 +2092,7 @@
       <w:pPr>
         <w:pStyle w:val="Heading2"/>
         <w:keepNext/>
+        <w:spacing w:before="240" w:after="60"/>
       </w:pPr>
       <w:r>
         <w:t>4. Results</w:t>
@@ -2092,6 +2102,7 @@
       <w:pPr>
         <w:pStyle w:val="Heading3"/>
         <w:keepNext/>
+        <w:spacing w:before="160" w:after="40"/>
       </w:pPr>
       <w:r>
         <w:t>4.1 Specification tests</w:t>
@@ -3302,7 +3313,7 @@
     </w:p>
     <w:p>
       <w:pPr>
-        <w:spacing w:after="100" w:line="259" w:lineRule="auto"/>
+        <w:spacing w:after="80" w:line="252" w:lineRule="auto"/>
         <w:jc w:val="both"/>
       </w:pPr>
       <w:r>
@@ -3317,6 +3328,7 @@
       <w:pPr>
         <w:pStyle w:val="Heading3"/>
         <w:keepNext/>
+        <w:spacing w:before="160" w:after="40"/>
       </w:pPr>
       <w:r>
         <w:t>4.2 Allowlist misspecification</w:t>
@@ -3325,7 +3337,7 @@
     <w:p>
       <w:pPr>
         <w:keepNext/>
-        <w:spacing w:before="120" w:line="259" w:lineRule="auto"/>
+        <w:spacing w:before="120" w:line="252" w:lineRule="auto"/>
         <w:jc w:val="center"/>
       </w:pPr>
       <w:r>
@@ -3382,7 +3394,7 @@
     </w:p>
     <w:p>
       <w:pPr>
-        <w:spacing w:after="100" w:line="259" w:lineRule="auto"/>
+        <w:spacing w:after="80" w:line="252" w:lineRule="auto"/>
         <w:jc w:val="both"/>
       </w:pPr>
       <w:r>
@@ -3397,6 +3409,7 @@
       <w:pPr>
         <w:pStyle w:val="Heading3"/>
         <w:keepNext/>
+        <w:spacing w:before="160" w:after="40"/>
       </w:pPr>
       <w:r>
         <w:t>4.3 The page arrives after the escape</w:t>
@@ -3404,7 +3417,7 @@
     </w:p>
     <w:p>
       <w:pPr>
-        <w:spacing w:after="100" w:line="259" w:lineRule="auto"/>
+        <w:spacing w:after="80" w:line="252" w:lineRule="auto"/>
         <w:jc w:val="both"/>
       </w:pPr>
       <w:r>
@@ -3463,7 +3476,7 @@
     <w:p>
       <w:pPr>
         <w:keepNext/>
-        <w:spacing w:before="120" w:line="259" w:lineRule="auto"/>
+        <w:spacing w:before="120" w:line="252" w:lineRule="auto"/>
         <w:jc w:val="center"/>
       </w:pPr>
       <w:r>
@@ -3473,7 +3486,7 @@
         </w:rPr>
         <w:drawing>
           <wp:inline>
-            <wp:extent cx="4937760" cy="2226833"/>
+            <wp:extent cx="4480560" cy="2020645"/>
             <wp:docPr id="2" name="Picture 2"/>
             <wp:cNvGraphicFramePr>
               <a:graphicFrameLocks noChangeAspect="1"/>
@@ -3494,7 +3507,7 @@
                   <pic:spPr>
                     <a:xfrm>
                       <a:off x="0" y="0"/>
-                      <a:ext cx="4937760" cy="2226833"/>
+                      <a:ext cx="4480560" cy="2020645"/>
                     </a:xfrm>
                     <a:prstGeom prst="rect"/>
                   </pic:spPr>
@@ -3522,6 +3535,7 @@
       <w:pPr>
         <w:pStyle w:val="Heading3"/>
         <w:keepNext/>
+        <w:spacing w:before="160" w:after="40"/>
       </w:pPr>
       <w:r>
         <w:t>4.4 Records we did not write: the DSEWiki export and a live Inspect run</w:t>
@@ -3529,7 +3543,7 @@
     </w:p>
     <w:p>
       <w:pPr>
-        <w:spacing w:after="100" w:line="259" w:lineRule="auto"/>
+        <w:spacing w:after="80" w:line="252" w:lineRule="auto"/>
         <w:jc w:val="both"/>
       </w:pPr>
       <w:r>
@@ -4093,7 +4107,7 @@
     </w:p>
     <w:p>
       <w:pPr>
-        <w:spacing w:after="100" w:line="259" w:lineRule="auto"/>
+        <w:spacing w:after="80" w:line="252" w:lineRule="auto"/>
         <w:jc w:val="both"/>
       </w:pPr>
       <w:r>
@@ -4121,7 +4135,7 @@
     </w:p>
     <w:p>
       <w:pPr>
-        <w:spacing w:after="100" w:line="259" w:lineRule="auto"/>
+        <w:spacing w:after="80" w:line="252" w:lineRule="auto"/>
         <w:jc w:val="both"/>
       </w:pPr>
       <w:r>
@@ -4151,6 +4165,7 @@
       <w:pPr>
         <w:pStyle w:val="Heading2"/>
         <w:keepNext/>
+        <w:spacing w:before="240" w:after="60"/>
       </w:pPr>
       <w:r>
         <w:t>5. Discussion and Limitations</w:t>
@@ -4158,7 +4173,7 @@
     </w:p>
     <w:p>
       <w:pPr>
-        <w:spacing w:after="100" w:line="259" w:lineRule="auto"/>
+        <w:spacing w:after="80" w:line="252" w:lineRule="auto"/>
         <w:jc w:val="both"/>
       </w:pPr>
       <w:r>
@@ -4171,7 +4186,7 @@
     </w:p>
     <w:p>
       <w:pPr>
-        <w:spacing w:after="100" w:line="259" w:lineRule="auto"/>
+        <w:spacing w:after="80" w:line="252" w:lineRule="auto"/>
         <w:jc w:val="both"/>
       </w:pPr>
       <w:r>
@@ -4246,6 +4261,7 @@
       <w:pPr>
         <w:pStyle w:val="Heading3"/>
         <w:keepNext/>
+        <w:spacing w:before="160" w:after="40"/>
       </w:pPr>
       <w:r>
         <w:t>Limitations</w:t>
@@ -4253,7 +4269,7 @@
     </w:p>
     <w:p>
       <w:pPr>
-        <w:spacing w:after="80" w:line="259" w:lineRule="auto"/>
+        <w:spacing w:after="80" w:line="252" w:lineRule="auto"/>
         <w:ind w:left="432" w:hanging="288"/>
         <w:jc w:val="both"/>
       </w:pPr>
@@ -4297,7 +4313,7 @@
     </w:p>
     <w:p>
       <w:pPr>
-        <w:spacing w:after="80" w:line="259" w:lineRule="auto"/>
+        <w:spacing w:after="80" w:line="252" w:lineRule="auto"/>
         <w:ind w:left="432" w:hanging="288"/>
         <w:jc w:val="both"/>
       </w:pPr>
@@ -4311,7 +4327,7 @@
     </w:p>
     <w:p>
       <w:pPr>
-        <w:spacing w:after="80" w:line="259" w:lineRule="auto"/>
+        <w:spacing w:after="80" w:line="252" w:lineRule="auto"/>
         <w:ind w:left="432" w:hanging="288"/>
         <w:jc w:val="both"/>
       </w:pPr>
@@ -4325,7 +4341,7 @@
     </w:p>
     <w:p>
       <w:pPr>
-        <w:spacing w:after="80" w:line="259" w:lineRule="auto"/>
+        <w:spacing w:after="80" w:line="252" w:lineRule="auto"/>
         <w:ind w:left="432" w:hanging="288"/>
         <w:jc w:val="both"/>
       </w:pPr>
@@ -4369,7 +4385,7 @@
     </w:p>
     <w:p>
       <w:pPr>
-        <w:spacing w:after="80" w:line="259" w:lineRule="auto"/>
+        <w:spacing w:after="80" w:line="252" w:lineRule="auto"/>
         <w:ind w:left="432" w:hanging="288"/>
         <w:jc w:val="both"/>
       </w:pPr>
@@ -4413,7 +4429,7 @@
     </w:p>
     <w:p>
       <w:pPr>
-        <w:spacing w:after="80" w:line="259" w:lineRule="auto"/>
+        <w:spacing w:after="80" w:line="252" w:lineRule="auto"/>
         <w:ind w:left="432" w:hanging="288"/>
         <w:jc w:val="both"/>
       </w:pPr>
@@ -4429,6 +4445,7 @@
       <w:pPr>
         <w:pStyle w:val="Heading3"/>
         <w:keepNext/>
+        <w:spacing w:before="160" w:after="40"/>
       </w:pPr>
       <w:r>
         <w:t>Future work</w:t>
@@ -4436,7 +4453,7 @@
     </w:p>
     <w:p>
       <w:pPr>
-        <w:spacing w:after="100" w:line="259" w:lineRule="auto"/>
+        <w:spacing w:after="80" w:line="252" w:lineRule="auto"/>
         <w:jc w:val="both"/>
       </w:pPr>
       <w:r>
@@ -4496,6 +4513,7 @@
       <w:pPr>
         <w:pStyle w:val="Heading2"/>
         <w:keepNext/>
+        <w:spacing w:before="240" w:after="60"/>
       </w:pPr>
       <w:r>
         <w:t>6. Conclusion</w:t>
@@ -4503,7 +4521,7 @@
     </w:p>
     <w:p>
       <w:pPr>
-        <w:spacing w:after="100" w:line="259" w:lineRule="auto"/>
+        <w:spacing w:after="80" w:line="252" w:lineRule="auto"/>
         <w:jc w:val="both"/>
       </w:pPr>
       <w:r>
@@ -4518,6 +4536,7 @@
       <w:pPr>
         <w:pStyle w:val="Heading2"/>
         <w:keepNext/>
+        <w:spacing w:before="240" w:after="60"/>
       </w:pPr>
       <w:r>
         <w:t>Code and Data</w:t>
@@ -4525,7 +4544,7 @@
     </w:p>
     <w:p>
       <w:pPr>
-        <w:spacing w:after="100" w:line="259" w:lineRule="auto"/>
+        <w:spacing w:after="80" w:line="252" w:lineRule="auto"/>
         <w:jc w:val="both"/>
       </w:pPr>
       <w:r>
@@ -4601,6 +4620,7 @@
       <w:pPr>
         <w:pStyle w:val="Heading2"/>
         <w:keepNext/>
+        <w:spacing w:before="240" w:after="60"/>
       </w:pPr>
       <w:r>
         <w:t>Author Contributions</w:t>
@@ -4608,7 +4628,7 @@
     </w:p>
     <w:p>
       <w:pPr>
-        <w:spacing w:after="100" w:line="259" w:lineRule="auto"/>
+        <w:spacing w:after="80" w:line="252" w:lineRule="auto"/>
         <w:jc w:val="both"/>
       </w:pPr>
       <w:r>
@@ -4623,7 +4643,7 @@
       <w:pPr>
         <w:pStyle w:val="Heading2"/>
         <w:keepNext/>
-        <w:pageBreakBefore/>
+        <w:spacing w:before="240" w:after="60"/>
       </w:pPr>
       <w:r>
         <w:t>References</w:t>
@@ -4632,7 +4652,7 @@
     <w:p>
       <w:bookmarkStart w:id="1" w:name="ref1"/>
       <w:pPr>
-        <w:spacing w:after="80" w:line="259" w:lineRule="auto"/>
+        <w:spacing w:after="80" w:line="252" w:lineRule="auto"/>
         <w:ind w:left="403" w:hanging="403"/>
         <w:jc w:val="left"/>
       </w:pPr>
@@ -4675,7 +4695,7 @@
     <w:p>
       <w:bookmarkStart w:id="2" w:name="ref2"/>
       <w:pPr>
-        <w:spacing w:after="80" w:line="259" w:lineRule="auto"/>
+        <w:spacing w:after="80" w:line="252" w:lineRule="auto"/>
         <w:ind w:left="403" w:hanging="403"/>
         <w:jc w:val="left"/>
       </w:pPr>
@@ -4701,7 +4721,7 @@
     <w:p>
       <w:bookmarkStart w:id="3" w:name="ref3"/>
       <w:pPr>
-        <w:spacing w:after="80" w:line="259" w:lineRule="auto"/>
+        <w:spacing w:after="80" w:line="252" w:lineRule="auto"/>
         <w:ind w:left="403" w:hanging="403"/>
         <w:jc w:val="left"/>
       </w:pPr>
@@ -4727,7 +4747,7 @@
     <w:p>
       <w:bookmarkStart w:id="4" w:name="ref4"/>
       <w:pPr>
-        <w:spacing w:after="80" w:line="259" w:lineRule="auto"/>
+        <w:spacing w:after="80" w:line="252" w:lineRule="auto"/>
         <w:ind w:left="403" w:hanging="403"/>
         <w:jc w:val="left"/>
       </w:pPr>
@@ -4753,7 +4773,7 @@
     <w:p>
       <w:bookmarkStart w:id="5" w:name="ref5"/>
       <w:pPr>
-        <w:spacing w:after="80" w:line="259" w:lineRule="auto"/>
+        <w:spacing w:after="80" w:line="252" w:lineRule="auto"/>
         <w:ind w:left="403" w:hanging="403"/>
         <w:jc w:val="left"/>
       </w:pPr>
@@ -4796,7 +4816,7 @@
     <w:p>
       <w:bookmarkStart w:id="6" w:name="ref6"/>
       <w:pPr>
-        <w:spacing w:after="80" w:line="259" w:lineRule="auto"/>
+        <w:spacing w:after="80" w:line="252" w:lineRule="auto"/>
         <w:ind w:left="403" w:hanging="403"/>
         <w:jc w:val="left"/>
       </w:pPr>
@@ -4822,7 +4842,7 @@
     <w:p>
       <w:bookmarkStart w:id="7" w:name="ref7"/>
       <w:pPr>
-        <w:spacing w:after="80" w:line="259" w:lineRule="auto"/>
+        <w:spacing w:after="80" w:line="252" w:lineRule="auto"/>
         <w:ind w:left="403" w:hanging="403"/>
         <w:jc w:val="left"/>
       </w:pPr>
@@ -4848,7 +4868,7 @@
     <w:p>
       <w:bookmarkStart w:id="8" w:name="ref8"/>
       <w:pPr>
-        <w:spacing w:after="80" w:line="259" w:lineRule="auto"/>
+        <w:spacing w:after="80" w:line="252" w:lineRule="auto"/>
         <w:ind w:left="403" w:hanging="403"/>
         <w:jc w:val="left"/>
       </w:pPr>
@@ -4874,7 +4894,7 @@
     <w:p>
       <w:bookmarkStart w:id="9" w:name="ref9"/>
       <w:pPr>
-        <w:spacing w:after="80" w:line="259" w:lineRule="auto"/>
+        <w:spacing w:after="80" w:line="252" w:lineRule="auto"/>
         <w:ind w:left="403" w:hanging="403"/>
         <w:jc w:val="left"/>
       </w:pPr>
@@ -4900,7 +4920,7 @@
     <w:p>
       <w:bookmarkStart w:id="10" w:name="ref10"/>
       <w:pPr>
-        <w:spacing w:after="80" w:line="259" w:lineRule="auto"/>
+        <w:spacing w:after="80" w:line="252" w:lineRule="auto"/>
         <w:ind w:left="403" w:hanging="403"/>
         <w:jc w:val="left"/>
       </w:pPr>
@@ -4933,7 +4953,7 @@
     <w:p>
       <w:bookmarkStart w:id="11" w:name="ref11"/>
       <w:pPr>
-        <w:spacing w:after="80" w:line="259" w:lineRule="auto"/>
+        <w:spacing w:after="80" w:line="252" w:lineRule="auto"/>
         <w:ind w:left="403" w:hanging="403"/>
         <w:jc w:val="left"/>
       </w:pPr>
@@ -4959,7 +4979,7 @@
     <w:p>
       <w:bookmarkStart w:id="12" w:name="ref12"/>
       <w:pPr>
-        <w:spacing w:after="80" w:line="259" w:lineRule="auto"/>
+        <w:spacing w:after="80" w:line="252" w:lineRule="auto"/>
         <w:ind w:left="403" w:hanging="403"/>
         <w:jc w:val="left"/>
       </w:pPr>
@@ -4985,7 +5005,7 @@
     <w:p>
       <w:bookmarkStart w:id="13" w:name="ref13"/>
       <w:pPr>
-        <w:spacing w:after="80" w:line="259" w:lineRule="auto"/>
+        <w:spacing w:after="80" w:line="252" w:lineRule="auto"/>
         <w:ind w:left="403" w:hanging="403"/>
         <w:jc w:val="left"/>
       </w:pPr>
@@ -5011,7 +5031,7 @@
     <w:p>
       <w:bookmarkStart w:id="14" w:name="ref14"/>
       <w:pPr>
-        <w:spacing w:after="80" w:line="259" w:lineRule="auto"/>
+        <w:spacing w:after="80" w:line="252" w:lineRule="auto"/>
         <w:ind w:left="403" w:hanging="403"/>
         <w:jc w:val="left"/>
       </w:pPr>
@@ -5037,7 +5057,7 @@
     <w:p>
       <w:bookmarkStart w:id="15" w:name="ref15"/>
       <w:pPr>
-        <w:spacing w:after="80" w:line="259" w:lineRule="auto"/>
+        <w:spacing w:after="80" w:line="252" w:lineRule="auto"/>
         <w:ind w:left="403" w:hanging="403"/>
         <w:jc w:val="left"/>
       </w:pPr>
@@ -5063,7 +5083,7 @@
     <w:p>
       <w:bookmarkStart w:id="16" w:name="ref16"/>
       <w:pPr>
-        <w:spacing w:after="80" w:line="259" w:lineRule="auto"/>
+        <w:spacing w:after="80" w:line="252" w:lineRule="auto"/>
         <w:ind w:left="403" w:hanging="403"/>
         <w:jc w:val="left"/>
       </w:pPr>
@@ -5089,7 +5109,7 @@
     <w:p>
       <w:bookmarkStart w:id="17" w:name="ref17"/>
       <w:pPr>
-        <w:spacing w:after="80" w:line="259" w:lineRule="auto"/>
+        <w:spacing w:after="80" w:line="252" w:lineRule="auto"/>
         <w:ind w:left="403" w:hanging="403"/>
         <w:jc w:val="left"/>
       </w:pPr>
@@ -5115,7 +5135,7 @@
     <w:p>
       <w:bookmarkStart w:id="18" w:name="ref18"/>
       <w:pPr>
-        <w:spacing w:after="80" w:line="259" w:lineRule="auto"/>
+        <w:spacing w:after="80" w:line="252" w:lineRule="auto"/>
         <w:ind w:left="403" w:hanging="403"/>
         <w:jc w:val="left"/>
       </w:pPr>
@@ -5141,7 +5161,7 @@
     <w:p>
       <w:bookmarkStart w:id="19" w:name="ref19"/>
       <w:pPr>
-        <w:spacing w:after="80" w:line="259" w:lineRule="auto"/>
+        <w:spacing w:after="80" w:line="252" w:lineRule="auto"/>
         <w:ind w:left="403" w:hanging="403"/>
         <w:jc w:val="left"/>
       </w:pPr>
@@ -5169,6 +5189,7 @@
         <w:pStyle w:val="Heading2"/>
         <w:keepNext/>
         <w:pageBreakBefore/>
+        <w:spacing w:before="240" w:after="60"/>
       </w:pPr>
       <w:r>
         <w:t>Appendix A. Limitations and Dual-Use Considerations</w:t>
@@ -5176,7 +5197,7 @@
     </w:p>
     <w:p>
       <w:pPr>
-        <w:spacing w:after="100" w:line="259" w:lineRule="auto"/>
+        <w:spacing w:after="80" w:line="252" w:lineRule="auto"/>
         <w:jc w:val="both"/>
       </w:pPr>
       <w:r>
@@ -5235,7 +5256,7 @@
     </w:p>
     <w:p>
       <w:pPr>
-        <w:spacing w:after="100" w:line="259" w:lineRule="auto"/>
+        <w:spacing w:after="80" w:line="252" w:lineRule="auto"/>
         <w:jc w:val="both"/>
       </w:pPr>
       <w:r>
@@ -5250,6 +5271,7 @@
       <w:pPr>
         <w:pStyle w:val="Heading2"/>
         <w:keepNext/>
+        <w:spacing w:before="240" w:after="60"/>
       </w:pPr>
       <w:r>
         <w:t>Appendix B. Taxonomy coverage</w:t>
@@ -6222,6 +6244,7 @@
         <w:pStyle w:val="Heading2"/>
         <w:keepNext/>
         <w:pageBreakBefore/>
+        <w:spacing w:before="240" w:after="60"/>
       </w:pPr>
       <w:r>
         <w:t>Appendix C. A filled containment record for one evaluation class</w:t>
@@ -6229,7 +6252,7 @@
     </w:p>
     <w:p>
       <w:pPr>
-        <w:spacing w:after="100" w:line="259" w:lineRule="auto"/>
+        <w:spacing w:after="80" w:line="252" w:lineRule="auto"/>
         <w:jc w:val="both"/>
       </w:pPr>
       <w:r>

</xml_diff>